<commit_message>
fix errors & issues after copyedit
</commit_message>
<xml_diff>
--- a/letters_from_usa/book.docx
+++ b/letters_from_usa/book.docx
@@ -98,10 +98,10 @@
           <w:szCs w:val="24"/>
         </w:rPr>
         <w:sectPr>
-          <w:headerReference w:type="even" r:id="rId7"/>
-          <w:headerReference w:type="default" r:id="rId8"/>
-          <w:footerReference w:type="even" r:id="rId9"/>
-          <w:footerReference w:type="default" r:id="rId10"/>
+          <w:headerReference w:type="even" r:id="rId8"/>
+          <w:headerReference w:type="default" r:id="rId9"/>
+          <w:footerReference w:type="even" r:id="rId10"/>
+          <w:footerReference w:type="default" r:id="rId11"/>
           <w:pgSz w:w="7286" w:h="11246"/>
           <w:pgMar w:top="864" w:right="864" w:bottom="864" w:left="1094" w:header="504" w:footer="504" w:gutter="0"/>
           <w:pgNumType w:fmt="lowerRoman"/>
@@ -1818,7 +1818,7 @@
           <w:szCs w:val="20"/>
         </w:rPr>
         <w:sectPr>
-          <w:footerReference w:type="first" r:id="rId11"/>
+          <w:footerReference w:type="first" r:id="rId12"/>
           <w:type w:val="nextColumn"/>
           <w:pgSz w:w="7286" w:h="11246"/>
           <w:pgMar w:top="864" w:right="864" w:bottom="864" w:left="1094" w:header="504" w:footer="432" w:gutter="0"/>
@@ -2902,7 +2902,16 @@
         <w:t>two</w:t>
       </w:r>
       <w:r>
-        <w:t xml:space="preserve"> layovers, arriving in Austin at 9:10 in the evening that very same day, August 16th. I already sent an email to my old classmate in Austin, hoping he can come to the airport to pick me up. The ticket cost 6,900 yuan. Booking the ticket directly through the airline would have been much more expensive, running about 8,900 yuan. I’m not entirely sure why the travel agency is so much cheaper. They told me to call Northwest Airlines in Shanghai the week before I leave to confirm everything, and I’ve already written down the phone number. </w:t>
+        <w:t xml:space="preserve"> layovers, arriving in Austin at 9:10 in the evening that very same day, August 16th. I already sent an email to my old classmate in Austin, hoping he </w:t>
+      </w:r>
+      <w:r>
+        <w:t>could</w:t>
+      </w:r>
+      <w:r>
+        <w:t xml:space="preserve"> </w:t>
+      </w:r>
+      <w:r>
+        <w:t xml:space="preserve">come to the airport to pick me up. The ticket cost 6,900 yuan. Booking the ticket directly through the airline would have been much more expensive, running about 8,900 yuan. I’m not entirely sure why the travel agency is so much cheaper. They told me to call Northwest Airlines in Shanghai the week before I leave to confirm everything, and I’ve already written down the phone number. </w:t>
       </w:r>
     </w:p>
     <w:p>
@@ -2983,9 +2992,9 @@
       <w:pPr>
         <w:pStyle w:val="CSP-ChapterBodyText"/>
         <w:sectPr>
-          <w:footerReference w:type="even" r:id="rId12"/>
-          <w:footerReference w:type="default" r:id="rId13"/>
-          <w:footerReference w:type="first" r:id="rId14"/>
+          <w:footerReference w:type="even" r:id="rId13"/>
+          <w:footerReference w:type="default" r:id="rId14"/>
+          <w:footerReference w:type="first" r:id="rId15"/>
           <w:type w:val="nextColumn"/>
           <w:pgSz w:w="7286" w:h="11246"/>
           <w:pgMar w:top="864" w:right="864" w:bottom="864" w:left="1094" w:header="576" w:footer="432" w:gutter="0"/>
@@ -3143,7 +3152,26 @@
         <w:pStyle w:val="CSP-ChapterBodyText"/>
       </w:pPr>
       <w:r>
-        <w:t>August 16th was the longest day in my life. Zhou</w:t>
+        <w:t xml:space="preserve">August 16th was the longest day </w:t>
+      </w:r>
+      <w:r>
+        <w:t>of</w:t>
+      </w:r>
+      <w:r>
+        <w:t xml:space="preserve"> my life.</w:t>
+      </w:r>
+    </w:p>
+    <w:p>
+      <w:pPr>
+        <w:pStyle w:val="CSP-ChapterBodyText"/>
+      </w:pPr>
+    </w:p>
+    <w:p>
+      <w:pPr>
+        <w:pStyle w:val="CSP-ChapterBodyText"/>
+      </w:pPr>
+      <w:r>
+        <w:t>Zhou</w:t>
       </w:r>
       <w:r>
         <w:t>-he</w:t>
@@ -3171,20 +3199,25 @@
         <w:pStyle w:val="CSP-ChapterBodyText"/>
       </w:pPr>
       <w:r>
-        <w:t>Around 4:00 p.m. Tokyo time, I boarded the exact same plane, sat in the exact same seat, and headed toward L.A. This leg of the trip took over ten hours. I ate two Japanese meals on board (sushi, sashimi, salad, etc.) and was really happy with them; I also watched two movies. After flying for a while, it got dark, but then just 5 or 6 hours later, the sun came up again!</w:t>
-      </w:r>
-    </w:p>
-    <w:p>
-      <w:pPr>
-        <w:pStyle w:val="CSP-ChapterBodyText"/>
-      </w:pPr>
-    </w:p>
-    <w:p>
-      <w:pPr>
-        <w:pStyle w:val="CSP-ChapterBodyText"/>
-      </w:pPr>
-      <w:r>
-        <w:lastRenderedPageBreak/>
+        <w:t xml:space="preserve">Around 4:00 p.m. Tokyo time, I boarded the exact same plane, sat in the exact same seat, and headed toward L.A. This leg of the trip took over ten hours. I ate two Japanese meals on board (sushi, sashimi, salad, etc.) and was really happy with them; I also watched two movies. After flying for a while, it got dark, but then just </w:t>
+      </w:r>
+      <w:r>
+        <w:t>five or six hours</w:t>
+      </w:r>
+      <w:r>
+        <w:t xml:space="preserve"> later, the sun came up again!</w:t>
+      </w:r>
+    </w:p>
+    <w:p>
+      <w:pPr>
+        <w:pStyle w:val="CSP-ChapterBodyText"/>
+      </w:pPr>
+    </w:p>
+    <w:p>
+      <w:pPr>
+        <w:pStyle w:val="CSP-ChapterBodyText"/>
+      </w:pPr>
+      <w:r>
         <w:t>By the time we landed in L.A., it was already past 10:00 a.m. local time. I only had a little over an hour before my next flight was scheduled to take off. The customs line was very long and slow, and because my gate changed at the last minute, I almost missed the flight. On the flight to Minneapolis, I was so wiped out I couldn't even manage to eat lunch. The final flight to Austin was pleasantly quiet, with only about half the seats occupied. I got a window seat this time, and the view was beautiful.</w:t>
       </w:r>
     </w:p>
@@ -3237,7 +3270,6 @@
         <w:pStyle w:val="CSP-ChapterBodyText"/>
       </w:pPr>
       <w:r>
-        <w:lastRenderedPageBreak/>
         <w:t>I’m going to sleep now and will write more tomorrow.</w:t>
       </w:r>
     </w:p>
@@ -3402,7 +3434,6 @@
         <w:pStyle w:val="CSP-ChapterBodyText"/>
       </w:pPr>
       <w:r>
-        <w:lastRenderedPageBreak/>
         <w:t>I will probably stay at this temporary apartment until the 24th, and then move to another place nearby. Once I move into my permanent apartment, I will let you know how to write to me.</w:t>
       </w:r>
     </w:p>
@@ -3423,8 +3454,8 @@
       <w:pPr>
         <w:pStyle w:val="CSP-ChapterBodyText"/>
         <w:sectPr>
-          <w:footerReference w:type="default" r:id="rId15"/>
-          <w:footerReference w:type="first" r:id="rId16"/>
+          <w:footerReference w:type="default" r:id="rId16"/>
+          <w:footerReference w:type="first" r:id="rId17"/>
           <w:type w:val="nextColumn"/>
           <w:pgSz w:w="7286" w:h="11246"/>
           <w:pgMar w:top="864" w:right="864" w:bottom="864" w:left="1094" w:header="576" w:footer="432" w:gutter="0"/>
@@ -3626,7 +3657,13 @@
         <w:pStyle w:val="CSP-ChapterBodyText"/>
       </w:pPr>
       <w:r>
-        <w:t xml:space="preserve">These past few days have been relatively busy, mostly because I had to attend the International TA Orientation. It ran for 4 consecutive days and just wrapped up yesterday; it was basically a training on how to be an effective international TA. Among the international students, Indians make up the largest group, followed by students from Taiwan, South Korea, and Mainland China. The fall semester officially starts on August 30th. </w:t>
+        <w:t xml:space="preserve">These past few days have been relatively busy, mostly because I had to attend the International TA Orientation. It ran for </w:t>
+      </w:r>
+      <w:r>
+        <w:t>four</w:t>
+      </w:r>
+      <w:r>
+        <w:t xml:space="preserve"> consecutive days and just wrapped up yesterday; it was basically a training on how to be an effective international TA. Among the international students, Indians make up the largest group, followed by students from Taiwan, South Korea, and Mainland China. The fall semester officially starts on August 30th. </w:t>
       </w:r>
     </w:p>
     <w:p>
@@ -3915,9 +3952,9 @@
       <w:pPr>
         <w:pStyle w:val="CSP-ChapterBodyText"/>
         <w:sectPr>
-          <w:footerReference w:type="even" r:id="rId17"/>
-          <w:footerReference w:type="default" r:id="rId18"/>
-          <w:footerReference w:type="first" r:id="rId19"/>
+          <w:footerReference w:type="even" r:id="rId18"/>
+          <w:footerReference w:type="default" r:id="rId19"/>
+          <w:footerReference w:type="first" r:id="rId20"/>
           <w:type w:val="nextColumn"/>
           <w:pgSz w:w="7286" w:h="11246"/>
           <w:pgMar w:top="864" w:right="864" w:bottom="864" w:left="1094" w:header="576" w:footer="432" w:gutter="0"/>
@@ -4155,7 +4192,7 @@
         <w:t>is</w:t>
       </w:r>
       <w:r>
-        <w:t xml:space="preserve"> Wang Wei and Xiao Fan’s phone numbers?</w:t>
+        <w:t xml:space="preserve"> Wang Wei and Xiao Fan’s phone number?</w:t>
       </w:r>
       <w:r>
         <w:rPr>
@@ -4211,7 +4248,7 @@
         <w:pStyle w:val="CSP-ChapterBodyText"/>
       </w:pPr>
       <w:r>
-        <w:t xml:space="preserve">As for classes, things are going okay, though it was a bit tough to understand some of the professors at first. One Indian professor has an accent that is hard to follow, so as soon as class lets out, the Chinese students get gather and try to figure out what he actually said. The Chinese students have a great tradition of forming study groups, so if we miss something, we just talk it through together. I think after a few more classes, I'll </w:t>
+        <w:t xml:space="preserve">As for classes, things are going okay, though it was a bit tough to understand some of the professors at first. One Indian professor has an accent that is hard to follow, so as soon as class lets out, the Chinese students gather and try to figure out what he actually said. The Chinese students have a great tradition of forming study groups, so if we miss something, we just talk it through together. I think after a few more classes, I'll </w:t>
       </w:r>
       <w:r>
         <w:lastRenderedPageBreak/>
@@ -4314,9 +4351,9 @@
       <w:pPr>
         <w:pStyle w:val="CSP-ChapterBodyText"/>
         <w:sectPr>
-          <w:footerReference w:type="even" r:id="rId20"/>
-          <w:footerReference w:type="default" r:id="rId21"/>
-          <w:footerReference w:type="first" r:id="rId22"/>
+          <w:footerReference w:type="even" r:id="rId21"/>
+          <w:footerReference w:type="default" r:id="rId22"/>
+          <w:footerReference w:type="first" r:id="rId23"/>
           <w:type w:val="nextColumn"/>
           <w:pgSz w:w="7286" w:h="11246"/>
           <w:pgMar w:top="864" w:right="864" w:bottom="864" w:left="1094" w:header="576" w:footer="432" w:gutter="0"/>
@@ -4946,9 +4983,9 @@
       <w:pPr>
         <w:pStyle w:val="CSP-ChapterBodyText"/>
         <w:sectPr>
-          <w:footerReference w:type="even" r:id="rId23"/>
-          <w:footerReference w:type="default" r:id="rId24"/>
-          <w:footerReference w:type="first" r:id="rId25"/>
+          <w:footerReference w:type="even" r:id="rId24"/>
+          <w:footerReference w:type="default" r:id="rId25"/>
+          <w:footerReference w:type="first" r:id="rId26"/>
           <w:type w:val="nextColumn"/>
           <w:pgSz w:w="7286" w:h="11246"/>
           <w:pgMar w:top="864" w:right="864" w:bottom="864" w:left="1094" w:header="576" w:footer="432" w:gutter="0"/>
@@ -5116,7 +5153,16 @@
         <w:pStyle w:val="CSP-ChapterBodyText"/>
       </w:pPr>
       <w:r>
-        <w:t>A week ago, I spent $120 on a used color TV. It’s practically brand new—even the plastic wrap on the remote control is still on! It’s a Samsung from South Korea, so the quality is pretty good. Since I haven't hooked up cable, I can only pick up about seven or eight local channels. I especially enjoy watching comedy shows called sitcoms. They seem to be very popular here. Each episode is only about half an hour long, which fits perfectly into my busy schedule. Most importantly, they’re very funny and always make me laugh.</w:t>
+        <w:t>A week ago, I spent $120 on a used color TV. It’s practically brand new—even the plastic wrap on the remote control is still on! It’s a Samsung from South Korea, so the quality is pretty good. Since I haven't hooked up cable, I can only pick up about seven or eight local channels. I especially enjoy watching comedy shows called sitcoms.</w:t>
+      </w:r>
+      <w:r>
+        <w:rPr>
+          <w:rStyle w:val="FootnoteReference"/>
+        </w:rPr>
+        <w:footnoteReference w:id="12"/>
+      </w:r>
+      <w:r>
+        <w:t xml:space="preserve"> They seem to be very popular here. Each episode is only about half an hour long, which fits perfectly into my busy schedule. Most importantly, they’re very funny and always make me laugh.</w:t>
       </w:r>
     </w:p>
     <w:p>
@@ -5143,7 +5189,11 @@
       </w:r>
       <w:proofErr w:type="gramEnd"/>
       <w:r>
-        <w:t xml:space="preserve"> if possible, I’d really like to move somewhere else and get an American roommate. It would force me to speak English every day and help me gain a better understanding of American culture. The university’s International Office runs a program called PALS (Partnerships to Advance Language Study), which pairs international students with Americans to build friendships and practice language skills. I signed up and was paired with Sarah. We meet once a week just to chat, and we've been doing it for about 4 weeks now.</w:t>
+        <w:t xml:space="preserve"> if possible, I’d really like to move somewhere else and get an American roommate. It would force me to speak English every day and help me gain a better understanding of American culture. The university’s International Office runs a program called PALS (Partnerships to Advance Language Study), which pairs international students with Americans to build friendships and practice language skills. I signed up and was paired with </w:t>
+      </w:r>
+      <w:r>
+        <w:lastRenderedPageBreak/>
+        <w:t>Sarah. We meet once a week just to chat, and we've been doing it for about 4 weeks now.</w:t>
       </w:r>
     </w:p>
     <w:p>
@@ -5162,7 +5212,6 @@
         <w:pStyle w:val="CSP-ChapterBodyText"/>
       </w:pPr>
       <w:r>
-        <w:lastRenderedPageBreak/>
         <w:t>Right now, exams are starting to pile up, and I expect I’ll have tests every week from now on. On one of my recent exams, the time limit was very tight and the questions weren’t easy, so I only managed to finish about half of them. I honestly thought I completely blew it. The exam was worth 75 points, and I ended up scoring 42. Fortunately, since everyone did so poorly across the board, the professor had to adjust total points down to 50. That turned my score into a 42 out of 50, which actually isn't bad at all!</w:t>
       </w:r>
     </w:p>
@@ -5182,21 +5231,57 @@
         <w:pStyle w:val="CSP-ChapterBodyText"/>
       </w:pPr>
       <w:r>
-        <w:t xml:space="preserve">October 31st was Halloween, which is a pretty big deal here in America. I’m not entirely sure how to translate it into Chinese—maybe Wan Sheng </w:t>
+        <w:t xml:space="preserve">October 31st was Halloween, which is a pretty big deal here in America. I’m not entirely sure how to translate it into Chinese—maybe </w:t>
       </w:r>
       <w:proofErr w:type="spellStart"/>
       <w:r>
-        <w:t>Jie</w:t>
+        <w:rPr>
+          <w:i/>
+          <w:iCs w:val="0"/>
+        </w:rPr>
+        <w:t>Wàn</w:t>
       </w:r>
       <w:proofErr w:type="spellEnd"/>
       <w:r>
+        <w:rPr>
+          <w:i/>
+          <w:iCs w:val="0"/>
+        </w:rPr>
+        <w:t xml:space="preserve"> </w:t>
+      </w:r>
+      <w:proofErr w:type="spellStart"/>
+      <w:r>
+        <w:rPr>
+          <w:i/>
+          <w:iCs w:val="0"/>
+        </w:rPr>
+        <w:t>Shèng</w:t>
+      </w:r>
+      <w:proofErr w:type="spellEnd"/>
+      <w:r>
+        <w:rPr>
+          <w:i/>
+          <w:iCs w:val="0"/>
+        </w:rPr>
+        <w:t xml:space="preserve"> </w:t>
+      </w:r>
+      <w:proofErr w:type="spellStart"/>
+      <w:r>
+        <w:rPr>
+          <w:i/>
+          <w:iCs w:val="0"/>
+        </w:rPr>
+        <w:t>Jié</w:t>
+      </w:r>
+      <w:proofErr w:type="spellEnd"/>
+      <w:r>
         <w:t>—but it’s basically a ghost festival. The story goes that ghosts all come back to life on that night. American children dress up in costumes and go door-to-door trick-or-treating for candy, while adults put on scary or elaborate outfits and march in street parades. Lately, television has been full of ghost stories, and people buy pumpkins to carve faces into them. I imagine Dad probably knows a little about all this already.</w:t>
       </w:r>
       <w:r>
         <w:rPr>
           <w:rStyle w:val="FootnoteReference"/>
         </w:rPr>
-        <w:footnoteReference w:id="12"/>
+        <w:footnoteReference w:id="13"/>
       </w:r>
     </w:p>
     <w:p>
@@ -5237,11 +5322,7 @@
         <w:t>Chun</w:t>
       </w:r>
       <w:r>
-        <w:t xml:space="preserve">’s transcripts finally came in, so she is busy getting her application materials together. She’s applying to five or six </w:t>
-      </w:r>
-      <w:r>
-        <w:lastRenderedPageBreak/>
-        <w:t>graduate schools, including UT. I check in with her by email every now and then.</w:t>
+        <w:t>’s transcripts finally came in, so she is busy getting her application materials together. She’s applying to five or six graduate schools, including UT. I check in with her by email every now and then.</w:t>
       </w:r>
     </w:p>
     <w:p>
@@ -5351,9 +5432,9 @@
       <w:pPr>
         <w:pStyle w:val="CSP-ChapterBodyText"/>
         <w:sectPr>
-          <w:footerReference w:type="even" r:id="rId26"/>
-          <w:footerReference w:type="default" r:id="rId27"/>
-          <w:footerReference w:type="first" r:id="rId28"/>
+          <w:footerReference w:type="even" r:id="rId27"/>
+          <w:footerReference w:type="default" r:id="rId28"/>
+          <w:footerReference w:type="first" r:id="rId29"/>
           <w:type w:val="nextColumn"/>
           <w:pgSz w:w="7286" w:h="11246"/>
           <w:pgMar w:top="864" w:right="864" w:bottom="864" w:left="1094" w:header="576" w:footer="432" w:gutter="0"/>
@@ -5513,7 +5594,19 @@
       </w:r>
       <w:r>
         <w:lastRenderedPageBreak/>
-        <w:t xml:space="preserve">hectic with work and classes, so whenever a holiday rolls around, we look for any excuse to get out and have fun. The whole trip only cost us about $20 each for the car rental, gas, and seafood. That doesn't include the $12 admission ticket for NASA though, which is honestly so expensive! </w:t>
+        <w:t xml:space="preserve">hectic with work and classes, so whenever a holiday rolls around, we look for any excuse to get out and have fun. The whole trip only cost us about $20 each for the car rental, gas, and seafood. That doesn't include the $12 admission ticket </w:t>
+      </w:r>
+      <w:r>
+        <w:t>to</w:t>
+      </w:r>
+      <w:r>
+        <w:t xml:space="preserve"> NASA</w:t>
+      </w:r>
+      <w:r>
+        <w:t>,</w:t>
+      </w:r>
+      <w:r>
+        <w:t xml:space="preserve"> though, which is honestly so expensive! </w:t>
       </w:r>
     </w:p>
     <w:p>
@@ -5561,7 +5654,7 @@
         <w:rPr>
           <w:rStyle w:val="FootnoteReference"/>
         </w:rPr>
-        <w:footnoteReference w:id="13"/>
+        <w:footnoteReference w:id="14"/>
       </w:r>
       <w:r>
         <w:t xml:space="preserve"> to me. Sure, the coursework is a bit more demanding than back home, but it's manageable.</w:t>
@@ -5689,9 +5782,9 @@
           <w:iCs/>
         </w:rPr>
         <w:sectPr>
-          <w:footerReference w:type="even" r:id="rId29"/>
-          <w:footerReference w:type="default" r:id="rId30"/>
-          <w:footerReference w:type="first" r:id="rId31"/>
+          <w:footerReference w:type="even" r:id="rId30"/>
+          <w:footerReference w:type="default" r:id="rId31"/>
+          <w:footerReference w:type="first" r:id="rId32"/>
           <w:type w:val="nextColumn"/>
           <w:pgSz w:w="7286" w:h="11246"/>
           <w:pgMar w:top="864" w:right="864" w:bottom="864" w:left="1094" w:header="576" w:footer="432" w:gutter="0"/>
@@ -5989,7 +6082,13 @@
         <w:t>Chun</w:t>
       </w:r>
       <w:r>
-        <w:t xml:space="preserve"> over during the winter break is entirely up to you. I have a feeling she’ll probably call to wish you a Happy New Year. Things between us aren't moving very quicky, and I haven't been trying hard enough either. I suppose the long distance makes it tough, and I honestly have no idea what the future holds. If she actually manages to get into UT Austin, it would truly be a miracle.</w:t>
+        <w:t xml:space="preserve"> over during the winter break is entirely up to you. I have a feeling she’ll probably call to wish you a Happy New Year. Things between us aren't moving very quick</w:t>
+      </w:r>
+      <w:r>
+        <w:t>l</w:t>
+      </w:r>
+      <w:r>
+        <w:t>y, and I haven't been trying hard enough either. I suppose the long distance makes it tough, and I honestly have no idea what the future holds. If she actually manages to get into UT Austin, it would truly be a miracle.</w:t>
       </w:r>
     </w:p>
     <w:p>
@@ -6068,9 +6167,9 @@
       <w:pPr>
         <w:pStyle w:val="CSP-ChapterBodyText"/>
         <w:sectPr>
-          <w:footerReference w:type="even" r:id="rId32"/>
-          <w:footerReference w:type="default" r:id="rId33"/>
-          <w:footerReference w:type="first" r:id="rId34"/>
+          <w:footerReference w:type="even" r:id="rId33"/>
+          <w:footerReference w:type="default" r:id="rId34"/>
+          <w:footerReference w:type="first" r:id="rId35"/>
           <w:type w:val="nextColumn"/>
           <w:pgSz w:w="7286" w:h="11246"/>
           <w:pgMar w:top="864" w:right="864" w:bottom="864" w:left="1094" w:header="576" w:footer="432" w:gutter="0"/>
@@ -6534,9 +6633,9 @@
           <w:iCs/>
         </w:rPr>
         <w:sectPr>
-          <w:footerReference w:type="even" r:id="rId35"/>
-          <w:footerReference w:type="default" r:id="rId36"/>
-          <w:footerReference w:type="first" r:id="rId37"/>
+          <w:footerReference w:type="even" r:id="rId36"/>
+          <w:footerReference w:type="default" r:id="rId37"/>
+          <w:footerReference w:type="first" r:id="rId38"/>
           <w:type w:val="nextColumn"/>
           <w:pgSz w:w="7286" w:h="11246"/>
           <w:pgMar w:top="864" w:right="864" w:bottom="864" w:left="1094" w:header="576" w:footer="432" w:gutter="0"/>
@@ -6692,7 +6791,7 @@
         <w:rPr>
           <w:rStyle w:val="FootnoteReference"/>
         </w:rPr>
-        <w:footnoteReference w:id="14"/>
+        <w:footnoteReference w:id="15"/>
       </w:r>
       <w:r>
         <w:t xml:space="preserve"> already. Still, I’d like to wish everyone in the family a Happy Chinese New Year! There isn’t the slightest trace of a festive atmosphere over here. On the other side of the globe, China must be incredibly alive with New Year celebrations right now.</w:t>
@@ -6721,11 +6820,17 @@
         <w:pStyle w:val="CSP-ChapterBodyText"/>
       </w:pPr>
       <w:r>
-        <w:t xml:space="preserve">I’ve been in the new apartment for a month and a half now, and everything is going great. My American roommate is very friendly and, in some ways, quite into Asian culture. He knows </w:t>
+        <w:t xml:space="preserve">I’ve been in the new apartment for a month and a half now, and everything is going great. My American roommate is very friendly and, in some ways, quite into Asian culture. </w:t>
+      </w:r>
+      <w:r>
+        <w:t xml:space="preserve">He knows </w:t>
       </w:r>
       <w:r>
         <w:lastRenderedPageBreak/>
-        <w:t>a bit of Japanese, frequently goes to the Chinese video rental store to rent Hong Kong movies, and the living room walls are covered with Hong Kong movie posters. People always assume I’m the one who put them up! When I tell them it was actually my roommate, they’re always shocked. Most of his friends are ethnically Chinese, specifically Taiwanese and Hongkongers who grew up in the States. He’s also a pretty good cook and has a Chinese-style wok, cleaver, and everything; the Chinese food he makes actually smells better than mine!</w:t>
+        <w:t>a bit of Japanese and frequently goes to the Chinese video rental store to rent Hong Kong movies. The walls of his living room are covered with Hong Kong movie posters.</w:t>
+      </w:r>
+      <w:r>
+        <w:t xml:space="preserve"> People always assume I’m the one who put them up! When I tell them it was actually my roommate, they’re always shocked. Most of his friends are ethnically Chinese, specifically Taiwanese and Hongkongers who grew up in the States. He’s also a pretty good cook and has a Chinese-style wok, cleaver, and everything; the Chinese food he makes actually smells better than mine!</w:t>
       </w:r>
     </w:p>
     <w:p>
@@ -6773,7 +6878,7 @@
         <w:rPr>
           <w:rStyle w:val="FootnoteReference"/>
         </w:rPr>
-        <w:footnoteReference w:id="15"/>
+        <w:footnoteReference w:id="16"/>
       </w:r>
       <w:r>
         <w:t xml:space="preserve"> Please don’t try to send me money!</w:t>
@@ -6789,7 +6894,6 @@
         <w:pStyle w:val="CSP-ChapterBodyText"/>
       </w:pPr>
       <w:r>
-        <w:lastRenderedPageBreak/>
         <w:t>I promise that no matter how much I spend, I will never overdraw my account, so there’s no need to worry. For me, the credit card is simply a convenient way to pay. For example, when I go to the supermarket, I don’t need to carry cash or checks; I just use the card, and the credit card company sends me a monthly statement. I can then pay the entire balance with a single check. It’s quite convenient—essentially a “buy now, pay later” system.</w:t>
       </w:r>
     </w:p>
@@ -6890,9 +6994,9 @@
         <w:widowControl/>
         <w:spacing w:after="160" w:line="259" w:lineRule="auto"/>
         <w:sectPr>
-          <w:footerReference w:type="even" r:id="rId38"/>
-          <w:footerReference w:type="default" r:id="rId39"/>
-          <w:footerReference w:type="first" r:id="rId40"/>
+          <w:footerReference w:type="even" r:id="rId39"/>
+          <w:footerReference w:type="default" r:id="rId40"/>
+          <w:footerReference w:type="first" r:id="rId41"/>
           <w:type w:val="nextColumn"/>
           <w:pgSz w:w="7286" w:h="11246"/>
           <w:pgMar w:top="864" w:right="864" w:bottom="864" w:left="1094" w:header="576" w:footer="432" w:gutter="0"/>
@@ -7041,7 +7145,7 @@
         <w:rPr>
           <w:rStyle w:val="FootnoteReference"/>
         </w:rPr>
-        <w:footnoteReference w:id="16"/>
+        <w:footnoteReference w:id="17"/>
       </w:r>
       <w:r>
         <w:t xml:space="preserve"> all the way through? With Mom's injury, who ended up preparing the New Year's Eve dinner</w:t>
@@ -7050,7 +7154,7 @@
         <w:rPr>
           <w:rStyle w:val="FootnoteReference"/>
         </w:rPr>
-        <w:footnoteReference w:id="17"/>
+        <w:footnoteReference w:id="18"/>
       </w:r>
       <w:r>
         <w:t xml:space="preserve">? Did Wang Wei and Xiao Fan join you for the dinner? If so, that must have made things a little better. Otherwise, it must have felt awfully quiet with just the two of you. Above all, please be more careful from now on. </w:t>
@@ -7676,7 +7780,7 @@
         <w:rPr>
           <w:rStyle w:val="FootnoteReference"/>
         </w:rPr>
-        <w:footnoteReference w:id="18"/>
+        <w:footnoteReference w:id="19"/>
       </w:r>
     </w:p>
     <w:p>
@@ -7811,7 +7915,7 @@
         <w:rPr>
           <w:rStyle w:val="FootnoteReference"/>
         </w:rPr>
-        <w:footnoteReference w:id="19"/>
+        <w:footnoteReference w:id="20"/>
       </w:r>
     </w:p>
     <w:p>
@@ -8329,7 +8433,7 @@
         <w:rPr>
           <w:rStyle w:val="FootnoteReference"/>
         </w:rPr>
-        <w:footnoteReference w:id="20"/>
+        <w:footnoteReference w:id="21"/>
       </w:r>
       <w:r>
         <w:t xml:space="preserve"> </w:t>
@@ -8365,7 +8469,13 @@
         <w:pStyle w:val="CSP-ChapterBodyText"/>
       </w:pPr>
       <w:r>
-        <w:t xml:space="preserve">While I’m in New Jersey, I’m staying in Jim’s living room. It’s large but almost empty. We take turn making dinner at home almost every night. On weekends, </w:t>
+        <w:t>While I’m in New Jersey, I’m staying in Jim’s living room. It’s large but almost empty. We take turn</w:t>
+      </w:r>
+      <w:r>
+        <w:t>s</w:t>
+      </w:r>
+      <w:r>
+        <w:t xml:space="preserve"> making dinner at home almost every night. On weekends, </w:t>
       </w:r>
       <w:r>
         <w:t>w</w:t>
@@ -8804,7 +8914,7 @@
       </w:r>
       <w:proofErr w:type="spellEnd"/>
       <w:r>
-        <w:t>. Wishing you both good health,</w:t>
+        <w:t>.</w:t>
       </w:r>
     </w:p>
     <w:p>
@@ -9039,11 +9149,25 @@
         <w:pStyle w:val="CSP-ChapterBodyText"/>
       </w:pPr>
       <w:r>
-        <w:t xml:space="preserve">As for whether I'll pursue a Ph.D., I’m still on the fence. My last letter might have caused a bit of a misunderstanding. Generally speaking, a Ph.D. degree actually narrows your job options. Bell Labs is primarily a research institution, so naturally they value advanced degrees and only hire international students with doctorates. However, most small and medium-sized companies prefer not to hire Ph.Ds. In other words, getting a Ph.D. often means limiting yourself to major </w:t>
+        <w:t xml:space="preserve">As for whether I'll pursue a Ph.D., I’m still on the fence. My last letter might have caused a bit of a misunderstanding. Generally speaking, a Ph.D. actually narrows your job options. Bell Labs is primarily a research institution, so naturally they value advanced degrees and only hire international students with doctorates. </w:t>
+      </w:r>
+      <w:r>
+        <w:t xml:space="preserve">However, most small and medium-sized companies prefer hiring people with bachelor's or master's degrees over </w:t>
+      </w:r>
+      <w:proofErr w:type="spellStart"/>
+      <w:r>
+        <w:t>Ph.D.s</w:t>
+      </w:r>
+      <w:proofErr w:type="spellEnd"/>
+      <w:r>
+        <w:t>.</w:t>
+      </w:r>
+      <w:r>
+        <w:t xml:space="preserve"> In other words, getting a Ph.D. often </w:t>
       </w:r>
       <w:r>
         <w:lastRenderedPageBreak/>
-        <w:t>corporations or research labs. Next semester, I plan to take three more classes to see whether any specific field catches my interest or whether I can find a suitable advisor. I'll think this through very carefully because it's an important decision.</w:t>
+        <w:t>means limiting yourself to major corporations or research labs. Next semester, I plan to take three more classes to see whether any specific field catches my interest or whether I can find a suitable advisor. I'll think this through very carefully because it's an important decision.</w:t>
       </w:r>
     </w:p>
     <w:p>
@@ -9070,27 +9194,6 @@
       </w:pPr>
       <w:r>
         <w:t>Are you watching the Olympics? They rarely broadcast events featuring the Chinese team here. Tonight is the closing ceremony.</w:t>
-      </w:r>
-    </w:p>
-    <w:p>
-      <w:pPr>
-        <w:pStyle w:val="CSP-ChapterBodyText"/>
-      </w:pPr>
-    </w:p>
-    <w:p>
-      <w:pPr>
-        <w:pStyle w:val="CSP-ChapterBodyText"/>
-      </w:pPr>
-      <w:r>
-        <w:t xml:space="preserve">I’ll stop here for now. Give my best to Wang Wei, Xiao Fan, and little </w:t>
-      </w:r>
-      <w:proofErr w:type="spellStart"/>
-      <w:r>
-        <w:t>Yueyue</w:t>
-      </w:r>
-      <w:proofErr w:type="spellEnd"/>
-      <w:r>
-        <w:t>.</w:t>
       </w:r>
     </w:p>
     <w:p>
@@ -9319,7 +9422,7 @@
         <w:rPr>
           <w:rStyle w:val="FootnoteReference"/>
         </w:rPr>
-        <w:footnoteReference w:id="21"/>
+        <w:footnoteReference w:id="22"/>
       </w:r>
       <w:r>
         <w:t xml:space="preserve"> Email is amazingly fast—it only takes a few minutes for a message to get through—so we can use it for anything urgent, or you can simply write to me whenever it's convenient. I get a ton of email these days. Chun actually emailed me a few days ago to let me know that she had arrived in the U.S.</w:t>
@@ -9348,7 +9451,7 @@
         <w:rPr>
           <w:rStyle w:val="FootnoteReference"/>
         </w:rPr>
-        <w:footnoteReference w:id="22"/>
+        <w:footnoteReference w:id="23"/>
       </w:r>
     </w:p>
     <w:p>
@@ -10201,28 +10304,26 @@
         <w:pStyle w:val="CSP-ChapterBodyText"/>
       </w:pPr>
       <w:r>
-        <w:t xml:space="preserve">One is from National Instruments here in Austin, a smaller company with about a thousand employees that mostly makes PC hardware and software. They offered a base salary of $42,000 plus an annual bonus of eight to nine percent, bringing the </w:t>
-      </w:r>
-      <w:proofErr w:type="spellStart"/>
-      <w:r>
-        <w:t>toal</w:t>
-      </w:r>
-      <w:proofErr w:type="spellEnd"/>
-      <w:r>
-        <w:t xml:space="preserve"> compensation to roughly $46,000 a year.</w:t>
-      </w:r>
-    </w:p>
-    <w:p>
-      <w:pPr>
-        <w:pStyle w:val="CSP-ChapterBodyText"/>
-      </w:pPr>
-    </w:p>
-    <w:p>
-      <w:pPr>
-        <w:pStyle w:val="CSP-ChapterBodyText"/>
-      </w:pPr>
-      <w:r>
-        <w:t>The other offer is from Morgan Stanley, a large and prestigious financial firm specializing in investment banking. My trip to New York was for their on-site interview. They offered a total compensation package of $62,500, consisting of a $50,000 base salary and a guaranteed minimum bonus of $12,500. It also comes with four weeks of paid vacation each year. While that number looks impressive on paper, the job is located on Broadway in Manhattan, where the cost of living there is much higher, so the salary isn't quite as high as it seems.</w:t>
+        <w:t>One is from National Instruments here in Austin, a smaller company with about a thousand employees that mostly makes PC hardware and software. They offered a base salary of $42,000 plus an annual bonus of eight to nine percent, bringing the to</w:t>
+      </w:r>
+      <w:r>
+        <w:t>t</w:t>
+      </w:r>
+      <w:r>
+        <w:t>al compensation to roughly $46,000 a year.</w:t>
+      </w:r>
+    </w:p>
+    <w:p>
+      <w:pPr>
+        <w:pStyle w:val="CSP-ChapterBodyText"/>
+      </w:pPr>
+    </w:p>
+    <w:p>
+      <w:pPr>
+        <w:pStyle w:val="CSP-ChapterBodyText"/>
+      </w:pPr>
+      <w:r>
+        <w:t>The other offer is from Morgan Stanley, a large and prestigious financial firm specializing in investment banking. My trip to New York was for their on-site interview. They offered a total compensation package of $62,500, consisting of a $50,000 base salary and a guaranteed minimum bonus of $12,500. It also comes with four weeks of paid vacation each year. While that number looks impressive on paper, the job is located on Broadway in Manhattan, where the cost of living is much higher, so the salary isn't quite as high as it seems.</w:t>
       </w:r>
     </w:p>
     <w:p>
@@ -10657,7 +10758,7 @@
         <w:rPr>
           <w:rStyle w:val="FootnoteReference"/>
         </w:rPr>
-        <w:footnoteReference w:id="23"/>
+        <w:footnoteReference w:id="24"/>
       </w:r>
       <w:r>
         <w:t xml:space="preserve">. We flew back to Austin that same night. </w:t>
@@ -10874,7 +10975,7 @@
         <w:rPr>
           <w:rStyle w:val="FootnoteReference"/>
         </w:rPr>
-        <w:footnoteReference w:id="24"/>
+        <w:footnoteReference w:id="25"/>
       </w:r>
       <w:r>
         <w:t>. I assume Mom is out in Chongming</w:t>
@@ -10883,7 +10984,7 @@
         <w:rPr>
           <w:rStyle w:val="FootnoteReference"/>
         </w:rPr>
-        <w:footnoteReference w:id="25"/>
+        <w:footnoteReference w:id="26"/>
       </w:r>
       <w:r>
         <w:t xml:space="preserve"> </w:t>
@@ -10951,7 +11052,7 @@
         <w:rPr>
           <w:rStyle w:val="FootnoteReference"/>
         </w:rPr>
-        <w:footnoteReference w:id="26"/>
+        <w:footnoteReference w:id="27"/>
       </w:r>
       <w:r>
         <w:t xml:space="preserve"> I think next year would be the perfect time. By then, I’ll be completely settled into my new environment, finances won't be a problem, and I’ll be able to take some time off to show you around. Please plan to dip into your savings for this trip. It simply wouldn't make much sense for you to spend your hard-earned money coming all this way. I'll take care of all the expenses related to your visit, so you won't need to worry about a thing.</w:t>
@@ -11214,7 +11315,13 @@
         <w:pStyle w:val="CSP-ChapterBodyText"/>
       </w:pPr>
       <w:r>
-        <w:t>The Grand Canyon was breathtaking; we camped out there and spent an entire day exploring. The Great Salt Lake is a massive saltwater lake with beaches and seagulls. If you weren't paying attention, you'd swear you were looking at the ocean, except there are no waves and the air carries a bit of a strange odor. Yellowstone was our main destination. The park is so vast that at one point our car was almost running out of gas and it freaked us out a bit. We camped there as well and spent a day checking out the sights, mostly geysers and waterfalls. Honestly, it wasn't quite as amazing as I had imagined, but all in all, it was a fantastic trip and gave us a great introduction to the American West.</w:t>
+        <w:t xml:space="preserve">The Grand Canyon was breathtaking; we camped out there and spent an entire day exploring. The Great Salt Lake is a massive saltwater lake with beaches and seagulls. If you weren't paying attention, you'd swear you were looking at the ocean, except there are no waves and the air carries a bit of a strange odor. Yellowstone was our main destination. </w:t>
+      </w:r>
+      <w:r>
+        <w:t>The park is so vast that at one point we nearly ran out of gas, which freaked us out a bit.</w:t>
+      </w:r>
+      <w:r>
+        <w:t xml:space="preserve"> We camped there as well and spent a day checking out the sights, mostly geysers and waterfalls. Honestly, it wasn't quite as amazing as I had imagined, but all in all, it was a fantastic trip and gave us a great introduction to the American West.</w:t>
       </w:r>
     </w:p>
     <w:p>
@@ -11236,7 +11343,7 @@
         <w:rPr>
           <w:rStyle w:val="FootnoteReference"/>
         </w:rPr>
-        <w:footnoteReference w:id="27"/>
+        <w:footnoteReference w:id="28"/>
       </w:r>
       <w:r>
         <w:t xml:space="preserve"> </w:t>
@@ -11273,11 +11380,11 @@
       </w:r>
       <w:proofErr w:type="spellEnd"/>
       <w:r>
-        <w:t xml:space="preserve"> among nine different divisions. I’ve been assigned to Information Technology, while most of the other divisions are finance-related and recruit primarily from </w:t>
+        <w:t xml:space="preserve"> among nine different divisions. I’ve been assigned to Information Technology, while most of the other divisions are finance-related and recruit primarily from business schools. We have an orientation scheduled from </w:t>
       </w:r>
       <w:r>
         <w:lastRenderedPageBreak/>
-        <w:t>business schools. We have an orientation scheduled from August 11th to the 15th at a hotel right on Broadway—coincidentally, the very same hotel I stayed during my interview. The orientation is mainly intended to give us an overview of the firm's operations and allow us to get to know one another.</w:t>
+        <w:t>August 11th to the 15th at a hotel right on Broadway—coincidentally, the very same hotel I stayed during my interview. The orientation is mainly intended to give us an overview of the firm's operations and allow us to get to know one another.</w:t>
       </w:r>
     </w:p>
     <w:p>
@@ -12248,7 +12355,13 @@
       </w:r>
       <w:r>
         <w:lastRenderedPageBreak/>
-        <w:t>than I had and was stayed at her sister’s place.</w:t>
+        <w:t xml:space="preserve">than I had and </w:t>
+      </w:r>
+      <w:r>
+        <w:t>was staying</w:t>
+      </w:r>
+      <w:r>
+        <w:t xml:space="preserve"> at her sister’s place.</w:t>
       </w:r>
     </w:p>
     <w:p>
@@ -12401,7 +12514,7 @@
         <w:t xml:space="preserve"> Ph.D. </w:t>
       </w:r>
       <w:r>
-        <w:t>in Computer Sciences</w:t>
+        <w:t>in Computer Science</w:t>
       </w:r>
       <w:r>
         <w:t xml:space="preserve"> at the University of Texas at Austin, </w:t>
@@ -12433,7 +12546,7 @@
     </w:p>
     <w:p/>
     <w:sectPr>
-      <w:footerReference w:type="first" r:id="rId41"/>
+      <w:footerReference w:type="first" r:id="rId42"/>
       <w:type w:val="nextColumn"/>
       <w:pgSz w:w="7286" w:h="11246"/>
       <w:pgMar w:top="864" w:right="864" w:bottom="864" w:left="1094" w:header="576" w:footer="432" w:gutter="0"/>
@@ -14325,7 +14438,13 @@
         <w:t xml:space="preserve"> </w:t>
       </w:r>
       <w:r>
-        <w:t>In 1995, cross-strait relations between mainland China and Taiwan were at a low point, triggered by Taiwan leader’s U.S. visit, leading into the 1995–1996 missile crisis and serious fears of military escalation.</w:t>
+        <w:t xml:space="preserve">In 1995, cross-strait relations between mainland China and Taiwan were at a low point, triggered by </w:t>
+      </w:r>
+      <w:r>
+        <w:t xml:space="preserve">the </w:t>
+      </w:r>
+      <w:r>
+        <w:t>Taiwan leader’s U.S. visit, leading into the 1995–1996 missile crisis and serious fears of military escalation.</w:t>
       </w:r>
     </w:p>
   </w:footnote>
@@ -14363,7 +14482,29 @@
         <w:t xml:space="preserve"> </w:t>
       </w:r>
       <w:r>
-        <w:t>Father was a visiting scholar at Cranfield University in England from 1979 to 1981. The observance of Halloween in England during this period was notably different from that in the United States in the 1990s.</w:t>
+        <w:t xml:space="preserve">My favorite sitcoms, including </w:t>
+      </w:r>
+      <w:r>
+        <w:rPr>
+          <w:i/>
+          <w:iCs/>
+        </w:rPr>
+        <w:t>Seinfeld</w:t>
+      </w:r>
+      <w:r>
+        <w:t xml:space="preserve">, were all part of NBC's legendary </w:t>
+      </w:r>
+      <w:r>
+        <w:t>“</w:t>
+      </w:r>
+      <w:r>
+        <w:t>Must See TV</w:t>
+      </w:r>
+      <w:r>
+        <w:t>”</w:t>
+      </w:r>
+      <w:r>
+        <w:t xml:space="preserve"> Thursday night lineup.</w:t>
       </w:r>
     </w:p>
   </w:footnote>
@@ -14382,7 +14523,7 @@
         <w:t xml:space="preserve"> </w:t>
       </w:r>
       <w:r>
-        <w:t>Here, "bitter" alludes to the Chinese expression "eating bitterness", meaning to endure hardship with perseverance and without complaint.</w:t>
+        <w:t>Father was a visiting scholar at Cranfield University in England from 1979 to 1981. The observance of Halloween in England during this period was notably different from that in the United States in the 1990s.</w:t>
       </w:r>
     </w:p>
   </w:footnote>
@@ -14401,29 +14542,7 @@
         <w:t xml:space="preserve"> </w:t>
       </w:r>
       <w:r>
-        <w:t xml:space="preserve">Lantern Festival is the traditional holiday that marks the final day of the Lunar New Year celebrations. People celebrate by eating round rice dumplings called </w:t>
-      </w:r>
-      <w:r>
-        <w:rPr>
-          <w:i/>
-          <w:iCs/>
-        </w:rPr>
-        <w:t>tangyuan</w:t>
-      </w:r>
-      <w:r>
-        <w:t xml:space="preserve"> or </w:t>
-      </w:r>
-      <w:proofErr w:type="spellStart"/>
-      <w:r>
-        <w:rPr>
-          <w:i/>
-          <w:iCs/>
-        </w:rPr>
-        <w:t>yuanxiao</w:t>
-      </w:r>
-      <w:proofErr w:type="spellEnd"/>
-      <w:r>
-        <w:t>, whose round shape represents family togetherness and completeness.</w:t>
+        <w:t>Here, "bitter" alludes to the Chinese expression "eating bitterness", meaning to endure hardship with perseverance and without complaint.</w:t>
       </w:r>
     </w:p>
   </w:footnote>
@@ -14442,7 +14561,29 @@
         <w:t xml:space="preserve"> </w:t>
       </w:r>
       <w:r>
-        <w:t>When parents visited the United States, children who agreed to sponsor the trip were advised to provide evidence of financial resources in case consular officers requested proof that the visit could be supported financially.</w:t>
+        <w:t xml:space="preserve">Lantern Festival is the traditional holiday that marks the final day of the Lunar New Year celebrations. People celebrate by eating round rice dumplings called </w:t>
+      </w:r>
+      <w:r>
+        <w:rPr>
+          <w:i/>
+          <w:iCs/>
+        </w:rPr>
+        <w:t>tangyuan</w:t>
+      </w:r>
+      <w:r>
+        <w:t xml:space="preserve"> or </w:t>
+      </w:r>
+      <w:proofErr w:type="spellStart"/>
+      <w:r>
+        <w:rPr>
+          <w:i/>
+          <w:iCs/>
+        </w:rPr>
+        <w:t>yuanxiao</w:t>
+      </w:r>
+      <w:proofErr w:type="spellEnd"/>
+      <w:r>
+        <w:t>, whose round shape represents family togetherness and completeness.</w:t>
       </w:r>
     </w:p>
   </w:footnote>
@@ -14461,7 +14602,7 @@
         <w:t xml:space="preserve"> </w:t>
       </w:r>
       <w:r>
-        <w:t>The Gala is a live TV show featuring music, dance, and comedy performances, held annually on Chinese New Year's Eve since 1983. It is considered as the most-watched TV broadcast on the planet. The broadcast typically spans several hours and leads up to the midnight countdown.</w:t>
+        <w:t>When parents visited the United States, children who agreed to sponsor the trip were advised to provide evidence of financial resources in case consular officers requested proof that the visit could be supported financially.</w:t>
       </w:r>
     </w:p>
   </w:footnote>
@@ -14480,7 +14621,7 @@
         <w:t xml:space="preserve"> </w:t>
       </w:r>
       <w:r>
-        <w:t>The Chinese New Year's Eve dinner, widely known as the Reunion Dinner, is the most important family meal of the year.</w:t>
+        <w:t>The Gala is a live TV show featuring music, dance, and comedy performances, held annually on Chinese New Year's Eve since 1983. It is considered as the most-watched TV broadcast on the planet. The broadcast typically spans several hours and leads up to the midnight countdown.</w:t>
       </w:r>
     </w:p>
   </w:footnote>
@@ -14499,7 +14640,7 @@
         <w:t xml:space="preserve"> </w:t>
       </w:r>
       <w:r>
-        <w:t>Bell Labs was one of the world’s premier industrial research laboratories, renowned for innovations like the transistor, the laser, and the Unix operating system that helped shape modern computing and telecommunications.</w:t>
+        <w:t>The Chinese New Year's Eve dinner, widely known as the Reunion Dinner, is the most important family meal of the year.</w:t>
       </w:r>
     </w:p>
   </w:footnote>
@@ -14518,19 +14659,7 @@
         <w:t xml:space="preserve"> </w:t>
       </w:r>
       <w:r>
-        <w:t>Father was a college professor in aerodynamics. He used computers and numerical algorithms to simulate</w:t>
-      </w:r>
-      <w:r>
-        <w:t xml:space="preserve"> and </w:t>
-      </w:r>
-      <w:r>
-        <w:t>analyze</w:t>
-      </w:r>
-      <w:r>
-        <w:t xml:space="preserve"> </w:t>
-      </w:r>
-      <w:r>
-        <w:t>how fluid flow in and around objects.</w:t>
+        <w:t>Bell Labs was one of the world’s premier industrial research laboratories, renowned for innovations like the transistor, the laser, and the Unix operating system that helped shape modern computing and telecommunications.</w:t>
       </w:r>
     </w:p>
   </w:footnote>
@@ -14549,13 +14678,19 @@
         <w:t xml:space="preserve"> </w:t>
       </w:r>
       <w:r>
-        <w:t xml:space="preserve">Mother enjoyed collecting coins. She began a modest coin collection after </w:t>
-      </w:r>
-      <w:r>
-        <w:t>f</w:t>
-      </w:r>
-      <w:r>
-        <w:t>ather returned from England in 1981 with several foreign coins.</w:t>
+        <w:t>Father was a college professor in aerodynamics. He used computers and numerical algorithms to simulate</w:t>
+      </w:r>
+      <w:r>
+        <w:t xml:space="preserve"> and </w:t>
+      </w:r>
+      <w:r>
+        <w:t>analyze</w:t>
+      </w:r>
+      <w:r>
+        <w:t xml:space="preserve"> </w:t>
+      </w:r>
+      <w:r>
+        <w:t>how fluid flow in and around objects.</w:t>
       </w:r>
     </w:p>
   </w:footnote>
@@ -14574,7 +14709,13 @@
         <w:t xml:space="preserve"> </w:t>
       </w:r>
       <w:r>
-        <w:t>Around 1996, the internet and email were not yet widely used in China. With a few exceptions in academic settings, most computers at home or in the workplace were not connected to the internet.</w:t>
+        <w:t xml:space="preserve">Mother enjoyed collecting coins. She began a modest coin collection after </w:t>
+      </w:r>
+      <w:r>
+        <w:t>f</w:t>
+      </w:r>
+      <w:r>
+        <w:t>ather returned from England in 1981 with several foreign coins.</w:t>
       </w:r>
     </w:p>
   </w:footnote>
@@ -14593,7 +14734,7 @@
         <w:t xml:space="preserve"> </w:t>
       </w:r>
       <w:r>
-        <w:t>Arranged matchmaking was relatively common in China at the time. I, too, met Chun through this kind of introduction.</w:t>
+        <w:t>Around 1996, the internet and email were not yet widely used in China. With a few exceptions in academic settings, most computers at home or in the workplace were not connected to the internet.</w:t>
       </w:r>
     </w:p>
   </w:footnote>
@@ -14612,7 +14753,7 @@
         <w:t xml:space="preserve"> </w:t>
       </w:r>
       <w:r>
-        <w:t>1. Cantonese is a Chinese language traditionally spoken in Guangdong Province, Hong Kong, and many overseas Chinese communities. Unlike the Mandarin spoken in Beijing, Cantonese differs significantly in pronunciation, vocabulary, and tone.</w:t>
+        <w:t>Arranged matchmaking was relatively common in China at the time. I, too, met Chun through this kind of introduction.</w:t>
       </w:r>
     </w:p>
   </w:footnote>
@@ -14631,7 +14772,7 @@
         <w:t xml:space="preserve"> </w:t>
       </w:r>
       <w:r>
-        <w:t>The Qingming Festival is a traditional Chinese holiday observed in early April to honor deceased ancestors and welcome the arrival of spring.</w:t>
+        <w:t>Cantonese is a Chinese language traditionally spoken in Guangdong Province, Hong Kong, and many overseas Chinese communities. Unlike the Mandarin spoken in Beijing, Cantonese differs significantly in pronunciation, vocabulary, and tone.</w:t>
       </w:r>
     </w:p>
   </w:footnote>
@@ -14650,7 +14791,7 @@
         <w:t xml:space="preserve"> </w:t>
       </w:r>
       <w:r>
-        <w:t>Chongming, once a largely rural part of Shanghai, is Mom's hometown.</w:t>
+        <w:t>The Qingming Festival is a traditional Chinese holiday observed in early April to honor deceased ancestors and welcome the arrival of spring.</w:t>
       </w:r>
     </w:p>
   </w:footnote>
@@ -14669,11 +14810,30 @@
         <w:t xml:space="preserve"> </w:t>
       </w:r>
       <w:r>
-        <w:t>Due to the complexities and uncertainties of U.S. immigration law, traveling back to one's home country carried certain risk and was generally discouraged while on work visa.</w:t>
+        <w:t>Chongming, once a largely rural part of Shanghai, is Mom's hometown.</w:t>
       </w:r>
     </w:p>
   </w:footnote>
   <w:footnote w:id="27">
+    <w:p>
+      <w:pPr>
+        <w:pStyle w:val="FootnoteText"/>
+      </w:pPr>
+      <w:r>
+        <w:rPr>
+          <w:rStyle w:val="FootnoteReference"/>
+        </w:rPr>
+        <w:footnoteRef/>
+      </w:r>
+      <w:r>
+        <w:t xml:space="preserve"> </w:t>
+      </w:r>
+      <w:r>
+        <w:t>Due to the complexities and uncertainties of U.S. immigration law, traveling back to one's home country carried certain risk and was generally discouraged while on work visa.</w:t>
+      </w:r>
+    </w:p>
+  </w:footnote>
+  <w:footnote w:id="28">
     <w:p>
       <w:pPr>
         <w:pStyle w:val="FootnoteText"/>
@@ -14741,6 +14901,68 @@
     </w:r>
   </w:p>
 </w:hdr>
+</file>
+
+<file path=word/numbering.xml><?xml version="1.0" encoding="utf-8"?>
+<w:numbering xmlns:wpc="http://schemas.microsoft.com/office/word/2010/wordprocessingCanvas" xmlns:cx="http://schemas.microsoft.com/office/drawing/2014/chartex" xmlns:cx1="http://schemas.microsoft.com/office/drawing/2015/9/8/chartex" xmlns:cx2="http://schemas.microsoft.com/office/drawing/2015/10/21/chartex" xmlns:cx3="http://schemas.microsoft.com/office/drawing/2016/5/9/chartex" xmlns:cx4="http://schemas.microsoft.com/office/drawing/2016/5/10/chartex" xmlns:cx5="http://schemas.microsoft.com/office/drawing/2016/5/11/chartex" xmlns:cx6="http://schemas.microsoft.com/office/drawing/2016/5/12/chartex" xmlns:cx7="http://schemas.microsoft.com/office/drawing/2016/5/13/chartex" xmlns:cx8="http://schemas.microsoft.com/office/drawing/2016/5/14/chartex" xmlns:mc="http://schemas.openxmlformats.org/markup-compatibility/2006" xmlns:aink="http://schemas.microsoft.com/office/drawing/2016/ink" xmlns:am3d="http://schemas.microsoft.com/office/drawing/2017/model3d" xmlns:o="urn:schemas-microsoft-com:office:office" xmlns:oel="http://schemas.microsoft.com/office/2019/extlst" xmlns:r="http://schemas.openxmlformats.org/officeDocument/2006/relationships" xmlns:m="http://schemas.openxmlformats.org/officeDocument/2006/math" xmlns:v="urn:schemas-microsoft-com:vml" xmlns:wp14="http://schemas.microsoft.com/office/word/2010/wordprocessingDrawing" xmlns:wp="http://schemas.openxmlformats.org/drawingml/2006/wordprocessingDrawing" xmlns:w10="urn:schemas-microsoft-com:office:word" xmlns:w="http://schemas.openxmlformats.org/wordprocessingml/2006/main" xmlns:w14="http://schemas.microsoft.com/office/word/2010/wordml" xmlns:w15="http://schemas.microsoft.com/office/word/2012/wordml" xmlns:w16cex="http://schemas.microsoft.com/office/word/2018/wordml/cex" xmlns:w16cid="http://schemas.microsoft.com/office/word/2016/wordml/cid" xmlns:w16="http://schemas.microsoft.com/office/word/2018/wordml" xmlns:w16sdtdh="http://schemas.microsoft.com/office/word/2020/wordml/sdtdatahash" xmlns:w16se="http://schemas.microsoft.com/office/word/2015/wordml/symex" xmlns:wpg="http://schemas.microsoft.com/office/word/2010/wordprocessingGroup" xmlns:wpi="http://schemas.microsoft.com/office/word/2010/wordprocessingInk" xmlns:wne="http://schemas.microsoft.com/office/word/2006/wordml" xmlns:wps="http://schemas.microsoft.com/office/word/2010/wordprocessingShape" mc:Ignorable="w14 w15 w16se w16cid w16 w16cex w16sdtdh wp14">
+  <w:abstractNum w:abstractNumId="0" w15:restartNumberingAfterBreak="0">
+    <w:nsid w:val="00000001"/>
+    <w:multiLevelType w:val="hybridMultilevel"/>
+    <w:tmpl w:val="FFFFFFFF"/>
+    <w:lvl w:ilvl="0" w:tplc="00000001">
+      <w:start w:val="1"/>
+      <w:numFmt w:val="bullet"/>
+      <w:lvlText w:val="•"/>
+      <w:lvlJc w:val="left"/>
+      <w:pPr>
+        <w:ind w:left="720" w:hanging="360"/>
+      </w:pPr>
+    </w:lvl>
+    <w:lvl w:ilvl="1" w:tplc="FFFFFFFF">
+      <w:numFmt w:val="decimal"/>
+      <w:lvlText w:val=""/>
+      <w:lvlJc w:val="left"/>
+    </w:lvl>
+    <w:lvl w:ilvl="2" w:tplc="FFFFFFFF">
+      <w:numFmt w:val="decimal"/>
+      <w:lvlText w:val=""/>
+      <w:lvlJc w:val="left"/>
+    </w:lvl>
+    <w:lvl w:ilvl="3" w:tplc="FFFFFFFF">
+      <w:numFmt w:val="decimal"/>
+      <w:lvlText w:val=""/>
+      <w:lvlJc w:val="left"/>
+    </w:lvl>
+    <w:lvl w:ilvl="4" w:tplc="FFFFFFFF">
+      <w:numFmt w:val="decimal"/>
+      <w:lvlText w:val=""/>
+      <w:lvlJc w:val="left"/>
+    </w:lvl>
+    <w:lvl w:ilvl="5" w:tplc="FFFFFFFF">
+      <w:numFmt w:val="decimal"/>
+      <w:lvlText w:val=""/>
+      <w:lvlJc w:val="left"/>
+    </w:lvl>
+    <w:lvl w:ilvl="6" w:tplc="FFFFFFFF">
+      <w:numFmt w:val="decimal"/>
+      <w:lvlText w:val=""/>
+      <w:lvlJc w:val="left"/>
+    </w:lvl>
+    <w:lvl w:ilvl="7" w:tplc="FFFFFFFF">
+      <w:numFmt w:val="decimal"/>
+      <w:lvlText w:val=""/>
+      <w:lvlJc w:val="left"/>
+    </w:lvl>
+    <w:lvl w:ilvl="8" w:tplc="FFFFFFFF">
+      <w:numFmt w:val="decimal"/>
+      <w:lvlText w:val=""/>
+      <w:lvlJc w:val="left"/>
+    </w:lvl>
+  </w:abstractNum>
+  <w:num w:numId="1" w16cid:durableId="1264919723">
+    <w:abstractNumId w:val="0"/>
+  </w:num>
+</w:numbering>
 </file>
 
 <file path=word/styles.xml><?xml version="1.0" encoding="utf-8"?>
@@ -15153,6 +15375,7 @@
   <w:style w:type="character" w:default="1" w:styleId="DefaultParagraphFont">
     <w:name w:val="Default Paragraph Font"/>
     <w:uiPriority w:val="1"/>
+    <w:semiHidden/>
     <w:unhideWhenUsed/>
   </w:style>
   <w:style w:type="table" w:default="1" w:styleId="TableNormal">

</xml_diff>

<commit_message>
more fixes after copyedit
</commit_message>
<xml_diff>
--- a/letters_from_usa/book.docx
+++ b/letters_from_usa/book.docx
@@ -407,7 +407,16 @@
         <w:t xml:space="preserve">cut </w:t>
       </w:r>
       <w:r>
-        <w:t>open and numbered. They were 56 letters I had written home between 1995 and 2001.</w:t>
+        <w:t xml:space="preserve">open and numbered. They were </w:t>
+      </w:r>
+      <w:r>
+        <w:t>fifty-six</w:t>
+      </w:r>
+      <w:r>
+        <w:t xml:space="preserve"> </w:t>
+      </w:r>
+      <w:r>
+        <w:t>letters I had written home between 1995 and 2001.</w:t>
       </w:r>
     </w:p>
     <w:p>
@@ -3368,7 +3377,13 @@
         <w:pStyle w:val="CSP-ChapterBodyText"/>
       </w:pPr>
       <w:r>
-        <w:t xml:space="preserve">I woke up around 10:00 this morning and had some milk, bagels, and a banana for breakfast. After noon, jet lag hit me and I felt so sleepy that I went right back to bed, so I didn't get much done today. Tomorrow morning, I plan to go to the department and see the secretary. </w:t>
+        <w:t xml:space="preserve">I woke up around 10:00 this morning and had some milk, bagels, and a banana for breakfast. After noon, jet lag hit me and I felt so sleepy </w:t>
+      </w:r>
+      <w:r>
+        <w:t>I went right back to bed and didn't get much done today.</w:t>
+      </w:r>
+      <w:r>
+        <w:t xml:space="preserve"> Tomorrow morning, I plan to go to the department and see the secretary. </w:t>
       </w:r>
     </w:p>
     <w:p>
@@ -3415,7 +3430,7 @@
         <w:pStyle w:val="CSP-ChapterBodyText"/>
       </w:pPr>
       <w:r>
-        <w:t>Evening of 08/17/95</w:t>
+        <w:t>08/17/95</w:t>
       </w:r>
     </w:p>
     <w:p>
@@ -3532,7 +3547,13 @@
         <w:pStyle w:val="CSP-ChapterBodyText"/>
       </w:pPr>
       <w:r>
-        <w:t>Last night, a classmate drove me to the supermarket to get some groceries. Usually, people here buy a whole week's worth of food at once. The supermarket is massive; it feels like they have absolutely everything. I bought 13 items for $12, which still feels very cheap.</w:t>
+        <w:t xml:space="preserve">Last night, a classmate drove me to the supermarket to get some groceries. Usually, people here buy a whole week's worth of food at once. The supermarket is massive; it feels like they have absolutely everything. I bought </w:t>
+      </w:r>
+      <w:r>
+        <w:t>thirteen</w:t>
+      </w:r>
+      <w:r>
+        <w:t xml:space="preserve"> items for $12, which still feels very cheap.</w:t>
       </w:r>
     </w:p>
     <w:p>
@@ -3738,7 +3759,13 @@
         <w:t xml:space="preserve"> </w:t>
       </w:r>
       <w:r>
-        <w:t>temporarily at someone’s apartment. I’ll be moving into my own place in a day or two, and then you’ll finally be able to write to me there. The new apartment is completely unfurnished; I will have to buy everything myself, including essentials like a bed, a table and a chair. I may also need to get a phone</w:t>
+        <w:t>temporarily at someone’s apartment. I’ll be moving into my own place in a day or two, and then you’ll finally be able to write to me there. The new apartment is completely unfurnished; I will have to buy everything myself, including essentials like a bed, a table</w:t>
+      </w:r>
+      <w:r>
+        <w:t>,</w:t>
+      </w:r>
+      <w:r>
+        <w:t xml:space="preserve"> and a chair. I may also need to get a phone</w:t>
       </w:r>
       <w:r>
         <w:rPr>
@@ -3779,11 +3806,11 @@
         <w:pStyle w:val="CSP-ChapterBodyText"/>
       </w:pPr>
       <w:r>
-        <w:t xml:space="preserve">I’m taking three classes this semester, and they are all in the afternoon. On top of that, I’ll be working as a TA (Teaching Assistant), so I expect this semester will be quite busy. To meet the requirements for interacting with students as a TA, I had to take an oral English exam, and I just barely passed. Hai took the same exam last year and failed. He retook it this year and </w:t>
+        <w:t xml:space="preserve">I’m taking three classes this semester, and they are all in the afternoon. On top of that, I’ll be working as a TA (Teaching Assistant), so I expect this semester will be quite busy. To meet the requirements for interacting with students as a TA, I had to take an oral English exam, and I just barely passed. Hai took the same exam last year and failed. He retook it this year and received a conditional pass, meaning he has to take an English </w:t>
       </w:r>
       <w:r>
         <w:lastRenderedPageBreak/>
-        <w:t xml:space="preserve">received a conditional pass, meaning he has to take an English course this semester. The department has already assigned me to a class, and tomorrow I’m going to apply for office space. </w:t>
+        <w:t xml:space="preserve">course this semester. The department has already assigned me to a class, and tomorrow I’m going to apply for office space. </w:t>
       </w:r>
     </w:p>
     <w:p>
@@ -3937,11 +3964,11 @@
         <w:pStyle w:val="CSP-ChapterBodyText"/>
       </w:pPr>
       <w:r>
-        <w:t xml:space="preserve">You can use this address to write to me from now on. I’m not especially thrilled with the place; the air conditioner is quite noisy. My share of the rent is $250 a month. It’s a two-bedroom apartment, and another Chinese student lives in the other room. Around here, it's pretty much standard for Chinese students to room together. Yesterday I spent $15 on a large </w:t>
+        <w:t xml:space="preserve">You can use this address to write to me from now on. I’m not especially thrilled with the place; the air conditioner is quite noisy. My share of the rent is $250 a month. It’s a two-bedroom apartment, and another Chinese student lives in the other room. Around here, it's pretty much standard for Chinese students to room together. Yesterday I spent $15 on a large table I bought from a neighbor. It’s in pretty good shape, but </w:t>
       </w:r>
       <w:r>
         <w:lastRenderedPageBreak/>
-        <w:t>table I bought from a neighbor. It’s in pretty good shape, but since I don’t have a chair yet, I’m actually standing up as I write this letter to you. At night, I just spread a bedsheet on the carpet and sleep there.</w:t>
+        <w:t>since I don’t have a chair yet, I’m actually standing up as I write this letter to you. At night, I just spread a bedsheet on the carpet and sleep there.</w:t>
       </w:r>
     </w:p>
     <w:p>
@@ -4337,7 +4364,13 @@
         <w:footnoteReference w:id="8"/>
       </w:r>
       <w:r>
-        <w:t xml:space="preserve"> Please look into it, since it might be more economical. I’ve heard that calling China from the U.S. after 8:00 p.m. costs only 70 cents a minute. What </w:t>
+        <w:t xml:space="preserve"> Please look into it, since it might be more economical. I’ve heard that calling China from the U.S. after 8:00 p.m. costs only </w:t>
+      </w:r>
+      <w:r>
+        <w:t>seventy</w:t>
+      </w:r>
+      <w:r>
+        <w:t xml:space="preserve"> cents a minute. What </w:t>
       </w:r>
       <w:r>
         <w:t>is</w:t>
@@ -4878,7 +4911,13 @@
         <w:pStyle w:val="CSP-ChapterBodyText"/>
       </w:pPr>
       <w:r>
-        <w:t>09/27, 1:00 a.m.</w:t>
+        <w:t>09/27</w:t>
+      </w:r>
+      <w:r>
+        <w:t xml:space="preserve"> at</w:t>
+      </w:r>
+      <w:r>
+        <w:t xml:space="preserve"> 1:00 a.m.</w:t>
       </w:r>
     </w:p>
     <w:p>
@@ -5376,11 +5415,11 @@
       </w:r>
       <w:proofErr w:type="gramEnd"/>
       <w:r>
-        <w:t xml:space="preserve"> if possible, I’d really like to move somewhere else and get an American roommate. It would force me to speak English every day and help me gain a better understanding of American culture. The university’s International Office runs a program called PALS (Partnerships to Advance Language Study), which pairs international students with Americans to build friendships and practice language skills. I signed up and was paired with </w:t>
+        <w:t xml:space="preserve"> if possible, I’d really like to move somewhere else and get an American roommate. It would force me to speak English every day and help me gain a better understanding of American culture. The university’s International Office runs a program called PALS (Partnerships to Advance Language Study), which pairs international students with Americans to build friendships and practice language skills. I signed up and was paired with Sarah. We meet once a week just to chat, and we've been doing </w:t>
       </w:r>
       <w:r>
         <w:lastRenderedPageBreak/>
-        <w:t xml:space="preserve">Sarah. We meet once a week just to chat, and we've been doing it for about </w:t>
+        <w:t xml:space="preserve">it for about </w:t>
       </w:r>
       <w:r>
         <w:t>four</w:t>
@@ -5519,6 +5558,7 @@
         <w:pStyle w:val="CSP-ChapterBodyText"/>
       </w:pPr>
       <w:r>
+        <w:lastRenderedPageBreak/>
         <w:t>Chun</w:t>
       </w:r>
       <w:r>
@@ -6155,9 +6195,12 @@
       <w:r>
         <w:t xml:space="preserve"> in all three of my classes this semester, which I pretty much expected. It definitely gives me a lot more confidence about my coursework going forward. I’ll be taking another three classes next semester. I don't know what class I’ll be </w:t>
       </w:r>
+      <w:r>
+        <w:t>TA-</w:t>
+      </w:r>
       <w:proofErr w:type="spellStart"/>
       <w:r>
-        <w:t>TAing</w:t>
+        <w:t>ing</w:t>
       </w:r>
       <w:proofErr w:type="spellEnd"/>
       <w:r>
@@ -6611,9 +6654,12 @@
       <w:r>
         <w:t xml:space="preserve">Winter break is just about over, and classes officially start on the 16th, so things are about to get busy again. Next semester, I’ll be </w:t>
       </w:r>
+      <w:r>
+        <w:t>TA-</w:t>
+      </w:r>
       <w:proofErr w:type="spellStart"/>
       <w:r>
-        <w:t>TAing</w:t>
+        <w:t>ing</w:t>
       </w:r>
       <w:proofErr w:type="spellEnd"/>
       <w:r>
@@ -6630,7 +6676,19 @@
         <w:pStyle w:val="CSP-ChapterBodyText"/>
       </w:pPr>
       <w:r>
-        <w:t>Yesterday, I spent two hours chatting online with Weihai, typing messages back and forth. Watching the words appear and jump onto the screen in real time felt almost magical—like we were talking face-to-face, even though we were a thousand miles apart. He’s only been in the U.S. for a few months but already dropped $900 on a used car and gotten his driver's license. He and his girlfriend back in China ended up breaking up. He told me he gets really lonely whenever he has nothing to do. His roommate is also American, and he mentioned that every time he fries fish, his roommate jumps out and cries, "Are you trying to kill me?" Needless to say, he doesn't eat much fish anymore. He’s decided not to finish his Ph.D. and plans to get his Master's and then look for a job.</w:t>
+        <w:t xml:space="preserve">Yesterday, I spent two hours chatting online with Weihai, typing messages back and forth. Watching the words appear and jump onto the screen in real time felt almost magical—like we were talking face-to-face, even though we were a thousand miles apart. He’s only been in the U.S. for a few months but already dropped $900 on a used car and gotten his driver's license. He and his girlfriend back in China ended up breaking up. He told me he gets really lonely whenever he has nothing to do. His roommate is also American, and he mentioned that every time he fries fish, his roommate jumps out and cries, "Are you trying to kill me?" Needless to say, he doesn't eat much fish anymore. He’s decided not to finish his Ph.D. and plans to get his </w:t>
+      </w:r>
+      <w:r>
+        <w:t>m</w:t>
+      </w:r>
+      <w:r>
+        <w:t xml:space="preserve">aster's </w:t>
+      </w:r>
+      <w:r>
+        <w:t xml:space="preserve">degree </w:t>
+      </w:r>
+      <w:r>
+        <w:t>and then look for a job.</w:t>
       </w:r>
     </w:p>
     <w:p>
@@ -7514,20 +7572,44 @@
         <w:pStyle w:val="CSP-ChapterBodyText"/>
       </w:pPr>
       <w:r>
-        <w:t xml:space="preserve">The semester ends in mid-May, and after a short break, the summer term begins in late May. We can either register for summer classes or take the summer off. Around this time, I need to decide whether I want to continue pursuing a Ph.D. If I decide not to continue and settle for a Master's degree instead, I need to start making plans right away. </w:t>
-      </w:r>
-    </w:p>
-    <w:p>
-      <w:pPr>
-        <w:pStyle w:val="CSP-ChapterBodyText"/>
-      </w:pPr>
-    </w:p>
-    <w:p>
-      <w:pPr>
-        <w:pStyle w:val="CSP-ChapterBodyText"/>
-      </w:pPr>
-      <w:r>
-        <w:t>Right now, I'm leaning toward just getting my Master’s and finding a job, but nothing is set in stone. The biggest problem is that I haven't found a research area that truly interests me. Most of the professors in the department work on topics that are much too theoretical for my taste.</w:t>
+        <w:t xml:space="preserve">The semester ends in mid-May, and after a short break, the summer term begins in late May. We can either register for summer classes or take the summer off. Around this time, I need to decide whether I want to continue pursuing a Ph.D. If I decide not to continue and settle for a </w:t>
+      </w:r>
+      <w:r>
+        <w:t>m</w:t>
+      </w:r>
+      <w:r>
+        <w:t>aster</w:t>
+      </w:r>
+      <w:r>
+        <w:t>’</w:t>
+      </w:r>
+      <w:r>
+        <w:t xml:space="preserve">s degree instead, I need to start making plans right away. </w:t>
+      </w:r>
+    </w:p>
+    <w:p>
+      <w:pPr>
+        <w:pStyle w:val="CSP-ChapterBodyText"/>
+      </w:pPr>
+    </w:p>
+    <w:p>
+      <w:pPr>
+        <w:pStyle w:val="CSP-ChapterBodyText"/>
+      </w:pPr>
+      <w:r>
+        <w:t xml:space="preserve">Right now, I'm leaning toward just getting my </w:t>
+      </w:r>
+      <w:r>
+        <w:t>m</w:t>
+      </w:r>
+      <w:r>
+        <w:t>aster’s</w:t>
+      </w:r>
+      <w:r>
+        <w:t xml:space="preserve"> degree</w:t>
+      </w:r>
+      <w:r>
+        <w:t xml:space="preserve"> and finding a job, but nothing is set in stone. The biggest problem is that I haven't found a research area that truly interests me. Most of the professors in the department work on topics that are much too theoretical for my taste.</w:t>
       </w:r>
     </w:p>
     <w:p>
@@ -7555,17 +7637,20 @@
       <w:r>
         <w:t xml:space="preserve">In the best-case scenario, I'd find a summer internship. Otherwise, I'll probably just have to register for one class and continue working as a TA. While </w:t>
       </w:r>
+      <w:r>
+        <w:t>TA-</w:t>
+      </w:r>
       <w:proofErr w:type="spellStart"/>
       <w:r>
-        <w:t>TAing</w:t>
+        <w:t>ing</w:t>
       </w:r>
       <w:proofErr w:type="spellEnd"/>
       <w:r>
-        <w:t xml:space="preserve"> provides some income, taking a class means paying tuition and fees, and I'd miss the opportunity to gain real work experience. I probably didn't plan ahead well enough, and I wasn't aggressive enough in looking </w:t>
+        <w:t xml:space="preserve"> provides some income, taking a class means paying tuition and fees, and I'd miss the opportunity to gain real work experience. I probably didn't plan ahead well enough, and I wasn't aggressive enough </w:t>
       </w:r>
       <w:r>
         <w:lastRenderedPageBreak/>
-        <w:t>for summer jobs, which is why I haven't had any luck so far.</w:t>
+        <w:t>in looking for summer jobs, which is why I haven't had any luck so far.</w:t>
       </w:r>
     </w:p>
     <w:p>
@@ -7799,7 +7884,19 @@
         <w:pStyle w:val="CSP-ChapterBodyText"/>
       </w:pPr>
       <w:r>
-        <w:t>Honestly, I got incredibly lucky this time. One of my high school classmates, who was also my classmate in college, graduated with his Master's last year and went to work at AT&amp;T Bell Labs. Two weeks ago, coincidentally, he sent out an email to everyone saying there was an opening for a permanent position and asking if anyone was interested. I replied and told him I was actually looking for a summer internship. He said it might be possible and asked me to send over my resume. I never expected it to actually work out, but yesterday someone from Bell Labs called me for an interview and asked a few questions. Today, my classmate told me everything was set. Because he recommended me, the whole process went much more smoothly.</w:t>
+        <w:t xml:space="preserve">Honestly, I got incredibly lucky this time. One of my high school classmates, who was also my classmate in college, graduated with his </w:t>
+      </w:r>
+      <w:r>
+        <w:t>m</w:t>
+      </w:r>
+      <w:r>
+        <w:t xml:space="preserve">aster's </w:t>
+      </w:r>
+      <w:r>
+        <w:t xml:space="preserve">degree </w:t>
+      </w:r>
+      <w:r>
+        <w:t>last year and went to work at AT&amp;T Bell Labs. Two weeks ago, coincidentally, he sent out an email to everyone saying there was an opening for a permanent position and asking if anyone was interested. I replied and told him I was actually looking for a summer internship. He said it might be possible and asked me to send over my resume. I never expected it to actually work out, but yesterday someone from Bell Labs called me for an interview and asked a few questions. Today, my classmate told me everything was set. Because he recommended me, the whole process went much more smoothly.</w:t>
       </w:r>
     </w:p>
     <w:p>
@@ -7857,7 +7954,19 @@
         <w:pStyle w:val="CSP-ChapterBodyText"/>
       </w:pPr>
       <w:r>
-        <w:t>Regarding what we discussed in my last letter about pursuing a Ph.D., that will likely settle itself in a few months. I plan to talk things over with my friends up there. If I get a taste of an industry job and don't like it, I might decide to pursue a Ph.D. and focus on research. On the other hand, if I really enjoy working, I'll just finish my Master's and head straight into the workforce.</w:t>
+        <w:t xml:space="preserve">Regarding what we discussed in my last letter about pursuing a Ph.D., that will likely settle itself in a few months. I plan to talk things over with my friends up there. If I get a taste of an industry job and don't like it, I might decide to pursue a Ph.D. and focus on research. On the other hand, if I really enjoy working, I'll just finish my </w:t>
+      </w:r>
+      <w:r>
+        <w:t>m</w:t>
+      </w:r>
+      <w:r>
+        <w:t xml:space="preserve">aster's </w:t>
+      </w:r>
+      <w:r>
+        <w:t xml:space="preserve">degree </w:t>
+      </w:r>
+      <w:r>
+        <w:t>and head straight into the workforce.</w:t>
       </w:r>
     </w:p>
     <w:p>
@@ -8503,11 +8612,11 @@
         <w:pStyle w:val="CSP-ChapterBodyText"/>
       </w:pPr>
       <w:r>
-        <w:t xml:space="preserve">I’ve been at my job for a little over three weeks now. I get up at 8:00 in the morning to head into work with Jim, usually grab lunch at the office, and get back home in the evening. It’s an eight-hour workday, but nobody really micro-manages things. </w:t>
+        <w:t xml:space="preserve">I’ve been at my job for a little over three weeks now. I get up at 8:00 in the morning to head into work with Jim, usually grab lunch at the office, and get back home in the evening. It’s an eight-hour workday, but nobody really micro-manages things. It’s way more relaxed than a typical corporate job—honestly, it </w:t>
       </w:r>
       <w:r>
         <w:lastRenderedPageBreak/>
-        <w:t xml:space="preserve">It’s way more relaxed than a typical corporate job—honestly, it feels more like being at a university. My coworkers are incredibly nice, and the workload is manageable. I’m confident I can handle the projects. Working during the day also means my evenings are actually free now, which is a nice change from my student days when I always had to read and do homework at night. </w:t>
+        <w:t xml:space="preserve">feels more like being at a university. My coworkers are incredibly nice, and the workload is manageable. I’m confident I can handle the projects. Working during the day also means my evenings are actually free now, which is a nice change from my student days when I always had to read and do homework at night. </w:t>
       </w:r>
     </w:p>
     <w:p>
@@ -8558,11 +8667,11 @@
         <w:pStyle w:val="CSP-ChapterBodyText"/>
       </w:pPr>
       <w:r>
-        <w:t xml:space="preserve">She emailed me a while back to tell me that Maryland offered her a scholarship, but that UT was still her top choice and asked if I could look into her admission status here. I went to the department to ask around, but they said they never received her application file from the International Office. Apparently, applications go there first for processing before being forwarded to the departments for review. When I asked what the hold-up was, they told me it was likely a "backlog," meaning a pile-up of paperwork they haven't gotten to yet. They weren’t </w:t>
+        <w:t xml:space="preserve">She emailed me a while back to tell me that Maryland offered her a scholarship, but that UT was still her top choice and asked if I could look into her admission status here. I went to the department to ask around, but they said they never received her application file from the International Office. Apparently, applications go there first for processing before being forwarded to the departments for review. When I asked what the hold-up was, they told me it was likely a "backlog," meaning a pile-up of paperwork they haven't gotten to yet. They weren’t really supposed to tell me that, since it's a private matter and </w:t>
       </w:r>
       <w:r>
         <w:lastRenderedPageBreak/>
-        <w:t>really supposed to tell me that, since it's a private matter and third parties aren't allowed to nose around. Honestly, I don't think things are going to work out between the two of us, so please don't get your hopes up.</w:t>
+        <w:t>third parties aren't allowed to nose around. Honestly, I don't think things are going to work out between the two of us, so please don't get your hopes up.</w:t>
       </w:r>
     </w:p>
     <w:p>
@@ -9528,7 +9637,7 @@
         <w:pStyle w:val="CSP-ChapterBodyText"/>
       </w:pPr>
       <w:r>
-        <w:t xml:space="preserve">Since I returned to Austin, we've started hanging out in person. She has sandy-blonde hair tied back into a ponytail, and always seems to sport the unofficial uniform of a Texas college girl—shorts and a T-shirt. She's very down-to-earth and unpretentious, which I find especially refreshing. She’s also very athletic and played on her high school varsity teams in basketball, volleyball, softball, and several other sports. </w:t>
+        <w:t xml:space="preserve">Since I returned to Austin, we've started hanging out in person. She has sandy-blonde hair tied back into a ponytail and always seems to sport the unofficial uniform of a Texas college girl—shorts and a T-shirt. She's very down-to-earth and unpretentious, which I find especially refreshing. She’s also very athletic and played on her high school varsity teams in basketball, volleyball, softball, and several other sports. </w:t>
       </w:r>
     </w:p>
     <w:p>
@@ -10050,7 +10159,13 @@
         <w:pStyle w:val="CSP-ChapterBodyText"/>
       </w:pPr>
       <w:r>
-        <w:t>I’ve been pretty overwhelmed lately. Besides my own classes, I’ve been busy working as a TA—grading homework and projects, and answering students' questions. Every time I finish grading a project, plenty of students complain about their scores and flood my inbox with emails. It is incredibly frustrating; at its worst, I receive over a dozen of these emails a day. On top of that, I’ve started looking for a job and have already had a few interviews, all of them conducted on campus. No news yet, but that’s normal. Companies typically require two rounds of interviews—the first one on campus and a second one on-site at the company. If I decide to graduate with just my Master’s degree, I’ll be finishing up next May. The bulk of interviewing will take place next year; this year is really just an opportunity to get some practice in.</w:t>
+        <w:t xml:space="preserve">I’ve been pretty overwhelmed lately. Besides my own classes, I’ve been busy working as a TA—grading homework and projects, and answering students' questions. Every time I finish grading a project, plenty of students complain about their scores and flood my inbox with emails. It is incredibly frustrating; at its worst, I receive over a dozen of these emails a day. On top of that, I’ve started looking for a job and have already had a few interviews, all of them conducted on campus. No news yet, but that’s normal. Companies typically require two rounds of interviews—the first one on campus and a second one on-site at the company. If I decide to graduate with just my </w:t>
+      </w:r>
+      <w:r>
+        <w:t>m</w:t>
+      </w:r>
+      <w:r>
+        <w:t>aster’s degree, I’ll be finishing up next May. The bulk of interviewing will take place next year; this year is really just an opportunity to get some practice in.</w:t>
       </w:r>
     </w:p>
     <w:p>
@@ -10302,7 +10417,13 @@
         <w:pStyle w:val="CSP-ChapterBodyText"/>
       </w:pPr>
       <w:r>
-        <w:t>I received both of your letters a while ago, but I just haven’t been able to find the time to write back. I’m really sorry. I've been busy with one thing after another, although sometimes I'm not even sure what I've been so busy doing.</w:t>
+        <w:t xml:space="preserve">I received both of your letters a while ago, but I just haven’t been able to find the time to write back. I’m really sorry. I've been busy with one thing after another, although sometimes </w:t>
+      </w:r>
+      <w:r>
+        <w:t>I'm not even sure what I've been so busy with</w:t>
+      </w:r>
+      <w:r>
+        <w:t>.</w:t>
       </w:r>
     </w:p>
     <w:p>
@@ -11060,24 +11181,33 @@
         <w:pStyle w:val="CSP-ChapterBodyText"/>
       </w:pPr>
       <w:r>
-        <w:t>I’m officially graduating in a little over a month. I’ve already taken care of all the necessary paperwork, including applying for graduation and filing for my work authorization (OPT). These are all standard administrative procedures, so there shouldn't be any problems. Graduation is around the middle of May, but I expect to have everything wrapped up by early May.</w:t>
-      </w:r>
-    </w:p>
-    <w:p>
-      <w:pPr>
-        <w:pStyle w:val="CSP-ChapterBodyText"/>
-      </w:pPr>
-    </w:p>
-    <w:p>
-      <w:pPr>
-        <w:pStyle w:val="CSP-ChapterBodyText"/>
-      </w:pPr>
-      <w:r>
-        <w:t xml:space="preserve">That said, I don’t plan on heading out to New York right away. For one thing, I need to wait for my diploma and work authorization to arrive. Besides, I have a lot of friends here in Austin, so it's a bit more fun here. I’ll probably wait until mid- or late June before making the move. Finding an apartment in New York or New Jersey is going to be a bit of a challenge. I may ask some friends to help me look, or I might stay with a </w:t>
+        <w:t>I’m officially graduating in a little over a month. I’ve already taken care of all the necessary paperwork, including applying for graduation and filing for my work authorization (OPT</w:t>
+      </w:r>
+      <w:r>
+        <w:rPr>
+          <w:rStyle w:val="FootnoteReference"/>
+        </w:rPr>
+        <w:footnoteReference w:id="27"/>
+      </w:r>
+      <w:r>
+        <w:t>). These are all standard administrative procedures, so there shouldn't be any problems. Graduation is around the middle of May, but I expect to have everything wrapped up by early May.</w:t>
+      </w:r>
+    </w:p>
+    <w:p>
+      <w:pPr>
+        <w:pStyle w:val="CSP-ChapterBodyText"/>
+      </w:pPr>
+    </w:p>
+    <w:p>
+      <w:pPr>
+        <w:pStyle w:val="CSP-ChapterBodyText"/>
+      </w:pPr>
+      <w:r>
+        <w:t xml:space="preserve">That said, I don’t plan on heading out to New York right away. For one thing, I need to wait for my diploma and work authorization to arrive. Besides, I have a lot of friends here in Austin, so it's a bit more fun here. I’ll probably wait until mid- or late June before making the move. Finding an apartment in New York or New Jersey is going to be a bit of a challenge. I </w:t>
       </w:r>
       <w:r>
         <w:lastRenderedPageBreak/>
-        <w:t>friend for a while after I get there and search for a place myself. Either way, I'm sure everything will work out in the end, so please don't worry too much.</w:t>
+        <w:t>may ask some friends to help me look, or I might stay with a friend for a while after I get there and search for a place myself. Either way, I'm sure everything will work out in the end, so please don't worry too much.</w:t>
       </w:r>
     </w:p>
     <w:p>
@@ -11096,7 +11226,7 @@
         <w:rPr>
           <w:rStyle w:val="FootnoteReference"/>
         </w:rPr>
-        <w:footnoteReference w:id="27"/>
+        <w:footnoteReference w:id="28"/>
       </w:r>
       <w:r>
         <w:t xml:space="preserve"> I think next year would be the perfect time. By then, I’ll be completely settled into my new environment, finances won't be a problem, and I’ll be able to take some time off to show you around. Please plan to dip into your savings for this trip. It simply wouldn't make much sense for you to spend your hard-earned money coming all this way. I'll take care of all the expenses related to your visit, so you won't need to worry about a thing.</w:t>
@@ -11191,19 +11321,7 @@
         <w:rPr>
           <w:rFonts w:ascii="Garamond" w:hAnsi="Garamond"/>
         </w:rPr>
-        <w:t>2</w:t>
-      </w:r>
-      <w:r>
-        <w:rPr>
-          <w:rFonts w:ascii="Garamond" w:hAnsi="Garamond"/>
-        </w:rPr>
-        <w:t>3</w:t>
-      </w:r>
-      <w:r>
-        <w:rPr>
-          <w:rFonts w:ascii="Garamond" w:hAnsi="Garamond"/>
-        </w:rPr>
-        <w:t>.</w:t>
+        <w:t>23.</w:t>
       </w:r>
       <w:r>
         <w:rPr>
@@ -11339,7 +11457,7 @@
         <w:rPr>
           <w:rStyle w:val="FootnoteReference"/>
         </w:rPr>
-        <w:footnoteReference w:id="28"/>
+        <w:footnoteReference w:id="29"/>
       </w:r>
       <w:r>
         <w:t xml:space="preserve"> that took effect this month. Please don't worry about it. The law is mainly aimed at illegal immigrants. As long as international students follow the rules, we're here legally on F-1 visas. After graduation, we're allowed to stay in the United States for one year. If we change to H-1B status during that time, we can continue working legally for several more years. While we're working, we can apply for a green card. Once that's approved, we're all set. For graduate students like us, America isn't going to kick us out. It wouldn't be in the country's best interest.</w:t>
@@ -11428,7 +11546,7 @@
         <w:rPr>
           <w:rStyle w:val="FootnoteReference"/>
         </w:rPr>
-        <w:footnoteReference w:id="29"/>
+        <w:footnoteReference w:id="30"/>
       </w:r>
       <w:r>
         <w:t xml:space="preserve"> </w:t>
@@ -11766,7 +11884,13 @@
         <w:pStyle w:val="CSP-ChapterBodyText"/>
       </w:pPr>
       <w:r>
-        <w:t xml:space="preserve">As for the sights, the Painted Desert is an area where the terrain displays these beautiful, layered colors due to mineral deposits and weathering. The Petrified Forest doesn't actually have standing trees anymore; they’ve all turned into stone fossils and lie scattered across the ground. We arrived at Las Vegas after 1:00 in the morning and spent a couple of hours wandering through the casinos, right when the Strip was at its liveliest. You have to be at least 21 to gamble over here, and they can never seem to guess the age of Asian people. An elderly lady working at the cashier counter—the place where you exchange cash for gambling chips—asked how old I was. When I told her I was </w:t>
+        <w:t xml:space="preserve">As for the sights, the Painted Desert is an area where the terrain displays these beautiful, layered colors due to mineral deposits and weathering. The Petrified Forest doesn't actually have standing trees anymore; </w:t>
+      </w:r>
+      <w:r>
+        <w:t>they’ve all petrified into fossils and lie scattered across the ground</w:t>
+      </w:r>
+      <w:r>
+        <w:t xml:space="preserve">. We arrived at Las Vegas after 1:00 in the morning and spent a couple of hours wandering through the casinos, right when the Strip was at its liveliest. You have to be at least 21 to gamble over here, and they can never seem to guess the age of Asian people. An elderly lady working at the cashier counter—the place where you exchange cash for gambling chips—asked how old I was. When I told her I was </w:t>
       </w:r>
       <w:r>
         <w:lastRenderedPageBreak/>
@@ -11811,7 +11935,7 @@
         <w:rPr>
           <w:rStyle w:val="FootnoteReference"/>
         </w:rPr>
-        <w:footnoteReference w:id="30"/>
+        <w:footnoteReference w:id="31"/>
       </w:r>
       <w:r>
         <w:t xml:space="preserve"> </w:t>
@@ -11827,7 +11951,13 @@
         <w:pStyle w:val="CSP-ChapterBodyText"/>
       </w:pPr>
       <w:r>
-        <w:t>My official start date at the company has been pushed back to August 4th. The firm wrote to me asking for my undergraduate and graduate transcripts. Luckily, I still had copies of my transcripts from colleges on hand, so I mailed those off along with my UT ones. I pulled off straight A's again this semester, which means my final cumulative GPA for the two years is a perfect 4.0.</w:t>
+        <w:t xml:space="preserve">My official start date at the company has been pushed back to August 4th. The firm wrote to me asking for my undergraduate and graduate transcripts. Luckily, I still had copies of my transcripts from </w:t>
+      </w:r>
+      <w:r>
+        <w:t xml:space="preserve">Chinese </w:t>
+      </w:r>
+      <w:r>
+        <w:t>colleges on hand, so I mailed those off along with my UT ones. I pulled off straight A's again this semester, which means my final cumulative GPA for the two years is a perfect 4.0.</w:t>
       </w:r>
     </w:p>
     <w:p>
@@ -11852,7 +11982,22 @@
       </w:r>
       <w:r>
         <w:lastRenderedPageBreak/>
-        <w:t>August 11th to the 15th at a hotel right on Broadway—coincidentally, the very same hotel I stayed during my interview. The orientation is mainly intended to give us an overview of the firm's operations and allow us to get to know one another.</w:t>
+        <w:t xml:space="preserve">August 11th </w:t>
+      </w:r>
+      <w:r>
+        <w:t>through</w:t>
+      </w:r>
+      <w:r>
+        <w:t xml:space="preserve"> </w:t>
+      </w:r>
+      <w:r>
+        <w:t xml:space="preserve">the 15th at a hotel right on Broadway—coincidentally, the very same hotel I stayed </w:t>
+      </w:r>
+      <w:r>
+        <w:t xml:space="preserve">at </w:t>
+      </w:r>
+      <w:r>
+        <w:t>during my interview. The orientation is mainly intended to give us an overview of the firm's operations and allow us to get to know one another.</w:t>
       </w:r>
     </w:p>
     <w:p>
@@ -12372,7 +12517,13 @@
         <w:pStyle w:val="CSP-ChapterBodyText"/>
       </w:pPr>
       <w:r>
-        <w:t>I’ve finally moved into my own apartment! It’s actually pretty spacious. The neighborhood is really nice—it’s just a two-minute walk to a local park and driving to a nearby mall only takes a few minutes. There are also two huge Asian grocery stores nearby that carry just about every Chinese food item you could want—Edison has a large Chinese population.</w:t>
+        <w:t>I’ve finally moved into my own apartment! It’s actually pretty spacious. The neighborhood is really nice—it’s just a two-minute walk to a local park</w:t>
+      </w:r>
+      <w:r>
+        <w:t>,</w:t>
+      </w:r>
+      <w:r>
+        <w:t xml:space="preserve"> and driving to a nearby mall only takes a few minutes. There are also two huge Asian grocery stores nearby that carry just about every Chinese food item you could want—Edison has a large Chinese population.</w:t>
       </w:r>
     </w:p>
     <w:p>
@@ -12875,7 +13026,13 @@
         <w:pStyle w:val="CSP-ChapterBodyText"/>
       </w:pPr>
       <w:r>
-        <w:t>We ended up having lunch together at the Wendy's. I ordered just a burger. If I remember correctly, she ordered a meal with a baked potato. She carefully slit the potato open and topped it with butter, chives, cheese and bacon. She told me she had worked in sales at IBM China for a year before coming to Austin. She definitely looked more confident and polished than I did. After all, up to that point I had been nothing but a full-</w:t>
+        <w:t>We ended up having lunch together at the Wendy's. I ordered just a burger. If I remember correctly, she ordered a meal with a baked potato. She carefully slit the potato open and topped it with butter, chives, cheese</w:t>
+      </w:r>
+      <w:r>
+        <w:t>,</w:t>
+      </w:r>
+      <w:r>
+        <w:t xml:space="preserve"> and bacon. She told me she had worked in sales at IBM China for a year before coming to Austin. She definitely looked more confident and polished than I did. After all, up to that point I had been nothing but a full-</w:t>
       </w:r>
       <w:r>
         <w:lastRenderedPageBreak/>
@@ -12920,7 +13077,13 @@
         <w:pStyle w:val="CSP-ChapterBodyText"/>
       </w:pPr>
       <w:r>
-        <w:t xml:space="preserve">"Because every extra day costs me money I don’t have.” I replied. Not exactly the kind of line you find in movies. </w:t>
+        <w:t>"Because every extra day costs me money I don’t have</w:t>
+      </w:r>
+      <w:r>
+        <w:t>,</w:t>
+      </w:r>
+      <w:r>
+        <w:t xml:space="preserve">” I replied. Not exactly the kind of line you find in movies. </w:t>
       </w:r>
     </w:p>
     <w:p>
@@ -14811,7 +14974,13 @@
         <w:t xml:space="preserve"> </w:t>
       </w:r>
       <w:r>
-        <w:t>For readers who grew up with cell phones and smartphones, this was a landline telephone.</w:t>
+        <w:t>This refers to a landline telephone—for context, cell phones and</w:t>
+      </w:r>
+      <w:r>
+        <w:t xml:space="preserve"> </w:t>
+      </w:r>
+      <w:r>
+        <w:t>smartphones did not yet exist for ordinary consumers.</w:t>
       </w:r>
     </w:p>
   </w:footnote>
@@ -14922,13 +15091,7 @@
         <w:t xml:space="preserve"> </w:t>
       </w:r>
       <w:r>
-        <w:t xml:space="preserve">I was </w:t>
-      </w:r>
-      <w:r>
-        <w:t>referring</w:t>
-      </w:r>
-      <w:r>
-        <w:t xml:space="preserve"> to collect call, a telephone call where the recipient, rather than the person making the call, agrees to pay the charges.</w:t>
+        <w:t>I was referring to a collect call, a telephone call in which the recipient, rather than the caller, agrees to pay the charges.</w:t>
       </w:r>
     </w:p>
   </w:footnote>
@@ -15131,7 +15294,10 @@
         <w:t xml:space="preserve"> </w:t>
       </w:r>
       <w:r>
-        <w:t>When parents visited the United States, children who agreed to sponsor the trip were advised to provide evidence of financial resources in case consular officers requested proof that the visit could be supported financially.</w:t>
+        <w:t>When parents visited the United States, children who agreed to sponsor the trip were advised to provide evidence of financial resources, in case consular officers required</w:t>
+      </w:r>
+      <w:r>
+        <w:t xml:space="preserve"> proof of their ability to support the visit.</w:t>
       </w:r>
     </w:p>
   </w:footnote>
@@ -15219,7 +15385,13 @@
         <w:t xml:space="preserve"> </w:t>
       </w:r>
       <w:r>
-        <w:t>how fluid flow in and around objects.</w:t>
+        <w:t>how fluid flow</w:t>
+      </w:r>
+      <w:r>
+        <w:t>s</w:t>
+      </w:r>
+      <w:r>
+        <w:t xml:space="preserve"> in and around objects.</w:t>
       </w:r>
     </w:p>
   </w:footnote>
@@ -15358,7 +15530,7 @@
         <w:t xml:space="preserve"> </w:t>
       </w:r>
       <w:r>
-        <w:t>Due to the complexities and uncertainties of U.S. immigration law, traveling back to one's home country carried certain risk and was generally discouraged while on work visa.</w:t>
+        <w:t>Optional Practical Training is a period during which international students on an F-1 visa can work in the U.S. in a job related to their field of study.</w:t>
       </w:r>
     </w:p>
   </w:footnote>
@@ -15377,7 +15549,13 @@
         <w:t xml:space="preserve"> </w:t>
       </w:r>
       <w:r>
-        <w:t>The Illegal Immigration Reform and Immigrant Responsibility Act of 1996 (IIRIRA) was signed into law on September 30, 1996. Most of its major provisions took effect on April 1, 1997. The law significantly expanded immigration enforcement and overhauled many aspects of U.S. immigration law, raising concerns among many immigrants and international students.</w:t>
+        <w:t xml:space="preserve">Due to the complexities and uncertainties of U.S. immigration law, traveling back to one's home country carried certain risk and was generally discouraged while on </w:t>
+      </w:r>
+      <w:r>
+        <w:t xml:space="preserve">a </w:t>
+      </w:r>
+      <w:r>
+        <w:t>work visa.</w:t>
       </w:r>
     </w:p>
   </w:footnote>
@@ -15396,11 +15574,30 @@
         <w:t xml:space="preserve"> </w:t>
       </w:r>
       <w:r>
-        <w:t>Before GPS became commonplace, people relied on paper maps for navigation. On long trips, it was often helpful to have a passenger read the map while the driver kept their eyes on the road.</w:t>
+        <w:t>The Illegal Immigration Reform and Immigrant Responsibility Act of 1996 (IIRIRA) was signed into law on September 30, 1996. Most of its major provisions took effect on April 1, 1997. The law significantly expanded immigration enforcement and overhauled many aspects of U.S. immigration law, raising concerns among many immigrants and international students.</w:t>
       </w:r>
     </w:p>
   </w:footnote>
   <w:footnote w:id="30">
+    <w:p>
+      <w:pPr>
+        <w:pStyle w:val="FootnoteText"/>
+      </w:pPr>
+      <w:r>
+        <w:rPr>
+          <w:rStyle w:val="FootnoteReference"/>
+        </w:rPr>
+        <w:footnoteRef/>
+      </w:r>
+      <w:r>
+        <w:t xml:space="preserve"> </w:t>
+      </w:r>
+      <w:r>
+        <w:t>Before GPS became commonplace, people relied on paper maps for navigation. On long trips, it was often helpful to have a passenger read the map while the driver kept their eyes on the road.</w:t>
+      </w:r>
+    </w:p>
+  </w:footnote>
+  <w:footnote w:id="31">
     <w:p>
       <w:pPr>
         <w:pStyle w:val="FootnoteText"/>
@@ -16132,9 +16329,9 @@
     <w:uiPriority w:val="99"/>
     <w:semiHidden/>
     <w:unhideWhenUsed/>
-    <w:rsid w:val="00A22002"/>
+    <w:rsid w:val="007168D2"/>
     <w:pPr>
-      <w:spacing w:after="120" w:line="240" w:lineRule="auto"/>
+      <w:spacing w:after="100" w:line="240" w:lineRule="auto"/>
     </w:pPr>
     <w:rPr>
       <w:rFonts w:ascii="Garamond" w:hAnsi="Garamond"/>
@@ -16148,7 +16345,7 @@
     <w:link w:val="FootnoteText"/>
     <w:uiPriority w:val="99"/>
     <w:semiHidden/>
-    <w:rsid w:val="00A22002"/>
+    <w:rsid w:val="007168D2"/>
     <w:rPr>
       <w:rFonts w:ascii="Garamond" w:eastAsia="Calibri" w:hAnsi="Garamond" w:cs="Times New Roman"/>
       <w:sz w:val="16"/>

</xml_diff>

<commit_message>
more footnote and revised author's note
</commit_message>
<xml_diff>
--- a/letters_from_usa/book.docx
+++ b/letters_from_usa/book.docx
@@ -469,7 +469,16 @@
         <w:t>voice and authenticity</w:t>
       </w:r>
       <w:r>
-        <w:t>. Each chapter begins with the postmark date from the original envelope. Because some letters were written over several days before they were mailed, the dates that appear within the letters reflect when individual entries were written.</w:t>
+        <w:t>. Each chapter</w:t>
+      </w:r>
+      <w:r>
+        <w:t xml:space="preserve"> </w:t>
+      </w:r>
+      <w:r>
+        <w:t>except the Epilogue</w:t>
+      </w:r>
+      <w:r>
+        <w:t xml:space="preserve"> begins with the postmark date from the original envelope. Because some letters were written over several days before they were mailed, the dates that appear within the letters reflect when individual entries were written.</w:t>
       </w:r>
     </w:p>
     <w:p>
@@ -3196,6 +3205,12 @@
         <w:t>graduation</w:t>
       </w:r>
       <w:r>
+        <w:rPr>
+          <w:rStyle w:val="FootnoteReference"/>
+        </w:rPr>
+        <w:footnoteReference w:id="1"/>
+      </w:r>
+      <w:r>
         <w:t xml:space="preserve"> dinner; the department rented out a cafeteria for it. I didn</w:t>
       </w:r>
       <w:r>
@@ -3338,7 +3353,7 @@
           <w:i/>
           <w:iCs w:val="0"/>
         </w:rPr>
-        <w:footnoteReference w:id="1"/>
+        <w:footnoteReference w:id="2"/>
       </w:r>
     </w:p>
     <w:p>
@@ -3406,7 +3421,7 @@
         <w:rPr>
           <w:rStyle w:val="FootnoteReference"/>
         </w:rPr>
-        <w:footnoteReference w:id="2"/>
+        <w:footnoteReference w:id="3"/>
       </w:r>
       <w:r>
         <w:t xml:space="preserve"> Since this flight goes to Tokyo first, most of the passengers on board were Japanese. It takes over two hours to fly from Shanghai to Tokyo, and once we landed, everyone had to get off the plane. I walked around the Tokyo airport for a bit. Just hours ago, I could safely assume that every Asian face I encountered belonged to a fellow Chinese. That assumption no longer worked, and for the first time in my life I found myself unsure whether to start a conversation in Chinese. </w:t>
@@ -3975,7 +3990,7 @@
         <w:rPr>
           <w:rStyle w:val="FootnoteReference"/>
         </w:rPr>
-        <w:footnoteReference w:id="3"/>
+        <w:footnoteReference w:id="4"/>
       </w:r>
       <w:r>
         <w:t xml:space="preserve">. </w:t>
@@ -4091,7 +4106,7 @@
         <w:rPr>
           <w:rStyle w:val="FootnoteReference"/>
         </w:rPr>
-        <w:footnoteReference w:id="4"/>
+        <w:footnoteReference w:id="5"/>
       </w:r>
       <w:r>
         <w:t xml:space="preserve"> the day before yesterday, and tomorrow I</w:t>
@@ -4376,7 +4391,7 @@
         <w:rPr>
           <w:rStyle w:val="FootnoteReference"/>
         </w:rPr>
-        <w:footnoteReference w:id="5"/>
+        <w:footnoteReference w:id="6"/>
       </w:r>
       <w:r>
         <w:t xml:space="preserve"> I even have a class that runs straight from 11:00 a.m. to 12:30 p.m.</w:t>
@@ -4598,7 +4613,7 @@
         <w:rPr>
           <w:rStyle w:val="FootnoteReference"/>
         </w:rPr>
-        <w:footnoteReference w:id="6"/>
+        <w:footnoteReference w:id="7"/>
       </w:r>
       <w:r>
         <w:t>. There were about 120 people there, and the atmosphere was really lively. We had a potluck dinner, sang worship songs, listened to a sermon, and enjoyed some mooncakes</w:t>
@@ -4607,7 +4622,7 @@
         <w:rPr>
           <w:rStyle w:val="FootnoteReference"/>
         </w:rPr>
-        <w:footnoteReference w:id="7"/>
+        <w:footnoteReference w:id="8"/>
       </w:r>
       <w:r>
         <w:t xml:space="preserve"> together. The mooncakes were cut into tiny pieces, so everyone only got about an eighth of one. </w:t>
@@ -4727,7 +4742,7 @@
         <w:rPr>
           <w:rStyle w:val="FootnoteReference"/>
         </w:rPr>
-        <w:footnoteReference w:id="8"/>
+        <w:footnoteReference w:id="9"/>
       </w:r>
       <w:r>
         <w:t xml:space="preserve"> Please look into it, since it might be more economical. I</w:t>
@@ -4760,7 +4775,7 @@
         <w:rPr>
           <w:rStyle w:val="FootnoteReference"/>
         </w:rPr>
-        <w:footnoteReference w:id="9"/>
+        <w:footnoteReference w:id="10"/>
       </w:r>
       <w:r>
         <w:t xml:space="preserve"> Let me know in your next letter, and please give them my regards. I won</w:t>
@@ -5205,7 +5220,7 @@
         <w:rPr>
           <w:rStyle w:val="FootnoteReference"/>
         </w:rPr>
-        <w:footnoteReference w:id="10"/>
+        <w:footnoteReference w:id="11"/>
       </w:r>
       <w:r>
         <w:t xml:space="preserve"> are very harmonious. My </w:t>
@@ -5773,7 +5788,7 @@
         <w:rPr>
           <w:rStyle w:val="FootnoteReference"/>
         </w:rPr>
-        <w:footnoteReference w:id="11"/>
+        <w:footnoteReference w:id="12"/>
       </w:r>
       <w:r>
         <w:t xml:space="preserve"> So a slight delay is perfectly normal. Actually, when you think about it, isn</w:t>
@@ -6036,7 +6051,7 @@
         <w:rPr>
           <w:rStyle w:val="FootnoteReference"/>
         </w:rPr>
-        <w:footnoteReference w:id="12"/>
+        <w:footnoteReference w:id="13"/>
       </w:r>
       <w:r>
         <w:t xml:space="preserve"> They seem to be very popular here. Each episode is only about half an hour long, which fits perfectly into my busy schedule. Most importantly, they</w:t>
@@ -6216,7 +6231,7 @@
         <w:rPr>
           <w:rStyle w:val="FootnoteReference"/>
         </w:rPr>
-        <w:footnoteReference w:id="13"/>
+        <w:footnoteReference w:id="14"/>
       </w:r>
     </w:p>
     <w:p>
@@ -6746,7 +6761,7 @@
         <w:rPr>
           <w:rStyle w:val="FootnoteReference"/>
         </w:rPr>
-        <w:footnoteReference w:id="14"/>
+        <w:footnoteReference w:id="15"/>
       </w:r>
       <w:r>
         <w:t xml:space="preserve"> to me. Sure, the coursework is a bit more demanding than back home, but it</w:t>
@@ -8154,7 +8169,7 @@
         <w:rPr>
           <w:rStyle w:val="FootnoteReference"/>
         </w:rPr>
-        <w:footnoteReference w:id="15"/>
+        <w:footnoteReference w:id="16"/>
       </w:r>
       <w:r>
         <w:t xml:space="preserve"> already. Still, I</w:t>
@@ -8349,7 +8364,7 @@
         <w:rPr>
           <w:rStyle w:val="FootnoteReference"/>
         </w:rPr>
-        <w:footnoteReference w:id="16"/>
+        <w:footnoteReference w:id="17"/>
       </w:r>
       <w:r>
         <w:t xml:space="preserve"> Please don</w:t>
@@ -8724,7 +8739,7 @@
         <w:rPr>
           <w:rStyle w:val="FootnoteReference"/>
         </w:rPr>
-        <w:footnoteReference w:id="17"/>
+        <w:footnoteReference w:id="18"/>
       </w:r>
       <w:r>
         <w:t xml:space="preserve"> all the way through? With Mom</w:t>
@@ -8745,7 +8760,7 @@
         <w:rPr>
           <w:rStyle w:val="FootnoteReference"/>
         </w:rPr>
-        <w:footnoteReference w:id="18"/>
+        <w:footnoteReference w:id="19"/>
       </w:r>
       <w:r>
         <w:t xml:space="preserve">? Did Wang Wei and Xiao Fan join you for the dinner? If so, that must have made things a little better. Otherwise, it must have felt awfully quiet with just the two of you. Above all, please be more careful from now on. </w:t>
@@ -9698,7 +9713,7 @@
         <w:rPr>
           <w:rStyle w:val="FootnoteReference"/>
         </w:rPr>
-        <w:footnoteReference w:id="19"/>
+        <w:footnoteReference w:id="20"/>
       </w:r>
     </w:p>
     <w:p>
@@ -9935,7 +9950,7 @@
         <w:rPr>
           <w:rStyle w:val="FootnoteReference"/>
         </w:rPr>
-        <w:footnoteReference w:id="20"/>
+        <w:footnoteReference w:id="21"/>
       </w:r>
     </w:p>
     <w:p>
@@ -10591,7 +10606,7 @@
         <w:rPr>
           <w:rStyle w:val="FootnoteReference"/>
         </w:rPr>
-        <w:footnoteReference w:id="21"/>
+        <w:footnoteReference w:id="22"/>
       </w:r>
       <w:r>
         <w:t xml:space="preserve"> </w:t>
@@ -12024,7 +12039,7 @@
         <w:rPr>
           <w:rStyle w:val="FootnoteReference"/>
         </w:rPr>
-        <w:footnoteReference w:id="22"/>
+        <w:footnoteReference w:id="23"/>
       </w:r>
       <w:r>
         <w:t xml:space="preserve"> Email is amazingly fast—it only takes a few minutes for a message to get through—so we can use it for anything urgent, or you can simply write to me whenever it</w:t>
@@ -12071,7 +12086,7 @@
         <w:rPr>
           <w:rStyle w:val="FootnoteReference"/>
         </w:rPr>
-        <w:footnoteReference w:id="23"/>
+        <w:footnoteReference w:id="24"/>
       </w:r>
     </w:p>
     <w:p>
@@ -14053,7 +14068,7 @@
         <w:rPr>
           <w:rStyle w:val="FootnoteReference"/>
         </w:rPr>
-        <w:footnoteReference w:id="24"/>
+        <w:footnoteReference w:id="25"/>
       </w:r>
       <w:r>
         <w:t xml:space="preserve">. We flew back to Austin that same night. </w:t>
@@ -14312,7 +14327,7 @@
         <w:rPr>
           <w:rStyle w:val="FootnoteReference"/>
         </w:rPr>
-        <w:footnoteReference w:id="25"/>
+        <w:footnoteReference w:id="26"/>
       </w:r>
       <w:r>
         <w:t>. I assume Mom is out in Chongming</w:t>
@@ -14321,7 +14336,7 @@
         <w:rPr>
           <w:rStyle w:val="FootnoteReference"/>
         </w:rPr>
-        <w:footnoteReference w:id="26"/>
+        <w:footnoteReference w:id="27"/>
       </w:r>
       <w:r>
         <w:t xml:space="preserve"> </w:t>
@@ -14376,7 +14391,7 @@
         <w:rPr>
           <w:rStyle w:val="FootnoteReference"/>
         </w:rPr>
-        <w:footnoteReference w:id="27"/>
+        <w:footnoteReference w:id="28"/>
       </w:r>
       <w:r>
         <w:t>). These are all standard administrative procedures, so there shouldn</w:t>
@@ -14451,7 +14466,7 @@
         <w:rPr>
           <w:rStyle w:val="FootnoteReference"/>
         </w:rPr>
-        <w:footnoteReference w:id="28"/>
+        <w:footnoteReference w:id="29"/>
       </w:r>
       <w:r>
         <w:t xml:space="preserve"> I think next year would be the perfect time. By then, I</w:t>
@@ -14766,7 +14781,7 @@
         <w:rPr>
           <w:rStyle w:val="FootnoteReference"/>
         </w:rPr>
-        <w:footnoteReference w:id="29"/>
+        <w:footnoteReference w:id="30"/>
       </w:r>
       <w:r>
         <w:t xml:space="preserve"> that took effect this month. Please don</w:t>
@@ -14963,7 +14978,7 @@
         <w:rPr>
           <w:rStyle w:val="FootnoteReference"/>
         </w:rPr>
-        <w:footnoteReference w:id="30"/>
+        <w:footnoteReference w:id="31"/>
       </w:r>
       <w:r>
         <w:t xml:space="preserve"> </w:t>
@@ -15526,7 +15541,7 @@
         <w:rPr>
           <w:rStyle w:val="FootnoteReference"/>
         </w:rPr>
-        <w:footnoteReference w:id="31"/>
+        <w:footnoteReference w:id="32"/>
       </w:r>
       <w:r>
         <w:t xml:space="preserve"> </w:t>
@@ -18779,13 +18794,7 @@
         <w:t xml:space="preserve"> </w:t>
       </w:r>
       <w:r>
-        <w:t>On the envelope of this letter, stamped “August 21, 1995,” Dad wrote the following: “Tong</w:t>
-      </w:r>
-      <w:r>
-        <w:t>’</w:t>
-      </w:r>
-      <w:r>
-        <w:t>s first letter from the United States. It took 20 days to arrive.”</w:t>
+        <w:t>In 1995, I graduated from Tsinghua University with a master's degree and was admitted to the Ph.D. program in Computer Science at the University of Texas at Austin.</w:t>
       </w:r>
     </w:p>
   </w:footnote>
@@ -18804,7 +18813,13 @@
         <w:t xml:space="preserve"> </w:t>
       </w:r>
       <w:r>
-        <w:t>For security reasons, no one other than airport staff and passengers was allowed beyond the security checkpoint into the gate area. Mom and Dad waited outside until my plane took off. It was the first time I had ever traveled by air.</w:t>
+        <w:t>On the envelope of this letter, stamped “August 21, 1995,” Dad wrote the following: “Tong</w:t>
+      </w:r>
+      <w:r>
+        <w:t>’</w:t>
+      </w:r>
+      <w:r>
+        <w:t>s first letter from the United States. It took 20 days to arrive.”</w:t>
       </w:r>
     </w:p>
   </w:footnote>
@@ -18823,7 +18838,7 @@
         <w:t xml:space="preserve"> </w:t>
       </w:r>
       <w:r>
-        <w:t>This refers to a landline telephone—for context, cell phones and smartphones did not yet exist for ordinary consumers.</w:t>
+        <w:t>For security reasons, no one other than airport staff and passengers was allowed beyond the security checkpoint into the gate area. Mom and Dad waited outside until my plane took off. It was the first time I had ever traveled by air.</w:t>
       </w:r>
     </w:p>
   </w:footnote>
@@ -18842,13 +18857,7 @@
         <w:t xml:space="preserve"> </w:t>
       </w:r>
       <w:r>
-        <w:t xml:space="preserve">Chun is the young woman I met through a family friend in the summer of 1995, just a </w:t>
-      </w:r>
-      <w:r>
-        <w:t>month</w:t>
-      </w:r>
-      <w:r>
-        <w:t xml:space="preserve"> before I left for the United States.</w:t>
+        <w:t>This refers to a landline telephone—for context, cell phones and smartphones did not yet exist for ordinary consumers.</w:t>
       </w:r>
     </w:p>
   </w:footnote>
@@ -18867,6 +18876,31 @@
         <w:t xml:space="preserve"> </w:t>
       </w:r>
       <w:r>
+        <w:t xml:space="preserve">Chun is the young woman I met through a family friend in the summer of 1995, just a </w:t>
+      </w:r>
+      <w:r>
+        <w:t>month</w:t>
+      </w:r>
+      <w:r>
+        <w:t xml:space="preserve"> before I left for the United States.</w:t>
+      </w:r>
+    </w:p>
+  </w:footnote>
+  <w:footnote w:id="6">
+    <w:p>
+      <w:pPr>
+        <w:pStyle w:val="FootnoteText"/>
+      </w:pPr>
+      <w:r>
+        <w:rPr>
+          <w:rStyle w:val="FootnoteReference"/>
+        </w:rPr>
+        <w:footnoteRef/>
+      </w:r>
+      <w:r>
+        <w:t xml:space="preserve"> </w:t>
+      </w:r>
+      <w:r>
         <w:t xml:space="preserve">The midday nap, known in Chinese as </w:t>
       </w:r>
       <w:proofErr w:type="spellStart"/>
@@ -18883,7 +18917,7 @@
       </w:r>
     </w:p>
   </w:footnote>
-  <w:footnote w:id="6">
+  <w:footnote w:id="7">
     <w:p>
       <w:pPr>
         <w:pStyle w:val="FootnoteText"/>
@@ -18899,25 +18933,6 @@
       </w:r>
       <w:r>
         <w:t>Like the vast majority of people in China, I was raised as an atheist. However, many Chinese immigrants convert to various religions after coming to America.</w:t>
-      </w:r>
-    </w:p>
-  </w:footnote>
-  <w:footnote w:id="7">
-    <w:p>
-      <w:pPr>
-        <w:pStyle w:val="FootnoteText"/>
-      </w:pPr>
-      <w:r>
-        <w:rPr>
-          <w:rStyle w:val="FootnoteReference"/>
-        </w:rPr>
-        <w:footnoteRef/>
-      </w:r>
-      <w:r>
-        <w:t xml:space="preserve"> </w:t>
-      </w:r>
-      <w:r>
-        <w:t>Mooncakes are traditional pastries associated with the Chinese Mid-Autumn Festival. Families share them while gathering, symbolizing reunion and togetherness.</w:t>
       </w:r>
     </w:p>
   </w:footnote>
@@ -18936,7 +18951,7 @@
         <w:t xml:space="preserve"> </w:t>
       </w:r>
       <w:r>
-        <w:t>I was referring to a collect call, a telephone call in which the recipient, rather than the caller, agrees to pay the charges.</w:t>
+        <w:t>Mooncakes are traditional pastries associated with the Chinese Mid-Autumn Festival. Families share them while gathering, symbolizing reunion and togetherness.</w:t>
       </w:r>
     </w:p>
   </w:footnote>
@@ -18952,13 +18967,10 @@
         <w:footnoteRef/>
       </w:r>
       <w:r>
-        <w:t xml:space="preserve"> Wang Wei and Xiao Fan are my sister and </w:t>
-      </w:r>
-      <w:r>
-        <w:t>brother-in-law</w:t>
-      </w:r>
-      <w:r>
-        <w:t>.</w:t>
+        <w:t xml:space="preserve"> </w:t>
+      </w:r>
+      <w:r>
+        <w:t>I was referring to a collect call, a telephone call in which the recipient, rather than the caller, agrees to pay the charges.</w:t>
       </w:r>
     </w:p>
   </w:footnote>
@@ -18974,22 +18986,13 @@
         <w:footnoteRef/>
       </w:r>
       <w:r>
-        <w:t xml:space="preserve"> </w:t>
-      </w:r>
-      <w:r>
-        <w:t xml:space="preserve">In 1995, cross-strait relations between mainland China and Taiwan were at a low point, triggered by </w:t>
-      </w:r>
-      <w:r>
-        <w:t xml:space="preserve">the </w:t>
-      </w:r>
-      <w:r>
-        <w:t>Taiwan leader</w:t>
-      </w:r>
-      <w:r>
-        <w:t>’</w:t>
-      </w:r>
-      <w:r>
-        <w:t>s U.S. visit, leading into the 1995–1996 missile crisis and serious fears of military escalation.</w:t>
+        <w:t xml:space="preserve"> Wang Wei and Xiao Fan are my sister and </w:t>
+      </w:r>
+      <w:r>
+        <w:t>brother-in-law</w:t>
+      </w:r>
+      <w:r>
+        <w:t>.</w:t>
       </w:r>
     </w:p>
   </w:footnote>
@@ -19008,7 +19011,19 @@
         <w:t xml:space="preserve"> </w:t>
       </w:r>
       <w:r>
-        <w:t>In reality, at that time many transoceanic calls went through geostationary satellites, which introduced noticeable latency.</w:t>
+        <w:t xml:space="preserve">In 1995, cross-strait relations between mainland China and Taiwan were at a low point, triggered by </w:t>
+      </w:r>
+      <w:r>
+        <w:t xml:space="preserve">the </w:t>
+      </w:r>
+      <w:r>
+        <w:t>Taiwan leader</w:t>
+      </w:r>
+      <w:r>
+        <w:t>’</w:t>
+      </w:r>
+      <w:r>
+        <w:t>s U.S. visit, leading into the 1995–1996 missile crisis and serious fears of military escalation.</w:t>
       </w:r>
     </w:p>
   </w:footnote>
@@ -19027,6 +19042,25 @@
         <w:t xml:space="preserve"> </w:t>
       </w:r>
       <w:r>
+        <w:t>In reality, at that time many transoceanic calls went through geostationary satellites, which introduced noticeable latency.</w:t>
+      </w:r>
+    </w:p>
+  </w:footnote>
+  <w:footnote w:id="13">
+    <w:p>
+      <w:pPr>
+        <w:pStyle w:val="FootnoteText"/>
+      </w:pPr>
+      <w:r>
+        <w:rPr>
+          <w:rStyle w:val="FootnoteReference"/>
+        </w:rPr>
+        <w:footnoteRef/>
+      </w:r>
+      <w:r>
+        <w:t xml:space="preserve"> </w:t>
+      </w:r>
+      <w:r>
         <w:t xml:space="preserve">My favorite sitcoms, including </w:t>
       </w:r>
       <w:r>
@@ -19059,7 +19093,7 @@
       </w:r>
     </w:p>
   </w:footnote>
-  <w:footnote w:id="13">
+  <w:footnote w:id="14">
     <w:p>
       <w:pPr>
         <w:pStyle w:val="FootnoteText"/>
@@ -19075,25 +19109,6 @@
       </w:r>
       <w:r>
         <w:t>Father was a visiting scholar at Cranfield University in England from 1979 to 1981. The observance of Halloween in England during this period was notably different from that in the United States in the 1990s.</w:t>
-      </w:r>
-    </w:p>
-  </w:footnote>
-  <w:footnote w:id="14">
-    <w:p>
-      <w:pPr>
-        <w:pStyle w:val="FootnoteText"/>
-      </w:pPr>
-      <w:r>
-        <w:rPr>
-          <w:rStyle w:val="FootnoteReference"/>
-        </w:rPr>
-        <w:footnoteRef/>
-      </w:r>
-      <w:r>
-        <w:t xml:space="preserve"> </w:t>
-      </w:r>
-      <w:r>
-        <w:t>Here, "bitter" alludes to the Chinese expression "eating bitterness", meaning to endure hardship with perseverance and without complaint.</w:t>
       </w:r>
     </w:p>
   </w:footnote>
@@ -19112,6 +19127,25 @@
         <w:t xml:space="preserve"> </w:t>
       </w:r>
       <w:r>
+        <w:t>Here, "bitter" alludes to the Chinese expression "eating bitterness", meaning to endure hardship with perseverance and without complaint.</w:t>
+      </w:r>
+    </w:p>
+  </w:footnote>
+  <w:footnote w:id="16">
+    <w:p>
+      <w:pPr>
+        <w:pStyle w:val="FootnoteText"/>
+      </w:pPr>
+      <w:r>
+        <w:rPr>
+          <w:rStyle w:val="FootnoteReference"/>
+        </w:rPr>
+        <w:footnoteRef/>
+      </w:r>
+      <w:r>
+        <w:t xml:space="preserve"> </w:t>
+      </w:r>
+      <w:r>
         <w:t xml:space="preserve">Lantern Festival is the traditional holiday that marks the final day of the Lunar New Year celebrations. People celebrate by eating round rice dumplings called </w:t>
       </w:r>
       <w:r>
@@ -19138,7 +19172,7 @@
       </w:r>
     </w:p>
   </w:footnote>
-  <w:footnote w:id="16">
+  <w:footnote w:id="17">
     <w:p>
       <w:pPr>
         <w:pStyle w:val="FootnoteText"/>
@@ -19154,31 +19188,6 @@
       </w:r>
       <w:r>
         <w:t>When parents visited the United States, children who agreed to sponsor the trip were advised to provide evidence of financial resources, in case consular officers required proof of their ability to support the visit.</w:t>
-      </w:r>
-    </w:p>
-  </w:footnote>
-  <w:footnote w:id="17">
-    <w:p>
-      <w:pPr>
-        <w:pStyle w:val="FootnoteText"/>
-      </w:pPr>
-      <w:r>
-        <w:rPr>
-          <w:rStyle w:val="FootnoteReference"/>
-        </w:rPr>
-        <w:footnoteRef/>
-      </w:r>
-      <w:r>
-        <w:t xml:space="preserve"> </w:t>
-      </w:r>
-      <w:r>
-        <w:t>The Gala is a live TV show featuring music, dance, and comedy performances, held annually on Chinese New Year</w:t>
-      </w:r>
-      <w:r>
-        <w:t>’</w:t>
-      </w:r>
-      <w:r>
-        <w:t>s Eve since 1983. It is considered as the most-watched TV broadcast on the planet. The broadcast typically spans several hours and leads up to the midnight countdown.</w:t>
       </w:r>
     </w:p>
   </w:footnote>
@@ -19197,13 +19206,13 @@
         <w:t xml:space="preserve"> </w:t>
       </w:r>
       <w:r>
-        <w:t>The Chinese New Year</w:t>
-      </w:r>
-      <w:r>
-        <w:t>’</w:t>
-      </w:r>
-      <w:r>
-        <w:t>s Eve dinner, widely known as the Reunion Dinner, is the most important family meal of the year.</w:t>
+        <w:t>The Gala is a live TV show featuring music, dance, and comedy performances, held annually on Chinese New Year</w:t>
+      </w:r>
+      <w:r>
+        <w:t>’</w:t>
+      </w:r>
+      <w:r>
+        <w:t>s Eve since 1983. It is considered as the most-watched TV broadcast on the planet. The broadcast typically spans several hours and leads up to the midnight countdown.</w:t>
       </w:r>
     </w:p>
   </w:footnote>
@@ -19222,13 +19231,13 @@
         <w:t xml:space="preserve"> </w:t>
       </w:r>
       <w:r>
-        <w:t>Bell Labs was one of the world</w:t>
-      </w:r>
-      <w:r>
-        <w:t>’</w:t>
-      </w:r>
-      <w:r>
-        <w:t>s premier industrial research laboratories, renowned for innovations like the transistor, the laser, and the Unix operating system that helped shape modern computing and telecommunications.</w:t>
+        <w:t>The Chinese New Year</w:t>
+      </w:r>
+      <w:r>
+        <w:t>’</w:t>
+      </w:r>
+      <w:r>
+        <w:t>s Eve dinner, widely known as the Reunion Dinner, is the most important family meal of the year.</w:t>
       </w:r>
     </w:p>
   </w:footnote>
@@ -19247,25 +19256,13 @@
         <w:t xml:space="preserve"> </w:t>
       </w:r>
       <w:r>
-        <w:t>Father was a college professor in aerodynamics. He used computers and numerical algorithms to simulate</w:t>
-      </w:r>
-      <w:r>
-        <w:t xml:space="preserve"> and </w:t>
-      </w:r>
-      <w:r>
-        <w:t>analyze</w:t>
-      </w:r>
-      <w:r>
-        <w:t xml:space="preserve"> </w:t>
-      </w:r>
-      <w:r>
-        <w:t>how fluid flow</w:t>
-      </w:r>
-      <w:r>
-        <w:t>s</w:t>
-      </w:r>
-      <w:r>
-        <w:t xml:space="preserve"> in and around objects.</w:t>
+        <w:t>Bell Labs was one of the world</w:t>
+      </w:r>
+      <w:r>
+        <w:t>’</w:t>
+      </w:r>
+      <w:r>
+        <w:t>s premier industrial research laboratories, renowned for innovations like the transistor, the laser, and the Unix operating system that helped shape modern computing and telecommunications.</w:t>
       </w:r>
     </w:p>
   </w:footnote>
@@ -19284,13 +19281,25 @@
         <w:t xml:space="preserve"> </w:t>
       </w:r>
       <w:r>
-        <w:t xml:space="preserve">Mother enjoyed collecting coins. She began a modest coin collection after </w:t>
-      </w:r>
-      <w:r>
-        <w:t>f</w:t>
-      </w:r>
-      <w:r>
-        <w:t>ather returned from England in 1981 with several foreign coins.</w:t>
+        <w:t>Father was a college professor in aerodynamics. He used computers and numerical algorithms to simulate</w:t>
+      </w:r>
+      <w:r>
+        <w:t xml:space="preserve"> and </w:t>
+      </w:r>
+      <w:r>
+        <w:t>analyze</w:t>
+      </w:r>
+      <w:r>
+        <w:t xml:space="preserve"> </w:t>
+      </w:r>
+      <w:r>
+        <w:t>how fluid flow</w:t>
+      </w:r>
+      <w:r>
+        <w:t>s</w:t>
+      </w:r>
+      <w:r>
+        <w:t xml:space="preserve"> in and around objects.</w:t>
       </w:r>
     </w:p>
   </w:footnote>
@@ -19309,7 +19318,13 @@
         <w:t xml:space="preserve"> </w:t>
       </w:r>
       <w:r>
-        <w:t>Around 1996, the internet and email were not yet widely used in China. With a few exceptions in academic settings, most computers at home or in the workplace were not connected to the internet.</w:t>
+        <w:t xml:space="preserve">Mother enjoyed collecting coins. She began a modest coin collection after </w:t>
+      </w:r>
+      <w:r>
+        <w:t>f</w:t>
+      </w:r>
+      <w:r>
+        <w:t>ather returned from England in 1981 with several foreign coins.</w:t>
       </w:r>
     </w:p>
   </w:footnote>
@@ -19328,7 +19343,7 @@
         <w:t xml:space="preserve"> </w:t>
       </w:r>
       <w:r>
-        <w:t>Arranged matchmaking was relatively common in China at the time. I, too, met Chun through this kind of introduction.</w:t>
+        <w:t>Around 1996, the internet and email were not yet widely used in China. With a few exceptions in academic settings, most computers at home or in the workplace were not connected to the internet.</w:t>
       </w:r>
     </w:p>
   </w:footnote>
@@ -19347,7 +19362,7 @@
         <w:t xml:space="preserve"> </w:t>
       </w:r>
       <w:r>
-        <w:t>Cantonese is a Chinese language traditionally spoken in Guangdong Province, Hong Kong, and many overseas Chinese communities. Unlike the Mandarin spoken in Beijing, Cantonese differs significantly in pronunciation, vocabulary, and tone.</w:t>
+        <w:t>Arranged matchmaking was relatively common in China at the time. I, too, met Chun through this kind of introduction.</w:t>
       </w:r>
     </w:p>
   </w:footnote>
@@ -19366,7 +19381,7 @@
         <w:t xml:space="preserve"> </w:t>
       </w:r>
       <w:r>
-        <w:t>The Qingming Festival is a traditional Chinese holiday observed in early April to honor deceased ancestors and welcome the arrival of spring.</w:t>
+        <w:t>Cantonese is a Chinese language traditionally spoken in Guangdong Province, Hong Kong, and many overseas Chinese communities. Unlike the Mandarin spoken in Beijing, Cantonese differs significantly in pronunciation, vocabulary, and tone.</w:t>
       </w:r>
     </w:p>
   </w:footnote>
@@ -19382,16 +19397,10 @@
         <w:footnoteRef/>
       </w:r>
       <w:r>
-        <w:t xml:space="preserve"> </w:t>
-      </w:r>
-      <w:r>
-        <w:t>Chongming, once a largely rural part of Shanghai, is Mom</w:t>
-      </w:r>
-      <w:r>
-        <w:t>’</w:t>
-      </w:r>
-      <w:r>
-        <w:t>s hometown.</w:t>
+        <w:t xml:space="preserve">The Qingming Festival is a traditional Chinese holiday observed in early April to honor deceased ancestors by visiting and tending their </w:t>
+      </w:r>
+      <w:r>
+        <w:t>graves.</w:t>
       </w:r>
     </w:p>
   </w:footnote>
@@ -19410,7 +19419,13 @@
         <w:t xml:space="preserve"> </w:t>
       </w:r>
       <w:r>
-        <w:t>Optional Practical Training is a period during which international students on an F-1 visa can work in the U.S. in a job related to their field of study.</w:t>
+        <w:t>Chongming, once a largely rural part of Shanghai, is Mom</w:t>
+      </w:r>
+      <w:r>
+        <w:t>’</w:t>
+      </w:r>
+      <w:r>
+        <w:t>s hometown.</w:t>
       </w:r>
     </w:p>
   </w:footnote>
@@ -19429,19 +19444,7 @@
         <w:t xml:space="preserve"> </w:t>
       </w:r>
       <w:r>
-        <w:t>Due to the complexities and uncertainties of U.S. immigration law, traveling back to one</w:t>
-      </w:r>
-      <w:r>
-        <w:t>’</w:t>
-      </w:r>
-      <w:r>
-        <w:t xml:space="preserve">s home country carried certain risk and was generally discouraged while on </w:t>
-      </w:r>
-      <w:r>
-        <w:t xml:space="preserve">a </w:t>
-      </w:r>
-      <w:r>
-        <w:t>work visa.</w:t>
+        <w:t>Optional Practical Training is a period during which international students on an F-1 visa can work in the U.S. in a job related to their field of study.</w:t>
       </w:r>
     </w:p>
   </w:footnote>
@@ -19460,7 +19463,19 @@
         <w:t xml:space="preserve"> </w:t>
       </w:r>
       <w:r>
-        <w:t>The Illegal Immigration Reform and Immigrant Responsibility Act of 1996 (IIRIRA) was signed into law on September 30, 1996. Most of its major provisions took effect on April 1, 1997. The law significantly expanded immigration enforcement and overhauled many aspects of U.S. immigration law, raising concerns among many immigrants and international students.</w:t>
+        <w:t>Due to the complexities and uncertainties of U.S. immigration law, traveling back to one</w:t>
+      </w:r>
+      <w:r>
+        <w:t>’</w:t>
+      </w:r>
+      <w:r>
+        <w:t xml:space="preserve">s home country carried certain risk and was generally discouraged while on </w:t>
+      </w:r>
+      <w:r>
+        <w:t xml:space="preserve">a </w:t>
+      </w:r>
+      <w:r>
+        <w:t>work visa.</w:t>
       </w:r>
     </w:p>
   </w:footnote>
@@ -19479,11 +19494,30 @@
         <w:t xml:space="preserve"> </w:t>
       </w:r>
       <w:r>
-        <w:t>Before GPS became commonplace, people relied on paper maps for navigation. On long trips, it was often helpful to have a passenger read the map while the driver kept their eyes on the road.</w:t>
+        <w:t>The Illegal Immigration Reform and Immigrant Responsibility Act of 1996 (IIRIRA) was signed into law on September 30, 1996. Most of its major provisions took effect on April 1, 1997. The law significantly expanded immigration enforcement and overhauled many aspects of U.S. immigration law, raising concerns among many immigrants and international students.</w:t>
       </w:r>
     </w:p>
   </w:footnote>
   <w:footnote w:id="31">
+    <w:p>
+      <w:pPr>
+        <w:pStyle w:val="FootnoteText"/>
+      </w:pPr>
+      <w:r>
+        <w:rPr>
+          <w:rStyle w:val="FootnoteReference"/>
+        </w:rPr>
+        <w:footnoteRef/>
+      </w:r>
+      <w:r>
+        <w:t xml:space="preserve"> </w:t>
+      </w:r>
+      <w:r>
+        <w:t>Before GPS became commonplace, people relied on paper maps for navigation. On long trips, it was often helpful to have a passenger read the map while the driver kept their eyes on the road.</w:t>
+      </w:r>
+    </w:p>
+  </w:footnote>
+  <w:footnote w:id="32">
     <w:p>
       <w:pPr>
         <w:pStyle w:val="FootnoteText"/>

</xml_diff>

<commit_message>
chapter 8, 9 revision
</commit_message>
<xml_diff>
--- a/letters_from_usa/book.docx
+++ b/letters_from_usa/book.docx
@@ -5509,13 +5509,21 @@
         <w:t>’</w:t>
       </w:r>
       <w:r>
-        <w:t>t have much money left in my checking account, so I checked my balance over the phone. To my surprise, there was actually $1,140 in it! As it turns out, today is the last day of September, which means it</w:t>
-      </w:r>
-      <w:r>
-        <w:t>’</w:t>
-      </w:r>
-      <w:r>
-        <w:t>s payday.</w:t>
+        <w:t xml:space="preserve">t have much money left in my checking account, so I checked my balance over the phone. To my surprise, there was actually $1,140 in it! As it turns out, today is the last day of September, which means </w:t>
+      </w:r>
+      <w:proofErr w:type="gramStart"/>
+      <w:r>
+        <w:t>it</w:t>
+      </w:r>
+      <w:r>
+        <w:t>’</w:t>
+      </w:r>
+      <w:r>
+        <w:t>s</w:t>
+      </w:r>
+      <w:proofErr w:type="gramEnd"/>
+      <w:r>
+        <w:t xml:space="preserve"> payday.</w:t>
       </w:r>
     </w:p>
     <w:p>
@@ -6071,7 +6079,15 @@
         <w:pStyle w:val="CSP-ChapterBodyText"/>
       </w:pPr>
       <w:r>
-        <w:t>My apartment lease is up at the end of February. I could renew it, but if possible, I</w:t>
+        <w:t xml:space="preserve">My apartment lease is up at the end of February. I could renew it, </w:t>
+      </w:r>
+      <w:proofErr w:type="gramStart"/>
+      <w:r>
+        <w:t>but</w:t>
+      </w:r>
+      <w:proofErr w:type="gramEnd"/>
+      <w:r>
+        <w:t xml:space="preserve"> if possible, I</w:t>
       </w:r>
       <w:r>
         <w:t>’</w:t>
@@ -6163,6 +6179,7 @@
       <w:r>
         <w:t xml:space="preserve">m not entirely sure how to translate it into Chinese—maybe </w:t>
       </w:r>
+      <w:proofErr w:type="spellStart"/>
       <w:r>
         <w:rPr>
           <w:i/>
@@ -6182,8 +6199,25 @@
           <w:i/>
           <w:iCs w:val="0"/>
         </w:rPr>
-        <w:t>hèng Jié</w:t>
-      </w:r>
+        <w:t>hèng</w:t>
+      </w:r>
+      <w:proofErr w:type="spellEnd"/>
+      <w:r>
+        <w:rPr>
+          <w:i/>
+          <w:iCs w:val="0"/>
+        </w:rPr>
+        <w:t xml:space="preserve"> </w:t>
+      </w:r>
+      <w:proofErr w:type="spellStart"/>
+      <w:r>
+        <w:rPr>
+          <w:i/>
+          <w:iCs w:val="0"/>
+        </w:rPr>
+        <w:t>Jié</w:t>
+      </w:r>
+      <w:proofErr w:type="spellEnd"/>
       <w:r>
         <w:t>—but it</w:t>
       </w:r>
@@ -7089,407 +7123,168 @@
         <w:pStyle w:val="CSP-ChapterBodyText"/>
       </w:pPr>
       <w:r>
-        <w:t>Dear Dad and Mom,</w:t>
-      </w:r>
-    </w:p>
-    <w:p>
-      <w:pPr>
-        <w:spacing w:after="0" w:line="240" w:lineRule="auto"/>
-        <w:ind w:firstLine="288"/>
-        <w:jc w:val="both"/>
-        <w:rPr>
-          <w:rFonts w:ascii="Garamond" w:hAnsi="Garamond"/>
-          <w:iCs/>
-        </w:rPr>
-      </w:pPr>
-    </w:p>
-    <w:p>
-      <w:pPr>
-        <w:pStyle w:val="CSP-ChapterBodyText"/>
-      </w:pPr>
-      <w:r>
-        <w:t>Winter break started about ten days ago. Since then, things have been pretty relaxed. When I</w:t>
-      </w:r>
-      <w:r>
-        <w:t>’</w:t>
-      </w:r>
-      <w:r>
-        <w:t>m not doing anything, I just watch TV or head over to campus to use the computers. Getting to school is a bit more of a hassle right now because the campus shuttles aren</w:t>
-      </w:r>
-      <w:r>
-        <w:t>’</w:t>
-      </w:r>
-      <w:r>
-        <w:t>t running, so I have to take the regular city bus. I ended up getting straight A</w:t>
-      </w:r>
-      <w:r>
-        <w:t>’</w:t>
-      </w:r>
-      <w:r>
-        <w:t>s in all three of my classes this semester, which I pretty much expected. It definitely gives me a lot more confidence about my coursework going forward. I</w:t>
-      </w:r>
-      <w:r>
-        <w:t>’</w:t>
-      </w:r>
-      <w:r>
-        <w:t>ll be taking another three classes next semester. I don</w:t>
-      </w:r>
-      <w:r>
-        <w:t>’</w:t>
-      </w:r>
-      <w:r>
-        <w:t>t know what class I</w:t>
-      </w:r>
-      <w:r>
-        <w:t>’</w:t>
-      </w:r>
-      <w:r>
-        <w:t xml:space="preserve">ll be </w:t>
-      </w:r>
-      <w:r>
-        <w:t>TA-ing</w:t>
-      </w:r>
-      <w:r>
-        <w:t xml:space="preserve"> for yet, but I</w:t>
-      </w:r>
-      <w:r>
-        <w:t>’</w:t>
-      </w:r>
-      <w:r>
-        <w:t>m hoping for a lighter workload. The spring semester officially kicks off on January 16th.</w:t>
-      </w:r>
-    </w:p>
-    <w:p>
-      <w:pPr>
-        <w:spacing w:after="0" w:line="240" w:lineRule="auto"/>
-        <w:ind w:firstLine="288"/>
-        <w:jc w:val="both"/>
-        <w:rPr>
-          <w:rFonts w:ascii="Garamond" w:hAnsi="Garamond"/>
-          <w:iCs/>
-        </w:rPr>
-      </w:pPr>
-    </w:p>
-    <w:p>
-      <w:pPr>
-        <w:pStyle w:val="CSP-ChapterBodyText"/>
-      </w:pPr>
-      <w:r>
-        <w:t>Christmas wasn</w:t>
-      </w:r>
-      <w:r>
-        <w:t>’</w:t>
-      </w:r>
-      <w:r>
-        <w:t>t overly lively, especially among the Chinese students, but the holiday lights are absolutely beautiful. Americans love decorating their houses, trees and streets with countless little lights—it looks amazing at night. On one little street, the neighbors have turned decorating into a tradition. People from all over Austin drive in just to see the lights, causing traffic jams that stretch for blocks. Christmas over here is just like Chinese New Year back home; everyone heads home to be with family, and almost all the shops and restaurants are closed for the day.</w:t>
-      </w:r>
-    </w:p>
-    <w:p>
-      <w:pPr>
-        <w:pStyle w:val="CSP-ChapterBodyText"/>
-      </w:pPr>
-    </w:p>
-    <w:p>
-      <w:pPr>
-        <w:pStyle w:val="CSP-ChapterBodyText"/>
-      </w:pPr>
+        <w:t>I received both of your letters, dated December 5th and 17th. I think it's wonderful that Mom is retiring next year. It'll be such a relief, and it should be much better for your health. Dad, I took care of that thing you asked me to do. You should be receiving two packages soon—one containing application materials, and the other information from the Mechanical Engineering Department. I hope they get to you soon.</w:t>
+      </w:r>
+    </w:p>
+    <w:p>
+      <w:pPr>
+        <w:pStyle w:val="CSP-ChapterBodyText"/>
+      </w:pPr>
+    </w:p>
+    <w:p>
+      <w:pPr>
+        <w:pStyle w:val="CSP-ChapterBodyText"/>
+      </w:pPr>
+      <w:r>
+        <w:t>Mom, you mentioned in the letter that some articles you've read make America sound terrifying. Honestly, that’s not been my experience at all—it really just depends on where you live. Austin is a mid-sized college town, and relatively speaking, it's very safe. Don't worry, I'll keep looking out for myself.</w:t>
+      </w:r>
+    </w:p>
+    <w:p>
+      <w:pPr>
+        <w:pStyle w:val="CSP-ChapterBodyText"/>
+      </w:pPr>
+    </w:p>
+    <w:p>
+      <w:pPr>
+        <w:pStyle w:val="CSP-ChapterBodyText"/>
+      </w:pPr>
+      <w:r>
+        <w:t>From now on, I'll be the one calling home to save you the expense. I'll probably call every couple of weeks, around noon on weekends. My phone bills are actually quite low because I keep my calls short, unlike some who can easily talk for twenty or thirty minutes. Mom, don't get nervous whenever you are on an international call. It really doesn't cost that much. A five-minute call costs about the same as a fast-food meal. Even though money is tight, I can certainly afford to call home, so please don't worry about it.</w:t>
+      </w:r>
+    </w:p>
+    <w:p>
+      <w:pPr>
+        <w:pStyle w:val="CSP-ChapterBodyText"/>
+      </w:pPr>
+    </w:p>
+    <w:p>
+      <w:pPr>
+        <w:pStyle w:val="CSP-ChapterBodyText"/>
+      </w:pPr>
+      <w:r>
+        <w:t xml:space="preserve">Winter break started about ten days ago. Since then, things have been pretty relaxed. When I'm not doing anything, I just watch </w:t>
+      </w:r>
       <w:r>
         <w:lastRenderedPageBreak/>
-        <w:t>A friend of mine originally invited me and a few others to Louisiana to check out the casinos—mostly just to see what they were like. But on Christmas morning, even though I got up at 5:30 a.m., I still missed the bus! So</w:t>
-      </w:r>
-      <w:r>
-        <w:t>,</w:t>
-      </w:r>
-      <w:r>
-        <w:t xml:space="preserve"> we changed our plans and went to San Antonio instead. San Antonio is a tourist city, famous for its River Walk. It</w:t>
-      </w:r>
-      <w:r>
-        <w:t>’</w:t>
-      </w:r>
-      <w:r>
-        <w:t>s a canal lined with restaurants on both sides, and the scenery is gorgeous. It</w:t>
-      </w:r>
-      <w:r>
-        <w:t>’</w:t>
-      </w:r>
-      <w:r>
-        <w:t>s so picturesque that it actually reminded me of the classical gardens in Suzhou, which really made me homesick.</w:t>
-      </w:r>
-    </w:p>
-    <w:p>
-      <w:pPr>
-        <w:pStyle w:val="CSP-ChapterBodyText"/>
-      </w:pPr>
-    </w:p>
-    <w:p>
-      <w:pPr>
-        <w:pStyle w:val="CSP-ChapterBodyText"/>
-      </w:pPr>
-      <w:r>
-        <w:t>Two or three weeks ago, I sent out some credit card applications, and a bunch of them just came through. I got a Citibank Visa, an AT&amp;T MasterCard, and a Discover card. I managed to get approved for all the major ones! My combined credit limit is $2,100, which is more than enough for me. Buying things will be so convenient from now on that I can just use a card. Plus, it</w:t>
-      </w:r>
-      <w:r>
-        <w:t>’</w:t>
-      </w:r>
-      <w:r>
-        <w:t>s really important to start building up my credit history early.</w:t>
-      </w:r>
-    </w:p>
-    <w:p>
-      <w:pPr>
-        <w:pStyle w:val="CSP-ChapterBodyText"/>
-      </w:pPr>
-    </w:p>
-    <w:p>
-      <w:pPr>
-        <w:pStyle w:val="CSP-ChapterBodyText"/>
-      </w:pPr>
-      <w:r>
-        <w:t>In about two weeks, I</w:t>
-      </w:r>
-      <w:r>
-        <w:t>’</w:t>
-      </w:r>
-      <w:r>
-        <w:t>m moving. Coincidentally, our Taiwanese neighbor</w:t>
-      </w:r>
-      <w:r>
-        <w:t>, Yao-zhu,</w:t>
-      </w:r>
-      <w:r>
-        <w:t xml:space="preserve"> is moving out too because she just bought a mobile home. It</w:t>
-      </w:r>
-      <w:r>
-        <w:t>’</w:t>
-      </w:r>
-      <w:r>
-        <w:t>s basically a house on wheels. She paid $8,000 for it and told me that it</w:t>
-      </w:r>
-      <w:r>
-        <w:t>’</w:t>
-      </w:r>
-      <w:r>
-        <w:t>s really nice—two bedrooms, a living room, a kitchen, a bathroom, and it even comes with a washer and dryer. The neighborhood seems great too. She repeatedly asked me to be her tenant, offering me rent for $200 a month plus half the utilities, which sounded tempting. At the time, though, I was already negotiating with that American student, and rooming with him would run me closer to $330. Compared to that, her mobile home was cheaper and just as nice, so I turned down the American student and told her I</w:t>
-      </w:r>
-      <w:r>
-        <w:t>’</w:t>
-      </w:r>
-      <w:r>
-        <w:t>d take it. But then a few days later, the guy called back and said he</w:t>
-      </w:r>
-      <w:r>
-        <w:t>’</w:t>
-      </w:r>
-      <w:r>
-        <w:t>d lower my share to $300. It left me feeling torn. In the end, I decided to go with him after all, so now I</w:t>
-      </w:r>
-      <w:r>
-        <w:t>’</w:t>
-      </w:r>
-      <w:r>
-        <w:t>m actually helping her find another roommate.</w:t>
-      </w:r>
-    </w:p>
-    <w:p>
-      <w:pPr>
-        <w:pStyle w:val="CSP-ChapterBodyText"/>
-      </w:pPr>
-    </w:p>
-    <w:p>
-      <w:pPr>
-        <w:pStyle w:val="CSP-ChapterBodyText"/>
-      </w:pPr>
-      <w:r>
-        <w:t>From now on, I</w:t>
-      </w:r>
-      <w:r>
-        <w:t>’</w:t>
-      </w:r>
-      <w:r>
-        <w:t xml:space="preserve">ll be the one calling home to save you the </w:t>
+        <w:t xml:space="preserve">TV or head over to campus to use the computers. Getting to school is a bit more of a hassle right now because the campus shuttles aren't running, so I have to take the regular city bus. I ended up getting straight </w:t>
+      </w:r>
+      <w:proofErr w:type="gramStart"/>
+      <w:r>
+        <w:t>A's</w:t>
+      </w:r>
+      <w:proofErr w:type="gramEnd"/>
+      <w:r>
+        <w:t xml:space="preserve"> in all three of my classes this semester, which I pretty much expected. It definitely gives me a lot more confidence about my coursework going forward. I'll be taking another three classes next semester. I don't know what class I'll be TA-</w:t>
+      </w:r>
+      <w:proofErr w:type="spellStart"/>
+      <w:r>
+        <w:t>ing</w:t>
+      </w:r>
+      <w:proofErr w:type="spellEnd"/>
+      <w:r>
+        <w:t xml:space="preserve"> for yet, but I'm hoping for a lighter workload. The spring semester officially kicks off on January 16th.</w:t>
+      </w:r>
+    </w:p>
+    <w:p>
+      <w:pPr>
+        <w:pStyle w:val="CSP-ChapterBodyText"/>
+      </w:pPr>
+    </w:p>
+    <w:p>
+      <w:pPr>
+        <w:pStyle w:val="CSP-ChapterBodyText"/>
+      </w:pPr>
+      <w:r>
+        <w:t>Christmas wasn't overly lively, especially among the Chinese students, but the holiday lights are absolutely beautiful. Americans love decorating their houses, trees and streets with countless little lights—it looks amazing at night. On one little street, the neighbors have turned decorating into a tradition, and people from all over Austin drive in just to see the lights, causing traffic jams that stretch for blocks. Christmas over here is just like Chinese New Year back home; everyone heads home to be with family, and almost all the shops and restaurants are closed for the day.</w:t>
+      </w:r>
+    </w:p>
+    <w:p>
+      <w:pPr>
+        <w:pStyle w:val="CSP-ChapterBodyText"/>
+      </w:pPr>
+    </w:p>
+    <w:p>
+      <w:pPr>
+        <w:pStyle w:val="CSP-ChapterBodyText"/>
+      </w:pPr>
+      <w:r>
+        <w:t>A friend of mine originally invited me and a few others to Louisiana to check out the casinos—mostly just to see what they were like. But on Christmas morning, even though we got up at 5:30 a.m., we still missed the bus! So, we changed our plans and went to San Antonio instead. San Antonio is a tourist city, famous for its River Walk. It's a canal lined with restaurants on both sides, and the scenery is gorgeous. It's so picturesque that it actually reminded me of the classical gardens in Suzhou, which really made me homesick.</w:t>
+      </w:r>
+    </w:p>
+    <w:p>
+      <w:pPr>
+        <w:pStyle w:val="CSP-ChapterBodyText"/>
+      </w:pPr>
+    </w:p>
+    <w:p>
+      <w:pPr>
+        <w:pStyle w:val="CSP-ChapterBodyText"/>
+      </w:pPr>
+      <w:r>
+        <w:t xml:space="preserve">Two or three weeks ago, I sent out some credit card applications, and a bunch of them just came through. I got a Citibank Visa, an AT&amp;T MasterCard, and a Discover card. I managed to get approved for all the major ones! My combined credit limit is $2,100, which is more than enough for me. Buying </w:t>
       </w:r>
       <w:r>
         <w:lastRenderedPageBreak/>
-        <w:t>expense. I</w:t>
-      </w:r>
-      <w:r>
-        <w:t>’</w:t>
-      </w:r>
-      <w:r>
-        <w:t>ll probably call every couple of weeks, around noon on the weekends. My phone bills are actually quite low because I keep my calls short, unlike some who can easily talk for twenty or thirty minutes. Mom, don</w:t>
-      </w:r>
-      <w:r>
-        <w:t>’</w:t>
-      </w:r>
-      <w:r>
-        <w:t>t get nervous whenever you are on an international call. It really doesn</w:t>
-      </w:r>
-      <w:r>
-        <w:t>’</w:t>
-      </w:r>
-      <w:r>
-        <w:t>t cost that much. A five-minute call costs about the same as a fast-food meal. Even though money is tight, I can certainly afford to call home, so please don</w:t>
-      </w:r>
-      <w:r>
-        <w:t>’</w:t>
-      </w:r>
-      <w:r>
-        <w:t>t worry about it.</w:t>
-      </w:r>
-    </w:p>
-    <w:p>
-      <w:pPr>
-        <w:pStyle w:val="CSP-ChapterBodyText"/>
-      </w:pPr>
-    </w:p>
-    <w:p>
-      <w:pPr>
-        <w:pStyle w:val="CSP-ChapterBodyText"/>
-      </w:pPr>
-      <w:r>
-        <w:t>Mom, you mentioned in your letter that some articles you</w:t>
-      </w:r>
-      <w:r>
-        <w:t>’</w:t>
-      </w:r>
-      <w:r>
-        <w:t>ve read make America sound terrifying. Honestly, it</w:t>
-      </w:r>
-      <w:r>
-        <w:t>’</w:t>
-      </w:r>
-      <w:r>
-        <w:t>s not like that at all—it really just depends on where you live. Austin is a mid-sized college town, so relatively speaking, it</w:t>
-      </w:r>
-      <w:r>
-        <w:t>’</w:t>
-      </w:r>
-      <w:r>
-        <w:t>s very safe. Don</w:t>
-      </w:r>
-      <w:r>
-        <w:t>’</w:t>
-      </w:r>
-      <w:r>
-        <w:t>t worry, I</w:t>
-      </w:r>
-      <w:r>
-        <w:t>’</w:t>
-      </w:r>
-      <w:r>
-        <w:t>ll keep looking out for myself.</w:t>
-      </w:r>
-    </w:p>
-    <w:p>
-      <w:pPr>
-        <w:pStyle w:val="CSP-ChapterBodyText"/>
-      </w:pPr>
-    </w:p>
-    <w:p>
-      <w:pPr>
-        <w:pStyle w:val="CSP-ChapterBodyText"/>
-      </w:pPr>
-      <w:r>
-        <w:t>I think it</w:t>
-      </w:r>
-      <w:r>
-        <w:t>’</w:t>
-      </w:r>
-      <w:r>
-        <w:t>s wonderful that Mom is retiring next year. It</w:t>
-      </w:r>
-      <w:r>
-        <w:t>’</w:t>
-      </w:r>
-      <w:r>
-        <w:t>ll be a nice relief, and it should be much better for her health. Dad, I took care of that thing you asked me to do. You should be receiving two packages soon—one containing application materials, and the other information from the Mechanical Engineering Department. I hope they get to you soon.</w:t>
-      </w:r>
-    </w:p>
-    <w:p>
-      <w:pPr>
-        <w:pStyle w:val="CSP-ChapterBodyText"/>
-      </w:pPr>
-    </w:p>
-    <w:p>
-      <w:pPr>
-        <w:pStyle w:val="CSP-ChapterBodyText"/>
-      </w:pPr>
-      <w:r>
-        <w:t>It</w:t>
-      </w:r>
-      <w:r>
-        <w:t>’</w:t>
-      </w:r>
-      <w:r>
-        <w:t xml:space="preserve">s such a shame that the Christmas card I sent you never arrived. I must not have put enough postage on it, and it probably got lost in transit somewhere. The card I sent to </w:t>
-      </w:r>
-      <w:r>
-        <w:t>Chun</w:t>
-      </w:r>
-      <w:r>
-        <w:t xml:space="preserve"> might be lost too, so I</w:t>
-      </w:r>
-      <w:r>
-        <w:t>’</w:t>
-      </w:r>
-      <w:r>
-        <w:t>ll write to her later to explain. I gave her a call two days ago, but she wasn</w:t>
-      </w:r>
-      <w:r>
-        <w:t>’</w:t>
-      </w:r>
-      <w:r>
-        <w:t xml:space="preserve">t in her office, so I just left a message with someone. Nothing urgent—just wanted to call and wish her a Happy New Year. Whether you invite </w:t>
-      </w:r>
-      <w:r>
-        <w:t>Chun</w:t>
-      </w:r>
-      <w:r>
-        <w:t xml:space="preserve"> over during the winter break is entirely up to you. I have a feeling she</w:t>
-      </w:r>
-      <w:r>
-        <w:t>’</w:t>
-      </w:r>
-      <w:r>
-        <w:t>ll probably call to wish you a Happy New Year. Things between us aren</w:t>
-      </w:r>
-      <w:r>
-        <w:t>’</w:t>
-      </w:r>
-      <w:r>
-        <w:t>t moving very quick</w:t>
-      </w:r>
-      <w:r>
-        <w:t>l</w:t>
-      </w:r>
-      <w:r>
-        <w:t>y, and I haven</w:t>
-      </w:r>
-      <w:r>
-        <w:t>’</w:t>
-      </w:r>
-      <w:r>
-        <w:t>t been trying hard enough either. I suppose the long distance makes it tough, and I honestly have no idea what the future holds. If she actually manages to get into UT Austin, it would truly be a miracle.</w:t>
-      </w:r>
-    </w:p>
-    <w:p>
-      <w:pPr>
-        <w:pStyle w:val="CSP-ChapterBodyText"/>
-      </w:pPr>
-    </w:p>
-    <w:p>
-      <w:pPr>
-        <w:pStyle w:val="CSP-ChapterBodyText"/>
-      </w:pPr>
+        <w:t>things will be so convenient from now on that I can just use a card. Plus, it's really important to start building up my credit history early.</w:t>
+      </w:r>
+    </w:p>
+    <w:p>
+      <w:pPr>
+        <w:pStyle w:val="CSP-ChapterBodyText"/>
+      </w:pPr>
+    </w:p>
+    <w:p>
+      <w:pPr>
+        <w:pStyle w:val="CSP-ChapterBodyText"/>
+      </w:pPr>
+      <w:r>
+        <w:t>In about two weeks, I'm moving. Coincidentally, our Taiwanese neighbor, Yao-</w:t>
+      </w:r>
+      <w:proofErr w:type="spellStart"/>
+      <w:r>
+        <w:t>zhu</w:t>
+      </w:r>
+      <w:proofErr w:type="spellEnd"/>
+      <w:r>
+        <w:t>, is moving out too because she just bought a mobile home. It's basically a house on wheels. She paid $8,000 for it and told me that it's really nice—two bedrooms, a living room, a kitchen, a bathroom, and it even comes with a washer and dryer. The neighborhood seems nice too. She repeatedly asked me to be her tenant, offering me rent for $200 a month plus half the utilities, which sounded tempting. At the time, though, I was already negotiating with that American student, and rooming with him would run me closer to $330. Compared to that, her mobile home was cheaper and just as nice, so I turned down the American student and told Yao-</w:t>
+      </w:r>
+      <w:proofErr w:type="spellStart"/>
+      <w:r>
+        <w:t>zhu</w:t>
+      </w:r>
+      <w:proofErr w:type="spellEnd"/>
+      <w:r>
+        <w:t xml:space="preserve"> I'd take it. But then a few days later, the guy called back and said he'd lower my share to $300. It left me feeling torn. In the end, I decided to go with him after all, so now I'm actually helping her find another roommate.</w:t>
+      </w:r>
+    </w:p>
+    <w:p>
+      <w:pPr>
+        <w:pStyle w:val="CSP-ChapterBodyText"/>
+      </w:pPr>
+    </w:p>
+    <w:p>
+      <w:pPr>
+        <w:pStyle w:val="CSP-ChapterBodyText"/>
+      </w:pPr>
+      <w:r>
+        <w:t>It's such a shame that the Christmas card I sent you never arrived. I must not have put enough postage on it, and it probably got lost in transit somewhere. The card I sent to Chun might be lost too, so I'll write to her later to explain. I gave her a call two days ago, but she wasn't in her office, so I just left a message with someone. Nothing urgent—just wanted to call and wish her a Happy New Year. Whether you invite Chun over during the winter break is entirely up to you. I have a feeling she'll probably call to wish you a Happy New Year. Things between us aren't moving very quickly, and I haven't been trying hard enough either. I suppose the long distance makes it tough, and I honestly have no idea what the future holds. If she actually manages to get into UT Austin, it would truly be a miracle.</w:t>
+      </w:r>
+    </w:p>
+    <w:p>
+      <w:pPr>
+        <w:pStyle w:val="CSP-ChapterBodyText"/>
+      </w:pPr>
+    </w:p>
+    <w:p>
+      <w:pPr>
+        <w:pStyle w:val="CSP-ChapterBodyText"/>
+      </w:pPr>
+      <w:r>
+        <w:t xml:space="preserve">My handwriting is getting uglier by the second, so I'd better </w:t>
+      </w:r>
       <w:r>
         <w:lastRenderedPageBreak/>
-        <w:t>My handwriting is getting uglier by the second, so I</w:t>
-      </w:r>
-      <w:r>
-        <w:t>’</w:t>
-      </w:r>
-      <w:r>
-        <w:t>d better stop here.</w:t>
+        <w:t>stop here.</w:t>
       </w:r>
     </w:p>
     <w:p>
@@ -7536,13 +7331,20 @@
         <w:pStyle w:val="CSP-ChapterBodyText"/>
       </w:pPr>
       <w:r>
-        <w:t xml:space="preserve">P.S. Dad, your poem has a really unique style to it—I liked it a lot! :-) </w:t>
-      </w:r>
-      <w:r>
-        <w:t xml:space="preserve">  ←</w:t>
-      </w:r>
-      <w:r>
-        <w:t xml:space="preserve"> that is a smiley face</w:t>
+        <w:t>P.S. Dad, your poem has a really unique style to it—I liked it a lot! :-) ← that is a smiley face</w:t>
+      </w:r>
+    </w:p>
+    <w:p>
+      <w:pPr>
+        <w:pStyle w:val="CSP-ChapterBodyText"/>
+      </w:pPr>
+    </w:p>
+    <w:p>
+      <w:pPr>
+        <w:pStyle w:val="CSP-ChapterBodyText"/>
+      </w:pPr>
+      <w:r>
+        <w:t>P.P.S. I actually got my hair cut at a real barbershop this time. It looks like the fine tradition of Chinese students cutting each other's hair has officially been lost!</w:t>
       </w:r>
     </w:p>
     <w:p>
@@ -7565,15 +7367,6 @@
           <w:docGrid w:linePitch="360"/>
         </w:sectPr>
       </w:pPr>
-      <w:r>
-        <w:t>P.P.S. I actually got my hair cut at a real barbershop this time. It looks like the fine tradition of Chinese students cutting each other</w:t>
-      </w:r>
-      <w:r>
-        <w:t>’</w:t>
-      </w:r>
-      <w:r>
-        <w:t>s hair has officially been lost!</w:t>
-      </w:r>
     </w:p>
     <w:p>
       <w:pPr>
@@ -7745,162 +7538,80 @@
         <w:pStyle w:val="CSP-ChapterBodyText"/>
       </w:pPr>
       <w:r>
-        <w:t>Phone: 512</w:t>
-      </w:r>
-      <w:r>
-        <w:t>-</w:t>
-      </w:r>
-      <w:r>
-        <w:t>479-8685</w:t>
-      </w:r>
-    </w:p>
-    <w:p>
-      <w:pPr>
-        <w:pStyle w:val="CSP-ChapterBodyText"/>
-      </w:pPr>
-    </w:p>
-    <w:p>
-      <w:pPr>
-        <w:pStyle w:val="CSP-ChapterBodyText"/>
-      </w:pPr>
-      <w:r>
-        <w:t>I called home yesterday, but unfortunately Mom wasn</w:t>
-      </w:r>
-      <w:r>
-        <w:t>’</w:t>
-      </w:r>
-      <w:r>
-        <w:t>t home because she had to teach a class. I</w:t>
-      </w:r>
-      <w:r>
-        <w:t>’</w:t>
-      </w:r>
-      <w:r>
-        <w:t>ll stick to calling on the weekends from now on; this time was just an exception because I needed to give you my new address.</w:t>
-      </w:r>
-    </w:p>
-    <w:p>
-      <w:pPr>
-        <w:pStyle w:val="CSP-ChapterBodyText"/>
-      </w:pPr>
-    </w:p>
-    <w:p>
-      <w:pPr>
-        <w:pStyle w:val="CSP-ChapterBodyText"/>
-      </w:pPr>
-      <w:r>
-        <w:t>My roommate is American, so if you call, just ask for "Tong" and that</w:t>
-      </w:r>
-      <w:r>
-        <w:t>’</w:t>
-      </w:r>
-      <w:r>
-        <w:t>ll do. If you ask for "Wang Tong," he might not catch on right away since last names come after first names over here. Moving was very easy; my roommate helped me out, and we finished everything in under an hour. I brought my table over to the new place, but the bed was too bulky. Besides, my new room already comes with a queen-size bed, so I ended up giving my old one to our Taiwanese neighbor. My roommate is a few years older than me and is an undergraduate majoring in Radio-Television-Film. He wants to move to Hong Kong someday and is currently planning his own experimental student film—apparently, a Hong Kong-style cop thriller.</w:t>
-      </w:r>
-    </w:p>
-    <w:p>
-      <w:pPr>
-        <w:pStyle w:val="CSP-ChapterBodyText"/>
-      </w:pPr>
-    </w:p>
-    <w:p>
-      <w:pPr>
-        <w:pStyle w:val="CSP-ChapterBodyText"/>
-      </w:pPr>
-      <w:r>
-        <w:t>Winter break is just about over, and classes officially start on the 16th, so things are about to get busy again. Next semester, I</w:t>
-      </w:r>
-      <w:r>
-        <w:t>’</w:t>
-      </w:r>
-      <w:r>
-        <w:t xml:space="preserve">ll be </w:t>
-      </w:r>
-      <w:r>
-        <w:t>TA-ing</w:t>
-      </w:r>
-      <w:r>
-        <w:t xml:space="preserve"> for a C++ course. C++ is a programming language similar to C. The grading workload will probably be a bit heavier, making me busier than the last term, but at least I</w:t>
-      </w:r>
-      <w:r>
-        <w:t>’</w:t>
-      </w:r>
-      <w:r>
-        <w:t>ll get to learn something useful.</w:t>
-      </w:r>
-    </w:p>
-    <w:p>
-      <w:pPr>
-        <w:pStyle w:val="CSP-ChapterBodyText"/>
-      </w:pPr>
-    </w:p>
-    <w:p>
-      <w:pPr>
-        <w:pStyle w:val="CSP-ChapterBodyText"/>
-      </w:pPr>
-      <w:r>
-        <w:t>Yesterday, I spent two hours chatting online with Weihai, typing messages back and forth. Watching the words appear and jump onto the screen in real time felt almost magical—like we were talking face-to-face, even though we were a thousand miles apart. He</w:t>
-      </w:r>
-      <w:r>
-        <w:t>’</w:t>
-      </w:r>
-      <w:r>
-        <w:t>s only been in the U.S. for a few months but already dropped $900 on a used car and gotten his driver</w:t>
-      </w:r>
-      <w:r>
-        <w:t>’</w:t>
-      </w:r>
-      <w:r>
-        <w:t>s license. He and his girlfriend back in China ended up breaking up. He told me he gets really lonely whenever he has nothing to do. His roommate is also American, and he mentioned that every time he fries fish, his roommate jumps out and cries, "Are you trying to kill me?" Needless to say, he doesn</w:t>
-      </w:r>
-      <w:r>
-        <w:t>’</w:t>
-      </w:r>
-      <w:r>
-        <w:t>t eat much fish anymore. He</w:t>
-      </w:r>
-      <w:r>
-        <w:t>’</w:t>
-      </w:r>
-      <w:r>
-        <w:t xml:space="preserve">s decided not to finish his Ph.D. and plans to get his </w:t>
-      </w:r>
-      <w:r>
-        <w:t>m</w:t>
-      </w:r>
-      <w:r>
-        <w:t>aster</w:t>
-      </w:r>
-      <w:r>
-        <w:t>’</w:t>
-      </w:r>
-      <w:r>
-        <w:t xml:space="preserve">s </w:t>
-      </w:r>
-      <w:r>
-        <w:t xml:space="preserve">degree </w:t>
-      </w:r>
-      <w:r>
-        <w:t>and then look for a job.</w:t>
-      </w:r>
-    </w:p>
-    <w:p>
-      <w:pPr>
-        <w:pStyle w:val="CSP-ChapterBodyText"/>
-      </w:pPr>
-    </w:p>
-    <w:p>
-      <w:pPr>
-        <w:pStyle w:val="CSP-ChapterBodyText"/>
-      </w:pPr>
-      <w:r>
-        <w:t>I</w:t>
-      </w:r>
-      <w:r>
-        <w:t>’</w:t>
-      </w:r>
-      <w:r>
-        <w:t>ll wrap things up here. Please give my best to Wang Wei and Xiao Fan!</w:t>
+        <w:t>Phone: 512-479-8685</w:t>
+      </w:r>
+    </w:p>
+    <w:p>
+      <w:pPr>
+        <w:pStyle w:val="CSP-ChapterBodyText"/>
+      </w:pPr>
+    </w:p>
+    <w:p>
+      <w:pPr>
+        <w:pStyle w:val="CSP-ChapterBodyText"/>
+      </w:pPr>
+      <w:r>
+        <w:t>I called home yesterday, but unfortunately Mom wasn't home because she had to teach a class. I'll stick to calling on the weekends from now on; this time was just an exception because I needed to give you my new address.</w:t>
+      </w:r>
+    </w:p>
+    <w:p>
+      <w:pPr>
+        <w:pStyle w:val="CSP-ChapterBodyText"/>
+      </w:pPr>
+    </w:p>
+    <w:p>
+      <w:pPr>
+        <w:pStyle w:val="CSP-ChapterBodyText"/>
+      </w:pPr>
+      <w:r>
+        <w:t>My roommate is American, so when you call, just ask for "Tong" and that'll do. If you ask for "Wang Tong," he might not catch on right away since last names come after first names over here. Moving was very easy; my roommate helped me out, and we finished everything in under an hour. I brought my table over to the new place, but the bed was too bulky. Besides, my new room already comes with a queen-size bed, so I ended up giving my old one to our Taiwanese neighbor. My roommate is a few years older than me and is an undergraduate majoring in Radio-Television-Film. He wants to move to Hong Kong someday and is currently planning his own experimental student film—apparently, a Hong Kong-style cop thriller.</w:t>
+      </w:r>
+    </w:p>
+    <w:p>
+      <w:pPr>
+        <w:pStyle w:val="CSP-ChapterBodyText"/>
+      </w:pPr>
+    </w:p>
+    <w:p>
+      <w:pPr>
+        <w:pStyle w:val="CSP-ChapterBodyText"/>
+      </w:pPr>
+      <w:r>
+        <w:t>Winter break is just about over, and classes officially start on the 16th, so things are about to get busy again. Next semester, I'll be TA-</w:t>
+      </w:r>
+      <w:proofErr w:type="spellStart"/>
+      <w:r>
+        <w:t>ing</w:t>
+      </w:r>
+      <w:proofErr w:type="spellEnd"/>
+      <w:r>
+        <w:t xml:space="preserve"> for a C++ course. C++ is a programming language similar to C. The grading workload will probably be a bit heavier, making me busier than the last term, but at least I'll get to learn something useful.</w:t>
+      </w:r>
+    </w:p>
+    <w:p>
+      <w:pPr>
+        <w:pStyle w:val="CSP-ChapterBodyText"/>
+      </w:pPr>
+    </w:p>
+    <w:p>
+      <w:pPr>
+        <w:pStyle w:val="CSP-ChapterBodyText"/>
+      </w:pPr>
+      <w:r>
+        <w:t>Yesterday, I spent two hours chatting online with Weihai, typing messages back and forth. Watching the words jump onto the screen in real time felt almost magical—like we were talking face-to-face, even though we were a thousand miles apart. He's only been in the U.S. for a few months but already dropped $900 on a used car and gotten his driver's license. He and his girlfriend back in China ended up breaking up. He told me he gets really lonely whenever he has nothing to do. His roommate is also American, and he mentioned that every time he fries fish, his roommate jumps out and cries, "Are you trying to kill me?" Needless to say, he doesn't eat much fish anymore. He's decided not to finish his Ph.D. and plans to get his master's degree and then look for a job.</w:t>
+      </w:r>
+    </w:p>
+    <w:p>
+      <w:pPr>
+        <w:pStyle w:val="CSP-ChapterBodyText"/>
+      </w:pPr>
+    </w:p>
+    <w:p>
+      <w:pPr>
+        <w:pStyle w:val="CSP-ChapterBodyText"/>
+      </w:pPr>
+      <w:r>
+        <w:t>I'll wrap things up here. Please give my best to Wang Wei and Xiao Fan!</w:t>
       </w:r>
     </w:p>
     <w:p>
@@ -7922,6 +7633,19 @@
       </w:pPr>
       <w:r>
         <w:t>01/12/96</w:t>
+      </w:r>
+    </w:p>
+    <w:p>
+      <w:pPr>
+        <w:pStyle w:val="CSP-ChapterBodyText"/>
+      </w:pPr>
+    </w:p>
+    <w:p>
+      <w:pPr>
+        <w:pStyle w:val="CSP-ChapterBodyText"/>
+      </w:pPr>
+      <w:r>
+        <w:t>P.S. Even though money is a little tight, I'm doing just fine and have everything I need. Please don't try to save every penny because of me. Taking good care of yourselves is what matters most!</w:t>
       </w:r>
     </w:p>
     <w:p>
@@ -7944,21 +7668,6 @@
           <w:docGrid w:linePitch="360"/>
         </w:sectPr>
       </w:pPr>
-      <w:r>
-        <w:t>P.S. Even though money is a little tight, I</w:t>
-      </w:r>
-      <w:r>
-        <w:t>’</w:t>
-      </w:r>
-      <w:r>
-        <w:t>m doing just fine and have everything I need. Please don</w:t>
-      </w:r>
-      <w:r>
-        <w:t>’</w:t>
-      </w:r>
-      <w:r>
-        <w:t>t try to save every penny because of me. Taking good care of yourselves is what matters most!</w:t>
-      </w:r>
     </w:p>
     <w:p>
       <w:pPr>
@@ -9055,13 +8764,21 @@
         <w:pStyle w:val="CSP-ChapterBodyText"/>
       </w:pPr>
       <w:r>
-        <w:t>I received your letter dated March 16th. I also got your phone call the day before yesterday and was so relieved to hear that Mom</w:t>
-      </w:r>
-      <w:r>
-        <w:t>’</w:t>
-      </w:r>
-      <w:r>
-        <w:t>s wrist is much better now.</w:t>
+        <w:t xml:space="preserve">I received your letter dated March 16th. I also got your phone call the day before yesterday and was so relieved to hear that </w:t>
+      </w:r>
+      <w:proofErr w:type="gramStart"/>
+      <w:r>
+        <w:t>Mom</w:t>
+      </w:r>
+      <w:r>
+        <w:t>’</w:t>
+      </w:r>
+      <w:r>
+        <w:t>s</w:t>
+      </w:r>
+      <w:proofErr w:type="gramEnd"/>
+      <w:r>
+        <w:t xml:space="preserve"> wrist is much better now.</w:t>
       </w:r>
     </w:p>
     <w:p>
@@ -9279,8 +8996,13 @@
         <w:t xml:space="preserve">ll probably just have to register for one class and continue working as a TA. While </w:t>
       </w:r>
       <w:r>
-        <w:t>TA-ing</w:t>
-      </w:r>
+        <w:t>TA-</w:t>
+      </w:r>
+      <w:proofErr w:type="spellStart"/>
+      <w:r>
+        <w:t>ing</w:t>
+      </w:r>
+      <w:proofErr w:type="spellEnd"/>
       <w:r>
         <w:t xml:space="preserve"> provides some income, taking a class means paying tuition and fees, and I</w:t>
       </w:r>
@@ -10472,13 +10194,21 @@
         <w:pStyle w:val="CSP-ChapterBodyText"/>
       </w:pPr>
       <w:r>
-        <w:t>This morning, Jim drove me to Wei Jin</w:t>
-      </w:r>
-      <w:r>
-        <w:t>’</w:t>
-      </w:r>
-      <w:r>
-        <w:t>s place for lunch and didn</w:t>
+        <w:t xml:space="preserve">This morning, Jim drove me to Wei </w:t>
+      </w:r>
+      <w:proofErr w:type="spellStart"/>
+      <w:r>
+        <w:t>Jin</w:t>
+      </w:r>
+      <w:r>
+        <w:t>’</w:t>
+      </w:r>
+      <w:r>
+        <w:t>s</w:t>
+      </w:r>
+      <w:proofErr w:type="spellEnd"/>
+      <w:r>
+        <w:t xml:space="preserve"> place for lunch and didn</w:t>
       </w:r>
       <w:r>
         <w:t>’</w:t>
@@ -10750,13 +10480,21 @@
         <w:t>’</w:t>
       </w:r>
       <w:r>
-        <w:t>m so excited to hear that Dad</w:t>
-      </w:r>
-      <w:r>
-        <w:t>’</w:t>
-      </w:r>
-      <w:r>
-        <w:t>s turbine design turned out so well! Is there any chance it can be manufactured or patented?</w:t>
+        <w:t xml:space="preserve">m so excited to hear that </w:t>
+      </w:r>
+      <w:proofErr w:type="gramStart"/>
+      <w:r>
+        <w:t>Dad</w:t>
+      </w:r>
+      <w:r>
+        <w:t>’</w:t>
+      </w:r>
+      <w:r>
+        <w:t>s</w:t>
+      </w:r>
+      <w:proofErr w:type="gramEnd"/>
+      <w:r>
+        <w:t xml:space="preserve"> turbine design turned out so well! Is there any chance it can be manufactured or patented?</w:t>
       </w:r>
     </w:p>
     <w:p>
@@ -10822,13 +10560,21 @@
         <w:pStyle w:val="CSP-ChapterBodyText"/>
       </w:pPr>
       <w:r>
-        <w:t>P.S. I pulled off straight A</w:t>
-      </w:r>
-      <w:r>
-        <w:t>’</w:t>
-      </w:r>
-      <w:r>
-        <w:t>s in my three classes again this semester.</w:t>
+        <w:t xml:space="preserve">P.S. I pulled off straight </w:t>
+      </w:r>
+      <w:proofErr w:type="gramStart"/>
+      <w:r>
+        <w:t>A</w:t>
+      </w:r>
+      <w:r>
+        <w:t>’</w:t>
+      </w:r>
+      <w:r>
+        <w:t>s</w:t>
+      </w:r>
+      <w:proofErr w:type="gramEnd"/>
+      <w:r>
+        <w:t xml:space="preserve"> in my three classes again this semester.</w:t>
       </w:r>
     </w:p>
     <w:p>
@@ -11122,7 +10868,15 @@
         <w:t>’</w:t>
       </w:r>
       <w:r>
-        <w:t xml:space="preserve">s $761. So you can see they hit you pretty hard with taxes here. </w:t>
+        <w:t xml:space="preserve">s $761. </w:t>
+      </w:r>
+      <w:proofErr w:type="gramStart"/>
+      <w:r>
+        <w:t>So</w:t>
+      </w:r>
+      <w:proofErr w:type="gramEnd"/>
+      <w:r>
+        <w:t xml:space="preserve"> you can see they hit you pretty hard with taxes here. </w:t>
       </w:r>
       <w:r>
         <w:lastRenderedPageBreak/>
@@ -11207,13 +10961,21 @@
         <w:t>’</w:t>
       </w:r>
       <w:r>
-        <w:t>m so happy to hear that Dad</w:t>
-      </w:r>
-      <w:r>
-        <w:t>’</w:t>
-      </w:r>
-      <w:r>
-        <w:t>s wind turbine design turned out so well. Keep up the great work! But please make sure to get some rest too. It</w:t>
+        <w:t xml:space="preserve">m so happy to hear that </w:t>
+      </w:r>
+      <w:proofErr w:type="gramStart"/>
+      <w:r>
+        <w:t>Dad</w:t>
+      </w:r>
+      <w:r>
+        <w:t>’</w:t>
+      </w:r>
+      <w:r>
+        <w:t>s</w:t>
+      </w:r>
+      <w:proofErr w:type="gramEnd"/>
+      <w:r>
+        <w:t xml:space="preserve"> wind turbine design turned out so well. Keep up the great work! But please make sure to get some rest too. It</w:t>
       </w:r>
       <w:r>
         <w:t>’</w:t>
@@ -11256,7 +11018,15 @@
         <w:t>’</w:t>
       </w:r>
       <w:r>
-        <w:t>ll stop here. Give my best to Wang Wei, Xiao Fan, and little Yueyue.</w:t>
+        <w:t xml:space="preserve">ll stop here. Give my best to Wang Wei, Xiao Fan, and little </w:t>
+      </w:r>
+      <w:proofErr w:type="spellStart"/>
+      <w:r>
+        <w:t>Yueyue</w:t>
+      </w:r>
+      <w:proofErr w:type="spellEnd"/>
+      <w:r>
+        <w:t>.</w:t>
       </w:r>
     </w:p>
     <w:p>
@@ -11590,7 +11360,15 @@
         <w:t>’</w:t>
       </w:r>
       <w:r>
-        <w:t>s degrees over Ph.D.s.</w:t>
+        <w:t xml:space="preserve">s degrees over </w:t>
+      </w:r>
+      <w:proofErr w:type="spellStart"/>
+      <w:r>
+        <w:t>Ph.D.s</w:t>
+      </w:r>
+      <w:proofErr w:type="spellEnd"/>
+      <w:r>
+        <w:t>.</w:t>
       </w:r>
       <w:r>
         <w:t xml:space="preserve"> In other words, getting a Ph.D. often </w:t>
@@ -13168,7 +12946,15 @@
         <w:pStyle w:val="CSP-ChapterBodyText"/>
       </w:pPr>
       <w:r>
-        <w:t>I see that Mom has officially retired! I can hardly believe how quickly that happened. It</w:t>
+        <w:t xml:space="preserve">I see that </w:t>
+      </w:r>
+      <w:proofErr w:type="gramStart"/>
+      <w:r>
+        <w:t>Mom</w:t>
+      </w:r>
+      <w:proofErr w:type="gramEnd"/>
+      <w:r>
+        <w:t xml:space="preserve"> has officially retired! I can hardly believe how quickly that happened. It</w:t>
       </w:r>
       <w:r>
         <w:t>’</w:t>
@@ -13330,7 +13116,15 @@
         <w:t>’</w:t>
       </w:r>
       <w:r>
-        <w:t>ll also be moving in mid-December and renting a room from my Taiwanese friend Yao-zhu. She</w:t>
+        <w:t>ll also be moving in mid-December and renting a room from my Taiwanese friend Yao-</w:t>
+      </w:r>
+      <w:proofErr w:type="spellStart"/>
+      <w:r>
+        <w:t>zhu</w:t>
+      </w:r>
+      <w:proofErr w:type="spellEnd"/>
+      <w:r>
+        <w:t>. She</w:t>
       </w:r>
       <w:r>
         <w:t>’</w:t>
@@ -13389,7 +13183,15 @@
         <w:t>’</w:t>
       </w:r>
       <w:r>
-        <w:t>ve only practiced three times. My first two driving lessons were with Yao-zhu, and Robin taught me once as well. I can handle the basics fine, but obviously, I still need a lot more practice. I</w:t>
+        <w:t>ve only practiced three times. My first two driving lessons were with Yao-</w:t>
+      </w:r>
+      <w:proofErr w:type="spellStart"/>
+      <w:r>
+        <w:t>zhu</w:t>
+      </w:r>
+      <w:proofErr w:type="spellEnd"/>
+      <w:r>
+        <w:t>, and Robin taught me once as well. I can handle the basics fine, but obviously, I still need a lot more practice. I</w:t>
       </w:r>
       <w:r>
         <w:t>’</w:t>
@@ -13783,7 +13585,15 @@
         <w:t>’</w:t>
       </w:r>
       <w:r>
-        <w:t>ve already been in the States for a year and four months. All things considered, it</w:t>
+        <w:t xml:space="preserve">ve already been in the States for a year and four months. All things </w:t>
+      </w:r>
+      <w:proofErr w:type="gramStart"/>
+      <w:r>
+        <w:t>considered,</w:t>
+      </w:r>
+      <w:proofErr w:type="gramEnd"/>
+      <w:r>
+        <w:t xml:space="preserve"> it</w:t>
       </w:r>
       <w:r>
         <w:t>’</w:t>
@@ -13851,8 +13661,21 @@
         <w:t>’</w:t>
       </w:r>
       <w:r>
-        <w:t>s on-site interview in New York, my classmate Xun came along with me, but unfortunately</w:t>
-      </w:r>
+        <w:t xml:space="preserve">s on-site interview in New York, my classmate </w:t>
+      </w:r>
+      <w:proofErr w:type="spellStart"/>
+      <w:r>
+        <w:t>Xun</w:t>
+      </w:r>
+      <w:proofErr w:type="spellEnd"/>
+      <w:r>
+        <w:t xml:space="preserve"> came along with me, but </w:t>
+      </w:r>
+      <w:proofErr w:type="gramStart"/>
+      <w:r>
+        <w:t>unfortunately</w:t>
+      </w:r>
+      <w:proofErr w:type="gramEnd"/>
       <w:r>
         <w:t xml:space="preserve"> </w:t>
       </w:r>
@@ -13886,7 +13709,15 @@
         <w:pStyle w:val="CSP-ChapterBodyText"/>
       </w:pPr>
       <w:r>
-        <w:t>The interview wrapped up around noon, and afterward, Xun and I took a cab down to Manhattan</w:t>
+        <w:t xml:space="preserve">The interview wrapped up around noon, and afterward, </w:t>
+      </w:r>
+      <w:proofErr w:type="spellStart"/>
+      <w:r>
+        <w:t>Xun</w:t>
+      </w:r>
+      <w:proofErr w:type="spellEnd"/>
+      <w:r>
+        <w:t xml:space="preserve"> and I took a cab down to Manhattan</w:t>
       </w:r>
       <w:r>
         <w:t>’</w:t>
@@ -13898,7 +13729,15 @@
         <w:t>’</w:t>
       </w:r>
       <w:r>
-        <w:t>t have much besides Chinese restaurants—some of them quite large—as well as a few grocery stores. There are street vendors along the sidewalks, and the streets were packed with Chinese people. It felt like walking down Wangfujing in Beijing, except almost everyone was speaking Cantonese</w:t>
+        <w:t xml:space="preserve">t have much besides Chinese restaurants—some of them quite large—as well as a few grocery stores. There are street vendors along the sidewalks, and the streets were packed with Chinese people. It felt like walking down </w:t>
+      </w:r>
+      <w:proofErr w:type="spellStart"/>
+      <w:r>
+        <w:t>Wangfujing</w:t>
+      </w:r>
+      <w:proofErr w:type="spellEnd"/>
+      <w:r>
+        <w:t xml:space="preserve"> in Beijing, except almost everyone was speaking Cantonese</w:t>
       </w:r>
       <w:r>
         <w:rPr>
@@ -14566,13 +14405,21 @@
         <w:t>’</w:t>
       </w:r>
       <w:r>
-        <w:t>m sorry to hear that Mom</w:t>
-      </w:r>
-      <w:r>
-        <w:t>’</w:t>
-      </w:r>
-      <w:r>
-        <w:t>s trip to Chongming wasn</w:t>
+        <w:t xml:space="preserve">m sorry to hear that </w:t>
+      </w:r>
+      <w:proofErr w:type="gramStart"/>
+      <w:r>
+        <w:t>Mom</w:t>
+      </w:r>
+      <w:r>
+        <w:t>’</w:t>
+      </w:r>
+      <w:r>
+        <w:t>s</w:t>
+      </w:r>
+      <w:proofErr w:type="gramEnd"/>
+      <w:r>
+        <w:t xml:space="preserve"> trip to Chongming wasn</w:t>
       </w:r>
       <w:r>
         <w:t>’</w:t>
@@ -14730,7 +14577,18 @@
         <w:pStyle w:val="CSP-ChapterBodyText"/>
       </w:pPr>
       <w:r>
-        <w:t>Telephone: 512-476-6770</w:t>
+        <w:t>U.S.A.</w:t>
+      </w:r>
+    </w:p>
+    <w:p>
+      <w:pPr>
+        <w:pStyle w:val="CSP-ChapterBodyText"/>
+      </w:pPr>
+      <w:r>
+        <w:t>P</w:t>
+      </w:r>
+      <w:r>
+        <w:t>hone: 512-476-6770</w:t>
       </w:r>
     </w:p>
     <w:p>
@@ -14792,7 +14650,15 @@
         <w:t>’</w:t>
       </w:r>
       <w:r>
-        <w:t>ll persuade Xun to drive with me.</w:t>
+        <w:t xml:space="preserve">ll persuade </w:t>
+      </w:r>
+      <w:proofErr w:type="spellStart"/>
+      <w:r>
+        <w:t>Xun</w:t>
+      </w:r>
+      <w:proofErr w:type="spellEnd"/>
+      <w:r>
+        <w:t xml:space="preserve"> to drive with me.</w:t>
       </w:r>
       <w:r>
         <w:rPr>
@@ -14801,7 +14667,15 @@
         <w:footnoteReference w:id="31"/>
       </w:r>
       <w:r>
-        <w:t xml:space="preserve"> Xun has accepted a job in Washington, D.C., which isn</w:t>
+        <w:t xml:space="preserve"> </w:t>
+      </w:r>
+      <w:proofErr w:type="spellStart"/>
+      <w:r>
+        <w:t>Xun</w:t>
+      </w:r>
+      <w:proofErr w:type="spellEnd"/>
+      <w:r>
+        <w:t xml:space="preserve"> has accepted a job in Washington, D.C., which isn</w:t>
       </w:r>
       <w:r>
         <w:t>’</w:t>
@@ -14844,7 +14718,15 @@
         <w:t>’</w:t>
       </w:r>
       <w:r>
-        <w:t>m planning to live in Edison, New Jersey, where Wei Jin lives. I also have an old college classmate from Shanghai who works in the city but lives there as well. A one-bedroom apartment rents for about $650 to $700 a month, which isn</w:t>
+        <w:t xml:space="preserve">m planning to live in Edison, New Jersey, where Wei </w:t>
+      </w:r>
+      <w:proofErr w:type="spellStart"/>
+      <w:r>
+        <w:t>Jin</w:t>
+      </w:r>
+      <w:proofErr w:type="spellEnd"/>
+      <w:r>
+        <w:t xml:space="preserve"> lives. I also have an old college classmate from Shanghai who works in the city but lives there as well. A one-bedroom apartment rents for about $650 to $700 a month, which isn</w:t>
       </w:r>
       <w:r>
         <w:t>’</w:t>
@@ -14869,17 +14751,17 @@
         <w:t>’</w:t>
       </w:r>
       <w:r>
-        <w:t>ll have to commute every day. The train ride takes about forty minutes each way, and a monthly train pass costs around $170. I</w:t>
-      </w:r>
-      <w:r>
-        <w:t>’</w:t>
-      </w:r>
-      <w:r>
-        <w:t xml:space="preserve">d also have to drive </w:t>
+        <w:t xml:space="preserve">ll have to commute every day. The train ride takes about forty minutes each way, and a </w:t>
       </w:r>
       <w:r>
         <w:lastRenderedPageBreak/>
-        <w:t>about ten minutes to the train station, where parking costs another $40 a month. Even so, Edison has a lot going for it. It</w:t>
+        <w:t>monthly train pass costs around $170. I</w:t>
+      </w:r>
+      <w:r>
+        <w:t>’</w:t>
+      </w:r>
+      <w:r>
+        <w:t>d also have to drive about ten minutes to the train station, where parking costs another $40 a month. Even so, Edison has a lot going for it. It</w:t>
       </w:r>
       <w:r>
         <w:t>’</w:t>
@@ -14891,7 +14773,15 @@
         <w:t>’</w:t>
       </w:r>
       <w:r>
-        <w:t>ve already been in touch with Wei Jin, and he</w:t>
+        <w:t xml:space="preserve">ve already been in touch with Wei </w:t>
+      </w:r>
+      <w:proofErr w:type="spellStart"/>
+      <w:r>
+        <w:t>Jin</w:t>
+      </w:r>
+      <w:proofErr w:type="spellEnd"/>
+      <w:r>
+        <w:t>, and he</w:t>
       </w:r>
       <w:r>
         <w:t>’</w:t>
@@ -14922,8 +14812,13 @@
       <w:pPr>
         <w:pStyle w:val="CSP-ChapterBodyText"/>
       </w:pPr>
-      <w:r>
-        <w:t>Haiqing came to Austin a few days ago for an interview, hoping to find a summer job. He</w:t>
+      <w:proofErr w:type="spellStart"/>
+      <w:r>
+        <w:t>Haiqing</w:t>
+      </w:r>
+      <w:proofErr w:type="spellEnd"/>
+      <w:r>
+        <w:t xml:space="preserve"> came to Austin a few days ago for an interview, hoping to find a summer job. He</w:t>
       </w:r>
       <w:r>
         <w:t>’</w:t>
@@ -15373,7 +15268,15 @@
         <w:pStyle w:val="CSP-ChapterBodyText"/>
       </w:pPr>
       <w:r>
-        <w:t>This year, Morgan Stanley hired about 240 associates from 31 universities and divided us among nine different divisions. I</w:t>
+        <w:t xml:space="preserve">This year, Morgan Stanley hired about 240 associates from 31 universities and divided </w:t>
+      </w:r>
+      <w:proofErr w:type="spellStart"/>
+      <w:r>
+        <w:t>us</w:t>
+      </w:r>
+      <w:proofErr w:type="spellEnd"/>
+      <w:r>
+        <w:t xml:space="preserve"> among nine different divisions. I</w:t>
       </w:r>
       <w:r>
         <w:t>’</w:t>
@@ -15423,7 +15326,15 @@
         <w:t>’</w:t>
       </w:r>
       <w:r>
-        <w:t>m going to hang out in Austin for another month or so, mostly to wait for Xun so we can drive up north together. Besides, there</w:t>
+        <w:t xml:space="preserve">m going to hang out in Austin for another month or so, mostly to wait for </w:t>
+      </w:r>
+      <w:proofErr w:type="spellStart"/>
+      <w:r>
+        <w:t>Xun</w:t>
+      </w:r>
+      <w:proofErr w:type="spellEnd"/>
+      <w:r>
+        <w:t xml:space="preserve"> so we can drive up north together. Besides, there</w:t>
       </w:r>
       <w:r>
         <w:t>’</w:t>
@@ -15727,7 +15638,15 @@
         <w:pStyle w:val="CSP-ChapterBodyText"/>
       </w:pPr>
       <w:r>
-        <w:t>Wei Jin has already helped me find an apartment in Edison, New Jersey. It</w:t>
+        <w:t xml:space="preserve">Wei </w:t>
+      </w:r>
+      <w:proofErr w:type="spellStart"/>
+      <w:r>
+        <w:t>Jin</w:t>
+      </w:r>
+      <w:proofErr w:type="spellEnd"/>
+      <w:r>
+        <w:t xml:space="preserve"> has already helped me find an apartment in Edison, New Jersey. It</w:t>
       </w:r>
       <w:r>
         <w:t>’</w:t>
@@ -15776,13 +15695,21 @@
         <w:t>’</w:t>
       </w:r>
       <w:r>
-        <w:t>ll crash at Wei Jin</w:t>
-      </w:r>
-      <w:r>
-        <w:t>’</w:t>
-      </w:r>
-      <w:r>
-        <w:t>s place until then. I also have submitted a "leave of absence" request to the department to officially pause my studies for a year. If it gets approved, I could theoretically come back and register for classes a year from now without having to re-apply for admission. Realistically, though, I doubt I</w:t>
+        <w:t xml:space="preserve">ll crash at Wei </w:t>
+      </w:r>
+      <w:proofErr w:type="spellStart"/>
+      <w:r>
+        <w:t>Jin</w:t>
+      </w:r>
+      <w:r>
+        <w:t>’</w:t>
+      </w:r>
+      <w:r>
+        <w:t>s</w:t>
+      </w:r>
+      <w:proofErr w:type="spellEnd"/>
+      <w:r>
+        <w:t xml:space="preserve"> place until then. I also have submitted a "leave of absence" request to the department to officially pause my studies for a year. If it gets approved, I could theoretically come back and register for classes a year from now without having to re-apply for admission. Realistically, though, I doubt I</w:t>
       </w:r>
       <w:r>
         <w:t>’</w:t>
@@ -16052,7 +15979,15 @@
         <w:pStyle w:val="CSP-ChapterBodyText"/>
       </w:pPr>
       <w:r>
-        <w:t>8 Koster Blvd. Apt. 3A</w:t>
+        <w:t xml:space="preserve">8 </w:t>
+      </w:r>
+      <w:proofErr w:type="spellStart"/>
+      <w:r>
+        <w:t>Koster</w:t>
+      </w:r>
+      <w:proofErr w:type="spellEnd"/>
+      <w:r>
+        <w:t xml:space="preserve"> Blvd. Apt. 3A</w:t>
       </w:r>
     </w:p>
     <w:p>
@@ -16076,7 +16011,10 @@
         <w:pStyle w:val="CSP-ChapterBodyText"/>
       </w:pPr>
       <w:r>
-        <w:t>Telephone: 908-906-2487</w:t>
+        <w:t>P</w:t>
+      </w:r>
+      <w:r>
+        <w:t>hone: 908-906-2487</w:t>
       </w:r>
     </w:p>
     <w:p>
@@ -16108,7 +16046,23 @@
         <w:t>’</w:t>
       </w:r>
       <w:r>
-        <w:t>s Independence Day. My friend Xun suddenly backed out a few days before the trip, but luckily I found another classmate who wanted to tag along, do some sightseeing, and meet up with her friends in New York. Her name is Emma. The drive took seven days in total, but we didn</w:t>
+        <w:t xml:space="preserve">s Independence Day. My friend </w:t>
+      </w:r>
+      <w:proofErr w:type="spellStart"/>
+      <w:r>
+        <w:t>Xun</w:t>
+      </w:r>
+      <w:proofErr w:type="spellEnd"/>
+      <w:r>
+        <w:t xml:space="preserve"> suddenly backed out a few days before the trip, but </w:t>
+      </w:r>
+      <w:proofErr w:type="gramStart"/>
+      <w:r>
+        <w:t>luckily</w:t>
+      </w:r>
+      <w:proofErr w:type="gramEnd"/>
+      <w:r>
+        <w:t xml:space="preserve"> I found another classmate who wanted to tag along, do some sightseeing, and meet up with her friends in New York. Her name is Emma. The drive took seven days in total, but we didn</w:t>
       </w:r>
       <w:r>
         <w:t>’</w:t>
@@ -16124,26 +16078,42 @@
         <w:t>’</w:t>
       </w:r>
       <w:r>
-        <w:t xml:space="preserve">t give me any trouble at all during the entire trip, which clocked in at about 2,500 miles. I drove roughly two-thirds of the distance. I stayed in touch with Wei Jin along the way. I am really thankful that he put a great deal of effort into helping me with housing arrangements. </w:t>
-      </w:r>
-    </w:p>
-    <w:p>
-      <w:pPr>
-        <w:pStyle w:val="CSP-ChapterBodyText"/>
-      </w:pPr>
-    </w:p>
-    <w:p>
-      <w:pPr>
-        <w:pStyle w:val="CSP-ChapterBodyText"/>
-      </w:pPr>
-      <w:r>
-        <w:t>I finally arrived in New Jersey on the night of July 11th and stayed at Wei Jin</w:t>
-      </w:r>
-      <w:r>
-        <w:t>’</w:t>
-      </w:r>
-      <w:r>
-        <w:t>s place for three nights before picking up the keys to my apartment on the afternoon of the 14th. Since I moved in, I</w:t>
+        <w:t xml:space="preserve">t give me any trouble at all during the entire trip, which clocked in at about 2,500 miles. I drove roughly two-thirds of the distance. I stayed in touch with Wei </w:t>
+      </w:r>
+      <w:proofErr w:type="spellStart"/>
+      <w:r>
+        <w:t>Jin</w:t>
+      </w:r>
+      <w:proofErr w:type="spellEnd"/>
+      <w:r>
+        <w:t xml:space="preserve"> along the way. I am really thankful that he put a great deal of effort into helping me with housing arrangements. </w:t>
+      </w:r>
+    </w:p>
+    <w:p>
+      <w:pPr>
+        <w:pStyle w:val="CSP-ChapterBodyText"/>
+      </w:pPr>
+    </w:p>
+    <w:p>
+      <w:pPr>
+        <w:pStyle w:val="CSP-ChapterBodyText"/>
+      </w:pPr>
+      <w:r>
+        <w:t xml:space="preserve">I finally arrived in New Jersey on the night of July 11th and stayed at Wei </w:t>
+      </w:r>
+      <w:proofErr w:type="spellStart"/>
+      <w:r>
+        <w:t>Jin</w:t>
+      </w:r>
+      <w:r>
+        <w:t>’</w:t>
+      </w:r>
+      <w:r>
+        <w:t>s</w:t>
+      </w:r>
+      <w:proofErr w:type="spellEnd"/>
+      <w:r>
+        <w:t xml:space="preserve"> place for three nights before picking up the keys to my apartment on the afternoon of the 14th. Since I moved in, I</w:t>
       </w:r>
       <w:r>
         <w:t>’</w:t>
@@ -16564,7 +16534,15 @@
         <w:t>’</w:t>
       </w:r>
       <w:r>
-        <w:t>t you show her the way?” He asked. Now, that was an excellent suggestion, except for one small problem: I had absolutely no idea where Dobie Center was. So I said, "Sure!"</w:t>
+        <w:t xml:space="preserve">t you show her the way?” He asked. Now, that was an excellent suggestion, except for one small problem: I had absolutely no idea where Dobie Center was. </w:t>
+      </w:r>
+      <w:proofErr w:type="gramStart"/>
+      <w:r>
+        <w:t>So</w:t>
+      </w:r>
+      <w:proofErr w:type="gramEnd"/>
+      <w:r>
+        <w:t xml:space="preserve"> I said, "Sure!"</w:t>
       </w:r>
     </w:p>
     <w:p>
@@ -18620,6 +18598,7 @@
       <w:r>
         <w:t xml:space="preserve">The midday nap, known in Chinese as </w:t>
       </w:r>
+      <w:proofErr w:type="spellStart"/>
       <w:r>
         <w:rPr>
           <w:i/>
@@ -18627,6 +18606,7 @@
         </w:rPr>
         <w:t>wujiao</w:t>
       </w:r>
+      <w:proofErr w:type="spellEnd"/>
       <w:r>
         <w:t>, is a deeply ingrained cultural tradition. In most schools, offices, and factories, lunch is followed by a quiet period that allows people to take a short nap. Napping in China has traditionally been seen as beneficial to health and productivity.</w:t>
       </w:r>
@@ -18873,6 +18853,7 @@
       <w:r>
         <w:t xml:space="preserve"> or </w:t>
       </w:r>
+      <w:proofErr w:type="spellStart"/>
       <w:r>
         <w:rPr>
           <w:i/>
@@ -18880,6 +18861,7 @@
         </w:rPr>
         <w:t>yuanxiao</w:t>
       </w:r>
+      <w:proofErr w:type="spellEnd"/>
       <w:r>
         <w:t>, whose round shape represents family togetherness and completeness.</w:t>
       </w:r>
@@ -19775,7 +19757,6 @@
   <w:style w:type="character" w:default="1" w:styleId="DefaultParagraphFont">
     <w:name w:val="Default Paragraph Font"/>
     <w:uiPriority w:val="1"/>
-    <w:semiHidden/>
     <w:unhideWhenUsed/>
   </w:style>
   <w:style w:type="table" w:default="1" w:styleId="TableNormal">

</xml_diff>

<commit_message>
add details of furniture purchases in NJ
</commit_message>
<xml_diff>
--- a/letters_from_usa/book.docx
+++ b/letters_from_usa/book.docx
@@ -16125,63 +16125,63 @@
         <w:t>’</w:t>
       </w:r>
       <w:r>
-        <w:t>s Independence Day. My friend Xun suddenly backed out a few days before the trip, but luckily I found another classmate who wanted to tag along, do some sightseeing, and meet up with her friends in New York. Her name is Emma. The drive took seven days in total, but we didn</w:t>
-      </w:r>
-      <w:r>
-        <w:t>’</w:t>
-      </w:r>
-      <w:r>
-        <w:t xml:space="preserve">t push ourselves too hard—especially toward the end, when we detoured to camp in a national forest and go </w:t>
+        <w:t>s Independence Day. My friend Xun suddenly backed out a few days before the trip, but luckily I found Emma, another classmate of mine, who wanted to tag along, do some sightseeing, and meet up with her friends in New York. The drive took seven days, but we didn</w:t>
+      </w:r>
+      <w:r>
+        <w:t>’</w:t>
+      </w:r>
+      <w:r>
+        <w:t xml:space="preserve">t push ourselves too hard—especially toward the end, when we detoured to camp in a national forest and go swimming at the </w:t>
       </w:r>
       <w:r>
         <w:lastRenderedPageBreak/>
-        <w:t>swimming at the beach. We had a great time and everything went very smoothly. The car didn</w:t>
-      </w:r>
-      <w:r>
-        <w:t>’</w:t>
-      </w:r>
-      <w:r>
-        <w:t>t give me any trouble at all during the entire trip, which clocked in at about 2,500 miles. I drove roughly two-thirds of the distance. I stayed in touch with Wei Jin along the way. I</w:t>
-      </w:r>
-      <w:r>
-        <w:t>’</w:t>
-      </w:r>
-      <w:r>
-        <w:t xml:space="preserve">m really thankful that he put a great deal of effort into helping me with housing arrangements. </w:t>
-      </w:r>
-    </w:p>
-    <w:p>
-      <w:pPr>
-        <w:pStyle w:val="CSP-ChapterBodyText"/>
-      </w:pPr>
-    </w:p>
-    <w:p>
-      <w:pPr>
-        <w:pStyle w:val="CSP-ChapterBodyText"/>
-      </w:pPr>
-      <w:r>
-        <w:t>I finally arrived in New Jersey on the night of July 11th and stayed at Wei Jin</w:t>
-      </w:r>
-      <w:r>
-        <w:t>’</w:t>
-      </w:r>
-      <w:r>
-        <w:t>s place for three nights before picking up the keys to my apartment on the afternoon of the 14th. Since I moved in, I</w:t>
-      </w:r>
-      <w:r>
-        <w:t>’</w:t>
-      </w:r>
-      <w:r>
-        <w:t>ve bought a queen-sized bed, a dining table, and two chairs. I</w:t>
-      </w:r>
-      <w:r>
-        <w:t>’</w:t>
-      </w:r>
-      <w:r>
-        <w:t>ll gradually pick up other things as I go, but at least the apartment no longer feels empty</w:t>
-      </w:r>
-      <w:r>
-        <w:t>—it</w:t>
+        <w:t>beach. We had a great time. The car didn</w:t>
+      </w:r>
+      <w:r>
+        <w:t>’</w:t>
+      </w:r>
+      <w:r>
+        <w:t>t give us any trouble at all during the entire trip—about 2,500 miles in all. I drove roughly two-thirds of the distance. Throughout the drive I stayed in touch with Wei Jin, and I</w:t>
+      </w:r>
+      <w:r>
+        <w:t>’</w:t>
+      </w:r>
+      <w:r>
+        <w:t>m really grateful for all the effort he put into finding my apartment.</w:t>
+      </w:r>
+      <w:r>
+        <w:t xml:space="preserve"> </w:t>
+      </w:r>
+    </w:p>
+    <w:p>
+      <w:pPr>
+        <w:pStyle w:val="CSP-ChapterBodyText"/>
+      </w:pPr>
+    </w:p>
+    <w:p>
+      <w:pPr>
+        <w:pStyle w:val="CSP-ChapterBodyText"/>
+      </w:pPr>
+      <w:r>
+        <w:t>We finally arrived in New Jersey on the night of July 11th and stayed at Wei Jin</w:t>
+      </w:r>
+      <w:r>
+        <w:t>’</w:t>
+      </w:r>
+      <w:r>
+        <w:t>s place for three nights before picking up the keys to my apartment on the afternoon of the 14th. Since moving in, Emma and I have been getting the place furnished. We picked up a queen-sized bed from BJ</w:t>
+      </w:r>
+      <w:r>
+        <w:t>’</w:t>
+      </w:r>
+      <w:r>
+        <w:t>s—a giant wholesale club—and a dining table and two chairs from IKEA. The bed was too big to fit in the Corolla, so we had to tie it to the roof of the car. As we drove gingerly home on local roads, we took a wrong turn and ended up on a high-speed toll road with a queen-sized bed strapped to the top—not exactly ideal. Driving in New Jersey is nothing like driving in Texas. The roads here are a maze of highways, traffic circles, and jughandles that make absolutely no sense until you get used to them. Anyway, I</w:t>
+      </w:r>
+      <w:r>
+        <w:t>’</w:t>
+      </w:r>
+      <w:r>
+        <w:t>ll gradually pick up other things as I go, but at least the apartment no longer feels empty—it</w:t>
       </w:r>
       <w:r>
         <w:t>’</w:t>
@@ -16250,7 +16250,11 @@
         <w:pStyle w:val="CSP-ChapterBodyText"/>
       </w:pPr>
       <w:r>
-        <w:t xml:space="preserve">Three days ago, we visited West Point, home of the U.S. Military Academy, and the campus is absolutely beautiful. Yesterday and the day before, we went out to the Delaware River for kayaking, camping, and paintball. Paintball is a mock combat game—not with real bullets, obviously, but with little capsules filled with colored dye that burst open on impact, splashing color all over you. It was tremendous fun. Those paintballs fly really fast, though, they really sting when </w:t>
+        <w:t xml:space="preserve">Three days ago, we visited West Point, home of the U.S. Military Academy, and the campus is absolutely beautiful. Yesterday and the day before, we went out to the Delaware River for kayaking, camping, and paintball. Paintball is a mock combat game—not with real bullets, obviously, but with little </w:t>
+      </w:r>
+      <w:r>
+        <w:lastRenderedPageBreak/>
+        <w:t xml:space="preserve">capsules filled with colored dye that burst open on impact, splashing color all over you. It was tremendous fun. Those paintballs fly really fast, though, they really sting when </w:t>
       </w:r>
       <w:r>
         <w:t>they</w:t>
@@ -16284,11 +16288,7 @@
         <w:t>’</w:t>
       </w:r>
       <w:r>
-        <w:t xml:space="preserve">ll mail some negatives to you in a couple </w:t>
-      </w:r>
-      <w:r>
-        <w:lastRenderedPageBreak/>
-        <w:t>of days. I even made sure to include the car in two of the pictures.</w:t>
+        <w:t>ll mail some negatives to you in a couple of days. I even made sure to include the car in two of the pictures.</w:t>
       </w:r>
     </w:p>
     <w:p>

</xml_diff>

<commit_message>
add to the about author
</commit_message>
<xml_diff>
--- a/letters_from_usa/book.docx
+++ b/letters_from_usa/book.docx
@@ -17686,6 +17686,49 @@
     <w:p>
       <w:pPr>
         <w:pStyle w:val="CSP-FrontMatterBodyText"/>
+      </w:pPr>
+      <w:r>
+        <w:t>Over the course of his career, he has worked in both the private and public sectors, including positions at Morgan Stanley, the Federal Reserve Bank, and, most recently, the Library of Congress. He lives in Maryland with his wife, Emma, and together they have raised two children.</w:t>
+      </w:r>
+    </w:p>
+    <w:p>
+      <w:pPr>
+        <w:pStyle w:val="CSP-FrontMatterBodyText"/>
+      </w:pPr>
+    </w:p>
+    <w:p>
+      <w:pPr>
+        <w:pStyle w:val="CSP-FrontMatterBodyText"/>
+      </w:pPr>
+      <w:r>
+        <w:t>His son, W. Austin, is expected to earn a Ph.D. in computer science in 2029.</w:t>
+      </w:r>
+      <w:r>
+        <w:t xml:space="preserve"> </w:t>
+      </w:r>
+    </w:p>
+    <w:p>
+      <w:pPr>
+        <w:pStyle w:val="CSP-FrontMatterBodyText"/>
+        <w:jc w:val="left"/>
+      </w:pPr>
+    </w:p>
+    <w:p>
+      <w:pPr>
+        <w:pStyle w:val="CSP-FrontMatterBodyText"/>
+        <w:jc w:val="left"/>
+      </w:pPr>
+    </w:p>
+    <w:p>
+      <w:pPr>
+        <w:pStyle w:val="CSP-FrontMatterBodyText"/>
+        <w:jc w:val="left"/>
+      </w:pPr>
+    </w:p>
+    <w:p>
+      <w:pPr>
+        <w:pStyle w:val="CSP-FrontMatterBodyText"/>
+        <w:jc w:val="left"/>
         <w:sectPr>
           <w:footerReference w:type="first" r:id="rId42"/>
           <w:type w:val="nextColumn"/>
@@ -17697,9 +17740,6 @@
           <w:docGrid w:linePitch="360"/>
         </w:sectPr>
       </w:pPr>
-      <w:r>
-        <w:t>Over the course of his career, he has worked in both the private and public sectors, including positions at Morgan Stanley, the Federal Reserve Bank, and, most recently, the Library of Congress. He lives in Maryland with his wife, Emma, and together they have raised two children.</w:t>
-      </w:r>
     </w:p>
     <w:p>
       <w:pPr>
@@ -20775,6 +20815,7 @@
   <w:style w:type="character" w:default="1" w:styleId="DefaultParagraphFont">
     <w:name w:val="Default Paragraph Font"/>
     <w:uiPriority w:val="1"/>
+    <w:semiHidden/>
     <w:unhideWhenUsed/>
   </w:style>
   <w:style w:type="table" w:default="1" w:styleId="TableNormal">

</xml_diff>

<commit_message>
Father and Mother throughout the editorial material
</commit_message>
<xml_diff>
--- a/letters_from_usa/book.docx
+++ b/letters_from_usa/book.docx
@@ -401,13 +401,25 @@
         <w:pStyle w:val="CSP-FrontMatterBodyText"/>
       </w:pPr>
       <w:r>
-        <w:t>On January 22, 2023, Emma and I boarded a flight to Nanjing, China. It was my first trip back since the pandemic began. My mother had passed away two weeks earlier during the devastating surge that followed the abrupt end of China</w:t>
-      </w:r>
-      <w:r>
-        <w:t>’</w:t>
-      </w:r>
-      <w:r>
-        <w:t xml:space="preserve">s zero-COVID restrictions. My father had died two years before. Travel bans and border closures meant I could not be at either of their bedsides. I never had the chance to say goodbye. Now, as one of the first </w:t>
+        <w:t xml:space="preserve">On January 22, 2023, Emma and I boarded a flight to Nanjing, China. It was my first trip back since the pandemic began. </w:t>
+      </w:r>
+      <w:r>
+        <w:t>Mother</w:t>
+      </w:r>
+      <w:r>
+        <w:t xml:space="preserve"> had passed away two weeks earlier during the devastating surge that followed the abrupt end of China</w:t>
+      </w:r>
+      <w:r>
+        <w:t>’</w:t>
+      </w:r>
+      <w:r>
+        <w:t xml:space="preserve">s zero-COVID restrictions. </w:t>
+      </w:r>
+      <w:r>
+        <w:t>Father</w:t>
+      </w:r>
+      <w:r>
+        <w:t xml:space="preserve"> had died two years before. Travel bans and border closures meant I could not be at either of their bedsides. I never had the chance to say goodbye. Now, as one of the first </w:t>
       </w:r>
       <w:r>
         <w:t>“</w:t>
@@ -11639,529 +11651,259 @@
     </w:p>
     <w:p>
       <w:pPr>
-        <w:spacing w:after="0" w:line="240" w:lineRule="auto"/>
-        <w:rPr>
-          <w:rFonts w:ascii="Garamond" w:hAnsi="Garamond"/>
-          <w:iCs/>
-        </w:rPr>
-      </w:pPr>
-      <w:r>
-        <w:rPr>
-          <w:rFonts w:ascii="Garamond" w:hAnsi="Garamond"/>
-          <w:iCs/>
-        </w:rPr>
+        <w:pStyle w:val="CSP-ChapterBodyText"/>
+      </w:pPr>
+      <w:r>
         <w:t>Dear Dad and Mom,</w:t>
       </w:r>
     </w:p>
     <w:p>
       <w:pPr>
-        <w:spacing w:after="0" w:line="240" w:lineRule="auto"/>
-        <w:rPr>
-          <w:rFonts w:ascii="Garamond" w:hAnsi="Garamond"/>
-          <w:iCs/>
-        </w:rPr>
-      </w:pPr>
-    </w:p>
-    <w:p>
-      <w:pPr>
-        <w:spacing w:after="0" w:line="240" w:lineRule="auto"/>
-        <w:rPr>
-          <w:rFonts w:ascii="Garamond" w:hAnsi="Garamond"/>
-          <w:iCs/>
-        </w:rPr>
-      </w:pPr>
-      <w:r>
-        <w:rPr>
-          <w:rFonts w:ascii="Garamond" w:hAnsi="Garamond"/>
-          <w:iCs/>
-        </w:rPr>
+        <w:pStyle w:val="CSP-ChapterBodyText"/>
+      </w:pPr>
+    </w:p>
+    <w:p>
+      <w:pPr>
+        <w:pStyle w:val="CSP-ChapterBodyText"/>
+      </w:pPr>
+      <w:r>
         <w:t>I</w:t>
       </w:r>
       <w:r>
-        <w:rPr>
-          <w:rFonts w:ascii="Garamond" w:hAnsi="Garamond"/>
-          <w:iCs/>
-        </w:rPr>
-        <w:t>’</w:t>
-      </w:r>
-      <w:r>
-        <w:rPr>
-          <w:rFonts w:ascii="Garamond" w:hAnsi="Garamond"/>
-          <w:iCs/>
-        </w:rPr>
+        <w:t>’</w:t>
+      </w:r>
+      <w:r>
         <w:t>m sure the previous letter I sent with the negatives hasn</w:t>
       </w:r>
       <w:r>
-        <w:rPr>
-          <w:rFonts w:ascii="Garamond" w:hAnsi="Garamond"/>
-          <w:iCs/>
-        </w:rPr>
-        <w:t>’</w:t>
-      </w:r>
-      <w:r>
-        <w:rPr>
-          <w:rFonts w:ascii="Garamond" w:hAnsi="Garamond"/>
-          <w:iCs/>
-        </w:rPr>
+        <w:t>’</w:t>
+      </w:r>
+      <w:r>
         <w:t>t been lost; it</w:t>
       </w:r>
       <w:r>
-        <w:rPr>
-          <w:rFonts w:ascii="Garamond" w:hAnsi="Garamond"/>
-          <w:iCs/>
-        </w:rPr>
-        <w:t>’</w:t>
-      </w:r>
-      <w:r>
-        <w:rPr>
-          <w:rFonts w:ascii="Garamond" w:hAnsi="Garamond"/>
-          <w:iCs/>
-        </w:rPr>
+        <w:t>’</w:t>
+      </w:r>
+      <w:r>
         <w:t>s probably just moving a bit slowly. It</w:t>
       </w:r>
       <w:r>
-        <w:rPr>
-          <w:rFonts w:ascii="Garamond" w:hAnsi="Garamond"/>
-          <w:iCs/>
-        </w:rPr>
-        <w:t>’</w:t>
-      </w:r>
-      <w:r>
-        <w:rPr>
-          <w:rFonts w:ascii="Garamond" w:hAnsi="Garamond"/>
-          <w:iCs/>
-        </w:rPr>
+        <w:t>’</w:t>
+      </w:r>
+      <w:r>
         <w:t>ll turn up if you give it a little more time, just like that New Year</w:t>
       </w:r>
       <w:r>
-        <w:rPr>
-          <w:rFonts w:ascii="Garamond" w:hAnsi="Garamond"/>
-          <w:iCs/>
-        </w:rPr>
-        <w:t>’</w:t>
-      </w:r>
-      <w:r>
-        <w:rPr>
-          <w:rFonts w:ascii="Garamond" w:hAnsi="Garamond"/>
-          <w:iCs/>
-        </w:rPr>
+        <w:t>’</w:t>
+      </w:r>
+      <w:r>
         <w:t>s card did.</w:t>
       </w:r>
       <w:r>
         <w:rPr>
           <w:rStyle w:val="FootnoteReference"/>
-          <w:rFonts w:ascii="Garamond" w:hAnsi="Garamond"/>
-          <w:iCs/>
         </w:rPr>
         <w:footnoteReference w:id="26"/>
       </w:r>
       <w:r>
-        <w:rPr>
-          <w:rFonts w:ascii="Garamond" w:hAnsi="Garamond"/>
-          <w:iCs/>
-        </w:rPr>
         <w:t xml:space="preserve"> There are nearly thirty negatives in that envelope, mostly from my trip to Houston last year and my recent trip to Atlantic City. By the way, Atlantic City is the gambling town—it</w:t>
       </w:r>
       <w:r>
-        <w:rPr>
-          <w:rFonts w:ascii="Garamond" w:hAnsi="Garamond"/>
-          <w:iCs/>
-        </w:rPr>
-        <w:t>’</w:t>
-      </w:r>
-      <w:r>
-        <w:rPr>
-          <w:rFonts w:ascii="Garamond" w:hAnsi="Garamond"/>
-          <w:iCs/>
-        </w:rPr>
+        <w:t>’</w:t>
+      </w:r>
+      <w:r>
         <w:t>s not Atlanta, where they</w:t>
       </w:r>
       <w:r>
-        <w:rPr>
-          <w:rFonts w:ascii="Garamond" w:hAnsi="Garamond"/>
-          <w:iCs/>
-        </w:rPr>
-        <w:t>’</w:t>
-      </w:r>
-      <w:r>
-        <w:rPr>
-          <w:rFonts w:ascii="Garamond" w:hAnsi="Garamond"/>
-          <w:iCs/>
-        </w:rPr>
+        <w:t>’</w:t>
+      </w:r>
+      <w:r>
         <w:t>re hosting the Olympics. Have you been watching the games? They rarely broadcast events featuring the Chinese teams here. Tonight is the closing ceremony.</w:t>
       </w:r>
     </w:p>
     <w:p>
       <w:pPr>
-        <w:spacing w:after="0" w:line="240" w:lineRule="auto"/>
-        <w:rPr>
-          <w:rFonts w:ascii="Garamond" w:hAnsi="Garamond"/>
-          <w:iCs/>
-        </w:rPr>
-      </w:pPr>
-    </w:p>
-    <w:p>
-      <w:pPr>
-        <w:spacing w:after="0" w:line="240" w:lineRule="auto"/>
-        <w:rPr>
-          <w:rFonts w:ascii="Garamond" w:hAnsi="Garamond"/>
-          <w:iCs/>
-        </w:rPr>
-      </w:pPr>
-      <w:r>
-        <w:rPr>
-          <w:rFonts w:ascii="Garamond" w:hAnsi="Garamond"/>
-          <w:iCs/>
-        </w:rPr>
+        <w:pStyle w:val="CSP-ChapterBodyText"/>
+      </w:pPr>
+    </w:p>
+    <w:p>
+      <w:pPr>
+        <w:pStyle w:val="CSP-ChapterBodyText"/>
+      </w:pPr>
+      <w:r>
         <w:t>I have three weeks left before I head back to Austin. Work has been going really smoothly, and I</w:t>
       </w:r>
       <w:r>
-        <w:rPr>
-          <w:rFonts w:ascii="Garamond" w:hAnsi="Garamond"/>
-          <w:iCs/>
-        </w:rPr>
-        <w:t>’</w:t>
-      </w:r>
-      <w:r>
-        <w:rPr>
-          <w:rFonts w:ascii="Garamond" w:hAnsi="Garamond"/>
-          <w:iCs/>
-        </w:rPr>
+        <w:t>’</w:t>
+      </w:r>
+      <w:r>
         <w:t>ve made great progress—I</w:t>
       </w:r>
       <w:r>
-        <w:rPr>
-          <w:rFonts w:ascii="Garamond" w:hAnsi="Garamond"/>
-          <w:iCs/>
-        </w:rPr>
-        <w:t>’</w:t>
-      </w:r>
-      <w:r>
-        <w:rPr>
-          <w:rFonts w:ascii="Garamond" w:hAnsi="Garamond"/>
-          <w:iCs/>
-        </w:rPr>
+        <w:t>’</w:t>
+      </w:r>
+      <w:r>
         <w:t>ve already finished writing two software programs. They</w:t>
       </w:r>
       <w:r>
-        <w:rPr>
-          <w:rFonts w:ascii="Garamond" w:hAnsi="Garamond"/>
-          <w:iCs/>
-        </w:rPr>
-        <w:t>’</w:t>
-      </w:r>
-      <w:r>
-        <w:rPr>
-          <w:rFonts w:ascii="Garamond" w:hAnsi="Garamond"/>
-          <w:iCs/>
-        </w:rPr>
+        <w:t>’</w:t>
+      </w:r>
+      <w:r>
         <w:t>ve even asked me to come back and work for another month over winter break. I haven</w:t>
       </w:r>
       <w:r>
-        <w:rPr>
-          <w:rFonts w:ascii="Garamond" w:hAnsi="Garamond"/>
-          <w:iCs/>
-        </w:rPr>
-        <w:t>’</w:t>
-      </w:r>
-      <w:r>
-        <w:rPr>
-          <w:rFonts w:ascii="Garamond" w:hAnsi="Garamond"/>
-          <w:iCs/>
-        </w:rPr>
+        <w:t>’</w:t>
+      </w:r>
+      <w:r>
         <w:t>t given them a definitive answer yet because I don</w:t>
       </w:r>
       <w:r>
-        <w:rPr>
-          <w:rFonts w:ascii="Garamond" w:hAnsi="Garamond"/>
-          <w:iCs/>
-        </w:rPr>
-        <w:t>’</w:t>
-      </w:r>
-      <w:r>
-        <w:rPr>
-          <w:rFonts w:ascii="Garamond" w:hAnsi="Garamond"/>
-          <w:iCs/>
-        </w:rPr>
+        <w:t>’</w:t>
+      </w:r>
+      <w:r>
         <w:t>t know what my plans will be. We</w:t>
       </w:r>
       <w:r>
-        <w:rPr>
-          <w:rFonts w:ascii="Garamond" w:hAnsi="Garamond"/>
-          <w:iCs/>
-        </w:rPr>
-        <w:t>’</w:t>
-      </w:r>
-      <w:r>
-        <w:rPr>
-          <w:rFonts w:ascii="Garamond" w:hAnsi="Garamond"/>
-          <w:iCs/>
-        </w:rPr>
+        <w:t>’</w:t>
+      </w:r>
+      <w:r>
         <w:t>ll just have to see how things play out.</w:t>
       </w:r>
     </w:p>
     <w:p>
       <w:pPr>
-        <w:spacing w:after="0" w:line="240" w:lineRule="auto"/>
-        <w:rPr>
-          <w:rFonts w:ascii="Garamond" w:hAnsi="Garamond"/>
-          <w:iCs/>
-        </w:rPr>
-      </w:pPr>
-    </w:p>
-    <w:p>
-      <w:pPr>
-        <w:spacing w:after="0" w:line="240" w:lineRule="auto"/>
-        <w:rPr>
-          <w:rFonts w:ascii="Garamond" w:hAnsi="Garamond"/>
-          <w:iCs/>
-        </w:rPr>
-      </w:pPr>
-      <w:r>
-        <w:rPr>
-          <w:rFonts w:ascii="Garamond" w:hAnsi="Garamond"/>
-          <w:iCs/>
-        </w:rPr>
+        <w:pStyle w:val="CSP-ChapterBodyText"/>
+      </w:pPr>
+    </w:p>
+    <w:p>
+      <w:pPr>
+        <w:pStyle w:val="CSP-ChapterBodyText"/>
+      </w:pPr>
+      <w:r>
         <w:t>As for my decision on Ph.D., I</w:t>
       </w:r>
       <w:r>
-        <w:rPr>
-          <w:rFonts w:ascii="Garamond" w:hAnsi="Garamond"/>
-          <w:iCs/>
-        </w:rPr>
-        <w:t>’</w:t>
-      </w:r>
-      <w:r>
-        <w:rPr>
-          <w:rFonts w:ascii="Garamond" w:hAnsi="Garamond"/>
-          <w:iCs/>
-        </w:rPr>
-        <w:t xml:space="preserve">m still on the fence. My last letter might have caused a bit of a misunderstanding. Generally speaking, a Ph.D. narrows the kinds of jobs you can </w:t>
-      </w:r>
-      <w:r>
-        <w:rPr>
-          <w:rFonts w:ascii="Garamond" w:hAnsi="Garamond"/>
-          <w:iCs/>
-        </w:rPr>
+        <w:t>’</w:t>
+      </w:r>
+      <w:r>
+        <w:t xml:space="preserve">m still on the fence. My last letter might have caused a bit of a misunderstanding. Generally speaking, a Ph.D. narrows the kinds of jobs you can pursue. Bell Labs is primarily a research institution, so naturally they </w:t>
+      </w:r>
+      <w:r>
         <w:lastRenderedPageBreak/>
-        <w:t>pursue. Bell Labs is primarily a research institution, so naturally they value advanced degrees and only hire international students with doctorates. However, most companies prefer hiring people with bachelor</w:t>
-      </w:r>
-      <w:r>
-        <w:rPr>
-          <w:rFonts w:ascii="Garamond" w:hAnsi="Garamond"/>
-          <w:iCs/>
-        </w:rPr>
-        <w:t>’</w:t>
-      </w:r>
-      <w:r>
-        <w:rPr>
-          <w:rFonts w:ascii="Garamond" w:hAnsi="Garamond"/>
-          <w:iCs/>
-        </w:rPr>
+        <w:t>value advanced degrees and only hire international students with doctorates. However, most companies prefer hiring people with bachelor</w:t>
+      </w:r>
+      <w:r>
+        <w:t>’</w:t>
+      </w:r>
+      <w:r>
         <w:t>s or master</w:t>
       </w:r>
       <w:r>
-        <w:rPr>
-          <w:rFonts w:ascii="Garamond" w:hAnsi="Garamond"/>
-          <w:iCs/>
-        </w:rPr>
-        <w:t>’</w:t>
-      </w:r>
-      <w:r>
-        <w:rPr>
-          <w:rFonts w:ascii="Garamond" w:hAnsi="Garamond"/>
-          <w:iCs/>
-        </w:rPr>
+        <w:t>’</w:t>
+      </w:r>
+      <w:r>
         <w:t xml:space="preserve">s degrees over </w:t>
       </w:r>
       <w:proofErr w:type="spellStart"/>
       <w:r>
-        <w:rPr>
-          <w:rFonts w:ascii="Garamond" w:hAnsi="Garamond"/>
-          <w:iCs/>
-        </w:rPr>
         <w:t>Ph.D.s</w:t>
       </w:r>
       <w:proofErr w:type="spellEnd"/>
       <w:r>
-        <w:rPr>
-          <w:rFonts w:ascii="Garamond" w:hAnsi="Garamond"/>
-          <w:iCs/>
-        </w:rPr>
         <w:t>. In other words, getting a Ph.D. often means limiting yourself to universities, major corporations, or research labs. Next semester, I plan to take three more classes to see whether any specific field catches my interest or whether I can find a suitable advisor.</w:t>
       </w:r>
     </w:p>
     <w:p>
       <w:pPr>
-        <w:spacing w:after="0" w:line="240" w:lineRule="auto"/>
-        <w:rPr>
-          <w:rFonts w:ascii="Garamond" w:hAnsi="Garamond"/>
-          <w:iCs/>
-        </w:rPr>
-      </w:pPr>
-    </w:p>
-    <w:p>
-      <w:pPr>
-        <w:spacing w:after="0" w:line="240" w:lineRule="auto"/>
-        <w:rPr>
-          <w:rFonts w:ascii="Garamond" w:hAnsi="Garamond"/>
-          <w:iCs/>
-        </w:rPr>
-      </w:pPr>
-      <w:r>
-        <w:rPr>
-          <w:rFonts w:ascii="Garamond" w:hAnsi="Garamond"/>
-          <w:iCs/>
-        </w:rPr>
+        <w:pStyle w:val="CSP-ChapterBodyText"/>
+      </w:pPr>
+    </w:p>
+    <w:p>
+      <w:pPr>
+        <w:pStyle w:val="CSP-ChapterBodyText"/>
+      </w:pPr>
+      <w:r>
         <w:t xml:space="preserve">Two weeks ago, about thirty Chinese employees at AT&amp;T, myself included, organized an outing. It took us about three to four hours to drive there. On the first day, we went camping—barbecuing outdoors and sleeping inside tents in our sleeping bags. I actually forgot how to write the Chinese characters for </w:t>
       </w:r>
       <w:r>
-        <w:rPr>
-          <w:rFonts w:ascii="Garamond" w:hAnsi="Garamond"/>
-          <w:iCs/>
-        </w:rPr>
         <w:t>“</w:t>
       </w:r>
       <w:r>
-        <w:rPr>
-          <w:rFonts w:ascii="Garamond" w:hAnsi="Garamond"/>
-          <w:iCs/>
-        </w:rPr>
         <w:t>tent</w:t>
       </w:r>
       <w:r>
-        <w:rPr>
-          <w:rFonts w:ascii="Garamond" w:hAnsi="Garamond"/>
-          <w:iCs/>
-        </w:rPr>
         <w:t>”</w:t>
       </w:r>
       <w:r>
-        <w:rPr>
-          <w:rFonts w:ascii="Garamond" w:hAnsi="Garamond"/>
-          <w:iCs/>
-        </w:rPr>
         <w:t xml:space="preserve"> and had to look them up in an English-Chinese dictionary! I</w:t>
       </w:r>
       <w:r>
-        <w:rPr>
-          <w:rFonts w:ascii="Garamond" w:hAnsi="Garamond"/>
-          <w:iCs/>
-        </w:rPr>
-        <w:t>’</w:t>
-      </w:r>
-      <w:r>
-        <w:rPr>
-          <w:rFonts w:ascii="Garamond" w:hAnsi="Garamond"/>
-          <w:iCs/>
-        </w:rPr>
+        <w:t>’</w:t>
+      </w:r>
+      <w:r>
         <w:t>m getting rusty when it comes to writing Chinese.</w:t>
       </w:r>
       <w:r>
-        <w:rPr>
-          <w:rFonts w:ascii="Garamond" w:hAnsi="Garamond"/>
-          <w:iCs/>
-        </w:rPr>
         <w:t xml:space="preserve"> </w:t>
       </w:r>
       <w:r>
-        <w:rPr>
-          <w:rFonts w:ascii="Garamond" w:hAnsi="Garamond"/>
-          <w:iCs/>
-        </w:rPr>
         <w:t>The second day was canoeing. Jim and I shared a boat, and we were supposed to paddle down the Delaware River for a full six hours. The river is very wide, and we were all wearing life jackets. Just twenty minutes after we started, our canoe flipped, and both of us—along with all our food—fell right into the water! Fortunately, it was summer and the water wasn</w:t>
       </w:r>
       <w:r>
-        <w:rPr>
-          <w:rFonts w:ascii="Garamond" w:hAnsi="Garamond"/>
-          <w:iCs/>
-        </w:rPr>
-        <w:t>’</w:t>
-      </w:r>
-      <w:r>
-        <w:rPr>
-          <w:rFonts w:ascii="Garamond" w:hAnsi="Garamond"/>
-          <w:iCs/>
-        </w:rPr>
+        <w:t>’</w:t>
+      </w:r>
+      <w:r>
         <w:t>t too cold. We got completely soaked and managed to swim about fifty meters to reach the riverbank. I ended up hitching a ride in someone else</w:t>
       </w:r>
       <w:r>
-        <w:rPr>
-          <w:rFonts w:ascii="Garamond" w:hAnsi="Garamond"/>
-          <w:iCs/>
-        </w:rPr>
-        <w:t>’</w:t>
-      </w:r>
-      <w:r>
-        <w:rPr>
-          <w:rFonts w:ascii="Garamond" w:hAnsi="Garamond"/>
-          <w:iCs/>
-        </w:rPr>
+        <w:t>’</w:t>
+      </w:r>
+      <w:r>
         <w:t>s canoe for the rest of the journey. I was much more cautious after that incident and managed to stay dry, but it was still a lot of fun. In fact, that was the first time I</w:t>
       </w:r>
       <w:r>
-        <w:rPr>
-          <w:rFonts w:ascii="Garamond" w:hAnsi="Garamond"/>
-          <w:iCs/>
-        </w:rPr>
-        <w:t>’</w:t>
-      </w:r>
-      <w:r>
-        <w:rPr>
-          <w:rFonts w:ascii="Garamond" w:hAnsi="Garamond"/>
-          <w:iCs/>
-        </w:rPr>
+        <w:t>’</w:t>
+      </w:r>
+      <w:r>
         <w:t>d ever gone swimming in America, though certainly not by choice! I keep teasing Jim that I saved his life because I helped him out of the water.</w:t>
       </w:r>
     </w:p>
     <w:p>
       <w:pPr>
-        <w:spacing w:after="0" w:line="240" w:lineRule="auto"/>
-        <w:rPr>
-          <w:rFonts w:ascii="Garamond" w:hAnsi="Garamond"/>
-          <w:iCs/>
-        </w:rPr>
-      </w:pPr>
-    </w:p>
-    <w:p>
-      <w:pPr>
-        <w:spacing w:after="0" w:line="240" w:lineRule="auto"/>
-        <w:rPr>
-          <w:rFonts w:ascii="Garamond" w:hAnsi="Garamond"/>
-          <w:iCs/>
-        </w:rPr>
-      </w:pPr>
-      <w:r>
-        <w:rPr>
-          <w:rFonts w:ascii="Garamond" w:hAnsi="Garamond"/>
-          <w:iCs/>
-        </w:rPr>
+        <w:pStyle w:val="CSP-ChapterBodyText"/>
+      </w:pPr>
+    </w:p>
+    <w:p>
+      <w:pPr>
+        <w:pStyle w:val="CSP-ChapterBodyText"/>
+      </w:pPr>
+      <w:r>
         <w:t>Wishing you both good health,</w:t>
       </w:r>
     </w:p>
     <w:p>
       <w:pPr>
-        <w:spacing w:after="0" w:line="240" w:lineRule="auto"/>
-        <w:rPr>
-          <w:rFonts w:ascii="Garamond" w:hAnsi="Garamond"/>
-          <w:iCs/>
-        </w:rPr>
-      </w:pPr>
-    </w:p>
-    <w:p>
-      <w:pPr>
-        <w:spacing w:after="0" w:line="240" w:lineRule="auto"/>
-        <w:rPr>
-          <w:rFonts w:ascii="Garamond" w:hAnsi="Garamond"/>
-          <w:iCs/>
-        </w:rPr>
-      </w:pPr>
-      <w:r>
-        <w:rPr>
-          <w:rFonts w:ascii="Garamond" w:hAnsi="Garamond"/>
-          <w:iCs/>
-        </w:rPr>
+        <w:pStyle w:val="CSP-ChapterBodyText"/>
+      </w:pPr>
+    </w:p>
+    <w:p>
+      <w:pPr>
+        <w:pStyle w:val="CSP-ChapterBodyText"/>
+      </w:pPr>
+      <w:r>
         <w:t>Tong</w:t>
+      </w:r>
+    </w:p>
+    <w:p>
+      <w:pPr>
+        <w:pStyle w:val="CSP-ChapterBodyText"/>
+        <w:rPr>
+          <w:sz w:val="44"/>
+          <w:szCs w:val="44"/>
+        </w:rPr>
+      </w:pPr>
+      <w:r>
+        <w:t>08/04/96</w:t>
       </w:r>
     </w:p>
     <w:p>
@@ -12174,24 +11916,6 @@
           <w:szCs w:val="44"/>
         </w:rPr>
       </w:pPr>
-      <w:r>
-        <w:rPr>
-          <w:rFonts w:ascii="Garamond" w:hAnsi="Garamond"/>
-          <w:iCs/>
-        </w:rPr>
-        <w:t>08/04/96</w:t>
-      </w:r>
-    </w:p>
-    <w:p>
-      <w:pPr>
-        <w:spacing w:after="0" w:line="240" w:lineRule="auto"/>
-        <w:rPr>
-          <w:rFonts w:ascii="Garamond" w:hAnsi="Garamond"/>
-          <w:iCs/>
-          <w:sz w:val="44"/>
-          <w:szCs w:val="44"/>
-        </w:rPr>
-      </w:pPr>
     </w:p>
     <w:p>
       <w:pPr>
@@ -12204,6 +11928,7 @@
         <w:rPr>
           <w:rFonts w:ascii="Garamond" w:hAnsi="Garamond"/>
         </w:rPr>
+        <w:lastRenderedPageBreak/>
         <w:t>1</w:t>
       </w:r>
       <w:r>
@@ -12438,191 +12163,187 @@
         <w:t>’</w:t>
       </w:r>
       <w:r>
-        <w:t xml:space="preserve">ll return next May to get married. He spent twenty days in Shanghai but only a few days with his </w:t>
-      </w:r>
+        <w:t>ll return next May to get married. He spent twenty days in Shanghai but only a few days with his parents in Beijing—talk about an unfilial son! Joking aside, I</w:t>
+      </w:r>
+      <w:r>
+        <w:t>’</w:t>
+      </w:r>
+      <w:r>
+        <w:t>m not very fond of arranged matchmaking.</w:t>
+      </w:r>
+    </w:p>
+    <w:p>
+      <w:pPr>
+        <w:pStyle w:val="CSP-ChapterBodyText"/>
+      </w:pPr>
+    </w:p>
+    <w:p>
+      <w:pPr>
+        <w:pStyle w:val="CSP-ChapterBodyText"/>
+      </w:pPr>
+      <w:r>
+        <w:t>About two months ago, while I was still in New Jersey, I met an American girl online. Her name is Robin. At first, we exchanged emails almost every day, and she even called me once. She</w:t>
+      </w:r>
+      <w:r>
+        <w:t>’</w:t>
+      </w:r>
+      <w:r>
+        <w:t>s a freshman here at UT Austin and, although she hasn</w:t>
+      </w:r>
+      <w:r>
+        <w:t>’</w:t>
+      </w:r>
+      <w:r>
+        <w:t>t declared a major yet, she</w:t>
+      </w:r>
+      <w:r>
+        <w:t>’</w:t>
+      </w:r>
+      <w:r>
+        <w:t>s very interested in psychology. She was born on Thanksgiving Day in 1977 and grew up on a 150-acre family farm about four hours from Austin. Her parents divorced when she was only a year old. Her maternal grandfather is Native American, and her father is of Irish descent.</w:t>
+      </w:r>
+    </w:p>
+    <w:p>
+      <w:pPr>
+        <w:pStyle w:val="CSP-ChapterBodyText"/>
+      </w:pPr>
+    </w:p>
+    <w:p>
+      <w:pPr>
+        <w:pStyle w:val="CSP-ChapterBodyText"/>
+      </w:pPr>
+      <w:r>
+        <w:t>Since I returned to Austin, we</w:t>
+      </w:r>
+      <w:r>
+        <w:t>’</w:t>
+      </w:r>
+      <w:r>
+        <w:t>ve started hanging out in person. She has sandy-blonde hair tied back into a ponytail and always seems to sport the unofficial uniform of a Texas college girl—shorts and a T-shirt. She</w:t>
+      </w:r>
+      <w:r>
+        <w:t>’</w:t>
+      </w:r>
+      <w:r>
+        <w:t>s very down-to-earth and unpretentious, which I find especially refreshing. She</w:t>
+      </w:r>
+      <w:r>
+        <w:t>’</w:t>
+      </w:r>
+      <w:r>
+        <w:t xml:space="preserve">s also very athletic and played on her high school varsity teams in basketball, volleyball, softball, and several other sports. </w:t>
+      </w:r>
+    </w:p>
+    <w:p>
+      <w:pPr>
+        <w:pStyle w:val="CSP-ChapterBodyText"/>
+      </w:pPr>
+    </w:p>
+    <w:p>
+      <w:pPr>
+        <w:pStyle w:val="CSP-ChapterBodyText"/>
+      </w:pPr>
+      <w:r>
+        <w:t>We see each other quite often now—going out for dinner, renting movies to watch at home, chatting over coffee, and watching football games. We were supposed to go to a play tonight, but it got canceled, so we ended up walking around the mall and getting coffee afterward. Lately, we</w:t>
+      </w:r>
+      <w:r>
+        <w:t>’</w:t>
+      </w:r>
+      <w:r>
+        <w:t>ve been talking on the phone every day.</w:t>
+      </w:r>
+    </w:p>
+    <w:p>
+      <w:pPr>
+        <w:pStyle w:val="CSP-ChapterBodyText"/>
+      </w:pPr>
+    </w:p>
+    <w:p>
+      <w:pPr>
+        <w:pStyle w:val="CSP-ChapterBodyText"/>
+      </w:pPr>
+      <w:r>
+        <w:t>All in all, she</w:t>
+      </w:r>
+      <w:r>
+        <w:t>’</w:t>
+      </w:r>
+      <w:r>
+        <w:t>s a really nice girl. Don</w:t>
+      </w:r>
+      <w:r>
+        <w:t>’</w:t>
+      </w:r>
+      <w:r>
+        <w:t>t assume that all Americans are super open and progressive—she</w:t>
+      </w:r>
+      <w:r>
+        <w:t>’</w:t>
+      </w:r>
+      <w:r>
+        <w:t>s actually fairly traditional and conservative. I like her a lot, and I think she feels the same way. For now, we</w:t>
+      </w:r>
+      <w:r>
+        <w:t>’</w:t>
+      </w:r>
+      <w:r>
+        <w:t>re simply seeing each other, and there</w:t>
+      </w:r>
+      <w:r>
+        <w:t>’</w:t>
+      </w:r>
+      <w:r>
+        <w:t>s no telling where things might lead. I don</w:t>
+      </w:r>
+      <w:r>
+        <w:t>’</w:t>
+      </w:r>
+      <w:r>
+        <w:t>t want to keep anything from you, but I also don</w:t>
+      </w:r>
+      <w:r>
+        <w:t>’</w:t>
+      </w:r>
+      <w:r>
+        <w:t>t want to raise your hopes and have you disappointed if things don</w:t>
+      </w:r>
+      <w:r>
+        <w:t>’</w:t>
+      </w:r>
+      <w:r>
+        <w:t>t work out.</w:t>
+      </w:r>
+    </w:p>
+    <w:p>
+      <w:pPr>
+        <w:pStyle w:val="CSP-ChapterBodyText"/>
+      </w:pPr>
+    </w:p>
+    <w:p>
+      <w:pPr>
+        <w:pStyle w:val="CSP-ChapterBodyText"/>
+      </w:pPr>
+      <w:r>
+        <w:t>I</w:t>
+      </w:r>
+      <w:r>
+        <w:t>’</w:t>
+      </w:r>
+      <w:r>
+        <w:t>ll leave it at that for now.</w:t>
+      </w:r>
+    </w:p>
+    <w:p>
+      <w:pPr>
+        <w:pStyle w:val="CSP-ChapterBodyText"/>
+      </w:pPr>
+    </w:p>
+    <w:p>
+      <w:pPr>
+        <w:pStyle w:val="CSP-ChapterBodyText"/>
+      </w:pPr>
       <w:r>
         <w:lastRenderedPageBreak/>
-        <w:t>parents in Beijing—talk about an unfilial son! Joking aside, I</w:t>
-      </w:r>
-      <w:r>
-        <w:t>’</w:t>
-      </w:r>
-      <w:r>
-        <w:t>m not very fond of arranged matchmaking.</w:t>
-      </w:r>
-    </w:p>
-    <w:p>
-      <w:pPr>
-        <w:pStyle w:val="CSP-ChapterBodyText"/>
-      </w:pPr>
-    </w:p>
-    <w:p>
-      <w:pPr>
-        <w:pStyle w:val="CSP-ChapterBodyText"/>
-      </w:pPr>
-      <w:r>
-        <w:t>About two months ago, while I was still in New Jersey, I met an American girl online. Her name is Robin. At first, we exchanged emails almost every day, and she even called me once. She</w:t>
-      </w:r>
-      <w:r>
-        <w:t>’</w:t>
-      </w:r>
-      <w:r>
-        <w:t>s a freshman here at UT Austin and, although she hasn</w:t>
-      </w:r>
-      <w:r>
-        <w:t>’</w:t>
-      </w:r>
-      <w:r>
-        <w:t>t declared a major yet, she</w:t>
-      </w:r>
-      <w:r>
-        <w:t>’</w:t>
-      </w:r>
-      <w:r>
-        <w:t>s very interested in psychology. She was born on Thanksgiving Day in 1977 and grew up on a 150-acre family farm about four hours from Austin. Her parents divorced when she was only a year old. Her maternal grandfather is Native American, and her father is of Irish descent.</w:t>
-      </w:r>
-    </w:p>
-    <w:p>
-      <w:pPr>
-        <w:pStyle w:val="CSP-ChapterBodyText"/>
-      </w:pPr>
-    </w:p>
-    <w:p>
-      <w:pPr>
-        <w:pStyle w:val="CSP-ChapterBodyText"/>
-      </w:pPr>
-      <w:r>
-        <w:t>Since I returned to Austin, we</w:t>
-      </w:r>
-      <w:r>
-        <w:t>’</w:t>
-      </w:r>
-      <w:r>
-        <w:t>ve started hanging out in person. She has sandy-blonde hair tied back into a ponytail and always seems to sport the unofficial uniform of a Texas college girl—shorts and a T-shirt. She</w:t>
-      </w:r>
-      <w:r>
-        <w:t>’</w:t>
-      </w:r>
-      <w:r>
-        <w:t>s very down-to-earth and unpretentious, which I find especially refreshing. She</w:t>
-      </w:r>
-      <w:r>
-        <w:t>’</w:t>
-      </w:r>
-      <w:r>
-        <w:t xml:space="preserve">s also very athletic and played on her high school varsity teams in basketball, volleyball, softball, and several other sports. </w:t>
-      </w:r>
-    </w:p>
-    <w:p>
-      <w:pPr>
-        <w:pStyle w:val="CSP-ChapterBodyText"/>
-      </w:pPr>
-    </w:p>
-    <w:p>
-      <w:pPr>
-        <w:pStyle w:val="CSP-ChapterBodyText"/>
-      </w:pPr>
-      <w:r>
-        <w:t>We see each other quite often now—going out for dinner, renting movies to watch at home, chatting over coffee, and watching football games. We were supposed to go to a play tonight, but it got canceled, so we ended up walking around the mall and getting coffee afterward. Lately, we</w:t>
-      </w:r>
-      <w:r>
-        <w:t>’</w:t>
-      </w:r>
-      <w:r>
-        <w:t>ve been talking on the phone every day.</w:t>
-      </w:r>
-    </w:p>
-    <w:p>
-      <w:pPr>
-        <w:pStyle w:val="CSP-ChapterBodyText"/>
-      </w:pPr>
-    </w:p>
-    <w:p>
-      <w:pPr>
-        <w:pStyle w:val="CSP-ChapterBodyText"/>
-      </w:pPr>
-      <w:r>
-        <w:t>All in all, she</w:t>
-      </w:r>
-      <w:r>
-        <w:t>’</w:t>
-      </w:r>
-      <w:r>
-        <w:t>s a really nice girl. Don</w:t>
-      </w:r>
-      <w:r>
-        <w:t>’</w:t>
-      </w:r>
-      <w:r>
-        <w:t>t assume that all Americans are super open and progressive—she</w:t>
-      </w:r>
-      <w:r>
-        <w:t>’</w:t>
-      </w:r>
-      <w:r>
-        <w:t>s actually fairly traditional and conservative. I like her a lot, and I think she feels the same way. For now, we</w:t>
-      </w:r>
-      <w:r>
-        <w:t>’</w:t>
-      </w:r>
-      <w:r>
-        <w:t>re simply seeing each other, and there</w:t>
-      </w:r>
-      <w:r>
-        <w:t>’</w:t>
-      </w:r>
-      <w:r>
-        <w:t>s no telling where things might lead. I don</w:t>
-      </w:r>
-      <w:r>
-        <w:t>’</w:t>
-      </w:r>
-      <w:r>
-        <w:t>t want to keep anything from you, but I also don</w:t>
-      </w:r>
-      <w:r>
-        <w:t>’</w:t>
-      </w:r>
-      <w:r>
-        <w:t>t want to raise your hopes and have you disappointed if things don</w:t>
-      </w:r>
-      <w:r>
-        <w:t>’</w:t>
-      </w:r>
-      <w:r>
-        <w:t>t work out.</w:t>
-      </w:r>
-    </w:p>
-    <w:p>
-      <w:pPr>
-        <w:pStyle w:val="CSP-ChapterBodyText"/>
-      </w:pPr>
-    </w:p>
-    <w:p>
-      <w:pPr>
-        <w:pStyle w:val="CSP-ChapterBodyText"/>
-      </w:pPr>
-      <w:r>
-        <w:lastRenderedPageBreak/>
-        <w:t>I</w:t>
-      </w:r>
-      <w:r>
-        <w:t>’</w:t>
-      </w:r>
-      <w:r>
-        <w:t>ll leave it at that for now.</w:t>
-      </w:r>
-    </w:p>
-    <w:p>
-      <w:pPr>
-        <w:pStyle w:val="CSP-ChapterBodyText"/>
-      </w:pPr>
-    </w:p>
-    <w:p>
-      <w:pPr>
-        <w:pStyle w:val="CSP-ChapterBodyText"/>
-      </w:pPr>
-      <w:r>
         <w:t>Wishing you the best,</w:t>
       </w:r>
     </w:p>
@@ -19660,7 +19381,13 @@
         <w:t>’</w:t>
       </w:r>
       <w:r>
-        <w:t>s salary for my father.</w:t>
+        <w:t xml:space="preserve">s salary for </w:t>
+      </w:r>
+      <w:r>
+        <w:t>Father</w:t>
+      </w:r>
+      <w:r>
+        <w:t>.</w:t>
       </w:r>
     </w:p>
   </w:footnote>

</xml_diff>

<commit_message>
more footnotes based on parents letters
</commit_message>
<xml_diff>
--- a/letters_from_usa/book.docx
+++ b/letters_from_usa/book.docx
@@ -315,6 +315,35 @@
     <w:p>
       <w:pPr>
         <w:pStyle w:val="CSP-FrontMatterBodyText"/>
+      </w:pPr>
+      <w:r>
+        <w:t xml:space="preserve">for </w:t>
+      </w:r>
+      <w:r>
+        <w:t xml:space="preserve">  </w:t>
+      </w:r>
+    </w:p>
+    <w:p>
+      <w:pPr>
+        <w:pStyle w:val="CSP-FrontMatterBodyText"/>
+      </w:pPr>
+      <w:r>
+        <w:t>your love,</w:t>
+      </w:r>
+      <w:proofErr w:type="spellStart"/>
+    </w:p>
+    <w:p>
+      <w:pPr>
+        <w:pStyle w:val="CSP-FrontMatterBodyText"/>
+      </w:pPr>
+      <w:proofErr w:type="spellEnd"/>
+      <w:r>
+        <w:t>support,</w:t>
+      </w:r>
+    </w:p>
+    <w:p>
+      <w:pPr>
+        <w:pStyle w:val="CSP-FrontMatterBodyText"/>
         <w:sectPr>
           <w:type w:val="nextColumn"/>
           <w:pgSz w:w="7286" w:h="11246"/>
@@ -327,7 +356,7 @@
         </w:sectPr>
       </w:pPr>
       <w:r>
-        <w:t>for everything</w:t>
+        <w:t xml:space="preserve"> and trust in me</w:t>
       </w:r>
     </w:p>
     <w:p>
@@ -1933,15 +1962,7 @@
                 <w:sz w:val="20"/>
                 <w:szCs w:val="20"/>
               </w:rPr>
-              <w:t>5</w:t>
-            </w:r>
-            <w:r>
-              <w:rPr>
-                <w:rFonts w:ascii="Garamond" w:hAnsi="Garamond"/>
-                <w:sz w:val="20"/>
-                <w:szCs w:val="20"/>
-              </w:rPr>
-              <w:t>9</w:t>
+              <w:t>61</w:t>
             </w:r>
           </w:p>
         </w:tc>
@@ -2047,7 +2068,15 @@
                 <w:sz w:val="20"/>
                 <w:szCs w:val="20"/>
               </w:rPr>
-              <w:t>61</w:t>
+              <w:t>6</w:t>
+            </w:r>
+            <w:r>
+              <w:rPr>
+                <w:rFonts w:ascii="Garamond" w:hAnsi="Garamond"/>
+                <w:sz w:val="20"/>
+                <w:szCs w:val="20"/>
+              </w:rPr>
+              <w:t>3</w:t>
             </w:r>
           </w:p>
         </w:tc>
@@ -2127,7 +2156,7 @@
                 <w:sz w:val="20"/>
                 <w:szCs w:val="20"/>
               </w:rPr>
-              <w:t>5</w:t>
+              <w:t>7</w:t>
             </w:r>
           </w:p>
         </w:tc>
@@ -2231,7 +2260,7 @@
                 <w:sz w:val="20"/>
                 <w:szCs w:val="20"/>
               </w:rPr>
-              <w:t>7</w:t>
+              <w:t>9</w:t>
             </w:r>
           </w:p>
         </w:tc>
@@ -2303,15 +2332,7 @@
                 <w:sz w:val="20"/>
                 <w:szCs w:val="20"/>
               </w:rPr>
-              <w:t>6</w:t>
-            </w:r>
-            <w:r>
-              <w:rPr>
-                <w:rFonts w:ascii="Garamond" w:hAnsi="Garamond"/>
-                <w:sz w:val="20"/>
-                <w:szCs w:val="20"/>
-              </w:rPr>
-              <w:t>9</w:t>
+              <w:t>71</w:t>
             </w:r>
           </w:p>
         </w:tc>
@@ -2391,7 +2412,7 @@
                 <w:sz w:val="20"/>
                 <w:szCs w:val="20"/>
               </w:rPr>
-              <w:t>3</w:t>
+              <w:t>5</w:t>
             </w:r>
           </w:p>
         </w:tc>
@@ -2471,7 +2492,7 @@
                 <w:sz w:val="20"/>
                 <w:szCs w:val="20"/>
               </w:rPr>
-              <w:t>7</w:t>
+              <w:t>9</w:t>
             </w:r>
           </w:p>
         </w:tc>
@@ -2543,7 +2564,15 @@
                 <w:sz w:val="20"/>
                 <w:szCs w:val="20"/>
               </w:rPr>
-              <w:t>81</w:t>
+              <w:t>8</w:t>
+            </w:r>
+            <w:r>
+              <w:rPr>
+                <w:rFonts w:ascii="Garamond" w:hAnsi="Garamond"/>
+                <w:sz w:val="20"/>
+                <w:szCs w:val="20"/>
+              </w:rPr>
+              <w:t>3</w:t>
             </w:r>
           </w:p>
         </w:tc>
@@ -2631,7 +2660,7 @@
                 <w:sz w:val="20"/>
                 <w:szCs w:val="20"/>
               </w:rPr>
-              <w:t>5</w:t>
+              <w:t>7</w:t>
             </w:r>
           </w:p>
         </w:tc>
@@ -2711,15 +2740,7 @@
                 <w:sz w:val="20"/>
                 <w:szCs w:val="20"/>
               </w:rPr>
-              <w:t>8</w:t>
-            </w:r>
-            <w:r>
-              <w:rPr>
-                <w:rFonts w:ascii="Garamond" w:hAnsi="Garamond"/>
-                <w:sz w:val="20"/>
-                <w:szCs w:val="20"/>
-              </w:rPr>
-              <w:t>9</w:t>
+              <w:t>91</w:t>
             </w:r>
           </w:p>
         </w:tc>
@@ -2799,7 +2820,15 @@
                 <w:sz w:val="20"/>
                 <w:szCs w:val="20"/>
               </w:rPr>
-              <w:t>91</w:t>
+              <w:t>9</w:t>
+            </w:r>
+            <w:r>
+              <w:rPr>
+                <w:rFonts w:ascii="Garamond" w:hAnsi="Garamond"/>
+                <w:sz w:val="20"/>
+                <w:szCs w:val="20"/>
+              </w:rPr>
+              <w:t>3</w:t>
             </w:r>
           </w:p>
         </w:tc>
@@ -2887,7 +2916,7 @@
                 <w:sz w:val="20"/>
                 <w:szCs w:val="20"/>
               </w:rPr>
-              <w:t>5</w:t>
+              <w:t>7</w:t>
             </w:r>
           </w:p>
         </w:tc>
@@ -3255,7 +3284,16 @@
         <w:pStyle w:val="CSP-ChapterBodyText"/>
       </w:pPr>
       <w:r>
-        <w:t>The ticket cost 6,900 yuan. Booking the same ticket directly through the airline would have been much more expensive, running about 8,900 yuan. I</w:t>
+        <w:t>The ticket cost 6,900 yuan.</w:t>
+      </w:r>
+      <w:r>
+        <w:rPr>
+          <w:rStyle w:val="FootnoteReference"/>
+        </w:rPr>
+        <w:footnoteReference w:id="1"/>
+      </w:r>
+      <w:r>
+        <w:t xml:space="preserve"> Booking the same ticket directly through the airline would have been much more expensive, running about 8,900 yuan. I</w:t>
       </w:r>
       <w:r>
         <w:t>’</w:t>
@@ -3292,20 +3330,23 @@
         <w:t>ve</w:t>
       </w:r>
       <w:r>
-        <w:t xml:space="preserve"> also booked my train ticket for July 10th. If everything goes as planned, I should be home on the 11th and will get to spend a whole month with you.</w:t>
-      </w:r>
-    </w:p>
-    <w:p>
-      <w:pPr>
-        <w:pStyle w:val="CSP-ChapterBodyText"/>
-      </w:pPr>
-    </w:p>
-    <w:p>
-      <w:pPr>
-        <w:pStyle w:val="CSP-ChapterBodyText"/>
-      </w:pPr>
+        <w:t xml:space="preserve"> also booked my train ticket for July 10th. If everything goes as planned, I should be home on the 11th and will get to spend </w:t>
+      </w:r>
       <w:r>
         <w:lastRenderedPageBreak/>
+        <w:t>a whole month with you.</w:t>
+      </w:r>
+    </w:p>
+    <w:p>
+      <w:pPr>
+        <w:pStyle w:val="CSP-ChapterBodyText"/>
+      </w:pPr>
+    </w:p>
+    <w:p>
+      <w:pPr>
+        <w:pStyle w:val="CSP-ChapterBodyText"/>
+      </w:pPr>
+      <w:r>
         <w:t>See you soon,</w:t>
       </w:r>
     </w:p>
@@ -3346,7 +3387,7 @@
         <w:rPr>
           <w:rStyle w:val="FootnoteReference"/>
         </w:rPr>
-        <w:footnoteReference w:id="1"/>
+        <w:footnoteReference w:id="2"/>
       </w:r>
       <w:r>
         <w:t xml:space="preserve"> The department rented out a cafeteria for the occasion. I didn</w:t>
@@ -3501,7 +3542,7 @@
           <w:i/>
           <w:iCs w:val="0"/>
         </w:rPr>
-        <w:footnoteReference w:id="2"/>
+        <w:footnoteReference w:id="3"/>
       </w:r>
     </w:p>
     <w:p>
@@ -3557,7 +3598,7 @@
         <w:rPr>
           <w:rStyle w:val="FootnoteReference"/>
         </w:rPr>
-        <w:footnoteReference w:id="3"/>
+        <w:footnoteReference w:id="4"/>
       </w:r>
       <w:r>
         <w:t xml:space="preserve"> Since this flight went to Tokyo first, most of the passengers on board were Japanese. It took a little over two hours to fly from Shanghai to Tokyo, and once we landed, everyone had to get off the plane. I wandered around the Tokyo airport for a while. </w:t>
@@ -3579,7 +3620,11 @@
         <w:pStyle w:val="CSP-ChapterBodyText"/>
       </w:pPr>
       <w:r>
-        <w:t>Around 4:00 p.m. Tokyo time, I boarded the exact same plane, sat in the exact same seat, and headed toward L.A. This leg of the trip took over ten hours. I ate two Japanese meals on board (sushi, sashimi, salad, etc.) and was really happy with them. I also watched two movies during the flight. After flying for a while, it got dark, but then just five or six hours later, the sun came up again!</w:t>
+        <w:t xml:space="preserve">Around 4:00 p.m. Tokyo time, I boarded the exact same plane, sat in the exact same seat, and headed toward L.A. This leg of the trip took over ten hours. I ate two Japanese meals on board (sushi, sashimi, salad, etc.) and was really happy with them. I also watched two movies during the flight. After flying for a while, it got dark, but then just five or six hours later, the sun </w:t>
+      </w:r>
+      <w:r>
+        <w:lastRenderedPageBreak/>
+        <w:t>came up again!</w:t>
       </w:r>
     </w:p>
     <w:p>
@@ -3676,11 +3721,11 @@
         <w:pStyle w:val="CSP-ChapterBodyText"/>
       </w:pPr>
       <w:r>
-        <w:t xml:space="preserve">Even though there were technically only two layovers, thanks to the extra stop in Tokyo, the whole trip felt like four separate flights strung together. It was truly exhausting, although I </w:t>
+        <w:t xml:space="preserve">Even though there were technically only two layovers, thanks to the extra stop in Tokyo, the whole trip felt like four separate </w:t>
       </w:r>
       <w:r>
         <w:lastRenderedPageBreak/>
-        <w:t>actually felt surprisingly energetic right after getting off the plane.</w:t>
+        <w:t>flights strung together. It was truly exhausting, although I actually felt surprisingly energetic right after getting off the plane.</w:t>
       </w:r>
       <w:r>
         <w:t xml:space="preserve"> My first impression of America has been very positive. </w:t>
@@ -3880,11 +3925,11 @@
         <w:pStyle w:val="CSP-ChapterBodyText"/>
       </w:pPr>
       <w:r>
-        <w:t xml:space="preserve">When I woke up this morning, it took me several hours before it suddenly dawned on me that today was my birthday! For </w:t>
+        <w:t xml:space="preserve">When I woke up this morning, it took me several hours before </w:t>
       </w:r>
       <w:r>
         <w:lastRenderedPageBreak/>
-        <w:t>lunch, I baked myself a frozen pizza, so I suppose that counts as my birthday celebration. Tonight, I</w:t>
+        <w:t>it suddenly dawned on me that today was my birthday! For lunch, I baked myself a frozen pizza, so I suppose that counts as my birthday celebration. Tonight, I</w:t>
       </w:r>
       <w:r>
         <w:t>’</w:t>
@@ -4133,7 +4178,7 @@
         <w:rPr>
           <w:rStyle w:val="FootnoteReference"/>
         </w:rPr>
-        <w:footnoteReference w:id="4"/>
+        <w:footnoteReference w:id="5"/>
       </w:r>
     </w:p>
     <w:p>
@@ -4246,7 +4291,7 @@
         <w:rPr>
           <w:rStyle w:val="FootnoteReference"/>
         </w:rPr>
-        <w:footnoteReference w:id="5"/>
+        <w:footnoteReference w:id="6"/>
       </w:r>
       <w:r>
         <w:t xml:space="preserve"> the day before yesterday. Tomorrow I</w:t>
@@ -4549,7 +4594,7 @@
         <w:rPr>
           <w:rStyle w:val="FootnoteReference"/>
         </w:rPr>
-        <w:footnoteReference w:id="6"/>
+        <w:footnoteReference w:id="7"/>
       </w:r>
       <w:r>
         <w:t xml:space="preserve"> I even have a class that runs straight from </w:t>
@@ -4780,7 +4825,7 @@
         <w:rPr>
           <w:rStyle w:val="FootnoteReference"/>
         </w:rPr>
-        <w:footnoteReference w:id="7"/>
+        <w:footnoteReference w:id="8"/>
       </w:r>
       <w:r>
         <w:t xml:space="preserve"> </w:t>
@@ -4792,7 +4837,7 @@
         <w:rPr>
           <w:rStyle w:val="FootnoteReference"/>
         </w:rPr>
-        <w:footnoteReference w:id="8"/>
+        <w:footnoteReference w:id="9"/>
       </w:r>
       <w:r>
         <w:t xml:space="preserve"> together. The mooncakes were cut into tiny pieces, so everyone only got about an eighth.</w:t>
@@ -4907,7 +4952,7 @@
         <w:rPr>
           <w:rStyle w:val="FootnoteReference"/>
         </w:rPr>
-        <w:footnoteReference w:id="9"/>
+        <w:footnoteReference w:id="10"/>
       </w:r>
       <w:r>
         <w:t xml:space="preserve"> Please look into it, since it might be more economical. I</w:t>
@@ -4928,7 +4973,7 @@
         <w:rPr>
           <w:rStyle w:val="FootnoteReference"/>
         </w:rPr>
-        <w:footnoteReference w:id="10"/>
+        <w:footnoteReference w:id="11"/>
       </w:r>
       <w:r>
         <w:t xml:space="preserve"> Please let me know in your next letter, and give them my regards. I won</w:t>
@@ -5257,7 +5302,16 @@
         <w:pStyle w:val="CSP-ChapterBodyText"/>
       </w:pPr>
       <w:r>
-        <w:t>I received both of your letters—the ones dated September 11th and 13th—at the same time yesterday! The one dated the 13th only took nine days to arrive. It seems letters have a mind of their own, traveling as fast or as slowly as they please. I was so happy to get them! After over a month in the U.S. and three letters home, I finally received your first replies.</w:t>
+        <w:t>I received both of your letters—the ones dated September 11th and 13th—at the same time yesterday! The one dated the 13th only took nine days to arrive. It seems letters have a mind of their own, traveling as fast or as slowly as they please.</w:t>
+      </w:r>
+      <w:r>
+        <w:rPr>
+          <w:rStyle w:val="FootnoteReference"/>
+        </w:rPr>
+        <w:footnoteReference w:id="12"/>
+      </w:r>
+      <w:r>
+        <w:t xml:space="preserve"> I was so happy to get them! After over a month in the U.S. and three letters home, I finally received your first replies.</w:t>
       </w:r>
     </w:p>
     <w:p>
@@ -5294,7 +5348,7 @@
         <w:rPr>
           <w:rStyle w:val="FootnoteReference"/>
         </w:rPr>
-        <w:footnoteReference w:id="11"/>
+        <w:footnoteReference w:id="13"/>
       </w:r>
       <w:r>
         <w:t xml:space="preserve"> So a slight delay is perfectly normal. Actually, when you think about it, isn</w:t>
@@ -5349,7 +5403,343 @@
         <w:rPr>
           <w:rFonts w:ascii="Segoe UI Symbol" w:hAnsi="Segoe UI Symbol" w:cs="Segoe UI Symbol"/>
         </w:rPr>
+        <w:t>❧❧❧</w:t>
+      </w:r>
+    </w:p>
+    <w:p>
+      <w:pPr>
+        <w:pStyle w:val="CSP-ChapterBodyText"/>
+      </w:pPr>
+    </w:p>
+    <w:p>
+      <w:pPr>
+        <w:pStyle w:val="CSP-ChapterBodyText"/>
+      </w:pPr>
+    </w:p>
+    <w:p>
+      <w:pPr>
+        <w:pStyle w:val="CSP-ChapterBodyText"/>
+      </w:pPr>
+    </w:p>
+    <w:p>
+      <w:pPr>
+        <w:pStyle w:val="CSP-ChapterBodyText"/>
+      </w:pPr>
+      <w:r>
+        <w:t>My roommate is a</w:t>
+      </w:r>
+      <w:r>
+        <w:t xml:space="preserve"> young</w:t>
+      </w:r>
+      <w:r>
+        <w:t xml:space="preserve"> undergraduate majoring in civil engineering. Like most Chinese undergraduates here, he is a permanent resident who moved to the </w:t>
+      </w:r>
+      <w:r>
+        <w:t>United States</w:t>
+      </w:r>
+      <w:r>
+        <w:t xml:space="preserve"> with his family. He</w:t>
+      </w:r>
+      <w:r>
+        <w:t>’</w:t>
+      </w:r>
+      <w:r>
+        <w:t xml:space="preserve">s been in the U.S. for a few years now, and before that, he spent several years studying in Europe. </w:t>
+      </w:r>
+      <w:r>
+        <w:t>He seems like a quiet, polite, and honest person.</w:t>
+      </w:r>
+      <w:r>
+        <w:t xml:space="preserve"> Believe it or not, my roommate</w:t>
+      </w:r>
+      <w:r>
+        <w:t>’</w:t>
+      </w:r>
+      <w:r>
+        <w:t xml:space="preserve">s name is also Tong! If someone calls asking for </w:t>
+      </w:r>
+      <w:r>
+        <w:t>“</w:t>
+      </w:r>
+      <w:r>
+        <w:t>Tong,</w:t>
+      </w:r>
+      <w:r>
+        <w:t>”</w:t>
+      </w:r>
+      <w:r>
+        <w:t xml:space="preserve"> things can get a little confusing.</w:t>
+      </w:r>
+    </w:p>
+    <w:p>
+      <w:pPr>
+        <w:pStyle w:val="CSP-ChapterBodyText"/>
+      </w:pPr>
+    </w:p>
+    <w:p>
+      <w:pPr>
+        <w:pStyle w:val="CSP-ChapterBodyText"/>
+      </w:pPr>
+      <w:r>
+        <w:t>Our next-door neighbors are two friendly Taiwanese—one undergraduate and one graduate student. Having never met anyone from Taiwan before, I was curious about them. As it turned out, they weren</w:t>
+      </w:r>
+      <w:r>
+        <w:t>’</w:t>
+      </w:r>
+      <w:r>
+        <w:t xml:space="preserve">t all that different from us, and we naturally bonded over our shared language, food, and culture. </w:t>
+      </w:r>
+      <w:r>
+        <w:t>Just</w:t>
+      </w:r>
+      <w:r>
+        <w:t xml:space="preserve"> l</w:t>
+      </w:r>
+      <w:r>
+        <w:t>ast Saturday at noon, they invited us over for homemade pizza. They piled it high with all kinds of toppings and cheese, and it was absolutely delicious. At least here, cross-strait relations are very harmonious.</w:t>
+      </w:r>
+      <w:r>
+        <w:rPr>
+          <w:rStyle w:val="FootnoteReference"/>
+        </w:rPr>
+        <w:footnoteReference w:id="14"/>
+      </w:r>
+    </w:p>
+    <w:p>
+      <w:pPr>
+        <w:pStyle w:val="CSP-ChapterBodyText"/>
+      </w:pPr>
+    </w:p>
+    <w:p>
+      <w:pPr>
+        <w:pStyle w:val="CSP-ChapterBodyText"/>
+      </w:pPr>
+      <w:r>
+        <w:t>At UT, probably because there are so many Chinese students, I haven</w:t>
+      </w:r>
+      <w:r>
+        <w:t>’</w:t>
+      </w:r>
+      <w:r>
+        <w:t>t had as many opportunities to interact with Americans as I had imagined. I practice my listening every day, but I don</w:t>
+      </w:r>
+      <w:r>
+        <w:t>’</w:t>
+      </w:r>
+      <w:r>
+        <w:t>t get to speak English all that much, and it takes time to make American friends. Fortunately, since I</w:t>
+      </w:r>
+      <w:r>
+        <w:t>’</w:t>
+      </w:r>
+      <w:r>
+        <w:t>m a TA, I still get to interact with students. In any case, I</w:t>
+      </w:r>
+      <w:r>
+        <w:t>’</w:t>
+      </w:r>
+      <w:r>
+        <w:t>m doing everything I can to find opportunities to practice my spoken English. My ability to understand lectures is improving day by day—I can understand my Indian professor without much difficulty now.</w:t>
+      </w:r>
+    </w:p>
+    <w:p>
+      <w:pPr>
+        <w:pStyle w:val="CSP-ChapterBodyText"/>
+      </w:pPr>
+    </w:p>
+    <w:p>
+      <w:pPr>
+        <w:pStyle w:val="CSP-ChapterBodyText"/>
+      </w:pPr>
+      <w:r>
+        <w:t xml:space="preserve">Being a TA has been pretty easy so far—I only hold two office hours a week. To make sure I know what the professor covered in class, I sit in on his lectures three times a week for </w:t>
+      </w:r>
+      <w:r>
+        <w:t>forty-five</w:t>
+      </w:r>
+      <w:r>
+        <w:t xml:space="preserve"> </w:t>
+      </w:r>
+      <w:r>
+        <w:t>minutes each. The rest of the job is just grading homework. Usually, no one shows up during my office hours, but a few days before an assignment is due, one or two students come in to ask questions. It</w:t>
+      </w:r>
+      <w:r>
+        <w:t>’</w:t>
+      </w:r>
+      <w:r>
+        <w:t xml:space="preserve">s a little embarrassing that I </w:t>
+      </w:r>
+      <w:r>
+        <w:t>still</w:t>
+      </w:r>
+      <w:r>
+        <w:t xml:space="preserve"> </w:t>
+      </w:r>
+      <w:r>
+        <w:t>occasionally have a hard time catching what they</w:t>
+      </w:r>
+      <w:r>
+        <w:t>’</w:t>
+      </w:r>
+      <w:r>
+        <w:t>re saying!</w:t>
+      </w:r>
+    </w:p>
+    <w:p>
+      <w:pPr>
+        <w:pStyle w:val="CSP-ChapterBodyText"/>
+      </w:pPr>
+    </w:p>
+    <w:p>
+      <w:pPr>
+        <w:pStyle w:val="CSP-ChapterBodyText"/>
+      </w:pPr>
+      <w:r>
+        <w:t>I have an exam next Tuesday. American courses have so many</w:t>
+      </w:r>
+      <w:r>
+        <w:t xml:space="preserve"> more</w:t>
+      </w:r>
+      <w:r>
+        <w:t xml:space="preserve"> exams—about one a month per class on average—not to mention all the homework, so I</w:t>
+      </w:r>
+      <w:r>
+        <w:t>’</w:t>
+      </w:r>
+      <w:r>
+        <w:t>ve been keeping busy. Lately, I get back to the apartment around 11:00 p.m. That</w:t>
+      </w:r>
+      <w:r>
+        <w:t>’</w:t>
+      </w:r>
+      <w:r>
+        <w:t xml:space="preserve">s when the last campus shuttle runs, and most of the people waiting for the final bus are Chinese students—they are incredibly hardworking! </w:t>
+      </w:r>
+      <w:r>
+        <w:t>Moving forward, the best time for you to call me is around midnight my local time, which is 1:00 p.m. Beijing time.</w:t>
+      </w:r>
+      <w:r>
+        <w:t xml:space="preserve"> I</w:t>
+      </w:r>
+      <w:r>
+        <w:t>’</w:t>
+      </w:r>
+      <w:r>
+        <w:t>ll definitely be home by then, and I won</w:t>
+      </w:r>
+      <w:r>
+        <w:t>’</w:t>
+      </w:r>
+      <w:r>
+        <w:t>t be asleep yet. I usually get up around 9:00 a.m. My earliest class isn</w:t>
+      </w:r>
+      <w:r>
+        <w:t>’</w:t>
+      </w:r>
+      <w:r>
+        <w:t>t until 11:00 a.m., so I get to sleep in a bit.</w:t>
+      </w:r>
+    </w:p>
+    <w:p>
+      <w:pPr>
+        <w:pStyle w:val="CSP-ChapterBodyText"/>
+      </w:pPr>
+    </w:p>
+    <w:p>
+      <w:pPr>
+        <w:pStyle w:val="CSP-ChapterBodyText"/>
+      </w:pPr>
+      <w:r>
+        <w:t>I</w:t>
+      </w:r>
+      <w:r>
+        <w:t>’</w:t>
+      </w:r>
+      <w:r>
+        <w:t>ve realized that I can</w:t>
+      </w:r>
+      <w:r>
+        <w:t>’</w:t>
+      </w:r>
+      <w:r>
+        <w:t>t really afford to eat burgers regularly—that would put me over budget. In the U.S., prepared food is expensive, while raw ingredients are cheap, so buying groceries and cooking for yourself is definitely the way to go. For example, I can buy a huge box of sixteen chicken drumsticks for just over two dollars, which is about the price of a single burger. I bake more than ten of them at a time. They turn out so delicious that it</w:t>
+      </w:r>
+      <w:r>
+        <w:t>’</w:t>
+      </w:r>
+      <w:r>
+        <w:t>s a shame you can</w:t>
+      </w:r>
+      <w:r>
+        <w:t>’</w:t>
+      </w:r>
+      <w:r>
+        <w:t xml:space="preserve">t taste them! </w:t>
+      </w:r>
+      <w:r>
+        <w:t>I often pack two meals—lunch and dinner—to bring to campus, though eating the same thing several days in a row gets old pretty quickly.</w:t>
+      </w:r>
+    </w:p>
+    <w:p>
+      <w:pPr>
+        <w:pStyle w:val="CSP-ChapterBodyText"/>
+      </w:pPr>
+    </w:p>
+    <w:p>
+      <w:pPr>
+        <w:pStyle w:val="CSP-ChapterBodyText"/>
+      </w:pPr>
+      <w:r>
+        <w:t>Tong</w:t>
+      </w:r>
+    </w:p>
+    <w:p>
+      <w:pPr>
+        <w:pStyle w:val="CSP-ChapterBodyText"/>
+      </w:pPr>
+      <w:r>
+        <w:t>09/27 at 1:00 a.m.</w:t>
+      </w:r>
+    </w:p>
+    <w:p>
+      <w:pPr>
+        <w:pStyle w:val="CSP-ChapterBodyText"/>
+      </w:pPr>
+    </w:p>
+    <w:p>
+      <w:pPr>
+        <w:pStyle w:val="CSP-ChapterBodyText"/>
+      </w:pPr>
+      <w:r>
         <w:lastRenderedPageBreak/>
+        <w:t xml:space="preserve">P.S. </w:t>
+      </w:r>
+      <w:r>
+        <w:t>I also received my first letter from Chun today.</w:t>
+      </w:r>
+    </w:p>
+    <w:p>
+      <w:pPr>
+        <w:pStyle w:val="CSP-ChapterBodyText"/>
+      </w:pPr>
+    </w:p>
+    <w:p>
+      <w:pPr>
+        <w:pStyle w:val="CSP-ChapterBodyText"/>
+      </w:pPr>
+    </w:p>
+    <w:p>
+      <w:pPr>
+        <w:pStyle w:val="CSP-ChapterBodyText"/>
+        <w:jc w:val="center"/>
+        <w:rPr>
+          <w:rFonts w:ascii="Segoe UI Symbol" w:hAnsi="Segoe UI Symbol" w:cs="Segoe UI Symbol"/>
+        </w:rPr>
+      </w:pPr>
+      <w:r>
+        <w:rPr>
+          <w:rFonts w:ascii="Segoe UI Symbol" w:hAnsi="Segoe UI Symbol" w:cs="Segoe UI Symbol"/>
+        </w:rPr>
         <w:t>❧❧❧</w:t>
       </w:r>
     </w:p>
@@ -5373,514 +5763,174 @@
         <w:pStyle w:val="CSP-ChapterBodyText"/>
       </w:pPr>
       <w:r>
-        <w:t>My roommate is a</w:t>
-      </w:r>
-      <w:r>
-        <w:t xml:space="preserve"> young</w:t>
-      </w:r>
-      <w:r>
-        <w:t xml:space="preserve"> undergraduate majoring in civil engineering. Like most Chinese undergraduates here, he is a permanent resident who moved to the </w:t>
-      </w:r>
-      <w:r>
-        <w:t>United States</w:t>
-      </w:r>
-      <w:r>
-        <w:t xml:space="preserve"> with his family. He</w:t>
-      </w:r>
-      <w:r>
-        <w:t>’</w:t>
-      </w:r>
-      <w:r>
-        <w:t xml:space="preserve">s been in the U.S. for a few years now, and before that, he spent several years studying in Europe. </w:t>
-      </w:r>
-      <w:r>
-        <w:t>He seems like a quiet, polite, and honest person.</w:t>
-      </w:r>
-      <w:r>
-        <w:t xml:space="preserve"> Believe it or not, my roommate</w:t>
-      </w:r>
-      <w:r>
-        <w:t>’</w:t>
-      </w:r>
-      <w:r>
-        <w:t xml:space="preserve">s name is also Tong! If someone calls asking for </w:t>
-      </w:r>
-      <w:r>
-        <w:t>“</w:t>
-      </w:r>
-      <w:r>
-        <w:t>Tong,</w:t>
-      </w:r>
-      <w:r>
-        <w:t>”</w:t>
-      </w:r>
-      <w:r>
-        <w:t xml:space="preserve"> things can get a little confusing.</w:t>
-      </w:r>
-    </w:p>
-    <w:p>
-      <w:pPr>
-        <w:pStyle w:val="CSP-ChapterBodyText"/>
-      </w:pPr>
-    </w:p>
-    <w:p>
-      <w:pPr>
-        <w:pStyle w:val="CSP-ChapterBodyText"/>
-      </w:pPr>
-      <w:r>
-        <w:t>Our next-door neighbors are two friendly Taiwanese—one undergraduate and one graduate student. Having never met anyone from Taiwan before, I was curious about them. As it turned out, they weren</w:t>
-      </w:r>
-      <w:r>
-        <w:t>’</w:t>
-      </w:r>
-      <w:r>
-        <w:t xml:space="preserve">t all that different from us, and we naturally bonded over our shared language, food, and culture. </w:t>
-      </w:r>
-      <w:r>
-        <w:t>Just</w:t>
-      </w:r>
-      <w:r>
-        <w:t xml:space="preserve"> l</w:t>
-      </w:r>
-      <w:r>
-        <w:t>ast Saturday at noon, they invited us over for homemade pizza. They piled it high with all kinds of toppings and cheese, and it was absolutely delicious. At least here, cross-strait relations are very harmonious.</w:t>
-      </w:r>
-      <w:r>
-        <w:rPr>
-          <w:rStyle w:val="FootnoteReference"/>
-        </w:rPr>
-        <w:footnoteReference w:id="12"/>
-      </w:r>
-    </w:p>
-    <w:p>
-      <w:pPr>
-        <w:pStyle w:val="CSP-ChapterBodyText"/>
-      </w:pPr>
-    </w:p>
-    <w:p>
-      <w:pPr>
-        <w:pStyle w:val="CSP-ChapterBodyText"/>
-      </w:pPr>
-      <w:r>
-        <w:t>At UT, probably because there are so many Chinese students, I haven</w:t>
-      </w:r>
-      <w:r>
-        <w:t>’</w:t>
-      </w:r>
-      <w:r>
-        <w:t>t had as many opportunities to interact with Americans as I had imagined. I practice my listening every day, but I don</w:t>
-      </w:r>
-      <w:r>
-        <w:t>’</w:t>
-      </w:r>
-      <w:r>
-        <w:t>t get to speak English all that much, and it takes time to make American friends. Fortunately, since I</w:t>
-      </w:r>
-      <w:r>
-        <w:t>’</w:t>
-      </w:r>
-      <w:r>
-        <w:t>m a TA, I still get to interact with students. In any case, I</w:t>
-      </w:r>
-      <w:r>
-        <w:t>’</w:t>
-      </w:r>
-      <w:r>
-        <w:t>m doing everything I can to find opportunities to practice my spoken English. My ability to understand lectures is improving day by day—I can understand my Indian professor without much difficulty now.</w:t>
-      </w:r>
-    </w:p>
-    <w:p>
-      <w:pPr>
-        <w:pStyle w:val="CSP-ChapterBodyText"/>
-      </w:pPr>
-    </w:p>
-    <w:p>
-      <w:pPr>
-        <w:pStyle w:val="CSP-ChapterBodyText"/>
-      </w:pPr>
-      <w:r>
-        <w:t xml:space="preserve">Being a TA has been pretty easy so far—I only hold two office </w:t>
+        <w:t>I got my first paycheck! I didn</w:t>
+      </w:r>
+      <w:r>
+        <w:t>’</w:t>
+      </w:r>
+      <w:r>
+        <w:t>t expect it to come so soon. I had originally planned to go shopping but was worried I didn</w:t>
+      </w:r>
+      <w:r>
+        <w:t>’</w:t>
+      </w:r>
+      <w:r>
+        <w:t xml:space="preserve">t have much money left in my checking account, so I checked my balance over the phone. To my surprise, there was actually $1,140 in it! As it turns out, today is the last day of September, which means </w:t>
+      </w:r>
+      <w:proofErr w:type="gramStart"/>
+      <w:r>
+        <w:t>it</w:t>
+      </w:r>
+      <w:r>
+        <w:t>’</w:t>
+      </w:r>
+      <w:r>
+        <w:t>s</w:t>
+      </w:r>
+      <w:proofErr w:type="gramEnd"/>
+      <w:r>
+        <w:t xml:space="preserve"> payday.</w:t>
+      </w:r>
+    </w:p>
+    <w:p>
+      <w:pPr>
+        <w:pStyle w:val="CSP-ChapterBodyText"/>
+      </w:pPr>
+    </w:p>
+    <w:p>
+      <w:pPr>
+        <w:pStyle w:val="CSP-ChapterBodyText"/>
+      </w:pPr>
+      <w:r>
+        <w:t>Today I went to the Chinese grocery store—one of only two in Austin—and bought two pounds of shrimp, a big bag of mussels, and a box of squid. This is the first time since coming to America that I</w:t>
+      </w:r>
+      <w:r>
+        <w:t>’</w:t>
+      </w:r>
+      <w:r>
+        <w:t>ve treated myself to seafood. Seafood is still expensive—the shrimp weren</w:t>
+      </w:r>
+      <w:r>
+        <w:t>’</w:t>
+      </w:r>
+      <w:r>
+        <w:t xml:space="preserve">t even that large, but they cost $2.99 a pound. </w:t>
+      </w:r>
+      <w:r>
+        <w:t>Unlike American supermarkets, the Chinese grocery store is cramped and a little damp, and carries an unpleasant smell of fish and raw meat—but I</w:t>
+      </w:r>
+      <w:r>
+        <w:t>’</w:t>
+      </w:r>
+      <w:r>
+        <w:t>m grateful it exists.</w:t>
+      </w:r>
+      <w:r>
+        <w:t xml:space="preserve"> There are things you simply can</w:t>
+      </w:r>
+      <w:r>
+        <w:t>’</w:t>
+      </w:r>
+      <w:r>
+        <w:t>t find anywhere else.</w:t>
+      </w:r>
+    </w:p>
+    <w:p>
+      <w:pPr>
+        <w:pStyle w:val="CSP-ChapterBodyText"/>
+      </w:pPr>
+    </w:p>
+    <w:p>
+      <w:pPr>
+        <w:pStyle w:val="CSP-ChapterBodyText"/>
+      </w:pPr>
+      <w:r>
+        <w:t>I hope this letter reaches you before Mom</w:t>
+      </w:r>
+      <w:r>
+        <w:t>’</w:t>
+      </w:r>
+      <w:r>
+        <w:t>s birthday on October 13th. Happy Birthday, Mom!</w:t>
+      </w:r>
+    </w:p>
+    <w:p>
+      <w:pPr>
+        <w:pStyle w:val="CSP-ChapterBodyText"/>
+      </w:pPr>
+    </w:p>
+    <w:p>
+      <w:pPr>
+        <w:pStyle w:val="CSP-ChapterBodyText"/>
+      </w:pPr>
+      <w:r>
+        <w:t>Tong</w:t>
+      </w:r>
+    </w:p>
+    <w:p>
+      <w:pPr>
+        <w:pStyle w:val="CSP-ChapterBodyText"/>
+      </w:pPr>
+      <w:r>
+        <w:t>09/30/95</w:t>
+      </w:r>
+    </w:p>
+    <w:p>
+      <w:pPr>
+        <w:pStyle w:val="CSP-ChapterBodyText"/>
+      </w:pPr>
+    </w:p>
+    <w:p>
+      <w:pPr>
+        <w:pStyle w:val="CSP-ChapterBodyText"/>
+      </w:pPr>
+    </w:p>
+    <w:p>
+      <w:pPr>
+        <w:pStyle w:val="CSP-ChapterBodyText"/>
+        <w:jc w:val="center"/>
+        <w:rPr>
+          <w:rFonts w:ascii="Segoe UI Symbol" w:hAnsi="Segoe UI Symbol" w:cs="Segoe UI Symbol"/>
+        </w:rPr>
+      </w:pPr>
+      <w:r>
+        <w:rPr>
+          <w:rFonts w:ascii="Segoe UI Symbol" w:hAnsi="Segoe UI Symbol" w:cs="Segoe UI Symbol"/>
+        </w:rPr>
+        <w:t>❧❧❧</w:t>
+      </w:r>
+    </w:p>
+    <w:p>
+      <w:pPr>
+        <w:pStyle w:val="CSP-ChapterBodyText"/>
+      </w:pPr>
+    </w:p>
+    <w:p>
+      <w:pPr>
+        <w:pStyle w:val="CSP-ChapterBodyText"/>
+      </w:pPr>
+    </w:p>
+    <w:p>
+      <w:pPr>
+        <w:pStyle w:val="CSP-ChapterBodyText"/>
+      </w:pPr>
+    </w:p>
+    <w:p>
+      <w:pPr>
+        <w:pStyle w:val="CSP-ChapterBodyText"/>
+      </w:pPr>
+      <w:r>
+        <w:t>I just received your third letter, dated September 24th, along with Chun</w:t>
+      </w:r>
+      <w:r>
+        <w:t>’</w:t>
+      </w:r>
+      <w:r>
+        <w:t xml:space="preserve">s second letter. She wrote that the administration at </w:t>
       </w:r>
       <w:r>
         <w:lastRenderedPageBreak/>
-        <w:t xml:space="preserve">hours a week. To make sure I know what the professor covered in class, I sit in on his lectures three times a week for </w:t>
-      </w:r>
-      <w:r>
-        <w:t>forty-five</w:t>
-      </w:r>
-      <w:r>
-        <w:t xml:space="preserve"> </w:t>
-      </w:r>
-      <w:r>
-        <w:t>minutes each. The rest of the job is just grading homework. Usually, no one shows up during my office hours, but a few days before an assignment is due, one or two students come in to ask questions. It</w:t>
-      </w:r>
-      <w:r>
-        <w:t>’</w:t>
-      </w:r>
-      <w:r>
-        <w:t xml:space="preserve">s a little embarrassing that I </w:t>
-      </w:r>
-      <w:r>
-        <w:t>still</w:t>
-      </w:r>
-      <w:r>
-        <w:t xml:space="preserve"> </w:t>
-      </w:r>
-      <w:r>
-        <w:t>occasionally have a hard time catching what they</w:t>
-      </w:r>
-      <w:r>
-        <w:t>’</w:t>
-      </w:r>
-      <w:r>
-        <w:t>re saying!</w:t>
-      </w:r>
-    </w:p>
-    <w:p>
-      <w:pPr>
-        <w:pStyle w:val="CSP-ChapterBodyText"/>
-      </w:pPr>
-    </w:p>
-    <w:p>
-      <w:pPr>
-        <w:pStyle w:val="CSP-ChapterBodyText"/>
-      </w:pPr>
-      <w:r>
-        <w:t>I have an exam next Tuesday. American courses have so many</w:t>
-      </w:r>
-      <w:r>
-        <w:t xml:space="preserve"> more</w:t>
-      </w:r>
-      <w:r>
-        <w:t xml:space="preserve"> exams—about one a month per class on average—not to mention all the homework, so I</w:t>
-      </w:r>
-      <w:r>
-        <w:t>’</w:t>
-      </w:r>
-      <w:r>
-        <w:t>ve been keeping busy. Lately, I get back to the apartment around 11:00 p.m. That</w:t>
-      </w:r>
-      <w:r>
-        <w:t>’</w:t>
-      </w:r>
-      <w:r>
-        <w:t xml:space="preserve">s when the last campus shuttle runs, and most of the people waiting for the final bus are Chinese students—they are incredibly hardworking! </w:t>
-      </w:r>
-      <w:r>
-        <w:t>Moving forward, the best time for you to call me is around midnight my local time, which is 1:00 p.m. Beijing time.</w:t>
-      </w:r>
-      <w:r>
-        <w:t xml:space="preserve"> I</w:t>
-      </w:r>
-      <w:r>
-        <w:t>’</w:t>
-      </w:r>
-      <w:r>
-        <w:t>ll definitely be home by then, and I won</w:t>
-      </w:r>
-      <w:r>
-        <w:t>’</w:t>
-      </w:r>
-      <w:r>
-        <w:t>t be asleep yet. I usually get up around 9:00 a.m. My earliest class isn</w:t>
-      </w:r>
-      <w:r>
-        <w:t>’</w:t>
-      </w:r>
-      <w:r>
-        <w:t>t until 11:00 a.m., so I get to sleep in a bit.</w:t>
-      </w:r>
-    </w:p>
-    <w:p>
-      <w:pPr>
-        <w:pStyle w:val="CSP-ChapterBodyText"/>
-      </w:pPr>
-    </w:p>
-    <w:p>
-      <w:pPr>
-        <w:pStyle w:val="CSP-ChapterBodyText"/>
-      </w:pPr>
-      <w:r>
-        <w:t>I</w:t>
-      </w:r>
-      <w:r>
-        <w:t>’</w:t>
-      </w:r>
-      <w:r>
-        <w:t>ve realized that I can</w:t>
-      </w:r>
-      <w:r>
-        <w:t>’</w:t>
-      </w:r>
-      <w:r>
-        <w:t>t really afford to eat burgers regularly—that would put me over budget. In the U.S., prepared food is expensive, while raw ingredients are cheap, so buying groceries and cooking for yourself is definitely the way to go. For example, I can buy a huge box of sixteen chicken drumsticks for just over two dollars, which is about the price of a single burger. I bake more than ten of them at a time. They turn out so delicious that it</w:t>
-      </w:r>
-      <w:r>
-        <w:t>’</w:t>
-      </w:r>
-      <w:r>
-        <w:t>s a shame you can</w:t>
-      </w:r>
-      <w:r>
-        <w:t>’</w:t>
-      </w:r>
-      <w:r>
-        <w:t xml:space="preserve">t taste them! </w:t>
-      </w:r>
-      <w:r>
-        <w:t>I often pack two meals—lunch and dinner—to bring to campus, though eating the same thing several days in a row gets old pretty quickly.</w:t>
-      </w:r>
-    </w:p>
-    <w:p>
-      <w:pPr>
-        <w:pStyle w:val="CSP-ChapterBodyText"/>
-      </w:pPr>
-    </w:p>
-    <w:p>
-      <w:pPr>
-        <w:pStyle w:val="CSP-ChapterBodyText"/>
-      </w:pPr>
-      <w:r>
-        <w:t>Tong</w:t>
-      </w:r>
-    </w:p>
-    <w:p>
-      <w:pPr>
-        <w:pStyle w:val="CSP-ChapterBodyText"/>
-      </w:pPr>
-      <w:r>
-        <w:t>09/27 at 1:00 a.m.</w:t>
-      </w:r>
-    </w:p>
-    <w:p>
-      <w:pPr>
-        <w:pStyle w:val="CSP-ChapterBodyText"/>
-      </w:pPr>
-    </w:p>
-    <w:p>
-      <w:pPr>
-        <w:pStyle w:val="CSP-ChapterBodyText"/>
-      </w:pPr>
-      <w:r>
-        <w:t xml:space="preserve">P.S. </w:t>
-      </w:r>
-      <w:r>
-        <w:t>I also received my first letter from Chun today.</w:t>
-      </w:r>
-    </w:p>
-    <w:p>
-      <w:pPr>
-        <w:pStyle w:val="CSP-ChapterBodyText"/>
-      </w:pPr>
-    </w:p>
-    <w:p>
-      <w:pPr>
-        <w:pStyle w:val="CSP-ChapterBodyText"/>
-      </w:pPr>
-    </w:p>
-    <w:p>
-      <w:pPr>
-        <w:pStyle w:val="CSP-ChapterBodyText"/>
-        <w:jc w:val="center"/>
-        <w:rPr>
-          <w:rFonts w:ascii="Segoe UI Symbol" w:hAnsi="Segoe UI Symbol" w:cs="Segoe UI Symbol"/>
-        </w:rPr>
-      </w:pPr>
-      <w:r>
-        <w:rPr>
-          <w:rFonts w:ascii="Segoe UI Symbol" w:hAnsi="Segoe UI Symbol" w:cs="Segoe UI Symbol"/>
-        </w:rPr>
-        <w:t>❧❧❧</w:t>
-      </w:r>
-    </w:p>
-    <w:p>
-      <w:pPr>
-        <w:pStyle w:val="CSP-ChapterBodyText"/>
-      </w:pPr>
-    </w:p>
-    <w:p>
-      <w:pPr>
-        <w:pStyle w:val="CSP-ChapterBodyText"/>
-      </w:pPr>
-    </w:p>
-    <w:p>
-      <w:pPr>
-        <w:pStyle w:val="CSP-ChapterBodyText"/>
-      </w:pPr>
-    </w:p>
-    <w:p>
-      <w:pPr>
-        <w:pStyle w:val="CSP-ChapterBodyText"/>
-      </w:pPr>
-      <w:r>
-        <w:t>I got my first paycheck! I didn</w:t>
-      </w:r>
-      <w:r>
-        <w:t>’</w:t>
-      </w:r>
-      <w:r>
-        <w:t>t expect it to come so soon. I had originally planned to go shopping but was worried I didn</w:t>
-      </w:r>
-      <w:r>
-        <w:t>’</w:t>
-      </w:r>
-      <w:r>
-        <w:t xml:space="preserve">t have much money left in my checking account, so I checked my balance over the phone. To my surprise, there was actually $1,140 in it! As it turns out, today is the last day of September, which means </w:t>
-      </w:r>
-      <w:proofErr w:type="gramStart"/>
-      <w:r>
-        <w:t>it</w:t>
-      </w:r>
-      <w:r>
-        <w:t>’</w:t>
-      </w:r>
-      <w:r>
-        <w:t>s</w:t>
-      </w:r>
-      <w:proofErr w:type="gramEnd"/>
-      <w:r>
-        <w:t xml:space="preserve"> payday.</w:t>
-      </w:r>
-    </w:p>
-    <w:p>
-      <w:pPr>
-        <w:pStyle w:val="CSP-ChapterBodyText"/>
-      </w:pPr>
-    </w:p>
-    <w:p>
-      <w:pPr>
-        <w:pStyle w:val="CSP-ChapterBodyText"/>
-      </w:pPr>
-      <w:r>
-        <w:t>Today I went to the Chinese grocery store—one of only two in Austin—and bought two pounds of shrimp, a big bag of mussels, and a box of squid. This is the first time since coming to America that I</w:t>
-      </w:r>
-      <w:r>
-        <w:t>’</w:t>
-      </w:r>
-      <w:r>
-        <w:t>ve treated myself to seafood. Seafood is still expensive—the shrimp weren</w:t>
-      </w:r>
-      <w:r>
-        <w:t>’</w:t>
-      </w:r>
-      <w:r>
-        <w:t xml:space="preserve">t even that large, but they cost $2.99 a pound. </w:t>
-      </w:r>
-      <w:r>
-        <w:t>Unlike American supermarkets, the Chinese grocery store is cramped and a little damp, and carries an unpleasant smell of fish and raw meat—but I</w:t>
-      </w:r>
-      <w:r>
-        <w:t>’</w:t>
-      </w:r>
-      <w:r>
-        <w:t>m grateful it exists.</w:t>
-      </w:r>
-      <w:r>
-        <w:t xml:space="preserve"> There are things you simply can</w:t>
-      </w:r>
-      <w:r>
-        <w:t>’</w:t>
-      </w:r>
-      <w:r>
-        <w:t>t find anywhere else.</w:t>
-      </w:r>
-    </w:p>
-    <w:p>
-      <w:pPr>
-        <w:pStyle w:val="CSP-ChapterBodyText"/>
-      </w:pPr>
-    </w:p>
-    <w:p>
-      <w:pPr>
-        <w:pStyle w:val="CSP-ChapterBodyText"/>
-      </w:pPr>
-      <w:r>
-        <w:t>I hope this letter reaches you before Mom</w:t>
-      </w:r>
-      <w:r>
-        <w:t>’</w:t>
-      </w:r>
-      <w:r>
-        <w:t>s birthday on October 13th. Happy Birthday, Mom!</w:t>
-      </w:r>
-    </w:p>
-    <w:p>
-      <w:pPr>
-        <w:pStyle w:val="CSP-ChapterBodyText"/>
-      </w:pPr>
-    </w:p>
-    <w:p>
-      <w:pPr>
-        <w:pStyle w:val="CSP-ChapterBodyText"/>
-      </w:pPr>
-      <w:r>
-        <w:t>Tong</w:t>
-      </w:r>
-    </w:p>
-    <w:p>
-      <w:pPr>
-        <w:pStyle w:val="CSP-ChapterBodyText"/>
-      </w:pPr>
-      <w:r>
-        <w:t>09/30/95</w:t>
-      </w:r>
-    </w:p>
-    <w:p>
-      <w:pPr>
-        <w:pStyle w:val="CSP-ChapterBodyText"/>
-      </w:pPr>
-    </w:p>
-    <w:p>
-      <w:pPr>
-        <w:pStyle w:val="CSP-ChapterBodyText"/>
-      </w:pPr>
-    </w:p>
-    <w:p>
-      <w:pPr>
-        <w:pStyle w:val="CSP-ChapterBodyText"/>
-        <w:jc w:val="center"/>
-        <w:rPr>
-          <w:rFonts w:ascii="Segoe UI Symbol" w:hAnsi="Segoe UI Symbol" w:cs="Segoe UI Symbol"/>
-        </w:rPr>
-      </w:pPr>
-      <w:r>
-        <w:rPr>
-          <w:rFonts w:ascii="Segoe UI Symbol" w:hAnsi="Segoe UI Symbol" w:cs="Segoe UI Symbol"/>
-        </w:rPr>
-        <w:t>❧❧❧</w:t>
-      </w:r>
-    </w:p>
-    <w:p>
-      <w:pPr>
-        <w:pStyle w:val="CSP-ChapterBodyText"/>
-      </w:pPr>
-    </w:p>
-    <w:p>
-      <w:pPr>
-        <w:pStyle w:val="CSP-ChapterBodyText"/>
-      </w:pPr>
-    </w:p>
-    <w:p>
-      <w:pPr>
-        <w:pStyle w:val="CSP-ChapterBodyText"/>
-      </w:pPr>
-    </w:p>
-    <w:p>
-      <w:pPr>
-        <w:pStyle w:val="CSP-ChapterBodyText"/>
-      </w:pPr>
-      <w:r>
-        <w:t>I just received your third letter, dated September 24th, along with Chun</w:t>
-      </w:r>
-      <w:r>
-        <w:t>’</w:t>
-      </w:r>
-      <w:r>
-        <w:t xml:space="preserve">s second letter. She wrote that the administration at her institute had refused to issue her academic transcripts. Their preliminary decision was to delay issuing them until this time </w:t>
-      </w:r>
-      <w:r>
-        <w:lastRenderedPageBreak/>
-        <w:t>next year. If that is the case, our plans will have to be delayed—she won</w:t>
+        <w:t>her institute had refused to issue her academic transcripts. Their preliminary decision was to delay issuing them until this time next year. If that is the case, our plans will have to be delayed—she won</w:t>
       </w:r>
       <w:r>
         <w:t>’</w:t>
@@ -6201,7 +6251,7 @@
         <w:rPr>
           <w:rStyle w:val="FootnoteReference"/>
         </w:rPr>
-        <w:footnoteReference w:id="13"/>
+        <w:footnoteReference w:id="15"/>
       </w:r>
       <w:r>
         <w:t xml:space="preserve"> They seem very popular here. Each episode is only about half an hour long, which fits perfectly into my busy schedule. Most importantly, they</w:t>
@@ -6275,7 +6325,7 @@
         <w:rPr>
           <w:rStyle w:val="FootnoteReference"/>
         </w:rPr>
-        <w:footnoteReference w:id="14"/>
+        <w:footnoteReference w:id="16"/>
       </w:r>
     </w:p>
     <w:p>
@@ -6761,7 +6811,7 @@
         <w:rPr>
           <w:rStyle w:val="FootnoteReference"/>
         </w:rPr>
-        <w:footnoteReference w:id="15"/>
+        <w:footnoteReference w:id="17"/>
       </w:r>
       <w:r>
         <w:t xml:space="preserve"> to me. Sure, the coursework is a bit more demanding than back home, but it</w:t>
@@ -7144,7 +7194,16 @@
         <w:t>’</w:t>
       </w:r>
       <w:r>
-        <w:t>m sure it will be much better for your health. Dad, I took care of that thing you asked me to do. You should be receiving two packages soon—one containing application materials, and the other</w:t>
+        <w:t>m sure it will be much better for your health. Dad, I took care of that thing you asked me to do.</w:t>
+      </w:r>
+      <w:r>
+        <w:rPr>
+          <w:rStyle w:val="FootnoteReference"/>
+        </w:rPr>
+        <w:footnoteReference w:id="18"/>
+      </w:r>
+      <w:r>
+        <w:t xml:space="preserve"> You should be receiving two packages soon—one containing application materials, and the other</w:t>
       </w:r>
       <w:r>
         <w:t>,</w:t>
@@ -7193,13 +7252,26 @@
         <w:t>’</w:t>
       </w:r>
       <w:r>
-        <w:t>s really no need. A five-minute call doesn</w:t>
-      </w:r>
-      <w:r>
-        <w:t>’</w:t>
-      </w:r>
-      <w:r>
-        <w:t>t cost me much more than a fast-food meal. Even though money is still a little tight here, I can easily afford it. So next time we talk, don</w:t>
+        <w:t>s really no need.</w:t>
+      </w:r>
+      <w:r>
+        <w:rPr>
+          <w:rStyle w:val="FootnoteReference"/>
+        </w:rPr>
+        <w:footnoteReference w:id="19"/>
+      </w:r>
+      <w:r>
+        <w:t xml:space="preserve"> A five-minute call doesn</w:t>
+      </w:r>
+      <w:r>
+        <w:t>’</w:t>
+      </w:r>
+      <w:r>
+        <w:t xml:space="preserve">t cost me much more than a fast-food meal. </w:t>
+      </w:r>
+      <w:r>
+        <w:lastRenderedPageBreak/>
+        <w:t>Even though money is still a little tight here, I can easily afford it. So next time we talk, don</w:t>
       </w:r>
       <w:r>
         <w:t>’</w:t>
@@ -7224,251 +7296,272 @@
         <w:t>’</w:t>
       </w:r>
       <w:r>
-        <w:t xml:space="preserve">m not doing anything, I just watch TV or head over to campus to use the computers. Getting to </w:t>
+        <w:t>m not doing anything, I just watch TV or head over to campus to use the computers. Getting to school is a bit more of a hassle right now because the campus shuttles aren</w:t>
+      </w:r>
+      <w:r>
+        <w:t>’</w:t>
+      </w:r>
+      <w:r>
+        <w:t xml:space="preserve">t running, so I have to take the regular city bus. I ended up getting straight </w:t>
+      </w:r>
+      <w:proofErr w:type="gramStart"/>
+      <w:r>
+        <w:t>A</w:t>
+      </w:r>
+      <w:r>
+        <w:t>’</w:t>
+      </w:r>
+      <w:r>
+        <w:t>s</w:t>
+      </w:r>
+      <w:proofErr w:type="gramEnd"/>
+      <w:r>
+        <w:t xml:space="preserve"> in all three of my classes this semester, which I pretty much expected. It definitely gives me a lot more confidence about my coursework going forward. I</w:t>
+      </w:r>
+      <w:r>
+        <w:t>’</w:t>
+      </w:r>
+      <w:r>
+        <w:t>ll be taking another three classes next semester. I don</w:t>
+      </w:r>
+      <w:r>
+        <w:t>’</w:t>
+      </w:r>
+      <w:r>
+        <w:t>t know what class I</w:t>
+      </w:r>
+      <w:r>
+        <w:t>’</w:t>
+      </w:r>
+      <w:r>
+        <w:t>ll be TA-</w:t>
+      </w:r>
+      <w:proofErr w:type="spellStart"/>
+      <w:r>
+        <w:t>ing</w:t>
+      </w:r>
+      <w:proofErr w:type="spellEnd"/>
+      <w:r>
+        <w:t xml:space="preserve"> for yet, but I</w:t>
+      </w:r>
+      <w:r>
+        <w:t>’</w:t>
+      </w:r>
+      <w:r>
+        <w:t>m hoping for a lighter workload. The spring semester officially kicks off on January 16th.</w:t>
+      </w:r>
+    </w:p>
+    <w:p>
+      <w:pPr>
+        <w:pStyle w:val="CSP-ChapterBodyText"/>
+      </w:pPr>
+    </w:p>
+    <w:p>
+      <w:pPr>
+        <w:pStyle w:val="CSP-ChapterBodyText"/>
+      </w:pPr>
+      <w:r>
+        <w:t>Christmas wasn</w:t>
+      </w:r>
+      <w:r>
+        <w:t>’</w:t>
+      </w:r>
+      <w:r>
+        <w:t>t overly lively, especially among the Chinese students, but the holiday lights are absolutely beautiful. Americans love decorating their houses, trees</w:t>
+      </w:r>
+      <w:r>
+        <w:t>,</w:t>
+      </w:r>
+      <w:r>
+        <w:t xml:space="preserve"> and streets with countless little lights—it looks amazing at night. On one little street, the neighbors have turned decorating into a tradition, and people from all over Austin drive in just to see the lights, causing traffic jams that stretch for blocks. Christmas over here is just like Chinese New Year back home; everyone heads home to be with family, and almost all the shops and restaurants are closed for the day.</w:t>
+      </w:r>
+    </w:p>
+    <w:p>
+      <w:pPr>
+        <w:pStyle w:val="CSP-ChapterBodyText"/>
+      </w:pPr>
+    </w:p>
+    <w:p>
+      <w:pPr>
+        <w:pStyle w:val="CSP-ChapterBodyText"/>
+      </w:pPr>
+      <w:r>
+        <w:t xml:space="preserve">A friend of mine originally invited me and a few others to Louisiana to check out the casinos—mostly just to see what they were like. But on Christmas morning, even though we got up at 5:30 a.m., we still missed the bus! </w:t>
+      </w:r>
+      <w:proofErr w:type="gramStart"/>
+      <w:r>
+        <w:t>So</w:t>
+      </w:r>
+      <w:proofErr w:type="gramEnd"/>
+      <w:r>
+        <w:t xml:space="preserve"> we changed our plans and went to San Antonio instead. San Antonio is a tourist city, famous for its River Walk—a canal lined with restaurants on both sides. With all the Christmas lights, the views there were absolutely beautiful. It</w:t>
+      </w:r>
+      <w:r>
+        <w:t>’</w:t>
+      </w:r>
+      <w:r>
+        <w:t xml:space="preserve">s so picturesque that it reminded me of the classical gardens of Suzhou, and it really made me </w:t>
       </w:r>
       <w:r>
         <w:lastRenderedPageBreak/>
-        <w:t>school is a bit more of a hassle right now because the campus shuttles aren</w:t>
-      </w:r>
-      <w:r>
-        <w:t>’</w:t>
-      </w:r>
-      <w:r>
-        <w:t xml:space="preserve">t running, so I have to take the regular city bus. I ended up getting straight </w:t>
-      </w:r>
-      <w:proofErr w:type="gramStart"/>
-      <w:r>
-        <w:t>A</w:t>
-      </w:r>
-      <w:r>
-        <w:t>’</w:t>
-      </w:r>
-      <w:r>
-        <w:t>s</w:t>
-      </w:r>
-      <w:proofErr w:type="gramEnd"/>
-      <w:r>
-        <w:t xml:space="preserve"> in all three of my classes this semester, which I pretty much expected. It definitely gives me a lot more confidence about my coursework going forward. I</w:t>
-      </w:r>
-      <w:r>
-        <w:t>’</w:t>
-      </w:r>
-      <w:r>
-        <w:t>ll be taking another three classes next semester. I don</w:t>
-      </w:r>
-      <w:r>
-        <w:t>’</w:t>
-      </w:r>
-      <w:r>
-        <w:t>t know what class I</w:t>
-      </w:r>
-      <w:r>
-        <w:t>’</w:t>
-      </w:r>
-      <w:r>
-        <w:t>ll be TA-</w:t>
+        <w:t>homesick.</w:t>
+      </w:r>
+    </w:p>
+    <w:p>
+      <w:pPr>
+        <w:pStyle w:val="CSP-ChapterBodyText"/>
+      </w:pPr>
+    </w:p>
+    <w:p>
+      <w:pPr>
+        <w:pStyle w:val="CSP-ChapterBodyText"/>
+      </w:pPr>
+      <w:r>
+        <w:t xml:space="preserve">Two or three weeks ago, I sent out some credit card applications, and a bunch of them just came through. I got a Citibank Visa, an AT&amp;T MasterCard, and a Discover card. I managed to get approved for all the major ones! My combined credit limit is $2,100, which is more than enough for me. </w:t>
+      </w:r>
+      <w:r>
+        <w:t>Making purchases will be so much more convenient from now on—I can just use a card.</w:t>
+      </w:r>
+      <w:r>
+        <w:t xml:space="preserve"> Plus, it</w:t>
+      </w:r>
+      <w:r>
+        <w:t>’</w:t>
+      </w:r>
+      <w:r>
+        <w:t>s really important to start building up my credit history early.</w:t>
+      </w:r>
+    </w:p>
+    <w:p>
+      <w:pPr>
+        <w:pStyle w:val="CSP-ChapterBodyText"/>
+      </w:pPr>
+    </w:p>
+    <w:p>
+      <w:pPr>
+        <w:pStyle w:val="CSP-ChapterBodyText"/>
+      </w:pPr>
+      <w:r>
+        <w:t>In about two weeks, I</w:t>
+      </w:r>
+      <w:r>
+        <w:t>’</w:t>
+      </w:r>
+      <w:r>
+        <w:t>m moving. Coincidentally, one of our Taiwanese neighbors, Yao-</w:t>
       </w:r>
       <w:proofErr w:type="spellStart"/>
       <w:r>
-        <w:t>ing</w:t>
+        <w:t>zhu</w:t>
       </w:r>
       <w:proofErr w:type="spellEnd"/>
       <w:r>
-        <w:t xml:space="preserve"> for yet, but I</w:t>
-      </w:r>
-      <w:r>
-        <w:t>’</w:t>
-      </w:r>
-      <w:r>
-        <w:t>m hoping for a lighter workload. The spring semester officially kicks off on January 16th.</w:t>
-      </w:r>
-    </w:p>
-    <w:p>
-      <w:pPr>
-        <w:pStyle w:val="CSP-ChapterBodyText"/>
-      </w:pPr>
-    </w:p>
-    <w:p>
-      <w:pPr>
-        <w:pStyle w:val="CSP-ChapterBodyText"/>
-      </w:pPr>
-      <w:r>
-        <w:t>Christmas wasn</w:t>
-      </w:r>
-      <w:r>
-        <w:t>’</w:t>
-      </w:r>
-      <w:r>
-        <w:t>t overly lively, especially among the Chinese students, but the holiday lights are absolutely beautiful. Americans love decorating their houses, trees</w:t>
-      </w:r>
-      <w:r>
-        <w:t>,</w:t>
-      </w:r>
-      <w:r>
-        <w:t xml:space="preserve"> and streets with countless little lights—it looks amazing at night. On one little street, the neighbors have turned decorating into a tradition, and people from all over Austin drive in just to see the lights, causing traffic jams that stretch for blocks. Christmas over here is just like Chinese New Year back home; everyone heads home to be with family, and almost all the shops and restaurants are closed for the day.</w:t>
-      </w:r>
-    </w:p>
-    <w:p>
-      <w:pPr>
-        <w:pStyle w:val="CSP-ChapterBodyText"/>
-      </w:pPr>
-    </w:p>
-    <w:p>
-      <w:pPr>
-        <w:pStyle w:val="CSP-ChapterBodyText"/>
-      </w:pPr>
-      <w:r>
-        <w:t xml:space="preserve">A friend of mine originally invited me and a few others to Louisiana to check out the casinos—mostly just to see what they were like. But on Christmas morning, even though we got up at 5:30 a.m., we still missed the bus! </w:t>
-      </w:r>
-      <w:proofErr w:type="gramStart"/>
-      <w:r>
-        <w:t>So</w:t>
-      </w:r>
-      <w:proofErr w:type="gramEnd"/>
-      <w:r>
-        <w:t xml:space="preserve"> we changed our plans and went to San Antonio instead. San Antonio is a tourist city, famous for its River Walk—a canal lined with restaurants on both sides. With all the Christmas lights, the views there were absolutely beautiful. It</w:t>
-      </w:r>
-      <w:r>
-        <w:t>’</w:t>
-      </w:r>
-      <w:r>
-        <w:t>s so picturesque that it reminded me of the classical gardens of Suzhou, and it really made me homesick.</w:t>
-      </w:r>
-    </w:p>
-    <w:p>
-      <w:pPr>
-        <w:pStyle w:val="CSP-ChapterBodyText"/>
-      </w:pPr>
-    </w:p>
-    <w:p>
-      <w:pPr>
-        <w:pStyle w:val="CSP-ChapterBodyText"/>
-      </w:pPr>
-      <w:r>
-        <w:t xml:space="preserve">Two or three weeks ago, I sent out some credit card applications, and a bunch of them just came through. I got a Citibank Visa, an AT&amp;T MasterCard, and a Discover card. I managed to get approved for all the major ones! My combined credit limit is $2,100, which is more than enough for me. </w:t>
+        <w:t>, is moving out too because she just bought a mobile home—basically a house on wheels, only it doesn</w:t>
+      </w:r>
+      <w:r>
+        <w:t>’</w:t>
+      </w:r>
+      <w:r>
+        <w:t>t go anywhere. She paid $8,000 for it and told me that it</w:t>
+      </w:r>
+      <w:r>
+        <w:t>’</w:t>
+      </w:r>
+      <w:r>
+        <w:t xml:space="preserve">s really nice—two bedrooms, a living room, a kitchen, a bathroom, and it even comes with a washer and dryer. The mobile home park seems nice too. She repeatedly asked me to be her roommate, offering me </w:t>
+      </w:r>
+      <w:r>
+        <w:t>a room</w:t>
+      </w:r>
+      <w:r>
+        <w:t xml:space="preserve"> for $200 a month plus half the utilities, which sounded tempting. At the time, though, I was already negotiating with that American student, and rooming with him would run me closer to $330. Compared to that, her mobile home was cheaper and just as nice, so I turned down the American student and told Yao-</w:t>
+      </w:r>
+      <w:proofErr w:type="spellStart"/>
+      <w:r>
+        <w:t>zhu</w:t>
+      </w:r>
+      <w:proofErr w:type="spellEnd"/>
+      <w:r>
+        <w:t xml:space="preserve"> I</w:t>
+      </w:r>
+      <w:r>
+        <w:t>’</w:t>
+      </w:r>
+      <w:r>
+        <w:t>d take it. But then a few days later, he called back and said he</w:t>
+      </w:r>
+      <w:r>
+        <w:t>’</w:t>
+      </w:r>
+      <w:r>
+        <w:t>d lower my share to $300. It left me feeling torn. In the end, I decided to go with him after all, so now I</w:t>
+      </w:r>
+      <w:r>
+        <w:t>’</w:t>
+      </w:r>
+      <w:r>
+        <w:t>m actually helping Yao-</w:t>
+      </w:r>
+      <w:proofErr w:type="spellStart"/>
+      <w:r>
+        <w:t>zhu</w:t>
+      </w:r>
+      <w:proofErr w:type="spellEnd"/>
+      <w:r>
+        <w:t xml:space="preserve"> find another roommate.</w:t>
+      </w:r>
+    </w:p>
+    <w:p>
+      <w:pPr>
+        <w:pStyle w:val="CSP-ChapterBodyText"/>
+      </w:pPr>
+    </w:p>
+    <w:p>
+      <w:pPr>
+        <w:pStyle w:val="CSP-ChapterBodyText"/>
+      </w:pPr>
+      <w:r>
+        <w:t>It</w:t>
+      </w:r>
+      <w:r>
+        <w:t>’</w:t>
+      </w:r>
+      <w:r>
+        <w:t>s such a shame that the Christmas card I sent you never arrived.</w:t>
+      </w:r>
+      <w:r>
+        <w:rPr>
+          <w:rStyle w:val="FootnoteReference"/>
+        </w:rPr>
+        <w:footnoteReference w:id="20"/>
+      </w:r>
+      <w:r>
+        <w:t xml:space="preserve"> I must not have put enough postage on it, and it probably got lost in transit somewhere. The card I sent to Chun might be lost too, so I</w:t>
+      </w:r>
+      <w:r>
+        <w:t>’</w:t>
+      </w:r>
+      <w:r>
+        <w:t>ll write to her later to explain. I gave her a call two days ago, but she wasn</w:t>
+      </w:r>
+      <w:r>
+        <w:t>’</w:t>
+      </w:r>
+      <w:r>
+        <w:t xml:space="preserve">t in her office, so I just left a message. Nothing urgent—just wanted to wish her a Happy </w:t>
       </w:r>
       <w:r>
         <w:lastRenderedPageBreak/>
-        <w:t>Making purchases will be so much more convenient from now on—I can just use a card.</w:t>
-      </w:r>
-      <w:r>
-        <w:t xml:space="preserve"> Plus, it</w:t>
-      </w:r>
-      <w:r>
-        <w:t>’</w:t>
-      </w:r>
-      <w:r>
-        <w:t>s really important to start building up my credit history early.</w:t>
-      </w:r>
-    </w:p>
-    <w:p>
-      <w:pPr>
-        <w:pStyle w:val="CSP-ChapterBodyText"/>
-      </w:pPr>
-    </w:p>
-    <w:p>
-      <w:pPr>
-        <w:pStyle w:val="CSP-ChapterBodyText"/>
-      </w:pPr>
-      <w:r>
-        <w:t>In about two weeks, I</w:t>
-      </w:r>
-      <w:r>
-        <w:t>’</w:t>
-      </w:r>
-      <w:r>
-        <w:t>m moving. Coincidentally, one of our Taiwanese neighbors, Yao-</w:t>
-      </w:r>
-      <w:proofErr w:type="spellStart"/>
-      <w:r>
-        <w:t>zhu</w:t>
-      </w:r>
-      <w:proofErr w:type="spellEnd"/>
-      <w:r>
-        <w:t>, is moving out too because she just bought a mobile home—basically a house on wheels, only it doesn</w:t>
-      </w:r>
-      <w:r>
-        <w:t>’</w:t>
-      </w:r>
-      <w:r>
-        <w:t>t go anywhere. She paid $8,000 for it and told me that it</w:t>
-      </w:r>
-      <w:r>
-        <w:t>’</w:t>
-      </w:r>
-      <w:r>
-        <w:t xml:space="preserve">s really nice—two bedrooms, a living room, a kitchen, a bathroom, and it even comes with a washer and dryer. The mobile home park seems nice too. She repeatedly asked me to be her roommate, offering me </w:t>
-      </w:r>
-      <w:r>
-        <w:t>a room</w:t>
-      </w:r>
-      <w:r>
-        <w:t xml:space="preserve"> for $200 a month plus half the utilities, which sounded tempting. At the time, though, I was already negotiating with that American student, and rooming with him would run me closer to $330. Compared to that, her mobile home was cheaper and just as nice, so I turned down the American student and told Yao-</w:t>
-      </w:r>
-      <w:proofErr w:type="spellStart"/>
-      <w:r>
-        <w:t>zhu</w:t>
-      </w:r>
-      <w:proofErr w:type="spellEnd"/>
-      <w:r>
-        <w:t xml:space="preserve"> I</w:t>
-      </w:r>
-      <w:r>
-        <w:t>’</w:t>
-      </w:r>
-      <w:r>
-        <w:t>d take it. But then a few days later, he called back and said he</w:t>
-      </w:r>
-      <w:r>
-        <w:t>’</w:t>
-      </w:r>
-      <w:r>
-        <w:t>d lower my share to $300. It left me feeling torn. In the end, I decided to go with him after all, so now I</w:t>
-      </w:r>
-      <w:r>
-        <w:t>’</w:t>
-      </w:r>
-      <w:r>
-        <w:t>m actually helping Yao-</w:t>
-      </w:r>
-      <w:proofErr w:type="spellStart"/>
-      <w:r>
-        <w:t>zhu</w:t>
-      </w:r>
-      <w:proofErr w:type="spellEnd"/>
-      <w:r>
-        <w:t xml:space="preserve"> find another roommate.</w:t>
-      </w:r>
-    </w:p>
-    <w:p>
-      <w:pPr>
-        <w:pStyle w:val="CSP-ChapterBodyText"/>
-      </w:pPr>
-    </w:p>
-    <w:p>
-      <w:pPr>
-        <w:pStyle w:val="CSP-ChapterBodyText"/>
-      </w:pPr>
-      <w:r>
-        <w:t>It</w:t>
-      </w:r>
-      <w:r>
-        <w:t>’</w:t>
-      </w:r>
-      <w:r>
-        <w:t>s such a shame that the Christmas card I sent you never arrived. I must not have put enough postage on it, and it probably got lost in transit somewhere. The card I sent to Chun might be lost too, so I</w:t>
-      </w:r>
-      <w:r>
-        <w:t>’</w:t>
-      </w:r>
-      <w:r>
-        <w:t>ll write to her later to explain. I gave her a call two days ago, but she wasn</w:t>
-      </w:r>
-      <w:r>
-        <w:t>’</w:t>
-      </w:r>
-      <w:r>
-        <w:t>t in her office, so I just left a message. Nothing urgent—just wanted to wish her a Happy New Year. Whether you invite Chun over during the winter break is entirely up to you. I have a feeling she</w:t>
+        <w:t>New Year. Whether you invite Chun over during the winter break is entirely up to you.</w:t>
+      </w:r>
+      <w:r>
+        <w:rPr>
+          <w:rStyle w:val="FootnoteReference"/>
+        </w:rPr>
+        <w:footnoteReference w:id="21"/>
+      </w:r>
+      <w:r>
+        <w:t xml:space="preserve"> I have a feeling she</w:t>
       </w:r>
       <w:r>
         <w:t>’</w:t>
@@ -7505,11 +7598,7 @@
         <w:t>’</w:t>
       </w:r>
       <w:r>
-        <w:t xml:space="preserve">d better </w:t>
-      </w:r>
-      <w:r>
-        <w:lastRenderedPageBreak/>
-        <w:t>stop here.</w:t>
+        <w:t>d better stop here.</w:t>
       </w:r>
     </w:p>
     <w:p>
@@ -7839,20 +7928,42 @@
         <w:t>”</w:t>
       </w:r>
       <w:r>
-        <w:t xml:space="preserve"> he might not catch on right away since last names come after first names over here. Moving was very easy</w:t>
+        <w:t xml:space="preserve"> he might not catch on right away since last names come after first names over here.</w:t>
+      </w:r>
+      <w:r>
+        <w:rPr>
+          <w:rStyle w:val="FootnoteReference"/>
+        </w:rPr>
+        <w:footnoteReference w:id="22"/>
+      </w:r>
+      <w:r>
+        <w:t xml:space="preserve"> </w:t>
+      </w:r>
+    </w:p>
+    <w:p>
+      <w:pPr>
+        <w:pStyle w:val="CSP-ChapterBodyText"/>
+      </w:pPr>
+    </w:p>
+    <w:p>
+      <w:pPr>
+        <w:pStyle w:val="CSP-ChapterBodyText"/>
+      </w:pPr>
+      <w:r>
+        <w:t>Moving was very easy</w:t>
       </w:r>
       <w:r>
         <w:t>—</w:t>
       </w:r>
       <w:r>
-        <w:t xml:space="preserve">my roommate helped me out, and we finished everything in under an hour. I brought my table over to the new place, but the bed was too bulky. Besides, my new room already comes with a queen-size bed, so I ended up giving my old one to our Taiwanese neighbor. My roommate is a few years older than me and is an undergraduate majoring in Radio-Television-Film. </w:t>
-      </w:r>
-      <w:r>
-        <w:t xml:space="preserve">He wants to move to Hong Kong someday to make movies and is currently working on his own experimental student film—apparently, a Hong Kong-style cop </w:t>
+        <w:t xml:space="preserve">my roommate helped me out, and we finished everything in under an hour. I brought my table over </w:t>
       </w:r>
       <w:r>
         <w:lastRenderedPageBreak/>
-        <w:t>thriller.</w:t>
+        <w:t xml:space="preserve">to the new place, but the bed was too bulky. Besides, my new room already comes with a queen-size bed, so I ended up giving my old one to our Taiwanese neighbor. My roommate is a few years older than me and is an undergraduate majoring in Radio-Television-Film. </w:t>
+      </w:r>
+      <w:r>
+        <w:t>He wants to move to Hong Kong someday to make movies and is currently working on his own experimental student film—apparently, a Hong Kong-style cop thriller.</w:t>
       </w:r>
     </w:p>
     <w:p>
@@ -8146,7 +8257,7 @@
         <w:rPr>
           <w:rStyle w:val="FootnoteReference"/>
         </w:rPr>
-        <w:footnoteReference w:id="16"/>
+        <w:footnoteReference w:id="23"/>
       </w:r>
       <w:r>
         <w:t xml:space="preserve"> already. Still, I</w:t>
@@ -8709,7 +8820,16 @@
         <w:t>’</w:t>
       </w:r>
       <w:r>
-        <w:t>t go well, especially that Mom fractured her left wrist. As you get older, you have to be much more careful—even a minor fall can result in a serious injury. I</w:t>
+        <w:t>t go well, especially that Mom fractured her left wrist.</w:t>
+      </w:r>
+      <w:r>
+        <w:rPr>
+          <w:rStyle w:val="FootnoteReference"/>
+        </w:rPr>
+        <w:footnoteReference w:id="24"/>
+      </w:r>
+      <w:r>
+        <w:t xml:space="preserve"> As you get older, you have to be much more careful—even a minor fall can result in a serious injury. I</w:t>
       </w:r>
       <w:r>
         <w:t>’</w:t>
@@ -8727,7 +8847,7 @@
         <w:rPr>
           <w:rStyle w:val="FootnoteReference"/>
         </w:rPr>
-        <w:footnoteReference w:id="17"/>
+        <w:footnoteReference w:id="25"/>
       </w:r>
       <w:r>
         <w:t xml:space="preserve"> </w:t>
@@ -8751,7 +8871,7 @@
         <w:rPr>
           <w:rStyle w:val="FootnoteReference"/>
         </w:rPr>
-        <w:footnoteReference w:id="18"/>
+        <w:footnoteReference w:id="26"/>
       </w:r>
       <w:r>
         <w:t xml:space="preserve"> Did Wang Wei and Xiao Fan join you for the dinner? If so, that must have made things a little better. Otherwise, it must have felt awfully quiet with just the two of you. Above all, please be extra careful from now on. </w:t>
@@ -8767,6 +8887,7 @@
         <w:pStyle w:val="CSP-ChapterBodyText"/>
       </w:pPr>
       <w:r>
+        <w:lastRenderedPageBreak/>
         <w:t xml:space="preserve">When the weather turns cold, </w:t>
       </w:r>
       <w:r>
@@ -8797,172 +8918,168 @@
         <w:t>I</w:t>
       </w:r>
       <w:r>
-        <w:t xml:space="preserve">t breaks my heart to </w:t>
+        <w:t xml:space="preserve">t breaks my heart to think of you freezing in the winter and sweltering in the summer. </w:t>
+      </w:r>
+      <w:r>
+        <w:t>Please don</w:t>
+      </w:r>
+      <w:r>
+        <w:t>’</w:t>
+      </w:r>
+      <w:r>
+        <w:t>t just tell me what I want to hear—I truly hope you</w:t>
+      </w:r>
+      <w:r>
+        <w:t>’</w:t>
+      </w:r>
+      <w:r>
+        <w:t>ll do something to make life a little easier on yourselves.</w:t>
+      </w:r>
+    </w:p>
+    <w:p>
+      <w:pPr>
+        <w:pStyle w:val="CSP-ChapterBodyText"/>
+      </w:pPr>
+    </w:p>
+    <w:p>
+      <w:pPr>
+        <w:pStyle w:val="CSP-ChapterBodyText"/>
+      </w:pPr>
+      <w:r>
+        <w:t>Mom, you mentioned in your letter that some of the news articles you</w:t>
+      </w:r>
+      <w:r>
+        <w:t>’</w:t>
+      </w:r>
+      <w:r>
+        <w:t>ve read make America sound like a terrifying place. Honestly, that hasn</w:t>
+      </w:r>
+      <w:r>
+        <w:t>’</w:t>
+      </w:r>
+      <w:r>
+        <w:t>t been my experience at all—it really just depends on where you live. Austin is a mid-sized college town, and relatively speaking, it</w:t>
+      </w:r>
+      <w:r>
+        <w:t>’</w:t>
+      </w:r>
+      <w:r>
+        <w:t>s pretty safe. Occasionally I</w:t>
+      </w:r>
+      <w:r>
+        <w:t>’</w:t>
+      </w:r>
+      <w:r>
+        <w:t>ve walked home alone from the computer labs on campus well past midnight, with hardly anyone else on the streets. I was only a little nervous the first couple of times. Now it hardly bothers me, though I always stay alert to my surroundings. Please don</w:t>
+      </w:r>
+      <w:r>
+        <w:t>’</w:t>
+      </w:r>
+      <w:r>
+        <w:t>t worry. I</w:t>
+      </w:r>
+      <w:r>
+        <w:t>’</w:t>
+      </w:r>
+      <w:r>
+        <w:t>ll keep looking out for myself.</w:t>
+      </w:r>
+    </w:p>
+    <w:p>
+      <w:pPr>
+        <w:pStyle w:val="CSP-ChapterBodyText"/>
+      </w:pPr>
+    </w:p>
+    <w:p>
+      <w:pPr>
+        <w:pStyle w:val="CSP-ChapterBodyText"/>
+      </w:pPr>
+      <w:r>
+        <w:t>Right now, we</w:t>
+      </w:r>
+      <w:r>
+        <w:t>’</w:t>
+      </w:r>
+      <w:r>
+        <w:t>re on spring break. It lasts a week and is already winding down. We</w:t>
+      </w:r>
+      <w:r>
+        <w:t>’</w:t>
+      </w:r>
+      <w:r>
+        <w:t>re halfway through the semester now, and things haven</w:t>
+      </w:r>
+      <w:r>
+        <w:t>’</w:t>
+      </w:r>
+      <w:r>
+        <w:t>t been overwhelmingly busy so far. I am the TA for a C++ course this time. C++ is a programming language that evolved from C, which I already know well. The workload is heavier than it was last term, but it</w:t>
+      </w:r>
+      <w:r>
+        <w:t>’</w:t>
+      </w:r>
+      <w:r>
+        <w:t>s still manageable. I hold three office hours a week and grade homework every other week. Since there are nearly 120 students in my class, grading a single assignment takes several hours.</w:t>
+      </w:r>
+    </w:p>
+    <w:p>
+      <w:pPr>
+        <w:pStyle w:val="CSP-ChapterBodyText"/>
+      </w:pPr>
+    </w:p>
+    <w:p>
+      <w:pPr>
+        <w:pStyle w:val="CSP-ChapterBodyText"/>
+      </w:pPr>
+      <w:r>
+        <w:t>The weather is gorgeous at this time of year—it</w:t>
+      </w:r>
+      <w:r>
+        <w:t>’</w:t>
+      </w:r>
+      <w:r>
+        <w:t>s warm enough that you only need a short-sleeved T-shirt. The winters here really aren</w:t>
+      </w:r>
+      <w:r>
+        <w:t>’</w:t>
+      </w:r>
+      <w:r>
+        <w:t>t bad at all. I</w:t>
+      </w:r>
+      <w:r>
+        <w:t>’</w:t>
+      </w:r>
+      <w:r>
+        <w:t>ve only had to wear a sweater for about four days last winter. I have no problems at all when it comes to food and clothing. In fact, I might even be eating a little too well—my waistline seems to be expanding, and I think I</w:t>
+      </w:r>
+      <w:r>
+        <w:t>’</w:t>
+      </w:r>
+      <w:r>
+        <w:t xml:space="preserve">m </w:t>
       </w:r>
       <w:r>
         <w:lastRenderedPageBreak/>
-        <w:t xml:space="preserve">think of you freezing in the winter and sweltering in the summer. </w:t>
-      </w:r>
-      <w:r>
-        <w:t>Please don</w:t>
-      </w:r>
-      <w:r>
-        <w:t>’</w:t>
-      </w:r>
-      <w:r>
-        <w:t>t just tell me what I want to hear—I truly hope you</w:t>
-      </w:r>
-      <w:r>
-        <w:t>’</w:t>
-      </w:r>
-      <w:r>
-        <w:t>ll do something to make life a little easier on yourselves.</w:t>
-      </w:r>
-    </w:p>
-    <w:p>
-      <w:pPr>
-        <w:pStyle w:val="CSP-ChapterBodyText"/>
-      </w:pPr>
-    </w:p>
-    <w:p>
-      <w:pPr>
-        <w:pStyle w:val="CSP-ChapterBodyText"/>
-      </w:pPr>
-      <w:r>
-        <w:t>Mom, you mentioned in your letter that some of the news articles you</w:t>
-      </w:r>
-      <w:r>
-        <w:t>’</w:t>
-      </w:r>
-      <w:r>
-        <w:t>ve read make America sound like a terrifying place. Honestly, that hasn</w:t>
-      </w:r>
-      <w:r>
-        <w:t>’</w:t>
-      </w:r>
-      <w:r>
-        <w:t>t been my experience at all—it really just depends on where you live. Austin is a mid-sized college town, and relatively speaking, it</w:t>
-      </w:r>
-      <w:r>
-        <w:t>’</w:t>
-      </w:r>
-      <w:r>
-        <w:t>s pretty safe. Occasionally I</w:t>
-      </w:r>
-      <w:r>
-        <w:t>’</w:t>
-      </w:r>
-      <w:r>
-        <w:t>ve walked home alone from the computer labs on campus well past midnight, with hardly anyone else on the streets. I was only a little nervous the first couple of times. Now it hardly bothers me, though I always stay alert to my surroundings. Please don</w:t>
-      </w:r>
-      <w:r>
-        <w:t>’</w:t>
-      </w:r>
-      <w:r>
-        <w:t>t worry. I</w:t>
-      </w:r>
-      <w:r>
-        <w:t>’</w:t>
-      </w:r>
-      <w:r>
-        <w:t>ll keep looking out for myself.</w:t>
-      </w:r>
-    </w:p>
-    <w:p>
-      <w:pPr>
-        <w:pStyle w:val="CSP-ChapterBodyText"/>
-      </w:pPr>
-    </w:p>
-    <w:p>
-      <w:pPr>
-        <w:pStyle w:val="CSP-ChapterBodyText"/>
-      </w:pPr>
-      <w:r>
-        <w:t>Right now, we</w:t>
-      </w:r>
-      <w:r>
-        <w:t>’</w:t>
-      </w:r>
-      <w:r>
-        <w:t>re on spring break. It lasts a week and is already winding down. We</w:t>
-      </w:r>
-      <w:r>
-        <w:t>’</w:t>
-      </w:r>
-      <w:r>
-        <w:t>re halfway through the semester now, and things haven</w:t>
-      </w:r>
-      <w:r>
-        <w:t>’</w:t>
-      </w:r>
-      <w:r>
-        <w:t>t been overwhelmingly busy so far. I am the TA for a C++ course this time. C++ is a programming language that evolved from C, which I already know well. The workload is heavier than it was last term, but it</w:t>
-      </w:r>
-      <w:r>
-        <w:t>’</w:t>
-      </w:r>
-      <w:r>
-        <w:t>s still manageable. I hold three office hours a week and grade homework every other week. Since there are nearly 120 students in my class, grading a single assignment takes several hours.</w:t>
-      </w:r>
-    </w:p>
-    <w:p>
-      <w:pPr>
-        <w:pStyle w:val="CSP-ChapterBodyText"/>
-      </w:pPr>
-    </w:p>
-    <w:p>
-      <w:pPr>
-        <w:pStyle w:val="CSP-ChapterBodyText"/>
-      </w:pPr>
-      <w:r>
-        <w:t>The weather is gorgeous at this time of year—it</w:t>
-      </w:r>
-      <w:r>
-        <w:t>’</w:t>
-      </w:r>
-      <w:r>
-        <w:t>s warm enough that you only need a short-sleeved T-shirt. The winters here really aren</w:t>
-      </w:r>
-      <w:r>
-        <w:t>’</w:t>
-      </w:r>
-      <w:r>
-        <w:t>t bad at all. I</w:t>
-      </w:r>
-      <w:r>
-        <w:t>’</w:t>
-      </w:r>
-      <w:r>
-        <w:t>ve only had to wear a sweater for about four days last winter. I have no problems at all when it comes to food and clothing. In fact, I might even be eating a little too well—my waistline seems to be expanding, and I think I</w:t>
-      </w:r>
-      <w:r>
-        <w:t>’</w:t>
-      </w:r>
-      <w:r>
-        <w:t>m putting on some weight.</w:t>
-      </w:r>
-    </w:p>
-    <w:p>
-      <w:pPr>
-        <w:pStyle w:val="CSP-ChapterBodyText"/>
-      </w:pPr>
-    </w:p>
-    <w:p>
-      <w:pPr>
-        <w:pStyle w:val="CSP-ChapterBodyText"/>
-      </w:pPr>
-      <w:r>
-        <w:t xml:space="preserve">Over the past few days, I received emails from two of my old Tsinghua classmates, both of whom have just been awarded fellowships—one at NYU and the other at Brown. They are </w:t>
-      </w:r>
-      <w:r>
-        <w:lastRenderedPageBreak/>
-        <w:t>both excellent universities, and receiving those fellowships is a huge accomplishment.</w:t>
+        <w:t>putting on some weight.</w:t>
+      </w:r>
+    </w:p>
+    <w:p>
+      <w:pPr>
+        <w:pStyle w:val="CSP-ChapterBodyText"/>
+      </w:pPr>
+    </w:p>
+    <w:p>
+      <w:pPr>
+        <w:pStyle w:val="CSP-ChapterBodyText"/>
+      </w:pPr>
+      <w:r>
+        <w:t>Over the past few days, I received emails from two of my old Tsinghua classmates, both of whom have just been awarded fellowships—one at NYU and the other at Brown. They are both excellent universities, and receiving those fellowships is a huge accomplishment.</w:t>
       </w:r>
       <w:r>
         <w:rPr>
           <w:rStyle w:val="FootnoteReference"/>
         </w:rPr>
-        <w:footnoteReference w:id="19"/>
+        <w:footnoteReference w:id="27"/>
       </w:r>
       <w:r>
         <w:t xml:space="preserve"> It really seems that if you</w:t>
@@ -9238,7 +9355,7 @@
         <w:rPr>
           <w:rStyle w:val="FootnoteReference"/>
         </w:rPr>
-        <w:footnoteReference w:id="20"/>
+        <w:footnoteReference w:id="28"/>
       </w:r>
     </w:p>
     <w:p>
@@ -9924,7 +10041,7 @@
         <w:rPr>
           <w:rStyle w:val="FootnoteReference"/>
         </w:rPr>
-        <w:footnoteReference w:id="21"/>
+        <w:footnoteReference w:id="29"/>
       </w:r>
       <w:r>
         <w:t xml:space="preserve"> you gave me is still untouched in a separate bank account. It matures on July 29th after a ten-month term at a 5.35% interest rate. </w:t>
@@ -9951,7 +10068,7 @@
         <w:rPr>
           <w:rStyle w:val="FootnoteReference"/>
         </w:rPr>
-        <w:footnoteReference w:id="22"/>
+        <w:footnoteReference w:id="30"/>
       </w:r>
     </w:p>
     <w:p>
@@ -10029,7 +10146,7 @@
         <w:rPr>
           <w:rStyle w:val="FootnoteReference"/>
         </w:rPr>
-        <w:footnoteReference w:id="23"/>
+        <w:footnoteReference w:id="31"/>
       </w:r>
     </w:p>
     <w:p>
@@ -10692,7 +10809,7 @@
           <w:rStyle w:val="FootnoteReference"/>
           <w:iCs w:val="0"/>
         </w:rPr>
-        <w:footnoteReference w:id="24"/>
+        <w:footnoteReference w:id="32"/>
       </w:r>
       <w:r>
         <w:t xml:space="preserve"> </w:t>
@@ -10811,7 +10928,7 @@
         <w:rPr>
           <w:rStyle w:val="FootnoteReference"/>
         </w:rPr>
-        <w:footnoteReference w:id="25"/>
+        <w:footnoteReference w:id="33"/>
       </w:r>
       <w:r>
         <w:t xml:space="preserve"> </w:t>
@@ -11207,7 +11324,16 @@
       </w:r>
       <w:proofErr w:type="gramEnd"/>
       <w:r>
-        <w:t xml:space="preserve"> wind turbine design turned out so well—keep up the great work! But please make sure to get some rest too. It</w:t>
+        <w:t xml:space="preserve"> wind turbine design turned out so well—keep up the great work!</w:t>
+      </w:r>
+      <w:r>
+        <w:rPr>
+          <w:rStyle w:val="FootnoteReference"/>
+        </w:rPr>
+        <w:footnoteReference w:id="34"/>
+      </w:r>
+      <w:r>
+        <w:t xml:space="preserve"> But please make sure to get some rest too. It</w:t>
       </w:r>
       <w:r>
         <w:t>’</w:t>
@@ -11289,7 +11415,17 @@
         <w:t>’</w:t>
       </w:r>
       <w:r>
-        <w:t>ll be working for about fifteen weeks, which means I should earn more than $9,000 after tax before the summer is over. I actually just got another credit card here in New Jersey with a $5,000 credit limit. They must think I</w:t>
+        <w:t>ll be working for about fifteen weeks, which means I should earn more than $9,000 after tax before the summer is over.</w:t>
+      </w:r>
+      <w:r>
+        <w:t xml:space="preserve"> </w:t>
+      </w:r>
+      <w:r>
+        <w:t xml:space="preserve">I actually </w:t>
+      </w:r>
+      <w:r>
+        <w:lastRenderedPageBreak/>
+        <w:t>just got another credit card here in New Jersey with a $5,000 credit limit. They must think I</w:t>
       </w:r>
       <w:r>
         <w:t>’</w:t>
@@ -11326,107 +11462,116 @@
         <w:pStyle w:val="CSP-ChapterBodyText"/>
       </w:pPr>
       <w:r>
+        <w:t>Speaking of permanent employees, without a Ph.D. it</w:t>
+      </w:r>
+      <w:r>
+        <w:t>’</w:t>
+      </w:r>
+      <w:r>
+        <w:t>s almost impossible to get a job at Bell Labs unless you</w:t>
+      </w:r>
+      <w:r>
+        <w:t>’</w:t>
+      </w:r>
+      <w:r>
+        <w:t>re hired as a consultant like Jim. Consultants make better money, but they</w:t>
+      </w:r>
+      <w:r>
+        <w:t>’</w:t>
+      </w:r>
+      <w:r>
+        <w:t>re essentially temporary employees rather than permanent staff, so the work is less stable. Quite a few Chinese engineers at Bell Labs are consultants, whereas the permanent staff are all scientists with Ph.D. degrees.</w:t>
+      </w:r>
+    </w:p>
+    <w:p>
+      <w:pPr>
+        <w:pStyle w:val="CSP-ChapterBodyText"/>
+      </w:pPr>
+    </w:p>
+    <w:p>
+      <w:pPr>
+        <w:pStyle w:val="CSP-ChapterBodyText"/>
+      </w:pPr>
+      <w:r>
+        <w:t>In my department at Bell Labs, there are only two Americans; everyone else comes from all over the world. We have people from Mainland China, Taiwan, Malaysia, South Korea, India (quite a few of them), Turkey, the Middle East, and Europe. It</w:t>
+      </w:r>
+      <w:r>
+        <w:t>’</w:t>
+      </w:r>
+      <w:r>
+        <w:t>s pretty cool—almost like a miniature United Nations. At our department picnic, we even got to sample dishes from every corner of the world.</w:t>
+      </w:r>
+    </w:p>
+    <w:p>
+      <w:pPr>
+        <w:pStyle w:val="CSP-ChapterBodyText"/>
+      </w:pPr>
+    </w:p>
+    <w:p>
+      <w:pPr>
+        <w:pStyle w:val="CSP-ChapterBodyText"/>
+      </w:pPr>
+      <w:r>
+        <w:t>While I</w:t>
+      </w:r>
+      <w:r>
+        <w:t>’</w:t>
+      </w:r>
+      <w:r>
+        <w:t>m completely tied up this summer, my winter break should be much quieter, so I might finally be able to come home for a visit. A round-trip ticket shouldn</w:t>
+      </w:r>
+      <w:r>
+        <w:t>’</w:t>
+      </w:r>
+      <w:r>
+        <w:t>t cost more than a thousand dollars. Besides, if I start working full-time next year, I</w:t>
+      </w:r>
+      <w:r>
+        <w:t>’</w:t>
+      </w:r>
+      <w:r>
+        <w:t>ll likely have even fewer opportunities to go back. It</w:t>
+      </w:r>
+      <w:r>
+        <w:t>’</w:t>
+      </w:r>
+      <w:r>
+        <w:t>s just an idea at this point—let me know what both of you think.</w:t>
+      </w:r>
+      <w:r>
+        <w:rPr>
+          <w:rStyle w:val="FootnoteReference"/>
+        </w:rPr>
+        <w:footnoteReference w:id="35"/>
+      </w:r>
+    </w:p>
+    <w:p>
+      <w:pPr>
+        <w:pStyle w:val="CSP-ChapterBodyText"/>
+      </w:pPr>
+    </w:p>
+    <w:p>
+      <w:pPr>
+        <w:pStyle w:val="CSP-ChapterBodyText"/>
+      </w:pPr>
+      <w:r>
+        <w:t>Chun and I have both agreed that things between us didn</w:t>
+      </w:r>
+      <w:r>
+        <w:t>’</w:t>
+      </w:r>
+      <w:r>
+        <w:t>t work out. We simply don</w:t>
+      </w:r>
+      <w:r>
+        <w:t>’</w:t>
+      </w:r>
+      <w:r>
+        <w:t xml:space="preserve">t have strong enough feelings for each </w:t>
+      </w:r>
+      <w:r>
         <w:lastRenderedPageBreak/>
-        <w:t>Speaking of permanent employees, without a Ph.D. it</w:t>
-      </w:r>
-      <w:r>
-        <w:t>’</w:t>
-      </w:r>
-      <w:r>
-        <w:t>s almost impossible to get a job at Bell Labs unless you</w:t>
-      </w:r>
-      <w:r>
-        <w:t>’</w:t>
-      </w:r>
-      <w:r>
-        <w:t>re hired as a consultant like Jim. Consultants make better money, but they</w:t>
-      </w:r>
-      <w:r>
-        <w:t>’</w:t>
-      </w:r>
-      <w:r>
-        <w:t>re essentially temporary employees rather than permanent staff, so the work is less stable. Quite a few Chinese engineers at Bell Labs are consultants, whereas the permanent staff are all scientists with Ph.D. degrees.</w:t>
-      </w:r>
-    </w:p>
-    <w:p>
-      <w:pPr>
-        <w:pStyle w:val="CSP-ChapterBodyText"/>
-      </w:pPr>
-    </w:p>
-    <w:p>
-      <w:pPr>
-        <w:pStyle w:val="CSP-ChapterBodyText"/>
-      </w:pPr>
-      <w:r>
-        <w:t>In my department at Bell Labs, there are only two Americans; everyone else comes from all over the world. We have people from Mainland China, Taiwan, Malaysia, South Korea, India (quite a few of them), Turkey, the Middle East, and Europe. It</w:t>
-      </w:r>
-      <w:r>
-        <w:t>’</w:t>
-      </w:r>
-      <w:r>
-        <w:t>s pretty cool—almost like a miniature United Nations. At our department picnic, we even got to sample dishes from every corner of the world.</w:t>
-      </w:r>
-    </w:p>
-    <w:p>
-      <w:pPr>
-        <w:pStyle w:val="CSP-ChapterBodyText"/>
-      </w:pPr>
-    </w:p>
-    <w:p>
-      <w:pPr>
-        <w:pStyle w:val="CSP-ChapterBodyText"/>
-      </w:pPr>
-      <w:r>
-        <w:t>While I</w:t>
-      </w:r>
-      <w:r>
-        <w:t>’</w:t>
-      </w:r>
-      <w:r>
-        <w:t>m completely tied up this summer, my winter break should be much quieter, so I might finally be able to come home for a visit. A round-trip ticket shouldn</w:t>
-      </w:r>
-      <w:r>
-        <w:t>’</w:t>
-      </w:r>
-      <w:r>
-        <w:t>t cost more than a thousand dollars. Besides, if I start working full-time next year, I</w:t>
-      </w:r>
-      <w:r>
-        <w:t>’</w:t>
-      </w:r>
-      <w:r>
-        <w:t>ll likely have even fewer opportunities to go back. It</w:t>
-      </w:r>
-      <w:r>
-        <w:t>’</w:t>
-      </w:r>
-      <w:r>
-        <w:t>s just an idea at this point—let me know what both of you think.</w:t>
-      </w:r>
-    </w:p>
-    <w:p>
-      <w:pPr>
-        <w:pStyle w:val="CSP-ChapterBodyText"/>
-      </w:pPr>
-    </w:p>
-    <w:p>
-      <w:pPr>
-        <w:pStyle w:val="CSP-ChapterBodyText"/>
-      </w:pPr>
-      <w:r>
-        <w:t>Chun and I have both agreed that things between us didn</w:t>
-      </w:r>
-      <w:r>
-        <w:t>’</w:t>
-      </w:r>
-      <w:r>
-        <w:t>t work out. We simply don</w:t>
-      </w:r>
-      <w:r>
-        <w:t>’</w:t>
-      </w:r>
-      <w:r>
-        <w:t>t have strong enough feelings for each other to overcome the 1,500 miles between us. As for my personal life, I think this is something I</w:t>
+        <w:t>other to overcome the 1,500 miles between us. As for my personal life, I think this is something I</w:t>
       </w:r>
       <w:r>
         <w:t>’</w:t>
@@ -11455,6 +11600,12 @@
       <w:r>
         <w:t>.</w:t>
       </w:r>
+      <w:r>
+        <w:rPr>
+          <w:rStyle w:val="FootnoteReference"/>
+        </w:rPr>
+        <w:footnoteReference w:id="36"/>
+      </w:r>
     </w:p>
     <w:p>
       <w:pPr>
@@ -11476,6 +11627,18 @@
       <w:r>
         <w:t>07/04/96</w:t>
       </w:r>
+    </w:p>
+    <w:p>
+      <w:pPr>
+        <w:pStyle w:val="CSP-ChapterBodyText"/>
+        <w:sectPr>
+          <w:pgSz w:w="7286" w:h="11246"/>
+          <w:pgMar w:top="864" w:right="864" w:bottom="864" w:left="1094" w:header="576" w:footer="432" w:gutter="0"/>
+          <w:cols w:space="720"/>
+          <w:titlePg/>
+          <w:docGrid w:linePitch="360"/>
+        </w:sectPr>
+      </w:pPr>
     </w:p>
     <w:p>
       <w:pPr>
@@ -11703,7 +11866,7 @@
         <w:rPr>
           <w:rStyle w:val="FootnoteReference"/>
         </w:rPr>
-        <w:footnoteReference w:id="26"/>
+        <w:footnoteReference w:id="37"/>
       </w:r>
       <w:r>
         <w:t xml:space="preserve"> There are nearly thirty negatives in that envelope, mostly from my trip to Houston last year and my recent trip to Atlantic City. By the way, Atlantic City is the gambling town—it</w:t>
@@ -12117,7 +12280,7 @@
         <w:rPr>
           <w:rStyle w:val="FootnoteReference"/>
         </w:rPr>
-        <w:footnoteReference w:id="27"/>
+        <w:footnoteReference w:id="38"/>
       </w:r>
       <w:r>
         <w:t xml:space="preserve"> Email is truly amazing; it only takes a few minutes for a message to get through. We can use it for anything urgent, or you can simply write whenever it</w:t>
@@ -14103,7 +14266,7 @@
         <w:rPr>
           <w:rStyle w:val="FootnoteReference"/>
         </w:rPr>
-        <w:footnoteReference w:id="28"/>
+        <w:footnoteReference w:id="39"/>
       </w:r>
       <w:r>
         <w:t xml:space="preserve"> We flew back to Austin that same night. </w:t>
@@ -14451,7 +14614,7 @@
         <w:rPr>
           <w:rStyle w:val="FootnoteReference"/>
         </w:rPr>
-        <w:footnoteReference w:id="29"/>
+        <w:footnoteReference w:id="40"/>
       </w:r>
       <w:r>
         <w:t xml:space="preserve"> I assume Mom is out in Chongming</w:t>
@@ -14460,7 +14623,7 @@
         <w:rPr>
           <w:rStyle w:val="FootnoteReference"/>
         </w:rPr>
-        <w:footnoteReference w:id="30"/>
+        <w:footnoteReference w:id="41"/>
       </w:r>
       <w:r>
         <w:t xml:space="preserve"> </w:t>
@@ -14518,7 +14681,7 @@
         <w:rPr>
           <w:rStyle w:val="FootnoteReference"/>
         </w:rPr>
-        <w:footnoteReference w:id="31"/>
+        <w:footnoteReference w:id="42"/>
       </w:r>
       <w:r>
         <w:t xml:space="preserve"> These are all standard administrative procedures, so there shouldn</w:t>
@@ -14593,7 +14756,7 @@
         <w:rPr>
           <w:rStyle w:val="FootnoteReference"/>
         </w:rPr>
-        <w:footnoteReference w:id="32"/>
+        <w:footnoteReference w:id="43"/>
       </w:r>
       <w:r>
         <w:t xml:space="preserve"> I think next year would be the perfect time. By then, I</w:t>
@@ -15022,7 +15185,7 @@
         <w:rPr>
           <w:rStyle w:val="FootnoteReference"/>
         </w:rPr>
-        <w:footnoteReference w:id="33"/>
+        <w:footnoteReference w:id="44"/>
       </w:r>
       <w:r>
         <w:t xml:space="preserve"> that took effect this month. </w:t>
@@ -15856,7 +16019,7 @@
         <w:rPr>
           <w:rStyle w:val="FootnoteReference"/>
         </w:rPr>
-        <w:footnoteReference w:id="34"/>
+        <w:footnoteReference w:id="45"/>
       </w:r>
       <w:r>
         <w:t xml:space="preserve"> </w:t>
@@ -19172,16 +19335,7 @@
         <w:t xml:space="preserve"> </w:t>
       </w:r>
       <w:r>
-        <w:t>In 1995, I completed my master</w:t>
-      </w:r>
-      <w:r>
-        <w:t>’</w:t>
-      </w:r>
-      <w:r>
-        <w:t>s degree at Tsinghua University and was admitted to the Ph.D. program in computer science at the University of Texas at Austin</w:t>
-      </w:r>
-      <w:r>
-        <w:t>.</w:t>
+        <w:t>At the time, 6,900 yuan was more than the average annual wage of an urban worker in China.</w:t>
       </w:r>
     </w:p>
   </w:footnote>
@@ -19200,34 +19354,16 @@
         <w:t xml:space="preserve"> </w:t>
       </w:r>
       <w:r>
-        <w:t xml:space="preserve">On the envelope of this letter, stamped </w:t>
-      </w:r>
-      <w:r>
-        <w:t>“</w:t>
-      </w:r>
-      <w:r>
-        <w:t>August 21, 1995,</w:t>
-      </w:r>
-      <w:r>
-        <w:t>”</w:t>
-      </w:r>
-      <w:r>
-        <w:t xml:space="preserve"> Dad wrote the following: </w:t>
-      </w:r>
-      <w:r>
-        <w:t>“</w:t>
-      </w:r>
-      <w:r>
-        <w:t>Tong</w:t>
-      </w:r>
-      <w:r>
-        <w:t>’</w:t>
-      </w:r>
-      <w:r>
-        <w:t>s first letter from the United States. It took 20 days to arrive.</w:t>
-      </w:r>
-      <w:r>
-        <w:t>”</w:t>
+        <w:t>In 1995, I completed my master</w:t>
+      </w:r>
+      <w:r>
+        <w:t>’</w:t>
+      </w:r>
+      <w:r>
+        <w:t>s degree at Tsinghua University and was admitted to the Ph.D. program in computer science at the University of Texas at Austin</w:t>
+      </w:r>
+      <w:r>
+        <w:t>.</w:t>
       </w:r>
     </w:p>
   </w:footnote>
@@ -19246,7 +19382,34 @@
         <w:t xml:space="preserve"> </w:t>
       </w:r>
       <w:r>
-        <w:t>For security reasons, no one other than airport staff and passengers was allowed beyond the security checkpoint into the gate area. Mom and Dad waited outside until my plane took off. It was the first time I had ever traveled by air.</w:t>
+        <w:t xml:space="preserve">On the envelope of this letter, stamped </w:t>
+      </w:r>
+      <w:r>
+        <w:t>“</w:t>
+      </w:r>
+      <w:r>
+        <w:t>August 21, 1995,</w:t>
+      </w:r>
+      <w:r>
+        <w:t>”</w:t>
+      </w:r>
+      <w:r>
+        <w:t xml:space="preserve"> Dad wrote the following: </w:t>
+      </w:r>
+      <w:r>
+        <w:t>“</w:t>
+      </w:r>
+      <w:r>
+        <w:t>Tong</w:t>
+      </w:r>
+      <w:r>
+        <w:t>’</w:t>
+      </w:r>
+      <w:r>
+        <w:t>s first letter from the United States. It took 20 days to arrive.</w:t>
+      </w:r>
+      <w:r>
+        <w:t>”</w:t>
       </w:r>
     </w:p>
   </w:footnote>
@@ -19265,7 +19428,7 @@
         <w:t xml:space="preserve"> </w:t>
       </w:r>
       <w:r>
-        <w:t>This refers to a landline telephone—for context, cell phones and smartphones did not yet exist for ordinary consumers.</w:t>
+        <w:t>No one other than airport staff and passengers was permitted beyond the security checkpoint into the gate area. Mom and Dad waited outside the terminal until they saw my plane taking off, though they almost missed it. It was the first time I had ever traveled by air.</w:t>
       </w:r>
     </w:p>
   </w:footnote>
@@ -19284,7 +19447,7 @@
         <w:t xml:space="preserve"> </w:t>
       </w:r>
       <w:r>
-        <w:t>Chun was a woman my age whom I met through a family friend in the summer of 1995, just a month before I left for the United States.</w:t>
+        <w:t>This refers to a landline telephone—for context, cell phones and smartphones did not yet exist for ordinary consumers.</w:t>
       </w:r>
     </w:p>
   </w:footnote>
@@ -19303,6 +19466,25 @@
         <w:t xml:space="preserve"> </w:t>
       </w:r>
       <w:r>
+        <w:t>Chun was a very intelligent and independent young woman my age whom I met through a family friend in the summer of 1995, just one month before I left for the United States.</w:t>
+      </w:r>
+    </w:p>
+  </w:footnote>
+  <w:footnote w:id="7">
+    <w:p>
+      <w:pPr>
+        <w:pStyle w:val="FootnoteText"/>
+      </w:pPr>
+      <w:r>
+        <w:rPr>
+          <w:rStyle w:val="FootnoteReference"/>
+        </w:rPr>
+        <w:footnoteRef/>
+      </w:r>
+      <w:r>
+        <w:t xml:space="preserve"> </w:t>
+      </w:r>
+      <w:r>
         <w:t>The midday nap, known in Chinese as</w:t>
       </w:r>
       <w:r>
@@ -19322,7 +19504,7 @@
       </w:r>
     </w:p>
   </w:footnote>
-  <w:footnote w:id="7">
+  <w:footnote w:id="8">
     <w:p>
       <w:pPr>
         <w:pStyle w:val="FootnoteText"/>
@@ -19338,25 +19520,6 @@
       </w:r>
       <w:r>
         <w:t>Like the vast majority of people in China, I was raised as an atheist. However, many Chinese immigrants convert to various religions after coming to America.</w:t>
-      </w:r>
-    </w:p>
-  </w:footnote>
-  <w:footnote w:id="8">
-    <w:p>
-      <w:pPr>
-        <w:pStyle w:val="FootnoteText"/>
-      </w:pPr>
-      <w:r>
-        <w:rPr>
-          <w:rStyle w:val="FootnoteReference"/>
-        </w:rPr>
-        <w:footnoteRef/>
-      </w:r>
-      <w:r>
-        <w:t xml:space="preserve"> </w:t>
-      </w:r>
-      <w:r>
-        <w:t>Mooncakes are traditional pastries associated with the Chinese Mid-Autumn Festival. Families share them while gathering, symbolizing reunion and togetherness.</w:t>
       </w:r>
     </w:p>
   </w:footnote>
@@ -19375,19 +19538,7 @@
         <w:t xml:space="preserve"> </w:t>
       </w:r>
       <w:r>
-        <w:t>At the time, a one-minute call from China to the United States cost between 26 and 30 yuan—nearly a day</w:t>
-      </w:r>
-      <w:r>
-        <w:t>’</w:t>
-      </w:r>
-      <w:r>
-        <w:t xml:space="preserve">s salary for </w:t>
-      </w:r>
-      <w:r>
-        <w:t>F</w:t>
-      </w:r>
-      <w:r>
-        <w:t>ather.</w:t>
+        <w:t>Mooncakes are traditional pastries associated with the Chinese Mid-Autumn Festival. Families share them while gathering, symbolizing reunion and togetherness.</w:t>
       </w:r>
     </w:p>
   </w:footnote>
@@ -19403,10 +19554,22 @@
         <w:footnoteRef/>
       </w:r>
       <w:r>
-        <w:t xml:space="preserve"> They</w:t>
-      </w:r>
-      <w:r>
-        <w:t xml:space="preserve"> are my sister and brother-in-law.</w:t>
+        <w:t xml:space="preserve"> </w:t>
+      </w:r>
+      <w:r>
+        <w:t>At the time, a one-minute call from China to the United States cost between 26 and 30 yuan—nearly a day</w:t>
+      </w:r>
+      <w:r>
+        <w:t>’</w:t>
+      </w:r>
+      <w:r>
+        <w:t xml:space="preserve">s salary for </w:t>
+      </w:r>
+      <w:r>
+        <w:t>F</w:t>
+      </w:r>
+      <w:r>
+        <w:t>ather.</w:t>
       </w:r>
     </w:p>
   </w:footnote>
@@ -19422,10 +19585,10 @@
         <w:footnoteRef/>
       </w:r>
       <w:r>
-        <w:t xml:space="preserve"> </w:t>
-      </w:r>
-      <w:r>
-        <w:t>In reality, at that time many transoceanic calls went through geostationary satellites, which introduced noticeable latency.</w:t>
+        <w:t xml:space="preserve"> They</w:t>
+      </w:r>
+      <w:r>
+        <w:t xml:space="preserve"> are my sister and brother-in-law.</w:t>
       </w:r>
     </w:p>
   </w:footnote>
@@ -19444,19 +19607,7 @@
         <w:t xml:space="preserve"> </w:t>
       </w:r>
       <w:r>
-        <w:t xml:space="preserve">In 1995, cross-strait relations between mainland China and Taiwan were at a low point, triggered by </w:t>
-      </w:r>
-      <w:r>
-        <w:t xml:space="preserve">the </w:t>
-      </w:r>
-      <w:r>
-        <w:t>Taiwan leader</w:t>
-      </w:r>
-      <w:r>
-        <w:t>’</w:t>
-      </w:r>
-      <w:r>
-        <w:t>s U.S. visit, leading into the 1995–1996 missile crisis and serious fears of military escalation.</w:t>
+        <w:t>In his letter, Father wrote that my first letter reached home after 20 days, while the second arrived in just 11.</w:t>
       </w:r>
     </w:p>
   </w:footnote>
@@ -19475,6 +19626,56 @@
         <w:t xml:space="preserve"> </w:t>
       </w:r>
       <w:r>
+        <w:t>In reality, at that time many transoceanic calls went through geostationary satellites, which introduced noticeable latency.</w:t>
+      </w:r>
+    </w:p>
+  </w:footnote>
+  <w:footnote w:id="14">
+    <w:p>
+      <w:pPr>
+        <w:pStyle w:val="FootnoteText"/>
+      </w:pPr>
+      <w:r>
+        <w:rPr>
+          <w:rStyle w:val="FootnoteReference"/>
+        </w:rPr>
+        <w:footnoteRef/>
+      </w:r>
+      <w:r>
+        <w:t xml:space="preserve"> </w:t>
+      </w:r>
+      <w:r>
+        <w:t xml:space="preserve">In 1995, cross-strait relations between mainland China and Taiwan were at a low point, triggered by </w:t>
+      </w:r>
+      <w:r>
+        <w:t xml:space="preserve">the </w:t>
+      </w:r>
+      <w:r>
+        <w:t>Taiwan leader</w:t>
+      </w:r>
+      <w:r>
+        <w:t>’</w:t>
+      </w:r>
+      <w:r>
+        <w:t>s U.S. visit, leading into the 1995–1996 missile crisis and serious fears of military escalation.</w:t>
+      </w:r>
+    </w:p>
+  </w:footnote>
+  <w:footnote w:id="15">
+    <w:p>
+      <w:pPr>
+        <w:pStyle w:val="FootnoteText"/>
+      </w:pPr>
+      <w:r>
+        <w:rPr>
+          <w:rStyle w:val="FootnoteReference"/>
+        </w:rPr>
+        <w:footnoteRef/>
+      </w:r>
+      <w:r>
+        <w:t xml:space="preserve"> </w:t>
+      </w:r>
+      <w:r>
         <w:t>My favorite sitcoms, including</w:t>
       </w:r>
       <w:r>
@@ -19510,7 +19711,7 @@
       </w:r>
     </w:p>
   </w:footnote>
-  <w:footnote w:id="14">
+  <w:footnote w:id="16">
     <w:p>
       <w:pPr>
         <w:pStyle w:val="FootnoteText"/>
@@ -19529,7 +19730,7 @@
       </w:r>
     </w:p>
   </w:footnote>
-  <w:footnote w:id="15">
+  <w:footnote w:id="17">
     <w:p>
       <w:pPr>
         <w:pStyle w:val="FootnoteText"/>
@@ -19573,7 +19774,105 @@
       </w:r>
     </w:p>
   </w:footnote>
-  <w:footnote w:id="16">
+  <w:footnote w:id="18">
+    <w:p>
+      <w:pPr>
+        <w:pStyle w:val="FootnoteText"/>
+      </w:pPr>
+      <w:r>
+        <w:rPr>
+          <w:rStyle w:val="FootnoteReference"/>
+        </w:rPr>
+        <w:footnoteRef/>
+      </w:r>
+      <w:r>
+        <w:t xml:space="preserve"> </w:t>
+      </w:r>
+      <w:r>
+        <w:t>Father was exploring the possibility of becoming a visiting scholar at UT. As he put it, "If only I could find a job at UT, we might be able to help you out a bit during this difficult period of your studies."</w:t>
+      </w:r>
+    </w:p>
+  </w:footnote>
+  <w:footnote w:id="19">
+    <w:p>
+      <w:pPr>
+        <w:pStyle w:val="FootnoteText"/>
+      </w:pPr>
+      <w:r>
+        <w:rPr>
+          <w:rStyle w:val="FootnoteReference"/>
+        </w:rPr>
+        <w:footnoteRef/>
+      </w:r>
+      <w:r>
+        <w:t xml:space="preserve"> </w:t>
+      </w:r>
+      <w:r>
+        <w:t>In her first letter</w:t>
+      </w:r>
+      <w:r>
+        <w:t>, Mother explained, "Our feelings are so conflicted. When your call came through, suddenly we didn’t know how much to ask. We want so badly to know how you are doing, to hear your voice, but at the same time, we are so afraid of running up your phone bill."</w:t>
+      </w:r>
+    </w:p>
+  </w:footnote>
+  <w:footnote w:id="20">
+    <w:p>
+      <w:pPr>
+        <w:pStyle w:val="FootnoteText"/>
+      </w:pPr>
+      <w:r>
+        <w:rPr>
+          <w:rStyle w:val="FootnoteReference"/>
+        </w:rPr>
+        <w:footnoteRef/>
+      </w:r>
+      <w:r>
+        <w:t xml:space="preserve"> </w:t>
+      </w:r>
+      <w:r>
+        <w:t>I later learned that this card spent 33 days in transit before finally reaching home.</w:t>
+      </w:r>
+    </w:p>
+  </w:footnote>
+  <w:footnote w:id="21">
+    <w:p>
+      <w:pPr>
+        <w:pStyle w:val="FootnoteText"/>
+      </w:pPr>
+      <w:r>
+        <w:rPr>
+          <w:rStyle w:val="FootnoteReference"/>
+        </w:rPr>
+        <w:footnoteRef/>
+      </w:r>
+      <w:r>
+        <w:t xml:space="preserve"> </w:t>
+      </w:r>
+      <w:r>
+        <w:t>Since Mom wasn't quite sure where things stood between Chun and me, she asked if she should invite her over.</w:t>
+      </w:r>
+    </w:p>
+  </w:footnote>
+  <w:footnote w:id="22">
+    <w:p>
+      <w:pPr>
+        <w:pStyle w:val="FootnoteText"/>
+      </w:pPr>
+      <w:r>
+        <w:rPr>
+          <w:rStyle w:val="FootnoteReference"/>
+        </w:rPr>
+        <w:footnoteRef/>
+      </w:r>
+      <w:r>
+        <w:t xml:space="preserve"> </w:t>
+      </w:r>
+      <w:r>
+        <w:t>In a letter dated March 2, 1996, Mother wrote: "Your dad dared me, claiming I was too scared to call you. So today I went ahead and tried anyway. With your dad's help, I've been practicing these lines in English every day: 'It's Tong's Mami. Could you please tell Tong to answer the phone?'" On that day, I answered the phone, heard someone speaking, and didn't understand a word.</w:t>
+      </w:r>
+    </w:p>
+  </w:footnote>
+  <w:footnote w:id="23">
     <w:p>
       <w:pPr>
         <w:pStyle w:val="FootnoteText"/>
@@ -19614,7 +19913,7 @@
       </w:r>
     </w:p>
   </w:footnote>
-  <w:footnote w:id="17">
+  <w:footnote w:id="24">
     <w:p>
       <w:pPr>
         <w:pStyle w:val="FootnoteText"/>
@@ -19629,179 +19928,7 @@
         <w:t xml:space="preserve"> </w:t>
       </w:r>
       <w:r>
-        <w:t>The Gala is a live TV show featuring music, dance, and comedy performances, held annually on Chinese New Year</w:t>
-      </w:r>
-      <w:r>
-        <w:t>’</w:t>
-      </w:r>
-      <w:r>
-        <w:t>s Eve since 1983. It is considered as the most-watched TV broadcast on the planet. The broadcast typically spans several hours and leads up to the midnight countdown.</w:t>
-      </w:r>
-    </w:p>
-  </w:footnote>
-  <w:footnote w:id="18">
-    <w:p>
-      <w:pPr>
-        <w:pStyle w:val="FootnoteText"/>
-      </w:pPr>
-      <w:r>
-        <w:rPr>
-          <w:rStyle w:val="FootnoteReference"/>
-        </w:rPr>
-        <w:footnoteRef/>
-      </w:r>
-      <w:r>
-        <w:t xml:space="preserve"> </w:t>
-      </w:r>
-      <w:r>
-        <w:t>The Chinese New Year</w:t>
-      </w:r>
-      <w:r>
-        <w:t>’</w:t>
-      </w:r>
-      <w:r>
-        <w:t>s Eve dinner, widely known as the Reunion Dinner, is the most important family meal of the year.</w:t>
-      </w:r>
-    </w:p>
-  </w:footnote>
-  <w:footnote w:id="19">
-    <w:p>
-      <w:pPr>
-        <w:pStyle w:val="FootnoteText"/>
-      </w:pPr>
-      <w:r>
-        <w:rPr>
-          <w:rStyle w:val="FootnoteReference"/>
-        </w:rPr>
-        <w:footnoteRef/>
-      </w:r>
-      <w:r>
-        <w:t xml:space="preserve"> </w:t>
-      </w:r>
-      <w:r>
-        <w:t>To obtain an F-1 student visa, international students must demonstrate that they have sufficient financial support for their studies and living expenses in the United States. For the vast majority of Chinese at the time, this meant securing a fellowship, scholarship, or assistantship such as a teaching assistant position. Without such support, studying in the United States was out of reach</w:t>
-      </w:r>
-      <w:r>
-        <w:t xml:space="preserve"> for most</w:t>
-      </w:r>
-      <w:r>
-        <w:t>.</w:t>
-      </w:r>
-    </w:p>
-  </w:footnote>
-  <w:footnote w:id="20">
-    <w:p>
-      <w:pPr>
-        <w:pStyle w:val="FootnoteText"/>
-      </w:pPr>
-      <w:r>
-        <w:rPr>
-          <w:rStyle w:val="FootnoteReference"/>
-        </w:rPr>
-        <w:footnoteRef/>
-      </w:r>
-      <w:r>
-        <w:t xml:space="preserve"> </w:t>
-      </w:r>
-      <w:r>
-        <w:t>At that time, most Chinese households did not own electric rice cookers or microwave ovens, which were common conveniences in American homes.</w:t>
-      </w:r>
-    </w:p>
-  </w:footnote>
-  <w:footnote w:id="21">
-    <w:p>
-      <w:pPr>
-        <w:pStyle w:val="FootnoteText"/>
-      </w:pPr>
-      <w:r>
-        <w:rPr>
-          <w:rStyle w:val="FootnoteReference"/>
-        </w:rPr>
-        <w:footnoteRef/>
-      </w:r>
-      <w:r>
-        <w:t xml:space="preserve"> </w:t>
-      </w:r>
-      <w:r>
-        <w:t xml:space="preserve">In addition to a few hundred U.S. dollars, I brought a few thousand Deutsche Marks with me when I first arrived in the United States. It was money </w:t>
-      </w:r>
-      <w:r>
-        <w:t>F</w:t>
-      </w:r>
-      <w:r>
-        <w:t>ather had saved during a three-month stay as a visiting scholar in Germany. I used to joke that it was my emergency fund—I would use it to buy a plane ticket home if I couldn</w:t>
-      </w:r>
-      <w:r>
-        <w:t>’</w:t>
-      </w:r>
-      <w:r>
-        <w:t>t make it in the United States.</w:t>
-      </w:r>
-    </w:p>
-  </w:footnote>
-  <w:footnote w:id="22">
-    <w:p>
-      <w:pPr>
-        <w:pStyle w:val="FootnoteText"/>
-      </w:pPr>
-      <w:r>
-        <w:rPr>
-          <w:rStyle w:val="FootnoteReference"/>
-        </w:rPr>
-        <w:footnoteRef/>
-      </w:r>
-      <w:r>
-        <w:t xml:space="preserve"> When parents visited the United States, children who agreed to sponsor the trip were advised to provide evidence of financial resources, in case consular officers required proof of their ability to support the visit.</w:t>
-      </w:r>
-    </w:p>
-  </w:footnote>
-  <w:footnote w:id="23">
-    <w:p>
-      <w:pPr>
-        <w:pStyle w:val="FootnoteText"/>
-      </w:pPr>
-      <w:r>
-        <w:rPr>
-          <w:rStyle w:val="FootnoteReference"/>
-        </w:rPr>
-        <w:footnoteRef/>
-      </w:r>
-      <w:r>
-        <w:t xml:space="preserve"> </w:t>
-      </w:r>
-      <w:r>
-        <w:t>F</w:t>
-      </w:r>
-      <w:r>
-        <w:t>ather was a college professor of aerodynamics.</w:t>
-      </w:r>
-      <w:r>
-        <w:t xml:space="preserve"> Much of his work involved using computers and numerical algorithms to simulate and analyze airflow around objects. Even at home, he often spent long hours at the computer working on his research.</w:t>
-      </w:r>
-    </w:p>
-  </w:footnote>
-  <w:footnote w:id="24">
-    <w:p>
-      <w:pPr>
-        <w:pStyle w:val="FootnoteText"/>
-      </w:pPr>
-      <w:r>
-        <w:rPr>
-          <w:rStyle w:val="FootnoteReference"/>
-        </w:rPr>
-        <w:footnoteRef/>
-      </w:r>
-      <w:r>
-        <w:t xml:space="preserve"> </w:t>
-      </w:r>
-      <w:r>
-        <w:t xml:space="preserve">Mother enjoyed collecting coins. She began a modest coin collection after </w:t>
-      </w:r>
-      <w:r>
-        <w:t>F</w:t>
-      </w:r>
-      <w:r>
-        <w:t>ather returned from England in 1981 with several foreign coins.</w:t>
+        <w:t>Father wrote, "This winter break has been incredibly difficult. First of all, you were not by our side. Second, the weather has been nothing but endless rain and snow, and the indoor temperature hovered constantly around 6 degrees Celsius. Third, on the morning of Chinese New Year's Eve, your mother slipped on the snow and fractured her left wrist." Equivalent to 42.8°F, six degrees Celsius would be considered bitterly cold indoors.</w:t>
       </w:r>
     </w:p>
   </w:footnote>
@@ -19820,7 +19947,13 @@
         <w:t xml:space="preserve"> </w:t>
       </w:r>
       <w:r>
-        <w:t>Gambling was illegal in mainland China at the time, and it still is today. Macau, a former Portuguese colony and now a Special Administrative Region of China, is the only place on Chinese soil where casino gambling is legal.</w:t>
+        <w:t>The Gala is a live TV show featuring music, dance, and comedy performances, held annually on Chinese New Year</w:t>
+      </w:r>
+      <w:r>
+        <w:t>’</w:t>
+      </w:r>
+      <w:r>
+        <w:t>s Eve since 1983. It is considered as the most-watched TV broadcast on the planet. The broadcast typically spans several hours and leads up to the midnight countdown.</w:t>
       </w:r>
     </w:p>
   </w:footnote>
@@ -19839,7 +19972,13 @@
         <w:t xml:space="preserve"> </w:t>
       </w:r>
       <w:r>
-        <w:t>Letter #16 was, in fact, lost, along with many of the film negatives. Unfortunately, I no longer remember what I wrote in it.</w:t>
+        <w:t>The Chinese New Year</w:t>
+      </w:r>
+      <w:r>
+        <w:t>’</w:t>
+      </w:r>
+      <w:r>
+        <w:t>s Eve dinner, widely known as the Reunion Dinner, is the most important family meal of the year.</w:t>
       </w:r>
     </w:p>
   </w:footnote>
@@ -19858,7 +19997,13 @@
         <w:t xml:space="preserve"> </w:t>
       </w:r>
       <w:r>
-        <w:t>Around 1996, with a few exceptions, most computers in China were not connected to the internet. Even where email was available, a single email account was often shared by multiple people.</w:t>
+        <w:t>To obtain an F-1 student visa, international students must demonstrate that they have sufficient financial support for their studies and living expenses in the United States. For the vast majority of Chinese at the time, this meant securing a fellowship, scholarship, or assistantship such as a teaching assistant position. Without such support, studying in the United States was out of reach</w:t>
+      </w:r>
+      <w:r>
+        <w:t xml:space="preserve"> for most</w:t>
+      </w:r>
+      <w:r>
+        <w:t>.</w:t>
       </w:r>
     </w:p>
   </w:footnote>
@@ -19877,7 +20022,7 @@
         <w:t xml:space="preserve"> </w:t>
       </w:r>
       <w:r>
-        <w:t>Cantonese is a Chinese language traditionally spoken in Guangdong Province, Hong Kong, and many overseas Chinese communities. Unlike the Mandarin spoken in Beijing, Cantonese differs significantly in pronunciation, vocabulary, and tone.</w:t>
+        <w:t>At that time, most Chinese households did not own electric rice cookers or microwave ovens, which were common conveniences in American homes.</w:t>
       </w:r>
     </w:p>
   </w:footnote>
@@ -19893,7 +20038,22 @@
         <w:footnoteRef/>
       </w:r>
       <w:r>
-        <w:t>The Qingming Festival is a traditional Chinese holiday observed in early April to honor deceased ancestors by visiting and tending their graves.</w:t>
+        <w:t xml:space="preserve"> </w:t>
+      </w:r>
+      <w:r>
+        <w:t xml:space="preserve">In addition to a few hundred U.S. dollars, I brought a few thousand Deutsche Marks with me when I first arrived in the United States. It was money </w:t>
+      </w:r>
+      <w:r>
+        <w:t>F</w:t>
+      </w:r>
+      <w:r>
+        <w:t>ather had saved during a three-month stay as a visiting scholar in Germany. I used to joke that it was my emergency fund—I would use it to buy a plane ticket home if I couldn</w:t>
+      </w:r>
+      <w:r>
+        <w:t>’</w:t>
+      </w:r>
+      <w:r>
+        <w:t>t make it in the United States.</w:t>
       </w:r>
     </w:p>
   </w:footnote>
@@ -19909,19 +20069,7 @@
         <w:footnoteRef/>
       </w:r>
       <w:r>
-        <w:t xml:space="preserve"> </w:t>
-      </w:r>
-      <w:r>
-        <w:t>Chongming, once a largely rural part of Shanghai, is Mo</w:t>
-      </w:r>
-      <w:r>
-        <w:t>ther</w:t>
-      </w:r>
-      <w:r>
-        <w:t>’</w:t>
-      </w:r>
-      <w:r>
-        <w:t>s hometown.</w:t>
+        <w:t xml:space="preserve"> When parents visited the United States, children who agreed to sponsor the trip were advised to provide evidence of financial resources, in case consular officers required proof of their ability to support the visit.</w:t>
       </w:r>
     </w:p>
   </w:footnote>
@@ -19940,13 +20088,13 @@
         <w:t xml:space="preserve"> </w:t>
       </w:r>
       <w:r>
-        <w:t xml:space="preserve">Optional Practical Training is a period during which international students on an F-1 visa can work in </w:t>
-      </w:r>
-      <w:r>
-        <w:t>the United States</w:t>
-      </w:r>
-      <w:r>
-        <w:t xml:space="preserve"> in a job related to their field of study.</w:t>
+        <w:t>F</w:t>
+      </w:r>
+      <w:r>
+        <w:t>ather was a college professor of aerodynamics.</w:t>
+      </w:r>
+      <w:r>
+        <w:t xml:space="preserve"> Much of his work involved using computers and numerical algorithms to simulate and analyze airflow around objects. Even at home, he often spent long hours at the computer working on his research.</w:t>
       </w:r>
     </w:p>
   </w:footnote>
@@ -19965,19 +20113,13 @@
         <w:t xml:space="preserve"> </w:t>
       </w:r>
       <w:r>
-        <w:t>Due to the complexities and uncertainties of U.S. immigration law, traveling back to one</w:t>
-      </w:r>
-      <w:r>
-        <w:t>’</w:t>
-      </w:r>
-      <w:r>
-        <w:t xml:space="preserve">s home country carried certain risk and was generally discouraged while on </w:t>
-      </w:r>
-      <w:r>
-        <w:t xml:space="preserve">a </w:t>
-      </w:r>
-      <w:r>
-        <w:t>work visa.</w:t>
+        <w:t xml:space="preserve">Mother enjoyed collecting coins. She began a modest coin collection after </w:t>
+      </w:r>
+      <w:r>
+        <w:t>F</w:t>
+      </w:r>
+      <w:r>
+        <w:t>ather returned from England in 1981 with several foreign coins.</w:t>
       </w:r>
     </w:p>
   </w:footnote>
@@ -19996,11 +20138,259 @@
         <w:t xml:space="preserve"> </w:t>
       </w:r>
       <w:r>
-        <w:t>The Illegal Immigration Reform and Immigrant Responsibility Act of 1996 (IIRIRA) was signed into law on September 30, 1996. Most of its major provisions took effect on April 1, 1997. The law significantly expanded immigration enforcement and overhauled many aspects of U.S. immigration law, raising concerns among many immigrants and international students.</w:t>
+        <w:t>Gambling was illegal in mainland China at the time, and it still is today. Macau, a former Portuguese colony and now a Special Administrative Region of China, is the only place on Chinese soil where casino gambling is legal.</w:t>
       </w:r>
     </w:p>
   </w:footnote>
   <w:footnote w:id="34">
+    <w:p>
+      <w:pPr>
+        <w:pStyle w:val="FootnoteText"/>
+        <w:rPr>
+          <w:rFonts w:hint="eastAsia"/>
+          <w:lang w:eastAsia="zh-CN"/>
+        </w:rPr>
+      </w:pPr>
+      <w:r>
+        <w:rPr>
+          <w:rStyle w:val="FootnoteReference"/>
+        </w:rPr>
+        <w:footnoteRef/>
+      </w:r>
+      <w:r>
+        <w:t xml:space="preserve"> </w:t>
+      </w:r>
+      <w:r>
+        <w:t>In his letter, Father wrote that the fans based on his design significantly outperformed the much more expensive German-imported Woods Air Movement fans and would replace them in subways and tunnels.</w:t>
+      </w:r>
+    </w:p>
+  </w:footnote>
+  <w:footnote w:id="35">
+    <w:p>
+      <w:pPr>
+        <w:pStyle w:val="FootnoteText"/>
+        <w:rPr>
+          <w:lang w:eastAsia="zh-CN"/>
+        </w:rPr>
+      </w:pPr>
+      <w:r>
+        <w:rPr>
+          <w:rStyle w:val="FootnoteReference"/>
+        </w:rPr>
+        <w:footnoteRef/>
+      </w:r>
+      <w:r>
+        <w:t xml:space="preserve"> </w:t>
+      </w:r>
+      <w:r>
+        <w:t>To which Mother replied: "Of course we are thrilled that you plan to come home for winter break. Whenever you want to come back to see us, you are always welcome. Our only worry is that you might find it hard to adjust to life back here. To tell you the truth, it was only for the sake of your future that we let you go. Deep down, we were so reluctant to part with you, and we miss you and worry about you every single day. But parents cannot keep their children by their side forever—a good child should set their sights on the wider world! I still remember when I, too, left my own parents to come to Nanjing."</w:t>
+      </w:r>
+    </w:p>
+  </w:footnote>
+  <w:footnote w:id="36">
+    <w:p>
+      <w:pPr>
+        <w:pStyle w:val="FootnoteText"/>
+      </w:pPr>
+      <w:r>
+        <w:rPr>
+          <w:rStyle w:val="FootnoteReference"/>
+        </w:rPr>
+        <w:footnoteRef/>
+      </w:r>
+      <w:r>
+        <w:t xml:space="preserve"> </w:t>
+      </w:r>
+      <w:r>
+        <w:t xml:space="preserve">My nephew, </w:t>
+      </w:r>
+      <w:proofErr w:type="spellStart"/>
+      <w:r>
+        <w:t>Yueyue</w:t>
+      </w:r>
+      <w:proofErr w:type="spellEnd"/>
+      <w:r>
+        <w:t>, was only five years old at the time. Ever since I left for America, whenever he spotted an airplane in the sky, he would point and say he wanted to fly on it to go visit his uncle.</w:t>
+      </w:r>
+    </w:p>
+  </w:footnote>
+  <w:footnote w:id="37">
+    <w:p>
+      <w:pPr>
+        <w:pStyle w:val="FootnoteText"/>
+      </w:pPr>
+      <w:r>
+        <w:rPr>
+          <w:rStyle w:val="FootnoteReference"/>
+        </w:rPr>
+        <w:footnoteRef/>
+      </w:r>
+      <w:r>
+        <w:t xml:space="preserve"> </w:t>
+      </w:r>
+      <w:r>
+        <w:t>Letter #16 was, in fact, lost, along with many of the film negatives. Unfortunately, I no longer remember what I wrote in it.</w:t>
+      </w:r>
+    </w:p>
+  </w:footnote>
+  <w:footnote w:id="38">
+    <w:p>
+      <w:pPr>
+        <w:pStyle w:val="FootnoteText"/>
+      </w:pPr>
+      <w:r>
+        <w:rPr>
+          <w:rStyle w:val="FootnoteReference"/>
+        </w:rPr>
+        <w:footnoteRef/>
+      </w:r>
+      <w:r>
+        <w:t xml:space="preserve"> </w:t>
+      </w:r>
+      <w:r>
+        <w:t>Around 1996, with a few exceptions, most computers in China were not connected to the internet. Even where email was available, a single email account was often shared by multiple people.</w:t>
+      </w:r>
+    </w:p>
+  </w:footnote>
+  <w:footnote w:id="39">
+    <w:p>
+      <w:pPr>
+        <w:pStyle w:val="FootnoteText"/>
+      </w:pPr>
+      <w:r>
+        <w:rPr>
+          <w:rStyle w:val="FootnoteReference"/>
+        </w:rPr>
+        <w:footnoteRef/>
+      </w:r>
+      <w:r>
+        <w:t xml:space="preserve"> </w:t>
+      </w:r>
+      <w:r>
+        <w:t>Cantonese is a Chinese language traditionally spoken in Guangdong Province, Hong Kong, and many overseas Chinese communities. Unlike the Mandarin spoken in Beijing, Cantonese differs significantly in pronunciation, vocabulary, and tone.</w:t>
+      </w:r>
+    </w:p>
+  </w:footnote>
+  <w:footnote w:id="40">
+    <w:p>
+      <w:pPr>
+        <w:pStyle w:val="FootnoteText"/>
+      </w:pPr>
+      <w:r>
+        <w:rPr>
+          <w:rStyle w:val="FootnoteReference"/>
+        </w:rPr>
+        <w:footnoteRef/>
+      </w:r>
+      <w:r>
+        <w:t>The Qingming Festival is a traditional Chinese holiday observed in early April to honor deceased ancestors by visiting and tending their graves.</w:t>
+      </w:r>
+    </w:p>
+  </w:footnote>
+  <w:footnote w:id="41">
+    <w:p>
+      <w:pPr>
+        <w:pStyle w:val="FootnoteText"/>
+      </w:pPr>
+      <w:r>
+        <w:rPr>
+          <w:rStyle w:val="FootnoteReference"/>
+        </w:rPr>
+        <w:footnoteRef/>
+      </w:r>
+      <w:r>
+        <w:t xml:space="preserve"> </w:t>
+      </w:r>
+      <w:r>
+        <w:t>Chongming, once a largely rural part of Shanghai, is Mo</w:t>
+      </w:r>
+      <w:r>
+        <w:t>ther</w:t>
+      </w:r>
+      <w:r>
+        <w:t>’</w:t>
+      </w:r>
+      <w:r>
+        <w:t>s hometown.</w:t>
+      </w:r>
+    </w:p>
+  </w:footnote>
+  <w:footnote w:id="42">
+    <w:p>
+      <w:pPr>
+        <w:pStyle w:val="FootnoteText"/>
+      </w:pPr>
+      <w:r>
+        <w:rPr>
+          <w:rStyle w:val="FootnoteReference"/>
+        </w:rPr>
+        <w:footnoteRef/>
+      </w:r>
+      <w:r>
+        <w:t xml:space="preserve"> </w:t>
+      </w:r>
+      <w:r>
+        <w:t xml:space="preserve">Optional Practical Training is a period during which international students on an F-1 visa can work in </w:t>
+      </w:r>
+      <w:r>
+        <w:t>the United States</w:t>
+      </w:r>
+      <w:r>
+        <w:t xml:space="preserve"> in a job related to their field of study.</w:t>
+      </w:r>
+    </w:p>
+  </w:footnote>
+  <w:footnote w:id="43">
+    <w:p>
+      <w:pPr>
+        <w:pStyle w:val="FootnoteText"/>
+      </w:pPr>
+      <w:r>
+        <w:rPr>
+          <w:rStyle w:val="FootnoteReference"/>
+        </w:rPr>
+        <w:footnoteRef/>
+      </w:r>
+      <w:r>
+        <w:t xml:space="preserve"> </w:t>
+      </w:r>
+      <w:r>
+        <w:t>Due to the complexities and uncertainties of U.S. immigration law, traveling back to one</w:t>
+      </w:r>
+      <w:r>
+        <w:t>’</w:t>
+      </w:r>
+      <w:r>
+        <w:t xml:space="preserve">s home country carried certain risk and was generally discouraged while on </w:t>
+      </w:r>
+      <w:r>
+        <w:t xml:space="preserve">a </w:t>
+      </w:r>
+      <w:r>
+        <w:t>work visa.</w:t>
+      </w:r>
+    </w:p>
+  </w:footnote>
+  <w:footnote w:id="44">
+    <w:p>
+      <w:pPr>
+        <w:pStyle w:val="FootnoteText"/>
+      </w:pPr>
+      <w:r>
+        <w:rPr>
+          <w:rStyle w:val="FootnoteReference"/>
+        </w:rPr>
+        <w:footnoteRef/>
+      </w:r>
+      <w:r>
+        <w:t xml:space="preserve"> </w:t>
+      </w:r>
+      <w:r>
+        <w:t>The Illegal Immigration Reform and Immigrant Responsibility Act of 1996 (IIRIRA) was signed into law on September 30, 1996. Most of its major provisions took effect on April 1, 1997. The law significantly expanded immigration enforcement and overhauled many aspects of U.S. immigration law, raising concerns among many immigrants and international students.</w:t>
+      </w:r>
+    </w:p>
+  </w:footnote>
+  <w:footnote w:id="45">
     <w:p>
       <w:pPr>
         <w:pStyle w:val="FootnoteText"/>
@@ -20810,6 +21200,46 @@
       <w:lang w:eastAsia="zh-CN"/>
     </w:rPr>
   </w:style>
+  <w:style w:type="paragraph" w:styleId="EndnoteText">
+    <w:name w:val="endnote text"/>
+    <w:basedOn w:val="Normal"/>
+    <w:link w:val="EndnoteTextChar"/>
+    <w:uiPriority w:val="99"/>
+    <w:semiHidden/>
+    <w:unhideWhenUsed/>
+    <w:rsid w:val="005276F4"/>
+    <w:pPr>
+      <w:spacing w:after="0" w:line="240" w:lineRule="auto"/>
+    </w:pPr>
+    <w:rPr>
+      <w:sz w:val="20"/>
+      <w:szCs w:val="20"/>
+    </w:rPr>
+  </w:style>
+  <w:style w:type="character" w:customStyle="1" w:styleId="EndnoteTextChar">
+    <w:name w:val="Endnote Text Char"/>
+    <w:basedOn w:val="DefaultParagraphFont"/>
+    <w:link w:val="EndnoteText"/>
+    <w:uiPriority w:val="99"/>
+    <w:semiHidden/>
+    <w:rsid w:val="005276F4"/>
+    <w:rPr>
+      <w:rFonts w:ascii="Calibri" w:eastAsia="Calibri" w:hAnsi="Calibri" w:cs="Times New Roman"/>
+      <w:sz w:val="20"/>
+      <w:szCs w:val="20"/>
+    </w:rPr>
+  </w:style>
+  <w:style w:type="character" w:styleId="EndnoteReference">
+    <w:name w:val="endnote reference"/>
+    <w:basedOn w:val="DefaultParagraphFont"/>
+    <w:uiPriority w:val="99"/>
+    <w:semiHidden/>
+    <w:unhideWhenUsed/>
+    <w:rsid w:val="005276F4"/>
+    <w:rPr>
+      <w:vertAlign w:val="superscript"/>
+    </w:rPr>
+  </w:style>
 </w:styles>
 </file>
 

</xml_diff>